<commit_message>
Strip Word doc down: title, intro placeholder, two tables
Removed the KPI callout box, the grey italic footnotes under each
table, and the colophon at the bottom. Section text is now a single
plain sentence, not a lede paragraph.

https://claude.ai/code/session_01PM89wz7vnfvW2NRaFUoooy
</commit_message>
<xml_diff>
--- a/Updating_SLV_Rules.docx
+++ b/Updating_SLV_Rules.docx
@@ -4,7 +4,7 @@
   <w:body>
     <w:p>
       <w:pPr>
-        <w:spacing w:before="0" w:after="80"/>
+        <w:spacing w:after="40"/>
       </w:pPr>
       <w:r>
         <w:rPr>
@@ -17,14 +17,13 @@
     </w:p>
     <w:p>
       <w:pPr>
-        <w:spacing w:before="0" w:after="200"/>
+        <w:spacing w:after="280"/>
         <w:pBdr>
-          <w:bottom w:val="single" w:sz="12" w:color="2F4A7C"/>
+          <w:bottom w:val="single" w:sz="8" w:color="2F4A7C"/>
         </w:pBdr>
       </w:pPr>
       <w:r>
         <w:rPr>
-          <w:i w:val="0"/>
           <w:color w:val="555555"/>
           <w:sz w:val="22"/>
         </w:rPr>
@@ -33,159 +32,37 @@
     </w:p>
     <w:p>
       <w:pPr>
-        <w:spacing w:after="240"/>
+        <w:spacing w:after="280"/>
       </w:pPr>
       <w:r>
         <w:rPr>
-          <w:i/>
           <w:color w:val="888888"/>
-          <w:sz w:val="21"/>
         </w:rPr>
-        <w:t>[Intro paragraph — one paragraph of McMaster-Carr voice framing the two decisions we are bringing forward: (1) loosening the R1 contact-count threshold, and (2) narrowing the R3 listcode exclusion after evaluating each listcode by contact-count profile.]</w:t>
+        <w:t>[Intro paragraph]</w:t>
       </w:r>
-    </w:p>
-    <w:tbl>
-      <w:tblPr>
-        <w:tblW w:type="auto" w:w="0"/>
-        <w:jc w:val="left"/>
-        <w:tblLayout w:type="fixed"/>
-        <w:tblLook w:firstColumn="1" w:firstRow="1" w:lastColumn="0" w:lastRow="0" w:noHBand="0" w:noVBand="1" w:val="04A0"/>
-      </w:tblPr>
-      <w:tblGrid>
-        <w:gridCol w:w="3456"/>
-        <w:gridCol w:w="4176"/>
-        <w:gridCol w:w="2592"/>
-      </w:tblGrid>
-      <w:tr>
-        <w:tc>
-          <w:tcPr>
-            <w:tcW w:type="dxa" w:w="3408"/>
-            <w:shd w:fill="E6ECF4" w:val="clear"/>
-            <w:tcBorders>
-              <w:top w:val="nil"/>
-              <w:bottom w:val="nil"/>
-              <w:right w:val="nil"/>
-            </w:tcBorders>
-            <w:tcBorders>
-              <w:top w:val="nil"/>
-              <w:bottom w:val="nil"/>
-              <w:right w:val="nil"/>
-              <w:left w:val="single" w:sz="24" w:color="2F4A7C"/>
-            </w:tcBorders>
-          </w:tcPr>
-          <w:p>
-            <w:r/>
-            <w:r>
-              <w:rPr>
-                <w:b/>
-                <w:color w:val="2F4A7C"/>
-                <w:sz w:val="17"/>
-              </w:rPr>
-              <w:t>STARTING UNIVERSE</w:t>
-              <w:br/>
-            </w:r>
-            <w:r>
-              <w:rPr>
-                <w:b/>
-                <w:color w:val="1A1A1A"/>
-                <w:sz w:val="23"/>
-              </w:rPr>
-              <w:t>566,092 CMFs</w:t>
-            </w:r>
-          </w:p>
-        </w:tc>
-        <w:tc>
-          <w:tcPr>
-            <w:tcW w:type="dxa" w:w="3408"/>
-            <w:shd w:fill="E6ECF4" w:val="clear"/>
-            <w:tcBorders>
-              <w:top w:val="nil"/>
-              <w:bottom w:val="nil"/>
-              <w:right w:val="nil"/>
-            </w:tcBorders>
-          </w:tcPr>
-          <w:p>
-            <w:r/>
-            <w:r>
-              <w:rPr>
-                <w:b/>
-                <w:color w:val="2F4A7C"/>
-                <w:sz w:val="17"/>
-              </w:rPr>
-              <w:t>AFTER ACTION 1 · DISTRIBUTOR REMOVED</w:t>
-              <w:br/>
-            </w:r>
-            <w:r>
-              <w:rPr>
-                <w:b/>
-                <w:color w:val="1A1A1A"/>
-                <w:sz w:val="23"/>
-              </w:rPr>
-              <w:t>545,030 CMFs · 16.99M orders</w:t>
-            </w:r>
-          </w:p>
-        </w:tc>
-        <w:tc>
-          <w:tcPr>
-            <w:tcW w:type="dxa" w:w="3408"/>
-            <w:shd w:fill="E6ECF4" w:val="clear"/>
-            <w:tcBorders>
-              <w:top w:val="nil"/>
-              <w:bottom w:val="nil"/>
-              <w:right w:val="nil"/>
-            </w:tcBorders>
-          </w:tcPr>
-          <w:p>
-            <w:r/>
-            <w:r>
-              <w:rPr>
-                <w:b/>
-                <w:color w:val="2F4A7C"/>
-                <w:sz w:val="17"/>
-              </w:rPr>
-              <w:t>WINDOW</w:t>
-              <w:br/>
-            </w:r>
-            <w:r>
-              <w:rPr>
-                <w:b/>
-                <w:color w:val="1A1A1A"/>
-                <w:sz w:val="23"/>
-              </w:rPr>
-              <w:t>3/12/2025 – 3/12/2026</w:t>
-            </w:r>
-          </w:p>
-        </w:tc>
-      </w:tr>
-    </w:tbl>
-    <w:p>
-      <w:pPr>
-        <w:spacing w:after="80"/>
-      </w:pPr>
     </w:p>
     <w:p>
       <w:pPr>
-        <w:spacing w:before="240" w:after="80"/>
+        <w:spacing w:before="40" w:after="80"/>
       </w:pPr>
       <w:r>
         <w:rPr>
           <w:b/>
           <w:color w:val="2F4A7C"/>
-          <w:sz w:val="27"/>
+          <w:sz w:val="28"/>
         </w:rPr>
         <w:t>1. R1 Threshold Sensitivity</w:t>
       </w:r>
     </w:p>
     <w:p>
       <w:pPr>
-        <w:spacing w:before="0" w:after="160"/>
+        <w:spacing w:after="120"/>
       </w:pPr>
       <w:r>
         <w:rPr>
-          <w:color w:val="555555"/>
-          <w:sz w:val="21"/>
+          <w:sz w:val="22"/>
         </w:rPr>
-        <w:t>R1 currently excludes CMFs with 10 or more active ordering contacts. Cumulative view shows what each step-up admits; the final row is the residual tail that stays out even at threshold 50.</w:t>
+        <w:t>R1 currently excludes CMFs with 10 or more active ordering contacts. The table shows what each higher threshold adds and where the residual tail sits. Universe is 545,030 CMFs and 16,985,084 orders after removing distributors (Action 1).</w:t>
       </w:r>
     </w:p>
     <w:tbl>
@@ -195,20 +72,20 @@
         <w:tblLook w:firstColumn="1" w:firstRow="1" w:lastColumn="0" w:lastRow="0" w:noHBand="0" w:noVBand="1" w:val="04A0"/>
       </w:tblPr>
       <w:tblGrid>
-        <w:gridCol w:w="2016"/>
+        <w:gridCol w:w="1872"/>
         <w:gridCol w:w="1656"/>
         <w:gridCol w:w="1080"/>
-        <w:gridCol w:w="2160"/>
+        <w:gridCol w:w="2232"/>
         <w:gridCol w:w="1944"/>
         <w:gridCol w:w="1224"/>
       </w:tblGrid>
       <w:tr>
         <w:trPr>
-          <w:trHeight w:val="520" w:hRule="atLeast"/>
+          <w:trHeight w:val="480" w:hRule="atLeast"/>
         </w:trPr>
         <w:tc>
           <w:tcPr>
-            <w:tcW w:type="dxa" w:w="1704"/>
+            <w:tcW w:type="dxa" w:w="1680"/>
             <w:vAlign w:val="center"/>
             <w:tcBorders>
               <w:top w:val="single" w:sz="6" w:color="B0B7C3"/>
@@ -226,9 +103,8 @@
             <w:r>
               <w:rPr>
                 <w:b/>
-                <w:i w:val="0"/>
                 <w:color w:val="FFFFFF"/>
-                <w:sz w:val="19"/>
+                <w:sz w:val="20"/>
               </w:rPr>
               <w:t>Threshold</w:t>
             </w:r>
@@ -236,7 +112,7 @@
         </w:tc>
         <w:tc>
           <w:tcPr>
-            <w:tcW w:type="dxa" w:w="1704"/>
+            <w:tcW w:type="dxa" w:w="1680"/>
             <w:vAlign w:val="center"/>
             <w:tcBorders>
               <w:top w:val="single" w:sz="6" w:color="B0B7C3"/>
@@ -254,9 +130,8 @@
             <w:r>
               <w:rPr>
                 <w:b/>
-                <w:i w:val="0"/>
                 <w:color w:val="FFFFFF"/>
-                <w:sz w:val="19"/>
+                <w:sz w:val="20"/>
               </w:rPr>
               <w:t>Eligible CMFs</w:t>
             </w:r>
@@ -264,7 +139,7 @@
         </w:tc>
         <w:tc>
           <w:tcPr>
-            <w:tcW w:type="dxa" w:w="1704"/>
+            <w:tcW w:type="dxa" w:w="1680"/>
             <w:vAlign w:val="center"/>
             <w:tcBorders>
               <w:top w:val="single" w:sz="6" w:color="B0B7C3"/>
@@ -282,9 +157,8 @@
             <w:r>
               <w:rPr>
                 <w:b/>
-                <w:i w:val="0"/>
                 <w:color w:val="FFFFFF"/>
-                <w:sz w:val="19"/>
+                <w:sz w:val="20"/>
               </w:rPr>
               <w:t>% CMFs</w:t>
             </w:r>
@@ -292,7 +166,7 @@
         </w:tc>
         <w:tc>
           <w:tcPr>
-            <w:tcW w:type="dxa" w:w="1704"/>
+            <w:tcW w:type="dxa" w:w="1680"/>
             <w:vAlign w:val="center"/>
             <w:tcBorders>
               <w:top w:val="single" w:sz="6" w:color="B0B7C3"/>
@@ -310,19 +184,16 @@
             <w:r>
               <w:rPr>
                 <w:b/>
-                <w:i w:val="0"/>
                 <w:color w:val="FFFFFF"/>
-                <w:sz w:val="19"/>
+                <w:sz w:val="20"/>
               </w:rPr>
-              <w:t>Eligible Orders</w:t>
-              <w:br/>
-              <w:t>(cumulative)</w:t>
+              <w:t>Eligible Orders (cumulative)</w:t>
             </w:r>
           </w:p>
         </w:tc>
         <w:tc>
           <w:tcPr>
-            <w:tcW w:type="dxa" w:w="1704"/>
+            <w:tcW w:type="dxa" w:w="1680"/>
             <w:vAlign w:val="center"/>
             <w:tcBorders>
               <w:top w:val="single" w:sz="6" w:color="B0B7C3"/>
@@ -340,9 +211,8 @@
             <w:r>
               <w:rPr>
                 <w:b/>
-                <w:i w:val="0"/>
                 <w:color w:val="FFFFFF"/>
-                <w:sz w:val="19"/>
+                <w:sz w:val="20"/>
               </w:rPr>
               <w:t>Marginal Orders (Δ)</w:t>
             </w:r>
@@ -350,7 +220,7 @@
         </w:tc>
         <w:tc>
           <w:tcPr>
-            <w:tcW w:type="dxa" w:w="1704"/>
+            <w:tcW w:type="dxa" w:w="1680"/>
             <w:vAlign w:val="center"/>
             <w:tcBorders>
               <w:top w:val="single" w:sz="6" w:color="B0B7C3"/>
@@ -368,9 +238,8 @@
             <w:r>
               <w:rPr>
                 <w:b/>
-                <w:i w:val="0"/>
                 <w:color w:val="FFFFFF"/>
-                <w:sz w:val="19"/>
+                <w:sz w:val="20"/>
               </w:rPr>
               <w:t>% of Orders</w:t>
             </w:r>
@@ -380,7 +249,7 @@
       <w:tr>
         <w:tc>
           <w:tcPr>
-            <w:tcW w:type="dxa" w:w="1704"/>
+            <w:tcW w:type="dxa" w:w="1680"/>
             <w:vAlign w:val="center"/>
             <w:tcBorders>
               <w:top w:val="single" w:sz="6" w:color="B0B7C3"/>
@@ -397,9 +266,8 @@
             <w:r>
               <w:rPr>
                 <w:b w:val="0"/>
-                <w:i w:val="0"/>
                 <w:color w:val="1A1A1A"/>
-                <w:sz w:val="20"/>
+                <w:sz w:val="21"/>
               </w:rPr>
               <w:t>10 (current)</w:t>
             </w:r>
@@ -407,7 +275,7 @@
         </w:tc>
         <w:tc>
           <w:tcPr>
-            <w:tcW w:type="dxa" w:w="1704"/>
+            <w:tcW w:type="dxa" w:w="1680"/>
             <w:vAlign w:val="center"/>
             <w:tcBorders>
               <w:top w:val="single" w:sz="6" w:color="B0B7C3"/>
@@ -424,9 +292,8 @@
             <w:r>
               <w:rPr>
                 <w:b w:val="0"/>
-                <w:i w:val="0"/>
                 <w:color w:val="1A1A1A"/>
-                <w:sz w:val="20"/>
+                <w:sz w:val="21"/>
               </w:rPr>
               <w:t>532,692</w:t>
             </w:r>
@@ -434,7 +301,7 @@
         </w:tc>
         <w:tc>
           <w:tcPr>
-            <w:tcW w:type="dxa" w:w="1704"/>
+            <w:tcW w:type="dxa" w:w="1680"/>
             <w:vAlign w:val="center"/>
             <w:tcBorders>
               <w:top w:val="single" w:sz="6" w:color="B0B7C3"/>
@@ -451,9 +318,8 @@
             <w:r>
               <w:rPr>
                 <w:b w:val="0"/>
-                <w:i w:val="0"/>
                 <w:color w:val="1A1A1A"/>
-                <w:sz w:val="20"/>
+                <w:sz w:val="21"/>
               </w:rPr>
               <w:t>97.7%</w:t>
             </w:r>
@@ -461,7 +327,7 @@
         </w:tc>
         <w:tc>
           <w:tcPr>
-            <w:tcW w:type="dxa" w:w="1704"/>
+            <w:tcW w:type="dxa" w:w="1680"/>
             <w:vAlign w:val="center"/>
             <w:tcBorders>
               <w:top w:val="single" w:sz="6" w:color="B0B7C3"/>
@@ -478,9 +344,8 @@
             <w:r>
               <w:rPr>
                 <w:b w:val="0"/>
-                <w:i w:val="0"/>
                 <w:color w:val="1A1A1A"/>
-                <w:sz w:val="20"/>
+                <w:sz w:val="21"/>
               </w:rPr>
               <w:t>12,696,477</w:t>
             </w:r>
@@ -488,7 +353,7 @@
         </w:tc>
         <w:tc>
           <w:tcPr>
-            <w:tcW w:type="dxa" w:w="1704"/>
+            <w:tcW w:type="dxa" w:w="1680"/>
             <w:vAlign w:val="center"/>
             <w:tcBorders>
               <w:top w:val="single" w:sz="6" w:color="B0B7C3"/>
@@ -505,9 +370,8 @@
             <w:r>
               <w:rPr>
                 <w:b w:val="0"/>
-                <w:i w:val="0"/>
-                <w:color w:val="2F4A7C"/>
-                <w:sz w:val="20"/>
+                <w:color w:val="1A1A1A"/>
+                <w:sz w:val="21"/>
               </w:rPr>
               <w:t>baseline</w:t>
             </w:r>
@@ -515,7 +379,7 @@
         </w:tc>
         <w:tc>
           <w:tcPr>
-            <w:tcW w:type="dxa" w:w="1704"/>
+            <w:tcW w:type="dxa" w:w="1680"/>
             <w:vAlign w:val="center"/>
             <w:tcBorders>
               <w:top w:val="single" w:sz="6" w:color="B0B7C3"/>
@@ -532,9 +396,8 @@
             <w:r>
               <w:rPr>
                 <w:b w:val="0"/>
-                <w:i w:val="0"/>
                 <w:color w:val="1A1A1A"/>
-                <w:sz w:val="20"/>
+                <w:sz w:val="21"/>
               </w:rPr>
               <w:t>74.8%</w:t>
             </w:r>
@@ -544,7 +407,7 @@
       <w:tr>
         <w:tc>
           <w:tcPr>
-            <w:tcW w:type="dxa" w:w="1704"/>
+            <w:tcW w:type="dxa" w:w="1680"/>
             <w:vAlign w:val="center"/>
             <w:tcBorders>
               <w:top w:val="single" w:sz="6" w:color="B0B7C3"/>
@@ -562,9 +425,8 @@
             <w:r>
               <w:rPr>
                 <w:b w:val="0"/>
-                <w:i w:val="0"/>
                 <w:color w:val="1A1A1A"/>
-                <w:sz w:val="20"/>
+                <w:sz w:val="21"/>
               </w:rPr>
               <w:t>12</w:t>
             </w:r>
@@ -572,7 +434,7 @@
         </w:tc>
         <w:tc>
           <w:tcPr>
-            <w:tcW w:type="dxa" w:w="1704"/>
+            <w:tcW w:type="dxa" w:w="1680"/>
             <w:vAlign w:val="center"/>
             <w:tcBorders>
               <w:top w:val="single" w:sz="6" w:color="B0B7C3"/>
@@ -590,9 +452,8 @@
             <w:r>
               <w:rPr>
                 <w:b w:val="0"/>
-                <w:i w:val="0"/>
                 <w:color w:val="1A1A1A"/>
-                <w:sz w:val="20"/>
+                <w:sz w:val="21"/>
               </w:rPr>
               <w:t>536,042</w:t>
             </w:r>
@@ -600,7 +461,7 @@
         </w:tc>
         <w:tc>
           <w:tcPr>
-            <w:tcW w:type="dxa" w:w="1704"/>
+            <w:tcW w:type="dxa" w:w="1680"/>
             <w:vAlign w:val="center"/>
             <w:tcBorders>
               <w:top w:val="single" w:sz="6" w:color="B0B7C3"/>
@@ -618,9 +479,8 @@
             <w:r>
               <w:rPr>
                 <w:b w:val="0"/>
-                <w:i w:val="0"/>
                 <w:color w:val="1A1A1A"/>
-                <w:sz w:val="20"/>
+                <w:sz w:val="21"/>
               </w:rPr>
               <w:t>98.4%</w:t>
             </w:r>
@@ -628,7 +488,7 @@
         </w:tc>
         <w:tc>
           <w:tcPr>
-            <w:tcW w:type="dxa" w:w="1704"/>
+            <w:tcW w:type="dxa" w:w="1680"/>
             <w:vAlign w:val="center"/>
             <w:tcBorders>
               <w:top w:val="single" w:sz="6" w:color="B0B7C3"/>
@@ -646,9 +506,8 @@
             <w:r>
               <w:rPr>
                 <w:b w:val="0"/>
-                <w:i w:val="0"/>
                 <w:color w:val="1A1A1A"/>
-                <w:sz w:val="20"/>
+                <w:sz w:val="21"/>
               </w:rPr>
               <w:t>13,207,047</w:t>
             </w:r>
@@ -656,7 +515,7 @@
         </w:tc>
         <w:tc>
           <w:tcPr>
-            <w:tcW w:type="dxa" w:w="1704"/>
+            <w:tcW w:type="dxa" w:w="1680"/>
             <w:vAlign w:val="center"/>
             <w:tcBorders>
               <w:top w:val="single" w:sz="6" w:color="B0B7C3"/>
@@ -674,9 +533,8 @@
             <w:r>
               <w:rPr>
                 <w:b w:val="0"/>
-                <w:i w:val="0"/>
-                <w:color w:val="2F4A7C"/>
-                <w:sz w:val="20"/>
+                <w:color w:val="1A1A1A"/>
+                <w:sz w:val="21"/>
               </w:rPr>
               <w:t>+510,570</w:t>
             </w:r>
@@ -684,7 +542,7 @@
         </w:tc>
         <w:tc>
           <w:tcPr>
-            <w:tcW w:type="dxa" w:w="1704"/>
+            <w:tcW w:type="dxa" w:w="1680"/>
             <w:vAlign w:val="center"/>
             <w:tcBorders>
               <w:top w:val="single" w:sz="6" w:color="B0B7C3"/>
@@ -702,9 +560,8 @@
             <w:r>
               <w:rPr>
                 <w:b w:val="0"/>
-                <w:i w:val="0"/>
                 <w:color w:val="1A1A1A"/>
-                <w:sz w:val="20"/>
+                <w:sz w:val="21"/>
               </w:rPr>
               <w:t>77.8%</w:t>
             </w:r>
@@ -714,7 +571,7 @@
       <w:tr>
         <w:tc>
           <w:tcPr>
-            <w:tcW w:type="dxa" w:w="1704"/>
+            <w:tcW w:type="dxa" w:w="1680"/>
             <w:vAlign w:val="center"/>
             <w:tcBorders>
               <w:top w:val="single" w:sz="6" w:color="B0B7C3"/>
@@ -731,9 +588,8 @@
             <w:r>
               <w:rPr>
                 <w:b w:val="0"/>
-                <w:i w:val="0"/>
                 <w:color w:val="1A1A1A"/>
-                <w:sz w:val="20"/>
+                <w:sz w:val="21"/>
               </w:rPr>
               <w:t>15</w:t>
             </w:r>
@@ -741,7 +597,7 @@
         </w:tc>
         <w:tc>
           <w:tcPr>
-            <w:tcW w:type="dxa" w:w="1704"/>
+            <w:tcW w:type="dxa" w:w="1680"/>
             <w:vAlign w:val="center"/>
             <w:tcBorders>
               <w:top w:val="single" w:sz="6" w:color="B0B7C3"/>
@@ -758,9 +614,8 @@
             <w:r>
               <w:rPr>
                 <w:b w:val="0"/>
-                <w:i w:val="0"/>
                 <w:color w:val="1A1A1A"/>
-                <w:sz w:val="20"/>
+                <w:sz w:val="21"/>
               </w:rPr>
               <w:t>538,906</w:t>
             </w:r>
@@ -768,7 +623,7 @@
         </w:tc>
         <w:tc>
           <w:tcPr>
-            <w:tcW w:type="dxa" w:w="1704"/>
+            <w:tcW w:type="dxa" w:w="1680"/>
             <w:vAlign w:val="center"/>
             <w:tcBorders>
               <w:top w:val="single" w:sz="6" w:color="B0B7C3"/>
@@ -785,9 +640,8 @@
             <w:r>
               <w:rPr>
                 <w:b w:val="0"/>
-                <w:i w:val="0"/>
                 <w:color w:val="1A1A1A"/>
-                <w:sz w:val="20"/>
+                <w:sz w:val="21"/>
               </w:rPr>
               <w:t>98.9%</w:t>
             </w:r>
@@ -795,7 +649,7 @@
         </w:tc>
         <w:tc>
           <w:tcPr>
-            <w:tcW w:type="dxa" w:w="1704"/>
+            <w:tcW w:type="dxa" w:w="1680"/>
             <w:vAlign w:val="center"/>
             <w:tcBorders>
               <w:top w:val="single" w:sz="6" w:color="B0B7C3"/>
@@ -812,9 +666,8 @@
             <w:r>
               <w:rPr>
                 <w:b w:val="0"/>
-                <w:i w:val="0"/>
                 <w:color w:val="1A1A1A"/>
-                <w:sz w:val="20"/>
+                <w:sz w:val="21"/>
               </w:rPr>
               <w:t>13,717,234</w:t>
             </w:r>
@@ -822,7 +675,7 @@
         </w:tc>
         <w:tc>
           <w:tcPr>
-            <w:tcW w:type="dxa" w:w="1704"/>
+            <w:tcW w:type="dxa" w:w="1680"/>
             <w:vAlign w:val="center"/>
             <w:tcBorders>
               <w:top w:val="single" w:sz="6" w:color="B0B7C3"/>
@@ -839,9 +692,8 @@
             <w:r>
               <w:rPr>
                 <w:b w:val="0"/>
-                <w:i w:val="0"/>
-                <w:color w:val="2F4A7C"/>
-                <w:sz w:val="20"/>
+                <w:color w:val="1A1A1A"/>
+                <w:sz w:val="21"/>
               </w:rPr>
               <w:t>+510,187</w:t>
             </w:r>
@@ -849,7 +701,7 @@
         </w:tc>
         <w:tc>
           <w:tcPr>
-            <w:tcW w:type="dxa" w:w="1704"/>
+            <w:tcW w:type="dxa" w:w="1680"/>
             <w:vAlign w:val="center"/>
             <w:tcBorders>
               <w:top w:val="single" w:sz="6" w:color="B0B7C3"/>
@@ -866,9 +718,8 @@
             <w:r>
               <w:rPr>
                 <w:b w:val="0"/>
-                <w:i w:val="0"/>
                 <w:color w:val="1A1A1A"/>
-                <w:sz w:val="20"/>
+                <w:sz w:val="21"/>
               </w:rPr>
               <w:t>80.8%</w:t>
             </w:r>
@@ -878,7 +729,7 @@
       <w:tr>
         <w:tc>
           <w:tcPr>
-            <w:tcW w:type="dxa" w:w="1704"/>
+            <w:tcW w:type="dxa" w:w="1680"/>
             <w:vAlign w:val="center"/>
             <w:tcBorders>
               <w:top w:val="single" w:sz="6" w:color="B0B7C3"/>
@@ -896,9 +747,8 @@
             <w:r>
               <w:rPr>
                 <w:b w:val="0"/>
-                <w:i w:val="0"/>
                 <w:color w:val="1A1A1A"/>
-                <w:sz w:val="20"/>
+                <w:sz w:val="21"/>
               </w:rPr>
               <w:t>20</w:t>
             </w:r>
@@ -906,7 +756,7 @@
         </w:tc>
         <w:tc>
           <w:tcPr>
-            <w:tcW w:type="dxa" w:w="1704"/>
+            <w:tcW w:type="dxa" w:w="1680"/>
             <w:vAlign w:val="center"/>
             <w:tcBorders>
               <w:top w:val="single" w:sz="6" w:color="B0B7C3"/>
@@ -924,9 +774,8 @@
             <w:r>
               <w:rPr>
                 <w:b w:val="0"/>
-                <w:i w:val="0"/>
                 <w:color w:val="1A1A1A"/>
-                <w:sz w:val="20"/>
+                <w:sz w:val="21"/>
               </w:rPr>
               <w:t>541,297</w:t>
             </w:r>
@@ -934,7 +783,7 @@
         </w:tc>
         <w:tc>
           <w:tcPr>
-            <w:tcW w:type="dxa" w:w="1704"/>
+            <w:tcW w:type="dxa" w:w="1680"/>
             <w:vAlign w:val="center"/>
             <w:tcBorders>
               <w:top w:val="single" w:sz="6" w:color="B0B7C3"/>
@@ -952,9 +801,8 @@
             <w:r>
               <w:rPr>
                 <w:b w:val="0"/>
-                <w:i w:val="0"/>
                 <w:color w:val="1A1A1A"/>
-                <w:sz w:val="20"/>
+                <w:sz w:val="21"/>
               </w:rPr>
               <w:t>99.3%</w:t>
             </w:r>
@@ -962,7 +810,7 @@
         </w:tc>
         <w:tc>
           <w:tcPr>
-            <w:tcW w:type="dxa" w:w="1704"/>
+            <w:tcW w:type="dxa" w:w="1680"/>
             <w:vAlign w:val="center"/>
             <w:tcBorders>
               <w:top w:val="single" w:sz="6" w:color="B0B7C3"/>
@@ -980,9 +828,8 @@
             <w:r>
               <w:rPr>
                 <w:b w:val="0"/>
-                <w:i w:val="0"/>
                 <w:color w:val="1A1A1A"/>
-                <w:sz w:val="20"/>
+                <w:sz w:val="21"/>
               </w:rPr>
               <w:t>14,226,992</w:t>
             </w:r>
@@ -990,7 +837,7 @@
         </w:tc>
         <w:tc>
           <w:tcPr>
-            <w:tcW w:type="dxa" w:w="1704"/>
+            <w:tcW w:type="dxa" w:w="1680"/>
             <w:vAlign w:val="center"/>
             <w:tcBorders>
               <w:top w:val="single" w:sz="6" w:color="B0B7C3"/>
@@ -1008,9 +855,8 @@
             <w:r>
               <w:rPr>
                 <w:b w:val="0"/>
-                <w:i w:val="0"/>
-                <w:color w:val="2F4A7C"/>
-                <w:sz w:val="20"/>
+                <w:color w:val="1A1A1A"/>
+                <w:sz w:val="21"/>
               </w:rPr>
               <w:t>+509,758</w:t>
             </w:r>
@@ -1018,7 +864,7 @@
         </w:tc>
         <w:tc>
           <w:tcPr>
-            <w:tcW w:type="dxa" w:w="1704"/>
+            <w:tcW w:type="dxa" w:w="1680"/>
             <w:vAlign w:val="center"/>
             <w:tcBorders>
               <w:top w:val="single" w:sz="6" w:color="B0B7C3"/>
@@ -1036,9 +882,8 @@
             <w:r>
               <w:rPr>
                 <w:b w:val="0"/>
-                <w:i w:val="0"/>
                 <w:color w:val="1A1A1A"/>
-                <w:sz w:val="20"/>
+                <w:sz w:val="21"/>
               </w:rPr>
               <w:t>83.8%</w:t>
             </w:r>
@@ -1048,7 +893,7 @@
       <w:tr>
         <w:tc>
           <w:tcPr>
-            <w:tcW w:type="dxa" w:w="1704"/>
+            <w:tcW w:type="dxa" w:w="1680"/>
             <w:vAlign w:val="center"/>
             <w:tcBorders>
               <w:top w:val="single" w:sz="6" w:color="B0B7C3"/>
@@ -1065,9 +910,8 @@
             <w:r>
               <w:rPr>
                 <w:b w:val="0"/>
-                <w:i w:val="0"/>
                 <w:color w:val="1A1A1A"/>
-                <w:sz w:val="20"/>
+                <w:sz w:val="21"/>
               </w:rPr>
               <w:t>25</w:t>
             </w:r>
@@ -1075,7 +919,7 @@
         </w:tc>
         <w:tc>
           <w:tcPr>
-            <w:tcW w:type="dxa" w:w="1704"/>
+            <w:tcW w:type="dxa" w:w="1680"/>
             <w:vAlign w:val="center"/>
             <w:tcBorders>
               <w:top w:val="single" w:sz="6" w:color="B0B7C3"/>
@@ -1092,9 +936,8 @@
             <w:r>
               <w:rPr>
                 <w:b w:val="0"/>
-                <w:i w:val="0"/>
                 <w:color w:val="1A1A1A"/>
-                <w:sz w:val="20"/>
+                <w:sz w:val="21"/>
               </w:rPr>
               <w:t>542,518</w:t>
             </w:r>
@@ -1102,7 +945,7 @@
         </w:tc>
         <w:tc>
           <w:tcPr>
-            <w:tcW w:type="dxa" w:w="1704"/>
+            <w:tcW w:type="dxa" w:w="1680"/>
             <w:vAlign w:val="center"/>
             <w:tcBorders>
               <w:top w:val="single" w:sz="6" w:color="B0B7C3"/>
@@ -1119,9 +962,8 @@
             <w:r>
               <w:rPr>
                 <w:b w:val="0"/>
-                <w:i w:val="0"/>
                 <w:color w:val="1A1A1A"/>
-                <w:sz w:val="20"/>
+                <w:sz w:val="21"/>
               </w:rPr>
               <w:t>99.5%</w:t>
             </w:r>
@@ -1129,7 +971,7 @@
         </w:tc>
         <w:tc>
           <w:tcPr>
-            <w:tcW w:type="dxa" w:w="1704"/>
+            <w:tcW w:type="dxa" w:w="1680"/>
             <w:vAlign w:val="center"/>
             <w:tcBorders>
               <w:top w:val="single" w:sz="6" w:color="B0B7C3"/>
@@ -1146,9 +988,8 @@
             <w:r>
               <w:rPr>
                 <w:b w:val="0"/>
-                <w:i w:val="0"/>
                 <w:color w:val="1A1A1A"/>
-                <w:sz w:val="20"/>
+                <w:sz w:val="21"/>
               </w:rPr>
               <w:t>14,554,315</w:t>
             </w:r>
@@ -1156,7 +997,7 @@
         </w:tc>
         <w:tc>
           <w:tcPr>
-            <w:tcW w:type="dxa" w:w="1704"/>
+            <w:tcW w:type="dxa" w:w="1680"/>
             <w:vAlign w:val="center"/>
             <w:tcBorders>
               <w:top w:val="single" w:sz="6" w:color="B0B7C3"/>
@@ -1173,9 +1014,8 @@
             <w:r>
               <w:rPr>
                 <w:b w:val="0"/>
-                <w:i w:val="0"/>
-                <w:color w:val="2F4A7C"/>
-                <w:sz w:val="20"/>
+                <w:color w:val="1A1A1A"/>
+                <w:sz w:val="21"/>
               </w:rPr>
               <w:t>+327,323</w:t>
             </w:r>
@@ -1183,7 +1023,7 @@
         </w:tc>
         <w:tc>
           <w:tcPr>
-            <w:tcW w:type="dxa" w:w="1704"/>
+            <w:tcW w:type="dxa" w:w="1680"/>
             <w:vAlign w:val="center"/>
             <w:tcBorders>
               <w:top w:val="single" w:sz="6" w:color="B0B7C3"/>
@@ -1200,9 +1040,8 @@
             <w:r>
               <w:rPr>
                 <w:b w:val="0"/>
-                <w:i w:val="0"/>
                 <w:color w:val="1A1A1A"/>
-                <w:sz w:val="20"/>
+                <w:sz w:val="21"/>
               </w:rPr>
               <w:t>85.7%</w:t>
             </w:r>
@@ -1212,7 +1051,7 @@
       <w:tr>
         <w:tc>
           <w:tcPr>
-            <w:tcW w:type="dxa" w:w="1704"/>
+            <w:tcW w:type="dxa" w:w="1680"/>
             <w:vAlign w:val="center"/>
             <w:tcBorders>
               <w:top w:val="single" w:sz="6" w:color="B0B7C3"/>
@@ -1230,9 +1069,8 @@
             <w:r>
               <w:rPr>
                 <w:b w:val="0"/>
-                <w:i w:val="0"/>
                 <w:color w:val="1A1A1A"/>
-                <w:sz w:val="20"/>
+                <w:sz w:val="21"/>
               </w:rPr>
               <w:t>50</w:t>
             </w:r>
@@ -1240,7 +1078,7 @@
         </w:tc>
         <w:tc>
           <w:tcPr>
-            <w:tcW w:type="dxa" w:w="1704"/>
+            <w:tcW w:type="dxa" w:w="1680"/>
             <w:vAlign w:val="center"/>
             <w:tcBorders>
               <w:top w:val="single" w:sz="6" w:color="B0B7C3"/>
@@ -1258,9 +1096,8 @@
             <w:r>
               <w:rPr>
                 <w:b w:val="0"/>
-                <w:i w:val="0"/>
                 <w:color w:val="1A1A1A"/>
-                <w:sz w:val="20"/>
+                <w:sz w:val="21"/>
               </w:rPr>
               <w:t>544,279</w:t>
             </w:r>
@@ -1268,7 +1105,7 @@
         </w:tc>
         <w:tc>
           <w:tcPr>
-            <w:tcW w:type="dxa" w:w="1704"/>
+            <w:tcW w:type="dxa" w:w="1680"/>
             <w:vAlign w:val="center"/>
             <w:tcBorders>
               <w:top w:val="single" w:sz="6" w:color="B0B7C3"/>
@@ -1286,9 +1123,8 @@
             <w:r>
               <w:rPr>
                 <w:b w:val="0"/>
-                <w:i w:val="0"/>
                 <w:color w:val="1A1A1A"/>
-                <w:sz w:val="20"/>
+                <w:sz w:val="21"/>
               </w:rPr>
               <w:t>99.9%</w:t>
             </w:r>
@@ -1296,7 +1132,7 @@
         </w:tc>
         <w:tc>
           <w:tcPr>
-            <w:tcW w:type="dxa" w:w="1704"/>
+            <w:tcW w:type="dxa" w:w="1680"/>
             <w:vAlign w:val="center"/>
             <w:tcBorders>
               <w:top w:val="single" w:sz="6" w:color="B0B7C3"/>
@@ -1314,9 +1150,8 @@
             <w:r>
               <w:rPr>
                 <w:b w:val="0"/>
-                <w:i w:val="0"/>
                 <w:color w:val="1A1A1A"/>
-                <w:sz w:val="20"/>
+                <w:sz w:val="21"/>
               </w:rPr>
               <w:t>15,232,307</w:t>
             </w:r>
@@ -1324,7 +1159,7 @@
         </w:tc>
         <w:tc>
           <w:tcPr>
-            <w:tcW w:type="dxa" w:w="1704"/>
+            <w:tcW w:type="dxa" w:w="1680"/>
             <w:vAlign w:val="center"/>
             <w:tcBorders>
               <w:top w:val="single" w:sz="6" w:color="B0B7C3"/>
@@ -1342,9 +1177,8 @@
             <w:r>
               <w:rPr>
                 <w:b w:val="0"/>
-                <w:i w:val="0"/>
-                <w:color w:val="2F4A7C"/>
-                <w:sz w:val="20"/>
+                <w:color w:val="1A1A1A"/>
+                <w:sz w:val="21"/>
               </w:rPr>
               <w:t>+678,000</w:t>
             </w:r>
@@ -1352,7 +1186,7 @@
         </w:tc>
         <w:tc>
           <w:tcPr>
-            <w:tcW w:type="dxa" w:w="1704"/>
+            <w:tcW w:type="dxa" w:w="1680"/>
             <w:vAlign w:val="center"/>
             <w:tcBorders>
               <w:top w:val="single" w:sz="6" w:color="B0B7C3"/>
@@ -1370,9 +1204,8 @@
             <w:r>
               <w:rPr>
                 <w:b w:val="0"/>
-                <w:i w:val="0"/>
                 <w:color w:val="1A1A1A"/>
-                <w:sz w:val="20"/>
+                <w:sz w:val="21"/>
               </w:rPr>
               <w:t>89.7%</w:t>
             </w:r>
@@ -1382,7 +1215,7 @@
       <w:tr>
         <w:tc>
           <w:tcPr>
-            <w:tcW w:type="dxa" w:w="1704"/>
+            <w:tcW w:type="dxa" w:w="1680"/>
             <w:vAlign w:val="center"/>
             <w:tcBorders>
               <w:top w:val="single" w:sz="6" w:color="B0B7C3"/>
@@ -1400,9 +1233,8 @@
             <w:r>
               <w:rPr>
                 <w:b/>
-                <w:i w:val="0"/>
                 <w:color w:val="1A1A1A"/>
-                <w:sz w:val="20"/>
+                <w:sz w:val="21"/>
               </w:rPr>
               <w:t>50+ (stays out)</w:t>
             </w:r>
@@ -1410,7 +1242,7 @@
         </w:tc>
         <w:tc>
           <w:tcPr>
-            <w:tcW w:type="dxa" w:w="1704"/>
+            <w:tcW w:type="dxa" w:w="1680"/>
             <w:vAlign w:val="center"/>
             <w:tcBorders>
               <w:top w:val="single" w:sz="6" w:color="B0B7C3"/>
@@ -1428,9 +1260,8 @@
             <w:r>
               <w:rPr>
                 <w:b w:val="0"/>
-                <w:i w:val="0"/>
                 <w:color w:val="1A1A1A"/>
-                <w:sz w:val="20"/>
+                <w:sz w:val="21"/>
               </w:rPr>
               <w:t>751</w:t>
             </w:r>
@@ -1438,7 +1269,7 @@
         </w:tc>
         <w:tc>
           <w:tcPr>
-            <w:tcW w:type="dxa" w:w="1704"/>
+            <w:tcW w:type="dxa" w:w="1680"/>
             <w:vAlign w:val="center"/>
             <w:tcBorders>
               <w:top w:val="single" w:sz="6" w:color="B0B7C3"/>
@@ -1456,9 +1287,8 @@
             <w:r>
               <w:rPr>
                 <w:b w:val="0"/>
-                <w:i w:val="0"/>
                 <w:color w:val="1A1A1A"/>
-                <w:sz w:val="20"/>
+                <w:sz w:val="21"/>
               </w:rPr>
               <w:t>0.1%</w:t>
             </w:r>
@@ -1466,7 +1296,7 @@
         </w:tc>
         <w:tc>
           <w:tcPr>
-            <w:tcW w:type="dxa" w:w="1704"/>
+            <w:tcW w:type="dxa" w:w="1680"/>
             <w:vAlign w:val="center"/>
             <w:tcBorders>
               <w:top w:val="single" w:sz="6" w:color="B0B7C3"/>
@@ -1484,9 +1314,8 @@
             <w:r>
               <w:rPr>
                 <w:b w:val="0"/>
-                <w:i w:val="0"/>
                 <w:color w:val="1A1A1A"/>
-                <w:sz w:val="20"/>
+                <w:sz w:val="21"/>
               </w:rPr>
               <w:t>—</w:t>
             </w:r>
@@ -1494,7 +1323,7 @@
         </w:tc>
         <w:tc>
           <w:tcPr>
-            <w:tcW w:type="dxa" w:w="1704"/>
+            <w:tcW w:type="dxa" w:w="1680"/>
             <w:vAlign w:val="center"/>
             <w:tcBorders>
               <w:top w:val="single" w:sz="6" w:color="B0B7C3"/>
@@ -1512,9 +1341,8 @@
             <w:r>
               <w:rPr>
                 <w:b w:val="0"/>
-                <w:i w:val="0"/>
                 <w:color w:val="1A1A1A"/>
-                <w:sz w:val="20"/>
+                <w:sz w:val="21"/>
               </w:rPr>
               <w:t>1,752,777</w:t>
             </w:r>
@@ -1522,7 +1350,7 @@
         </w:tc>
         <w:tc>
           <w:tcPr>
-            <w:tcW w:type="dxa" w:w="1704"/>
+            <w:tcW w:type="dxa" w:w="1680"/>
             <w:vAlign w:val="center"/>
             <w:tcBorders>
               <w:top w:val="single" w:sz="6" w:color="B0B7C3"/>
@@ -1540,9 +1368,8 @@
             <w:r>
               <w:rPr>
                 <w:b w:val="0"/>
-                <w:i w:val="0"/>
                 <w:color w:val="1A1A1A"/>
-                <w:sz w:val="20"/>
+                <w:sz w:val="21"/>
               </w:rPr>
               <w:t>10.3%</w:t>
             </w:r>
@@ -1552,40 +1379,26 @@
     </w:tbl>
     <w:p>
       <w:pPr>
-        <w:spacing w:after="120"/>
-      </w:pPr>
-      <w:r>
-        <w:rPr>
-          <w:i/>
-          <w:color w:val="888888"/>
-          <w:sz w:val="19"/>
-        </w:rPr>
-        <w:t>Density climbs at every step (152 → 178 → 213 → 268 → 385 orders per added CMF). The 751 CMFs above 50 contacts still cover 10% of orders — they will never qualify on contact count alone.</w:t>
-      </w:r>
-    </w:p>
-    <w:p>
-      <w:pPr>
-        <w:spacing w:before="240" w:after="80"/>
+        <w:spacing w:before="320" w:after="80"/>
       </w:pPr>
       <w:r>
         <w:rPr>
           <w:b/>
           <w:color w:val="2F4A7C"/>
-          <w:sz w:val="27"/>
+          <w:sz w:val="28"/>
         </w:rPr>
-        <w:t>2. R3 Listcodes · CMFs and Orders by Contact-Count Range</w:t>
+        <w:t>2. R3 Listcodes by Contact-Count Range</w:t>
       </w:r>
     </w:p>
     <w:p>
       <w:pPr>
-        <w:spacing w:before="0" w:after="160"/>
+        <w:spacing w:after="120"/>
       </w:pPr>
       <w:r>
         <w:rPr>
-          <w:color w:val="555555"/>
-          <w:sz w:val="21"/>
+          <w:sz w:val="22"/>
         </w:rPr>
-        <w:t>For each R3-excluded listcode, CMFs and orders split by active-contact range: &lt;10 would already pass R1, 10–25 is the recoverable middle, 25+ is the never-eligible tail. Distributor removed per Action 1.</w:t>
+        <w:t>For each R3-excluded listcode, CMFs and orders split by active-contact range. Distributors removed per Action 1.</w:t>
       </w:r>
     </w:p>
     <w:tbl>
@@ -1595,24 +1408,24 @@
         <w:tblLook w:firstColumn="1" w:firstRow="1" w:lastColumn="0" w:lastRow="0" w:noHBand="0" w:noVBand="1" w:val="04A0"/>
       </w:tblPr>
       <w:tblGrid>
-        <w:gridCol w:w="648"/>
-        <w:gridCol w:w="2304"/>
-        <w:gridCol w:w="864"/>
+        <w:gridCol w:w="792"/>
+        <w:gridCol w:w="2376"/>
+        <w:gridCol w:w="936"/>
         <w:gridCol w:w="792"/>
         <w:gridCol w:w="864"/>
         <w:gridCol w:w="792"/>
         <w:gridCol w:w="1080"/>
+        <w:gridCol w:w="864"/>
         <w:gridCol w:w="936"/>
-        <w:gridCol w:w="1008"/>
-        <w:gridCol w:w="936"/>
+        <w:gridCol w:w="864"/>
       </w:tblGrid>
       <w:tr>
         <w:trPr>
-          <w:trHeight w:val="600" w:hRule="atLeast"/>
+          <w:trHeight w:val="640" w:hRule="atLeast"/>
         </w:trPr>
         <w:tc>
           <w:tcPr>
-            <w:tcW w:type="dxa" w:w="1022"/>
+            <w:tcW w:type="dxa" w:w="1008"/>
             <w:vAlign w:val="center"/>
             <w:tcBorders>
               <w:top w:val="single" w:sz="6" w:color="B0B7C3"/>
@@ -1630,9 +1443,8 @@
             <w:r>
               <w:rPr>
                 <w:b/>
-                <w:i w:val="0"/>
                 <w:color w:val="FFFFFF"/>
-                <w:sz w:val="17"/>
+                <w:sz w:val="19"/>
               </w:rPr>
               <w:t>Listcode</w:t>
             </w:r>
@@ -1640,7 +1452,7 @@
         </w:tc>
         <w:tc>
           <w:tcPr>
-            <w:tcW w:type="dxa" w:w="1022"/>
+            <w:tcW w:type="dxa" w:w="1008"/>
             <w:vAlign w:val="center"/>
             <w:tcBorders>
               <w:top w:val="single" w:sz="6" w:color="B0B7C3"/>
@@ -1658,9 +1470,8 @@
             <w:r>
               <w:rPr>
                 <w:b/>
-                <w:i w:val="0"/>
                 <w:color w:val="FFFFFF"/>
-                <w:sz w:val="17"/>
+                <w:sz w:val="19"/>
               </w:rPr>
               <w:t>Category</w:t>
             </w:r>
@@ -1668,7 +1479,7 @@
         </w:tc>
         <w:tc>
           <w:tcPr>
-            <w:tcW w:type="dxa" w:w="1022"/>
+            <w:tcW w:type="dxa" w:w="1008"/>
             <w:vAlign w:val="center"/>
             <w:tcBorders>
               <w:top w:val="single" w:sz="6" w:color="B0B7C3"/>
@@ -1686,9 +1497,8 @@
             <w:r>
               <w:rPr>
                 <w:b/>
-                <w:i w:val="0"/>
                 <w:color w:val="FFFFFF"/>
-                <w:sz w:val="17"/>
+                <w:sz w:val="19"/>
               </w:rPr>
               <w:t>Total</w:t>
               <w:br/>
@@ -1698,7 +1508,7 @@
         </w:tc>
         <w:tc>
           <w:tcPr>
-            <w:tcW w:type="dxa" w:w="1022"/>
+            <w:tcW w:type="dxa" w:w="1008"/>
             <w:vAlign w:val="center"/>
             <w:tcBorders>
               <w:top w:val="single" w:sz="6" w:color="B0B7C3"/>
@@ -1716,9 +1526,8 @@
             <w:r>
               <w:rPr>
                 <w:b/>
-                <w:i w:val="0"/>
                 <w:color w:val="FFFFFF"/>
-                <w:sz w:val="17"/>
+                <w:sz w:val="19"/>
               </w:rPr>
               <w:t>CMFs</w:t>
               <w:br/>
@@ -1728,7 +1537,7 @@
         </w:tc>
         <w:tc>
           <w:tcPr>
-            <w:tcW w:type="dxa" w:w="1022"/>
+            <w:tcW w:type="dxa" w:w="1008"/>
             <w:vAlign w:val="center"/>
             <w:tcBorders>
               <w:top w:val="single" w:sz="6" w:color="B0B7C3"/>
@@ -1746,9 +1555,8 @@
             <w:r>
               <w:rPr>
                 <w:b/>
-                <w:i w:val="0"/>
                 <w:color w:val="FFFFFF"/>
-                <w:sz w:val="17"/>
+                <w:sz w:val="19"/>
               </w:rPr>
               <w:t>CMFs</w:t>
               <w:br/>
@@ -1758,7 +1566,7 @@
         </w:tc>
         <w:tc>
           <w:tcPr>
-            <w:tcW w:type="dxa" w:w="1022"/>
+            <w:tcW w:type="dxa" w:w="1008"/>
             <w:vAlign w:val="center"/>
             <w:tcBorders>
               <w:top w:val="single" w:sz="6" w:color="B0B7C3"/>
@@ -1776,9 +1584,8 @@
             <w:r>
               <w:rPr>
                 <w:b/>
-                <w:i w:val="0"/>
                 <w:color w:val="FFFFFF"/>
-                <w:sz w:val="17"/>
+                <w:sz w:val="19"/>
               </w:rPr>
               <w:t>CMFs</w:t>
               <w:br/>
@@ -1788,7 +1595,7 @@
         </w:tc>
         <w:tc>
           <w:tcPr>
-            <w:tcW w:type="dxa" w:w="1022"/>
+            <w:tcW w:type="dxa" w:w="1008"/>
             <w:vAlign w:val="center"/>
             <w:tcBorders>
               <w:top w:val="single" w:sz="6" w:color="B0B7C3"/>
@@ -1806,9 +1613,8 @@
             <w:r>
               <w:rPr>
                 <w:b/>
-                <w:i w:val="0"/>
                 <w:color w:val="FFFFFF"/>
-                <w:sz w:val="17"/>
+                <w:sz w:val="19"/>
               </w:rPr>
               <w:t>Total</w:t>
               <w:br/>
@@ -1818,7 +1624,7 @@
         </w:tc>
         <w:tc>
           <w:tcPr>
-            <w:tcW w:type="dxa" w:w="1022"/>
+            <w:tcW w:type="dxa" w:w="1008"/>
             <w:vAlign w:val="center"/>
             <w:tcBorders>
               <w:top w:val="single" w:sz="6" w:color="B0B7C3"/>
@@ -1836,9 +1642,8 @@
             <w:r>
               <w:rPr>
                 <w:b/>
-                <w:i w:val="0"/>
                 <w:color w:val="FFFFFF"/>
-                <w:sz w:val="17"/>
+                <w:sz w:val="19"/>
               </w:rPr>
               <w:t>Orders</w:t>
               <w:br/>
@@ -1848,7 +1653,7 @@
         </w:tc>
         <w:tc>
           <w:tcPr>
-            <w:tcW w:type="dxa" w:w="1022"/>
+            <w:tcW w:type="dxa" w:w="1008"/>
             <w:vAlign w:val="center"/>
             <w:tcBorders>
               <w:top w:val="single" w:sz="6" w:color="B0B7C3"/>
@@ -1866,9 +1671,8 @@
             <w:r>
               <w:rPr>
                 <w:b/>
-                <w:i w:val="0"/>
                 <w:color w:val="FFFFFF"/>
-                <w:sz w:val="17"/>
+                <w:sz w:val="19"/>
               </w:rPr>
               <w:t>Orders</w:t>
               <w:br/>
@@ -1878,7 +1682,7 @@
         </w:tc>
         <w:tc>
           <w:tcPr>
-            <w:tcW w:type="dxa" w:w="1022"/>
+            <w:tcW w:type="dxa" w:w="1008"/>
             <w:vAlign w:val="center"/>
             <w:tcBorders>
               <w:top w:val="single" w:sz="6" w:color="B0B7C3"/>
@@ -1896,9 +1700,8 @@
             <w:r>
               <w:rPr>
                 <w:b/>
-                <w:i w:val="0"/>
                 <w:color w:val="FFFFFF"/>
-                <w:sz w:val="17"/>
+                <w:sz w:val="19"/>
               </w:rPr>
               <w:t>Orders</w:t>
               <w:br/>
@@ -1910,7 +1713,7 @@
       <w:tr>
         <w:tc>
           <w:tcPr>
-            <w:tcW w:type="dxa" w:w="1022"/>
+            <w:tcW w:type="dxa" w:w="1008"/>
             <w:vAlign w:val="center"/>
             <w:tcBorders>
               <w:top w:val="single" w:sz="6" w:color="B0B7C3"/>
@@ -1927,9 +1730,8 @@
             <w:r>
               <w:rPr>
                 <w:b w:val="0"/>
-                <w:i w:val="0"/>
                 <w:color w:val="1A1A1A"/>
-                <w:sz w:val="18"/>
+                <w:sz w:val="19"/>
               </w:rPr>
               <w:t>05</w:t>
             </w:r>
@@ -1937,7 +1739,7 @@
         </w:tc>
         <w:tc>
           <w:tcPr>
-            <w:tcW w:type="dxa" w:w="1022"/>
+            <w:tcW w:type="dxa" w:w="1008"/>
             <w:vAlign w:val="center"/>
             <w:tcBorders>
               <w:top w:val="single" w:sz="6" w:color="B0B7C3"/>
@@ -1954,9 +1756,8 @@
             <w:r>
               <w:rPr>
                 <w:b w:val="0"/>
-                <w:i w:val="0"/>
                 <w:color w:val="1A1A1A"/>
-                <w:sz w:val="18"/>
+                <w:sz w:val="19"/>
               </w:rPr>
               <w:t>Federal Gov (Domestic)</w:t>
             </w:r>
@@ -1964,7 +1765,7 @@
         </w:tc>
         <w:tc>
           <w:tcPr>
-            <w:tcW w:type="dxa" w:w="1022"/>
+            <w:tcW w:type="dxa" w:w="1008"/>
             <w:vAlign w:val="center"/>
             <w:tcBorders>
               <w:top w:val="single" w:sz="6" w:color="B0B7C3"/>
@@ -1981,9 +1782,8 @@
             <w:r>
               <w:rPr>
                 <w:b w:val="0"/>
-                <w:i w:val="0"/>
                 <w:color w:val="1A1A1A"/>
-                <w:sz w:val="18"/>
+                <w:sz w:val="19"/>
               </w:rPr>
               <w:t>3,032</w:t>
             </w:r>
@@ -1991,7 +1791,7 @@
         </w:tc>
         <w:tc>
           <w:tcPr>
-            <w:tcW w:type="dxa" w:w="1022"/>
+            <w:tcW w:type="dxa" w:w="1008"/>
             <w:vAlign w:val="center"/>
             <w:tcBorders>
               <w:top w:val="single" w:sz="6" w:color="B0B7C3"/>
@@ -2008,9 +1808,8 @@
             <w:r>
               <w:rPr>
                 <w:b w:val="0"/>
-                <w:i w:val="0"/>
                 <w:color w:val="1A1A1A"/>
-                <w:sz w:val="18"/>
+                <w:sz w:val="19"/>
               </w:rPr>
               <w:t>2,924</w:t>
             </w:r>
@@ -2018,7 +1817,7 @@
         </w:tc>
         <w:tc>
           <w:tcPr>
-            <w:tcW w:type="dxa" w:w="1022"/>
+            <w:tcW w:type="dxa" w:w="1008"/>
             <w:vAlign w:val="center"/>
             <w:tcBorders>
               <w:top w:val="single" w:sz="6" w:color="B0B7C3"/>
@@ -2035,9 +1834,8 @@
             <w:r>
               <w:rPr>
                 <w:b w:val="0"/>
-                <w:i w:val="0"/>
                 <w:color w:val="1A1A1A"/>
-                <w:sz w:val="18"/>
+                <w:sz w:val="19"/>
               </w:rPr>
               <w:t>87</w:t>
             </w:r>
@@ -2045,7 +1843,7 @@
         </w:tc>
         <w:tc>
           <w:tcPr>
-            <w:tcW w:type="dxa" w:w="1022"/>
+            <w:tcW w:type="dxa" w:w="1008"/>
             <w:vAlign w:val="center"/>
             <w:tcBorders>
               <w:top w:val="single" w:sz="6" w:color="B0B7C3"/>
@@ -2062,9 +1860,8 @@
             <w:r>
               <w:rPr>
                 <w:b w:val="0"/>
-                <w:i w:val="0"/>
                 <w:color w:val="1A1A1A"/>
-                <w:sz w:val="18"/>
+                <w:sz w:val="19"/>
               </w:rPr>
               <w:t>21</w:t>
             </w:r>
@@ -2072,7 +1869,7 @@
         </w:tc>
         <w:tc>
           <w:tcPr>
-            <w:tcW w:type="dxa" w:w="1022"/>
+            <w:tcW w:type="dxa" w:w="1008"/>
             <w:vAlign w:val="center"/>
             <w:tcBorders>
               <w:top w:val="single" w:sz="6" w:color="B0B7C3"/>
@@ -2089,9 +1886,8 @@
             <w:r>
               <w:rPr>
                 <w:b w:val="0"/>
-                <w:i w:val="0"/>
                 <w:color w:val="1A1A1A"/>
-                <w:sz w:val="18"/>
+                <w:sz w:val="19"/>
               </w:rPr>
               <w:t>58,169</w:t>
             </w:r>
@@ -2099,7 +1895,7 @@
         </w:tc>
         <w:tc>
           <w:tcPr>
-            <w:tcW w:type="dxa" w:w="1022"/>
+            <w:tcW w:type="dxa" w:w="1008"/>
             <w:vAlign w:val="center"/>
             <w:tcBorders>
               <w:top w:val="single" w:sz="6" w:color="B0B7C3"/>
@@ -2116,9 +1912,8 @@
             <w:r>
               <w:rPr>
                 <w:b w:val="0"/>
-                <w:i w:val="0"/>
                 <w:color w:val="1A1A1A"/>
-                <w:sz w:val="18"/>
+                <w:sz w:val="19"/>
               </w:rPr>
               <w:t>23,278</w:t>
             </w:r>
@@ -2126,7 +1921,7 @@
         </w:tc>
         <w:tc>
           <w:tcPr>
-            <w:tcW w:type="dxa" w:w="1022"/>
+            <w:tcW w:type="dxa" w:w="1008"/>
             <w:vAlign w:val="center"/>
             <w:tcBorders>
               <w:top w:val="single" w:sz="6" w:color="B0B7C3"/>
@@ -2143,9 +1938,8 @@
             <w:r>
               <w:rPr>
                 <w:b w:val="0"/>
-                <w:i w:val="0"/>
                 <w:color w:val="1A1A1A"/>
-                <w:sz w:val="18"/>
+                <w:sz w:val="19"/>
               </w:rPr>
               <w:t>11,401</w:t>
             </w:r>
@@ -2153,7 +1947,7 @@
         </w:tc>
         <w:tc>
           <w:tcPr>
-            <w:tcW w:type="dxa" w:w="1022"/>
+            <w:tcW w:type="dxa" w:w="1008"/>
             <w:vAlign w:val="center"/>
             <w:tcBorders>
               <w:top w:val="single" w:sz="6" w:color="B0B7C3"/>
@@ -2170,9 +1964,8 @@
             <w:r>
               <w:rPr>
                 <w:b w:val="0"/>
-                <w:i w:val="0"/>
                 <w:color w:val="1A1A1A"/>
-                <w:sz w:val="18"/>
+                <w:sz w:val="19"/>
               </w:rPr>
               <w:t>23,490</w:t>
             </w:r>
@@ -2182,7 +1975,7 @@
       <w:tr>
         <w:tc>
           <w:tcPr>
-            <w:tcW w:type="dxa" w:w="1022"/>
+            <w:tcW w:type="dxa" w:w="1008"/>
             <w:vAlign w:val="center"/>
             <w:tcBorders>
               <w:top w:val="single" w:sz="6" w:color="B0B7C3"/>
@@ -2200,9 +1993,8 @@
             <w:r>
               <w:rPr>
                 <w:b w:val="0"/>
-                <w:i w:val="0"/>
                 <w:color w:val="1A1A1A"/>
-                <w:sz w:val="18"/>
+                <w:sz w:val="19"/>
               </w:rPr>
               <w:t>06</w:t>
             </w:r>
@@ -2210,7 +2002,7 @@
         </w:tc>
         <w:tc>
           <w:tcPr>
-            <w:tcW w:type="dxa" w:w="1022"/>
+            <w:tcW w:type="dxa" w:w="1008"/>
             <w:vAlign w:val="center"/>
             <w:tcBorders>
               <w:top w:val="single" w:sz="6" w:color="B0B7C3"/>
@@ -2228,9 +2020,8 @@
             <w:r>
               <w:rPr>
                 <w:b w:val="0"/>
-                <w:i w:val="0"/>
                 <w:color w:val="1A1A1A"/>
-                <w:sz w:val="18"/>
+                <w:sz w:val="19"/>
               </w:rPr>
               <w:t>Federal Gov (APO/FPO)</w:t>
             </w:r>
@@ -2238,7 +2029,7 @@
         </w:tc>
         <w:tc>
           <w:tcPr>
-            <w:tcW w:type="dxa" w:w="1022"/>
+            <w:tcW w:type="dxa" w:w="1008"/>
             <w:vAlign w:val="center"/>
             <w:tcBorders>
               <w:top w:val="single" w:sz="6" w:color="B0B7C3"/>
@@ -2256,9 +2047,8 @@
             <w:r>
               <w:rPr>
                 <w:b w:val="0"/>
-                <w:i w:val="0"/>
                 <w:color w:val="1A1A1A"/>
-                <w:sz w:val="18"/>
+                <w:sz w:val="19"/>
               </w:rPr>
               <w:t>186</w:t>
             </w:r>
@@ -2266,7 +2056,7 @@
         </w:tc>
         <w:tc>
           <w:tcPr>
-            <w:tcW w:type="dxa" w:w="1022"/>
+            <w:tcW w:type="dxa" w:w="1008"/>
             <w:vAlign w:val="center"/>
             <w:tcBorders>
               <w:top w:val="single" w:sz="6" w:color="B0B7C3"/>
@@ -2284,9 +2074,8 @@
             <w:r>
               <w:rPr>
                 <w:b w:val="0"/>
-                <w:i w:val="0"/>
                 <w:color w:val="1A1A1A"/>
-                <w:sz w:val="18"/>
+                <w:sz w:val="19"/>
               </w:rPr>
               <w:t>185</w:t>
             </w:r>
@@ -2294,7 +2083,7 @@
         </w:tc>
         <w:tc>
           <w:tcPr>
-            <w:tcW w:type="dxa" w:w="1022"/>
+            <w:tcW w:type="dxa" w:w="1008"/>
             <w:vAlign w:val="center"/>
             <w:tcBorders>
               <w:top w:val="single" w:sz="6" w:color="B0B7C3"/>
@@ -2312,9 +2101,8 @@
             <w:r>
               <w:rPr>
                 <w:b w:val="0"/>
-                <w:i w:val="0"/>
                 <w:color w:val="1A1A1A"/>
-                <w:sz w:val="18"/>
+                <w:sz w:val="19"/>
               </w:rPr>
               <w:t>1</w:t>
             </w:r>
@@ -2322,7 +2110,7 @@
         </w:tc>
         <w:tc>
           <w:tcPr>
-            <w:tcW w:type="dxa" w:w="1022"/>
+            <w:tcW w:type="dxa" w:w="1008"/>
             <w:vAlign w:val="center"/>
             <w:tcBorders>
               <w:top w:val="single" w:sz="6" w:color="B0B7C3"/>
@@ -2340,9 +2128,8 @@
             <w:r>
               <w:rPr>
                 <w:b w:val="0"/>
-                <w:i w:val="0"/>
                 <w:color w:val="1A1A1A"/>
-                <w:sz w:val="18"/>
+                <w:sz w:val="19"/>
               </w:rPr>
               <w:t>0</w:t>
             </w:r>
@@ -2350,7 +2137,7 @@
         </w:tc>
         <w:tc>
           <w:tcPr>
-            <w:tcW w:type="dxa" w:w="1022"/>
+            <w:tcW w:type="dxa" w:w="1008"/>
             <w:vAlign w:val="center"/>
             <w:tcBorders>
               <w:top w:val="single" w:sz="6" w:color="B0B7C3"/>
@@ -2368,9 +2155,8 @@
             <w:r>
               <w:rPr>
                 <w:b w:val="0"/>
-                <w:i w:val="0"/>
                 <w:color w:val="1A1A1A"/>
-                <w:sz w:val="18"/>
+                <w:sz w:val="19"/>
               </w:rPr>
               <w:t>786</w:t>
             </w:r>
@@ -2378,7 +2164,7 @@
         </w:tc>
         <w:tc>
           <w:tcPr>
-            <w:tcW w:type="dxa" w:w="1022"/>
+            <w:tcW w:type="dxa" w:w="1008"/>
             <w:vAlign w:val="center"/>
             <w:tcBorders>
               <w:top w:val="single" w:sz="6" w:color="B0B7C3"/>
@@ -2396,9 +2182,8 @@
             <w:r>
               <w:rPr>
                 <w:b w:val="0"/>
-                <w:i w:val="0"/>
                 <w:color w:val="1A1A1A"/>
-                <w:sz w:val="18"/>
+                <w:sz w:val="19"/>
               </w:rPr>
               <w:t>705</w:t>
             </w:r>
@@ -2406,7 +2191,7 @@
         </w:tc>
         <w:tc>
           <w:tcPr>
-            <w:tcW w:type="dxa" w:w="1022"/>
+            <w:tcW w:type="dxa" w:w="1008"/>
             <w:vAlign w:val="center"/>
             <w:tcBorders>
               <w:top w:val="single" w:sz="6" w:color="B0B7C3"/>
@@ -2424,9 +2209,8 @@
             <w:r>
               <w:rPr>
                 <w:b w:val="0"/>
-                <w:i w:val="0"/>
                 <w:color w:val="1A1A1A"/>
-                <w:sz w:val="18"/>
+                <w:sz w:val="19"/>
               </w:rPr>
               <w:t>81</w:t>
             </w:r>
@@ -2434,7 +2218,7 @@
         </w:tc>
         <w:tc>
           <w:tcPr>
-            <w:tcW w:type="dxa" w:w="1022"/>
+            <w:tcW w:type="dxa" w:w="1008"/>
             <w:vAlign w:val="center"/>
             <w:tcBorders>
               <w:top w:val="single" w:sz="6" w:color="B0B7C3"/>
@@ -2452,9 +2236,8 @@
             <w:r>
               <w:rPr>
                 <w:b w:val="0"/>
-                <w:i w:val="0"/>
                 <w:color w:val="1A1A1A"/>
-                <w:sz w:val="18"/>
+                <w:sz w:val="19"/>
               </w:rPr>
               <w:t>0</w:t>
             </w:r>
@@ -2464,7 +2247,7 @@
       <w:tr>
         <w:tc>
           <w:tcPr>
-            <w:tcW w:type="dxa" w:w="1022"/>
+            <w:tcW w:type="dxa" w:w="1008"/>
             <w:vAlign w:val="center"/>
             <w:tcBorders>
               <w:top w:val="single" w:sz="6" w:color="B0B7C3"/>
@@ -2481,9 +2264,8 @@
             <w:r>
               <w:rPr>
                 <w:b w:val="0"/>
-                <w:i w:val="0"/>
                 <w:color w:val="1A1A1A"/>
-                <w:sz w:val="18"/>
+                <w:sz w:val="19"/>
               </w:rPr>
               <w:t>07</w:t>
             </w:r>
@@ -2491,7 +2273,7 @@
         </w:tc>
         <w:tc>
           <w:tcPr>
-            <w:tcW w:type="dxa" w:w="1022"/>
+            <w:tcW w:type="dxa" w:w="1008"/>
             <w:vAlign w:val="center"/>
             <w:tcBorders>
               <w:top w:val="single" w:sz="6" w:color="B0B7C3"/>
@@ -2508,9 +2290,8 @@
             <w:r>
               <w:rPr>
                 <w:b w:val="0"/>
-                <w:i w:val="0"/>
                 <w:color w:val="1A1A1A"/>
-                <w:sz w:val="18"/>
+                <w:sz w:val="19"/>
               </w:rPr>
               <w:t>State Gov</w:t>
             </w:r>
@@ -2518,7 +2299,7 @@
         </w:tc>
         <w:tc>
           <w:tcPr>
-            <w:tcW w:type="dxa" w:w="1022"/>
+            <w:tcW w:type="dxa" w:w="1008"/>
             <w:vAlign w:val="center"/>
             <w:tcBorders>
               <w:top w:val="single" w:sz="6" w:color="B0B7C3"/>
@@ -2535,9 +2316,8 @@
             <w:r>
               <w:rPr>
                 <w:b w:val="0"/>
-                <w:i w:val="0"/>
                 <w:color w:val="1A1A1A"/>
-                <w:sz w:val="18"/>
+                <w:sz w:val="19"/>
               </w:rPr>
               <w:t>6,798</w:t>
             </w:r>
@@ -2545,7 +2325,7 @@
         </w:tc>
         <w:tc>
           <w:tcPr>
-            <w:tcW w:type="dxa" w:w="1022"/>
+            <w:tcW w:type="dxa" w:w="1008"/>
             <w:vAlign w:val="center"/>
             <w:tcBorders>
               <w:top w:val="single" w:sz="6" w:color="B0B7C3"/>
@@ -2562,9 +2342,8 @@
             <w:r>
               <w:rPr>
                 <w:b w:val="0"/>
-                <w:i w:val="0"/>
                 <w:color w:val="1A1A1A"/>
-                <w:sz w:val="18"/>
+                <w:sz w:val="19"/>
               </w:rPr>
               <w:t>6,282</w:t>
             </w:r>
@@ -2572,7 +2351,7 @@
         </w:tc>
         <w:tc>
           <w:tcPr>
-            <w:tcW w:type="dxa" w:w="1022"/>
+            <w:tcW w:type="dxa" w:w="1008"/>
             <w:vAlign w:val="center"/>
             <w:tcBorders>
               <w:top w:val="single" w:sz="6" w:color="B0B7C3"/>
@@ -2589,9 +2368,8 @@
             <w:r>
               <w:rPr>
                 <w:b w:val="0"/>
-                <w:i w:val="0"/>
                 <w:color w:val="1A1A1A"/>
-                <w:sz w:val="18"/>
+                <w:sz w:val="19"/>
               </w:rPr>
               <w:t>382</w:t>
             </w:r>
@@ -2599,7 +2377,7 @@
         </w:tc>
         <w:tc>
           <w:tcPr>
-            <w:tcW w:type="dxa" w:w="1022"/>
+            <w:tcW w:type="dxa" w:w="1008"/>
             <w:vAlign w:val="center"/>
             <w:tcBorders>
               <w:top w:val="single" w:sz="6" w:color="B0B7C3"/>
@@ -2616,9 +2394,8 @@
             <w:r>
               <w:rPr>
                 <w:b w:val="0"/>
-                <w:i w:val="0"/>
                 <w:color w:val="1A1A1A"/>
-                <w:sz w:val="18"/>
+                <w:sz w:val="19"/>
               </w:rPr>
               <w:t>134</w:t>
             </w:r>
@@ -2626,7 +2403,7 @@
         </w:tc>
         <w:tc>
           <w:tcPr>
-            <w:tcW w:type="dxa" w:w="1022"/>
+            <w:tcW w:type="dxa" w:w="1008"/>
             <w:vAlign w:val="center"/>
             <w:tcBorders>
               <w:top w:val="single" w:sz="6" w:color="B0B7C3"/>
@@ -2643,9 +2420,8 @@
             <w:r>
               <w:rPr>
                 <w:b w:val="0"/>
-                <w:i w:val="0"/>
                 <w:color w:val="1A1A1A"/>
-                <w:sz w:val="18"/>
+                <w:sz w:val="19"/>
               </w:rPr>
               <w:t>184,911</w:t>
             </w:r>
@@ -2653,7 +2429,7 @@
         </w:tc>
         <w:tc>
           <w:tcPr>
-            <w:tcW w:type="dxa" w:w="1022"/>
+            <w:tcW w:type="dxa" w:w="1008"/>
             <w:vAlign w:val="center"/>
             <w:tcBorders>
               <w:top w:val="single" w:sz="6" w:color="B0B7C3"/>
@@ -2670,9 +2446,8 @@
             <w:r>
               <w:rPr>
                 <w:b w:val="0"/>
-                <w:i w:val="0"/>
                 <w:color w:val="1A1A1A"/>
-                <w:sz w:val="18"/>
+                <w:sz w:val="19"/>
               </w:rPr>
               <w:t>86,816</w:t>
             </w:r>
@@ -2680,7 +2455,7 @@
         </w:tc>
         <w:tc>
           <w:tcPr>
-            <w:tcW w:type="dxa" w:w="1022"/>
+            <w:tcW w:type="dxa" w:w="1008"/>
             <w:vAlign w:val="center"/>
             <w:tcBorders>
               <w:top w:val="single" w:sz="6" w:color="B0B7C3"/>
@@ -2697,9 +2472,8 @@
             <w:r>
               <w:rPr>
                 <w:b w:val="0"/>
-                <w:i w:val="0"/>
                 <w:color w:val="1A1A1A"/>
-                <w:sz w:val="18"/>
+                <w:sz w:val="19"/>
               </w:rPr>
               <w:t>43,295</w:t>
             </w:r>
@@ -2707,7 +2481,7 @@
         </w:tc>
         <w:tc>
           <w:tcPr>
-            <w:tcW w:type="dxa" w:w="1022"/>
+            <w:tcW w:type="dxa" w:w="1008"/>
             <w:vAlign w:val="center"/>
             <w:tcBorders>
               <w:top w:val="single" w:sz="6" w:color="B0B7C3"/>
@@ -2724,9 +2498,8 @@
             <w:r>
               <w:rPr>
                 <w:b w:val="0"/>
-                <w:i w:val="0"/>
                 <w:color w:val="1A1A1A"/>
-                <w:sz w:val="18"/>
+                <w:sz w:val="19"/>
               </w:rPr>
               <w:t>54,800</w:t>
             </w:r>
@@ -2736,7 +2509,7 @@
       <w:tr>
         <w:tc>
           <w:tcPr>
-            <w:tcW w:type="dxa" w:w="1022"/>
+            <w:tcW w:type="dxa" w:w="1008"/>
             <w:vAlign w:val="center"/>
             <w:tcBorders>
               <w:top w:val="single" w:sz="6" w:color="B0B7C3"/>
@@ -2754,9 +2527,8 @@
             <w:r>
               <w:rPr>
                 <w:b w:val="0"/>
-                <w:i w:val="0"/>
                 <w:color w:val="1A1A1A"/>
-                <w:sz w:val="18"/>
+                <w:sz w:val="19"/>
               </w:rPr>
               <w:t>08</w:t>
             </w:r>
@@ -2764,7 +2536,7 @@
         </w:tc>
         <w:tc>
           <w:tcPr>
-            <w:tcW w:type="dxa" w:w="1022"/>
+            <w:tcW w:type="dxa" w:w="1008"/>
             <w:vAlign w:val="center"/>
             <w:tcBorders>
               <w:top w:val="single" w:sz="6" w:color="B0B7C3"/>
@@ -2782,9 +2554,8 @@
             <w:r>
               <w:rPr>
                 <w:b w:val="0"/>
-                <w:i w:val="0"/>
                 <w:color w:val="1A1A1A"/>
-                <w:sz w:val="18"/>
+                <w:sz w:val="19"/>
               </w:rPr>
               <w:t>Municipal / Private Institute</w:t>
             </w:r>
@@ -2792,7 +2563,7 @@
         </w:tc>
         <w:tc>
           <w:tcPr>
-            <w:tcW w:type="dxa" w:w="1022"/>
+            <w:tcW w:type="dxa" w:w="1008"/>
             <w:vAlign w:val="center"/>
             <w:tcBorders>
               <w:top w:val="single" w:sz="6" w:color="B0B7C3"/>
@@ -2810,9 +2581,8 @@
             <w:r>
               <w:rPr>
                 <w:b w:val="0"/>
-                <w:i w:val="0"/>
                 <w:color w:val="1A1A1A"/>
-                <w:sz w:val="18"/>
+                <w:sz w:val="19"/>
               </w:rPr>
               <w:t>16,009</w:t>
             </w:r>
@@ -2820,7 +2590,7 @@
         </w:tc>
         <w:tc>
           <w:tcPr>
-            <w:tcW w:type="dxa" w:w="1022"/>
+            <w:tcW w:type="dxa" w:w="1008"/>
             <w:vAlign w:val="center"/>
             <w:tcBorders>
               <w:top w:val="single" w:sz="6" w:color="B0B7C3"/>
@@ -2838,9 +2608,8 @@
             <w:r>
               <w:rPr>
                 <w:b w:val="0"/>
-                <w:i w:val="0"/>
                 <w:color w:val="1A1A1A"/>
-                <w:sz w:val="18"/>
+                <w:sz w:val="19"/>
               </w:rPr>
               <w:t>15,787</w:t>
             </w:r>
@@ -2848,7 +2617,7 @@
         </w:tc>
         <w:tc>
           <w:tcPr>
-            <w:tcW w:type="dxa" w:w="1022"/>
+            <w:tcW w:type="dxa" w:w="1008"/>
             <w:vAlign w:val="center"/>
             <w:tcBorders>
               <w:top w:val="single" w:sz="6" w:color="B0B7C3"/>
@@ -2866,9 +2635,8 @@
             <w:r>
               <w:rPr>
                 <w:b w:val="0"/>
-                <w:i w:val="0"/>
                 <w:color w:val="1A1A1A"/>
-                <w:sz w:val="18"/>
+                <w:sz w:val="19"/>
               </w:rPr>
               <w:t>176</w:t>
             </w:r>
@@ -2876,7 +2644,7 @@
         </w:tc>
         <w:tc>
           <w:tcPr>
-            <w:tcW w:type="dxa" w:w="1022"/>
+            <w:tcW w:type="dxa" w:w="1008"/>
             <w:vAlign w:val="center"/>
             <w:tcBorders>
               <w:top w:val="single" w:sz="6" w:color="B0B7C3"/>
@@ -2894,9 +2662,8 @@
             <w:r>
               <w:rPr>
                 <w:b w:val="0"/>
-                <w:i w:val="0"/>
                 <w:color w:val="1A1A1A"/>
-                <w:sz w:val="18"/>
+                <w:sz w:val="19"/>
               </w:rPr>
               <w:t>46</w:t>
             </w:r>
@@ -2904,7 +2671,7 @@
         </w:tc>
         <w:tc>
           <w:tcPr>
-            <w:tcW w:type="dxa" w:w="1022"/>
+            <w:tcW w:type="dxa" w:w="1008"/>
             <w:vAlign w:val="center"/>
             <w:tcBorders>
               <w:top w:val="single" w:sz="6" w:color="B0B7C3"/>
@@ -2922,9 +2689,8 @@
             <w:r>
               <w:rPr>
                 <w:b w:val="0"/>
-                <w:i w:val="0"/>
                 <w:color w:val="1A1A1A"/>
-                <w:sz w:val="18"/>
+                <w:sz w:val="19"/>
               </w:rPr>
               <w:t>222,199</w:t>
             </w:r>
@@ -2932,7 +2698,7 @@
         </w:tc>
         <w:tc>
           <w:tcPr>
-            <w:tcW w:type="dxa" w:w="1022"/>
+            <w:tcW w:type="dxa" w:w="1008"/>
             <w:vAlign w:val="center"/>
             <w:tcBorders>
               <w:top w:val="single" w:sz="6" w:color="B0B7C3"/>
@@ -2950,9 +2716,8 @@
             <w:r>
               <w:rPr>
                 <w:b w:val="0"/>
-                <w:i w:val="0"/>
                 <w:color w:val="1A1A1A"/>
-                <w:sz w:val="18"/>
+                <w:sz w:val="19"/>
               </w:rPr>
               <w:t>151,639</w:t>
             </w:r>
@@ -2960,7 +2725,7 @@
         </w:tc>
         <w:tc>
           <w:tcPr>
-            <w:tcW w:type="dxa" w:w="1022"/>
+            <w:tcW w:type="dxa" w:w="1008"/>
             <w:vAlign w:val="center"/>
             <w:tcBorders>
               <w:top w:val="single" w:sz="6" w:color="B0B7C3"/>
@@ -2978,9 +2743,8 @@
             <w:r>
               <w:rPr>
                 <w:b w:val="0"/>
-                <w:i w:val="0"/>
                 <w:color w:val="1A1A1A"/>
-                <w:sz w:val="18"/>
+                <w:sz w:val="19"/>
               </w:rPr>
               <w:t>22,623</w:t>
             </w:r>
@@ -2988,7 +2752,7 @@
         </w:tc>
         <w:tc>
           <w:tcPr>
-            <w:tcW w:type="dxa" w:w="1022"/>
+            <w:tcW w:type="dxa" w:w="1008"/>
             <w:vAlign w:val="center"/>
             <w:tcBorders>
               <w:top w:val="single" w:sz="6" w:color="B0B7C3"/>
@@ -3006,9 +2770,8 @@
             <w:r>
               <w:rPr>
                 <w:b w:val="0"/>
-                <w:i w:val="0"/>
                 <w:color w:val="1A1A1A"/>
-                <w:sz w:val="18"/>
+                <w:sz w:val="19"/>
               </w:rPr>
               <w:t>47,937</w:t>
             </w:r>
@@ -3018,7 +2781,7 @@
       <w:tr>
         <w:tc>
           <w:tcPr>
-            <w:tcW w:type="dxa" w:w="1022"/>
+            <w:tcW w:type="dxa" w:w="1008"/>
             <w:vAlign w:val="center"/>
             <w:tcBorders>
               <w:top w:val="single" w:sz="6" w:color="B0B7C3"/>
@@ -3035,9 +2798,8 @@
             <w:r>
               <w:rPr>
                 <w:b w:val="0"/>
-                <w:i w:val="0"/>
                 <w:color w:val="1A1A1A"/>
-                <w:sz w:val="18"/>
+                <w:sz w:val="19"/>
               </w:rPr>
               <w:t>09</w:t>
             </w:r>
@@ -3045,7 +2807,7 @@
         </w:tc>
         <w:tc>
           <w:tcPr>
-            <w:tcW w:type="dxa" w:w="1022"/>
+            <w:tcW w:type="dxa" w:w="1008"/>
             <w:vAlign w:val="center"/>
             <w:tcBorders>
               <w:top w:val="single" w:sz="6" w:color="B0B7C3"/>
@@ -3062,9 +2824,8 @@
             <w:r>
               <w:rPr>
                 <w:b w:val="0"/>
-                <w:i w:val="0"/>
                 <w:color w:val="1A1A1A"/>
-                <w:sz w:val="18"/>
+                <w:sz w:val="19"/>
               </w:rPr>
               <w:t>Private College / University</w:t>
             </w:r>
@@ -3072,7 +2833,7 @@
         </w:tc>
         <w:tc>
           <w:tcPr>
-            <w:tcW w:type="dxa" w:w="1022"/>
+            <w:tcW w:type="dxa" w:w="1008"/>
             <w:vAlign w:val="center"/>
             <w:tcBorders>
               <w:top w:val="single" w:sz="6" w:color="B0B7C3"/>
@@ -3089,9 +2850,8 @@
             <w:r>
               <w:rPr>
                 <w:b w:val="0"/>
-                <w:i w:val="0"/>
                 <w:color w:val="1A1A1A"/>
-                <w:sz w:val="18"/>
+                <w:sz w:val="19"/>
               </w:rPr>
               <w:t>2,423</w:t>
             </w:r>
@@ -3099,7 +2859,7 @@
         </w:tc>
         <w:tc>
           <w:tcPr>
-            <w:tcW w:type="dxa" w:w="1022"/>
+            <w:tcW w:type="dxa" w:w="1008"/>
             <w:vAlign w:val="center"/>
             <w:tcBorders>
               <w:top w:val="single" w:sz="6" w:color="B0B7C3"/>
@@ -3116,9 +2876,8 @@
             <w:r>
               <w:rPr>
                 <w:b w:val="0"/>
-                <w:i w:val="0"/>
                 <w:color w:val="1A1A1A"/>
-                <w:sz w:val="18"/>
+                <w:sz w:val="19"/>
               </w:rPr>
               <w:t>2,160</w:t>
             </w:r>
@@ -3126,7 +2885,7 @@
         </w:tc>
         <w:tc>
           <w:tcPr>
-            <w:tcW w:type="dxa" w:w="1022"/>
+            <w:tcW w:type="dxa" w:w="1008"/>
             <w:vAlign w:val="center"/>
             <w:tcBorders>
               <w:top w:val="single" w:sz="6" w:color="B0B7C3"/>
@@ -3143,9 +2902,8 @@
             <w:r>
               <w:rPr>
                 <w:b w:val="0"/>
-                <w:i w:val="0"/>
                 <w:color w:val="1A1A1A"/>
-                <w:sz w:val="18"/>
+                <w:sz w:val="19"/>
               </w:rPr>
               <w:t>171</w:t>
             </w:r>
@@ -3153,7 +2911,7 @@
         </w:tc>
         <w:tc>
           <w:tcPr>
-            <w:tcW w:type="dxa" w:w="1022"/>
+            <w:tcW w:type="dxa" w:w="1008"/>
             <w:vAlign w:val="center"/>
             <w:tcBorders>
               <w:top w:val="single" w:sz="6" w:color="B0B7C3"/>
@@ -3170,9 +2928,8 @@
             <w:r>
               <w:rPr>
                 <w:b w:val="0"/>
-                <w:i w:val="0"/>
                 <w:color w:val="1A1A1A"/>
-                <w:sz w:val="18"/>
+                <w:sz w:val="19"/>
               </w:rPr>
               <w:t>92</w:t>
             </w:r>
@@ -3180,7 +2937,7 @@
         </w:tc>
         <w:tc>
           <w:tcPr>
-            <w:tcW w:type="dxa" w:w="1022"/>
+            <w:tcW w:type="dxa" w:w="1008"/>
             <w:vAlign w:val="center"/>
             <w:tcBorders>
               <w:top w:val="single" w:sz="6" w:color="B0B7C3"/>
@@ -3197,9 +2954,8 @@
             <w:r>
               <w:rPr>
                 <w:b w:val="0"/>
-                <w:i w:val="0"/>
                 <w:color w:val="1A1A1A"/>
-                <w:sz w:val="18"/>
+                <w:sz w:val="19"/>
               </w:rPr>
               <w:t>112,332</w:t>
             </w:r>
@@ -3207,7 +2963,7 @@
         </w:tc>
         <w:tc>
           <w:tcPr>
-            <w:tcW w:type="dxa" w:w="1022"/>
+            <w:tcW w:type="dxa" w:w="1008"/>
             <w:vAlign w:val="center"/>
             <w:tcBorders>
               <w:top w:val="single" w:sz="6" w:color="B0B7C3"/>
@@ -3224,9 +2980,8 @@
             <w:r>
               <w:rPr>
                 <w:b w:val="0"/>
-                <w:i w:val="0"/>
                 <w:color w:val="1A1A1A"/>
-                <w:sz w:val="18"/>
+                <w:sz w:val="19"/>
               </w:rPr>
               <w:t>32,102</w:t>
             </w:r>
@@ -3234,7 +2989,7 @@
         </w:tc>
         <w:tc>
           <w:tcPr>
-            <w:tcW w:type="dxa" w:w="1022"/>
+            <w:tcW w:type="dxa" w:w="1008"/>
             <w:vAlign w:val="center"/>
             <w:tcBorders>
               <w:top w:val="single" w:sz="6" w:color="B0B7C3"/>
@@ -3251,9 +3006,8 @@
             <w:r>
               <w:rPr>
                 <w:b w:val="0"/>
-                <w:i w:val="0"/>
                 <w:color w:val="1A1A1A"/>
-                <w:sz w:val="18"/>
+                <w:sz w:val="19"/>
               </w:rPr>
               <w:t>17,286</w:t>
             </w:r>
@@ -3261,7 +3015,7 @@
         </w:tc>
         <w:tc>
           <w:tcPr>
-            <w:tcW w:type="dxa" w:w="1022"/>
+            <w:tcW w:type="dxa" w:w="1008"/>
             <w:vAlign w:val="center"/>
             <w:tcBorders>
               <w:top w:val="single" w:sz="6" w:color="B0B7C3"/>
@@ -3278,9 +3032,8 @@
             <w:r>
               <w:rPr>
                 <w:b w:val="0"/>
-                <w:i w:val="0"/>
                 <w:color w:val="1A1A1A"/>
-                <w:sz w:val="18"/>
+                <w:sz w:val="19"/>
               </w:rPr>
               <w:t>62,944</w:t>
             </w:r>
@@ -3290,7 +3043,7 @@
       <w:tr>
         <w:tc>
           <w:tcPr>
-            <w:tcW w:type="dxa" w:w="1022"/>
+            <w:tcW w:type="dxa" w:w="1008"/>
             <w:vAlign w:val="center"/>
             <w:tcBorders>
               <w:top w:val="single" w:sz="6" w:color="B0B7C3"/>
@@ -3308,9 +3061,8 @@
             <w:r>
               <w:rPr>
                 <w:b w:val="0"/>
-                <w:i w:val="0"/>
                 <w:color w:val="1A1A1A"/>
-                <w:sz w:val="18"/>
+                <w:sz w:val="19"/>
               </w:rPr>
               <w:t>15</w:t>
             </w:r>
@@ -3318,7 +3070,7 @@
         </w:tc>
         <w:tc>
           <w:tcPr>
-            <w:tcW w:type="dxa" w:w="1022"/>
+            <w:tcW w:type="dxa" w:w="1008"/>
             <w:vAlign w:val="center"/>
             <w:tcBorders>
               <w:top w:val="single" w:sz="6" w:color="B0B7C3"/>
@@ -3336,17 +3088,16 @@
             <w:r>
               <w:rPr>
                 <w:b/>
-                <w:i w:val="0"/>
                 <w:color w:val="1A1A1A"/>
-                <w:sz w:val="18"/>
+                <w:sz w:val="19"/>
               </w:rPr>
-              <w:t>McMaster-Carr internal (excluded)</w:t>
+              <w:t>McMaster-Carr internal</w:t>
             </w:r>
           </w:p>
         </w:tc>
         <w:tc>
           <w:tcPr>
-            <w:tcW w:type="dxa" w:w="1022"/>
+            <w:tcW w:type="dxa" w:w="1008"/>
             <w:vAlign w:val="center"/>
             <w:tcBorders>
               <w:top w:val="single" w:sz="6" w:color="B0B7C3"/>
@@ -3364,9 +3115,8 @@
             <w:r>
               <w:rPr>
                 <w:b/>
-                <w:i w:val="0"/>
                 <w:color w:val="1A1A1A"/>
-                <w:sz w:val="18"/>
+                <w:sz w:val="19"/>
               </w:rPr>
               <w:t>5</w:t>
             </w:r>
@@ -3374,7 +3124,7 @@
         </w:tc>
         <w:tc>
           <w:tcPr>
-            <w:tcW w:type="dxa" w:w="1022"/>
+            <w:tcW w:type="dxa" w:w="1008"/>
             <w:vAlign w:val="center"/>
             <w:tcBorders>
               <w:top w:val="single" w:sz="6" w:color="B0B7C3"/>
@@ -3392,9 +3142,8 @@
             <w:r>
               <w:rPr>
                 <w:b/>
-                <w:i w:val="0"/>
                 <w:color w:val="1A1A1A"/>
-                <w:sz w:val="18"/>
+                <w:sz w:val="19"/>
               </w:rPr>
               <w:t>0</w:t>
             </w:r>
@@ -3402,7 +3151,7 @@
         </w:tc>
         <w:tc>
           <w:tcPr>
-            <w:tcW w:type="dxa" w:w="1022"/>
+            <w:tcW w:type="dxa" w:w="1008"/>
             <w:vAlign w:val="center"/>
             <w:tcBorders>
               <w:top w:val="single" w:sz="6" w:color="B0B7C3"/>
@@ -3420,9 +3169,8 @@
             <w:r>
               <w:rPr>
                 <w:b/>
-                <w:i w:val="0"/>
                 <w:color w:val="1A1A1A"/>
-                <w:sz w:val="18"/>
+                <w:sz w:val="19"/>
               </w:rPr>
               <w:t>0</w:t>
             </w:r>
@@ -3430,7 +3178,7 @@
         </w:tc>
         <w:tc>
           <w:tcPr>
-            <w:tcW w:type="dxa" w:w="1022"/>
+            <w:tcW w:type="dxa" w:w="1008"/>
             <w:vAlign w:val="center"/>
             <w:tcBorders>
               <w:top w:val="single" w:sz="6" w:color="B0B7C3"/>
@@ -3448,9 +3196,8 @@
             <w:r>
               <w:rPr>
                 <w:b/>
-                <w:i w:val="0"/>
                 <w:color w:val="1A1A1A"/>
-                <w:sz w:val="18"/>
+                <w:sz w:val="19"/>
               </w:rPr>
               <w:t>5</w:t>
             </w:r>
@@ -3458,7 +3205,7 @@
         </w:tc>
         <w:tc>
           <w:tcPr>
-            <w:tcW w:type="dxa" w:w="1022"/>
+            <w:tcW w:type="dxa" w:w="1008"/>
             <w:vAlign w:val="center"/>
             <w:tcBorders>
               <w:top w:val="single" w:sz="6" w:color="B0B7C3"/>
@@ -3476,9 +3223,8 @@
             <w:r>
               <w:rPr>
                 <w:b/>
-                <w:i w:val="0"/>
                 <w:color w:val="1A1A1A"/>
-                <w:sz w:val="18"/>
+                <w:sz w:val="19"/>
               </w:rPr>
               <w:t>42,130</w:t>
             </w:r>
@@ -3486,7 +3232,7 @@
         </w:tc>
         <w:tc>
           <w:tcPr>
-            <w:tcW w:type="dxa" w:w="1022"/>
+            <w:tcW w:type="dxa" w:w="1008"/>
             <w:vAlign w:val="center"/>
             <w:tcBorders>
               <w:top w:val="single" w:sz="6" w:color="B0B7C3"/>
@@ -3504,9 +3250,8 @@
             <w:r>
               <w:rPr>
                 <w:b/>
-                <w:i w:val="0"/>
                 <w:color w:val="1A1A1A"/>
-                <w:sz w:val="18"/>
+                <w:sz w:val="19"/>
               </w:rPr>
               <w:t>0</w:t>
             </w:r>
@@ -3514,7 +3259,7 @@
         </w:tc>
         <w:tc>
           <w:tcPr>
-            <w:tcW w:type="dxa" w:w="1022"/>
+            <w:tcW w:type="dxa" w:w="1008"/>
             <w:vAlign w:val="center"/>
             <w:tcBorders>
               <w:top w:val="single" w:sz="6" w:color="B0B7C3"/>
@@ -3532,9 +3277,8 @@
             <w:r>
               <w:rPr>
                 <w:b/>
-                <w:i w:val="0"/>
                 <w:color w:val="1A1A1A"/>
-                <w:sz w:val="18"/>
+                <w:sz w:val="19"/>
               </w:rPr>
               <w:t>0</w:t>
             </w:r>
@@ -3542,7 +3286,7 @@
         </w:tc>
         <w:tc>
           <w:tcPr>
-            <w:tcW w:type="dxa" w:w="1022"/>
+            <w:tcW w:type="dxa" w:w="1008"/>
             <w:vAlign w:val="center"/>
             <w:tcBorders>
               <w:top w:val="single" w:sz="6" w:color="B0B7C3"/>
@@ -3560,9 +3304,8 @@
             <w:r>
               <w:rPr>
                 <w:b/>
-                <w:i w:val="0"/>
                 <w:color w:val="1A1A1A"/>
-                <w:sz w:val="18"/>
+                <w:sz w:val="19"/>
               </w:rPr>
               <w:t>42,130</w:t>
             </w:r>
@@ -3572,7 +3315,7 @@
       <w:tr>
         <w:tc>
           <w:tcPr>
-            <w:tcW w:type="dxa" w:w="1022"/>
+            <w:tcW w:type="dxa" w:w="1008"/>
             <w:vAlign w:val="center"/>
             <w:tcBorders>
               <w:top w:val="single" w:sz="6" w:color="B0B7C3"/>
@@ -3590,9 +3333,8 @@
             <w:r>
               <w:rPr>
                 <w:b w:val="0"/>
-                <w:i w:val="0"/>
                 <w:color w:val="1A1A1A"/>
-                <w:sz w:val="18"/>
+                <w:sz w:val="19"/>
               </w:rPr>
               <w:t>—</w:t>
             </w:r>
@@ -3600,7 +3342,7 @@
         </w:tc>
         <w:tc>
           <w:tcPr>
-            <w:tcW w:type="dxa" w:w="1022"/>
+            <w:tcW w:type="dxa" w:w="1008"/>
             <w:vAlign w:val="center"/>
             <w:tcBorders>
               <w:top w:val="single" w:sz="6" w:color="B0B7C3"/>
@@ -3618,17 +3360,16 @@
             <w:r>
               <w:rPr>
                 <w:b/>
-                <w:i w:val="0"/>
                 <w:color w:val="1A1A1A"/>
-                <w:sz w:val="18"/>
+                <w:sz w:val="19"/>
               </w:rPr>
-              <w:t>R3 TOTAL (ex-distributor)</w:t>
+              <w:t>Total (ex-distributor)</w:t>
             </w:r>
           </w:p>
         </w:tc>
         <w:tc>
           <w:tcPr>
-            <w:tcW w:type="dxa" w:w="1022"/>
+            <w:tcW w:type="dxa" w:w="1008"/>
             <w:vAlign w:val="center"/>
             <w:tcBorders>
               <w:top w:val="single" w:sz="6" w:color="B0B7C3"/>
@@ -3646,9 +3387,8 @@
             <w:r>
               <w:rPr>
                 <w:b/>
-                <w:i w:val="0"/>
                 <w:color w:val="1A1A1A"/>
-                <w:sz w:val="18"/>
+                <w:sz w:val="19"/>
               </w:rPr>
               <w:t>28,453</w:t>
             </w:r>
@@ -3656,7 +3396,7 @@
         </w:tc>
         <w:tc>
           <w:tcPr>
-            <w:tcW w:type="dxa" w:w="1022"/>
+            <w:tcW w:type="dxa" w:w="1008"/>
             <w:vAlign w:val="center"/>
             <w:tcBorders>
               <w:top w:val="single" w:sz="6" w:color="B0B7C3"/>
@@ -3674,9 +3414,8 @@
             <w:r>
               <w:rPr>
                 <w:b/>
-                <w:i w:val="0"/>
                 <w:color w:val="1A1A1A"/>
-                <w:sz w:val="18"/>
+                <w:sz w:val="19"/>
               </w:rPr>
               <w:t>27,338</w:t>
             </w:r>
@@ -3684,7 +3423,7 @@
         </w:tc>
         <w:tc>
           <w:tcPr>
-            <w:tcW w:type="dxa" w:w="1022"/>
+            <w:tcW w:type="dxa" w:w="1008"/>
             <w:vAlign w:val="center"/>
             <w:tcBorders>
               <w:top w:val="single" w:sz="6" w:color="B0B7C3"/>
@@ -3702,9 +3441,8 @@
             <w:r>
               <w:rPr>
                 <w:b/>
-                <w:i w:val="0"/>
                 <w:color w:val="1A1A1A"/>
-                <w:sz w:val="18"/>
+                <w:sz w:val="19"/>
               </w:rPr>
               <w:t>817</w:t>
             </w:r>
@@ -3712,7 +3450,7 @@
         </w:tc>
         <w:tc>
           <w:tcPr>
-            <w:tcW w:type="dxa" w:w="1022"/>
+            <w:tcW w:type="dxa" w:w="1008"/>
             <w:vAlign w:val="center"/>
             <w:tcBorders>
               <w:top w:val="single" w:sz="6" w:color="B0B7C3"/>
@@ -3730,9 +3468,8 @@
             <w:r>
               <w:rPr>
                 <w:b/>
-                <w:i w:val="0"/>
                 <w:color w:val="1A1A1A"/>
-                <w:sz w:val="18"/>
+                <w:sz w:val="19"/>
               </w:rPr>
               <w:t>298</w:t>
             </w:r>
@@ -3740,7 +3477,7 @@
         </w:tc>
         <w:tc>
           <w:tcPr>
-            <w:tcW w:type="dxa" w:w="1022"/>
+            <w:tcW w:type="dxa" w:w="1008"/>
             <w:vAlign w:val="center"/>
             <w:tcBorders>
               <w:top w:val="single" w:sz="6" w:color="B0B7C3"/>
@@ -3758,9 +3495,8 @@
             <w:r>
               <w:rPr>
                 <w:b/>
-                <w:i w:val="0"/>
                 <w:color w:val="1A1A1A"/>
-                <w:sz w:val="18"/>
+                <w:sz w:val="19"/>
               </w:rPr>
               <w:t>620,527</w:t>
             </w:r>
@@ -3768,7 +3504,7 @@
         </w:tc>
         <w:tc>
           <w:tcPr>
-            <w:tcW w:type="dxa" w:w="1022"/>
+            <w:tcW w:type="dxa" w:w="1008"/>
             <w:vAlign w:val="center"/>
             <w:tcBorders>
               <w:top w:val="single" w:sz="6" w:color="B0B7C3"/>
@@ -3786,9 +3522,8 @@
             <w:r>
               <w:rPr>
                 <w:b/>
-                <w:i w:val="0"/>
                 <w:color w:val="1A1A1A"/>
-                <w:sz w:val="18"/>
+                <w:sz w:val="19"/>
               </w:rPr>
               <w:t>294,540</w:t>
             </w:r>
@@ -3796,7 +3531,7 @@
         </w:tc>
         <w:tc>
           <w:tcPr>
-            <w:tcW w:type="dxa" w:w="1022"/>
+            <w:tcW w:type="dxa" w:w="1008"/>
             <w:vAlign w:val="center"/>
             <w:tcBorders>
               <w:top w:val="single" w:sz="6" w:color="B0B7C3"/>
@@ -3814,9 +3549,8 @@
             <w:r>
               <w:rPr>
                 <w:b/>
-                <w:i w:val="0"/>
                 <w:color w:val="1A1A1A"/>
-                <w:sz w:val="18"/>
+                <w:sz w:val="19"/>
               </w:rPr>
               <w:t>94,686</w:t>
             </w:r>
@@ -3824,7 +3558,7 @@
         </w:tc>
         <w:tc>
           <w:tcPr>
-            <w:tcW w:type="dxa" w:w="1022"/>
+            <w:tcW w:type="dxa" w:w="1008"/>
             <w:vAlign w:val="center"/>
             <w:tcBorders>
               <w:top w:val="single" w:sz="6" w:color="B0B7C3"/>
@@ -3842,9 +3576,8 @@
             <w:r>
               <w:rPr>
                 <w:b/>
-                <w:i w:val="0"/>
                 <w:color w:val="1A1A1A"/>
-                <w:sz w:val="18"/>
+                <w:sz w:val="19"/>
               </w:rPr>
               <w:t>231,301</w:t>
             </w:r>
@@ -3852,42 +3585,9 @@
         </w:tc>
       </w:tr>
     </w:tbl>
-    <w:p>
-      <w:pPr>
-        <w:spacing w:after="40"/>
-      </w:pPr>
-      <w:r>
-        <w:rPr>
-          <w:i/>
-          <w:color w:val="888888"/>
-          <w:sz w:val="19"/>
-        </w:rPr>
-        <w:t>96% of R3-excluded CMFs are already R1-eligible (&lt;10 contacts) but carry only 48% of the blocked orders. The 25+ tail — under 300 CMFs — carries 231K orders. Listcode 15 is 100% in the 25+ bucket because it is McMaster-Carr's own five branches (500–1,700 employees each).</w:t>
-      </w:r>
-    </w:p>
-    <w:p>
-      <w:pPr>
-        <w:spacing w:before="120"/>
-      </w:pPr>
-    </w:p>
-    <w:p>
-      <w:pPr>
-        <w:pBdr>
-          <w:top w:val="single" w:sz="4" w:color="C8C2B0"/>
-        </w:pBdr>
-      </w:pPr>
-      <w:r>
-        <w:rPr>
-          <w:i/>
-          <w:color w:val="888888"/>
-          <w:sz w:val="18"/>
-        </w:rPr>
-        <w:t>Source: secure.order_source · Universe: CMFs that placed ≥1 order in window · ex-three shared credit-card CMFs · Contact counts and listcodes as of 12-month window.</w:t>
-      </w:r>
-    </w:p>
     <w:sectPr>
       <w:pgSz w:w="12240" w:h="15840"/>
-      <w:pgMar w:top="792" w:right="1008" w:bottom="792" w:left="1008" w:header="720" w:footer="720" w:gutter="0"/>
+      <w:pgMar w:top="1008" w:right="1080" w:bottom="1008" w:left="1080" w:header="720" w:footer="720" w:gutter="0"/>
       <w:cols w:space="720"/>
       <w:docGrid w:linePitch="360"/>
     </w:sectPr>
@@ -4260,7 +3960,7 @@
     <w:rsid w:val="00FC693F"/>
     <w:rPr>
       <w:rFonts w:ascii="Calibri" w:hAnsi="Calibri"/>
-      <w:sz w:val="21"/>
+      <w:sz w:val="22"/>
     </w:rPr>
   </w:style>
   <w:style w:type="paragraph" w:styleId="Header">

</xml_diff>

<commit_message>
Rewrite SLV doc in business language, landscape layout
- Switched to landscape letter so the 10-column list-code table
  breathes with proper column widths.
- Replaced analyst jargon: section headings are now "Raising the
  Contact-Count Threshold" and "Excluded List Codes by Contact
  Count" instead of R1/R3 labels.
- Removed "Distributors removed per Action 1" and other internal
  process references.
- Trimmed row labels: "McMaster-Carr Internal" and just "Total".

https://claude.ai/code/session_01PM89wz7vnfvW2NRaFUoooy
</commit_message>
<xml_diff>
--- a/Updating_SLV_Rules.docx
+++ b/Updating_SLV_Rules.docx
@@ -51,7 +51,7 @@
           <w:color w:val="2F4A7C"/>
           <w:sz w:val="28"/>
         </w:rPr>
-        <w:t>1. R1 Threshold Sensitivity</w:t>
+        <w:t>1. Raising the Contact-Count Threshold</w:t>
       </w:r>
     </w:p>
     <w:p>
@@ -62,7 +62,7 @@
         <w:rPr>
           <w:sz w:val="22"/>
         </w:rPr>
-        <w:t>R1 currently excludes CMFs with 10 or more active ordering contacts. The table shows what each higher threshold adds and where the residual tail sits. Universe is 545,030 CMFs and 16,985,084 orders after removing distributors (Action 1).</w:t>
+        <w:t>The current rule excludes any customer location with 10 or more active ordering contacts. The table shows how many additional customer locations and orders would be included at each higher threshold, and what would remain excluded even at 50 contacts.</w:t>
       </w:r>
     </w:p>
     <w:tbl>
@@ -72,20 +72,20 @@
         <w:tblLook w:firstColumn="1" w:firstRow="1" w:lastColumn="0" w:lastRow="0" w:noHBand="0" w:noVBand="1" w:val="04A0"/>
       </w:tblPr>
       <w:tblGrid>
-        <w:gridCol w:w="1872"/>
-        <w:gridCol w:w="1656"/>
-        <w:gridCol w:w="1080"/>
-        <w:gridCol w:w="2232"/>
-        <w:gridCol w:w="1944"/>
-        <w:gridCol w:w="1224"/>
+        <w:gridCol w:w="2160"/>
+        <w:gridCol w:w="2016"/>
+        <w:gridCol w:w="1440"/>
+        <w:gridCol w:w="2880"/>
+        <w:gridCol w:w="2448"/>
+        <w:gridCol w:w="1584"/>
       </w:tblGrid>
       <w:tr>
         <w:trPr>
-          <w:trHeight w:val="480" w:hRule="atLeast"/>
+          <w:trHeight w:val="440" w:hRule="atLeast"/>
         </w:trPr>
         <w:tc>
           <w:tcPr>
-            <w:tcW w:type="dxa" w:w="1680"/>
+            <w:tcW w:type="dxa" w:w="2160"/>
             <w:vAlign w:val="center"/>
             <w:tcBorders>
               <w:top w:val="single" w:sz="6" w:color="B0B7C3"/>
@@ -97,6 +97,7 @@
           </w:tcPr>
           <w:p>
             <w:pPr>
+              <w:spacing w:before="0" w:after="0"/>
               <w:jc w:val="left"/>
             </w:pPr>
             <w:r/>
@@ -104,7 +105,7 @@
               <w:rPr>
                 <w:b/>
                 <w:color w:val="FFFFFF"/>
-                <w:sz w:val="20"/>
+                <w:sz w:val="21"/>
               </w:rPr>
               <w:t>Threshold</w:t>
             </w:r>
@@ -112,7 +113,7 @@
         </w:tc>
         <w:tc>
           <w:tcPr>
-            <w:tcW w:type="dxa" w:w="1680"/>
+            <w:tcW w:type="dxa" w:w="2016"/>
             <w:vAlign w:val="center"/>
             <w:tcBorders>
               <w:top w:val="single" w:sz="6" w:color="B0B7C3"/>
@@ -124,6 +125,7 @@
           </w:tcPr>
           <w:p>
             <w:pPr>
+              <w:spacing w:before="0" w:after="0"/>
               <w:jc w:val="right"/>
             </w:pPr>
             <w:r/>
@@ -131,7 +133,7 @@
               <w:rPr>
                 <w:b/>
                 <w:color w:val="FFFFFF"/>
-                <w:sz w:val="20"/>
+                <w:sz w:val="21"/>
               </w:rPr>
               <w:t>Eligible CMFs</w:t>
             </w:r>
@@ -139,7 +141,7 @@
         </w:tc>
         <w:tc>
           <w:tcPr>
-            <w:tcW w:type="dxa" w:w="1680"/>
+            <w:tcW w:type="dxa" w:w="1440"/>
             <w:vAlign w:val="center"/>
             <w:tcBorders>
               <w:top w:val="single" w:sz="6" w:color="B0B7C3"/>
@@ -151,6 +153,7 @@
           </w:tcPr>
           <w:p>
             <w:pPr>
+              <w:spacing w:before="0" w:after="0"/>
               <w:jc w:val="right"/>
             </w:pPr>
             <w:r/>
@@ -158,7 +161,7 @@
               <w:rPr>
                 <w:b/>
                 <w:color w:val="FFFFFF"/>
-                <w:sz w:val="20"/>
+                <w:sz w:val="21"/>
               </w:rPr>
               <w:t>% CMFs</w:t>
             </w:r>
@@ -166,7 +169,7 @@
         </w:tc>
         <w:tc>
           <w:tcPr>
-            <w:tcW w:type="dxa" w:w="1680"/>
+            <w:tcW w:type="dxa" w:w="2880"/>
             <w:vAlign w:val="center"/>
             <w:tcBorders>
               <w:top w:val="single" w:sz="6" w:color="B0B7C3"/>
@@ -178,6 +181,7 @@
           </w:tcPr>
           <w:p>
             <w:pPr>
+              <w:spacing w:before="0" w:after="0"/>
               <w:jc w:val="right"/>
             </w:pPr>
             <w:r/>
@@ -185,7 +189,7 @@
               <w:rPr>
                 <w:b/>
                 <w:color w:val="FFFFFF"/>
-                <w:sz w:val="20"/>
+                <w:sz w:val="21"/>
               </w:rPr>
               <w:t>Eligible Orders (cumulative)</w:t>
             </w:r>
@@ -193,7 +197,7 @@
         </w:tc>
         <w:tc>
           <w:tcPr>
-            <w:tcW w:type="dxa" w:w="1680"/>
+            <w:tcW w:type="dxa" w:w="2448"/>
             <w:vAlign w:val="center"/>
             <w:tcBorders>
               <w:top w:val="single" w:sz="6" w:color="B0B7C3"/>
@@ -205,6 +209,7 @@
           </w:tcPr>
           <w:p>
             <w:pPr>
+              <w:spacing w:before="0" w:after="0"/>
               <w:jc w:val="right"/>
             </w:pPr>
             <w:r/>
@@ -212,7 +217,7 @@
               <w:rPr>
                 <w:b/>
                 <w:color w:val="FFFFFF"/>
-                <w:sz w:val="20"/>
+                <w:sz w:val="21"/>
               </w:rPr>
               <w:t>Marginal Orders (Δ)</w:t>
             </w:r>
@@ -220,7 +225,7 @@
         </w:tc>
         <w:tc>
           <w:tcPr>
-            <w:tcW w:type="dxa" w:w="1680"/>
+            <w:tcW w:type="dxa" w:w="1584"/>
             <w:vAlign w:val="center"/>
             <w:tcBorders>
               <w:top w:val="single" w:sz="6" w:color="B0B7C3"/>
@@ -232,6 +237,7 @@
           </w:tcPr>
           <w:p>
             <w:pPr>
+              <w:spacing w:before="0" w:after="0"/>
               <w:jc w:val="right"/>
             </w:pPr>
             <w:r/>
@@ -239,7 +245,7 @@
               <w:rPr>
                 <w:b/>
                 <w:color w:val="FFFFFF"/>
-                <w:sz w:val="20"/>
+                <w:sz w:val="21"/>
               </w:rPr>
               <w:t>% of Orders</w:t>
             </w:r>
@@ -247,9 +253,12 @@
         </w:tc>
       </w:tr>
       <w:tr>
+        <w:trPr>
+          <w:trHeight w:val="400" w:hRule="atLeast"/>
+        </w:trPr>
         <w:tc>
           <w:tcPr>
-            <w:tcW w:type="dxa" w:w="1680"/>
+            <w:tcW w:type="dxa" w:w="2160"/>
             <w:vAlign w:val="center"/>
             <w:tcBorders>
               <w:top w:val="single" w:sz="6" w:color="B0B7C3"/>
@@ -260,6 +269,7 @@
           </w:tcPr>
           <w:p>
             <w:pPr>
+              <w:spacing w:before="0" w:after="0"/>
               <w:jc w:val="left"/>
             </w:pPr>
             <w:r/>
@@ -275,7 +285,7 @@
         </w:tc>
         <w:tc>
           <w:tcPr>
-            <w:tcW w:type="dxa" w:w="1680"/>
+            <w:tcW w:type="dxa" w:w="2016"/>
             <w:vAlign w:val="center"/>
             <w:tcBorders>
               <w:top w:val="single" w:sz="6" w:color="B0B7C3"/>
@@ -286,6 +296,7 @@
           </w:tcPr>
           <w:p>
             <w:pPr>
+              <w:spacing w:before="0" w:after="0"/>
               <w:jc w:val="right"/>
             </w:pPr>
             <w:r/>
@@ -301,7 +312,7 @@
         </w:tc>
         <w:tc>
           <w:tcPr>
-            <w:tcW w:type="dxa" w:w="1680"/>
+            <w:tcW w:type="dxa" w:w="1440"/>
             <w:vAlign w:val="center"/>
             <w:tcBorders>
               <w:top w:val="single" w:sz="6" w:color="B0B7C3"/>
@@ -312,6 +323,7 @@
           </w:tcPr>
           <w:p>
             <w:pPr>
+              <w:spacing w:before="0" w:after="0"/>
               <w:jc w:val="right"/>
             </w:pPr>
             <w:r/>
@@ -327,7 +339,7 @@
         </w:tc>
         <w:tc>
           <w:tcPr>
-            <w:tcW w:type="dxa" w:w="1680"/>
+            <w:tcW w:type="dxa" w:w="2880"/>
             <w:vAlign w:val="center"/>
             <w:tcBorders>
               <w:top w:val="single" w:sz="6" w:color="B0B7C3"/>
@@ -338,6 +350,7 @@
           </w:tcPr>
           <w:p>
             <w:pPr>
+              <w:spacing w:before="0" w:after="0"/>
               <w:jc w:val="right"/>
             </w:pPr>
             <w:r/>
@@ -353,7 +366,7 @@
         </w:tc>
         <w:tc>
           <w:tcPr>
-            <w:tcW w:type="dxa" w:w="1680"/>
+            <w:tcW w:type="dxa" w:w="2448"/>
             <w:vAlign w:val="center"/>
             <w:tcBorders>
               <w:top w:val="single" w:sz="6" w:color="B0B7C3"/>
@@ -364,6 +377,7 @@
           </w:tcPr>
           <w:p>
             <w:pPr>
+              <w:spacing w:before="0" w:after="0"/>
               <w:jc w:val="right"/>
             </w:pPr>
             <w:r/>
@@ -379,7 +393,7 @@
         </w:tc>
         <w:tc>
           <w:tcPr>
-            <w:tcW w:type="dxa" w:w="1680"/>
+            <w:tcW w:type="dxa" w:w="1584"/>
             <w:vAlign w:val="center"/>
             <w:tcBorders>
               <w:top w:val="single" w:sz="6" w:color="B0B7C3"/>
@@ -390,6 +404,7 @@
           </w:tcPr>
           <w:p>
             <w:pPr>
+              <w:spacing w:before="0" w:after="0"/>
               <w:jc w:val="right"/>
             </w:pPr>
             <w:r/>
@@ -405,9 +420,12 @@
         </w:tc>
       </w:tr>
       <w:tr>
+        <w:trPr>
+          <w:trHeight w:val="400" w:hRule="atLeast"/>
+        </w:trPr>
         <w:tc>
           <w:tcPr>
-            <w:tcW w:type="dxa" w:w="1680"/>
+            <w:tcW w:type="dxa" w:w="2160"/>
             <w:vAlign w:val="center"/>
             <w:tcBorders>
               <w:top w:val="single" w:sz="6" w:color="B0B7C3"/>
@@ -419,6 +437,7 @@
           </w:tcPr>
           <w:p>
             <w:pPr>
+              <w:spacing w:before="0" w:after="0"/>
               <w:jc w:val="left"/>
             </w:pPr>
             <w:r/>
@@ -434,7 +453,7 @@
         </w:tc>
         <w:tc>
           <w:tcPr>
-            <w:tcW w:type="dxa" w:w="1680"/>
+            <w:tcW w:type="dxa" w:w="2016"/>
             <w:vAlign w:val="center"/>
             <w:tcBorders>
               <w:top w:val="single" w:sz="6" w:color="B0B7C3"/>
@@ -446,6 +465,7 @@
           </w:tcPr>
           <w:p>
             <w:pPr>
+              <w:spacing w:before="0" w:after="0"/>
               <w:jc w:val="right"/>
             </w:pPr>
             <w:r/>
@@ -461,7 +481,7 @@
         </w:tc>
         <w:tc>
           <w:tcPr>
-            <w:tcW w:type="dxa" w:w="1680"/>
+            <w:tcW w:type="dxa" w:w="1440"/>
             <w:vAlign w:val="center"/>
             <w:tcBorders>
               <w:top w:val="single" w:sz="6" w:color="B0B7C3"/>
@@ -473,6 +493,7 @@
           </w:tcPr>
           <w:p>
             <w:pPr>
+              <w:spacing w:before="0" w:after="0"/>
               <w:jc w:val="right"/>
             </w:pPr>
             <w:r/>
@@ -488,7 +509,7 @@
         </w:tc>
         <w:tc>
           <w:tcPr>
-            <w:tcW w:type="dxa" w:w="1680"/>
+            <w:tcW w:type="dxa" w:w="2880"/>
             <w:vAlign w:val="center"/>
             <w:tcBorders>
               <w:top w:val="single" w:sz="6" w:color="B0B7C3"/>
@@ -500,6 +521,7 @@
           </w:tcPr>
           <w:p>
             <w:pPr>
+              <w:spacing w:before="0" w:after="0"/>
               <w:jc w:val="right"/>
             </w:pPr>
             <w:r/>
@@ -515,7 +537,7 @@
         </w:tc>
         <w:tc>
           <w:tcPr>
-            <w:tcW w:type="dxa" w:w="1680"/>
+            <w:tcW w:type="dxa" w:w="2448"/>
             <w:vAlign w:val="center"/>
             <w:tcBorders>
               <w:top w:val="single" w:sz="6" w:color="B0B7C3"/>
@@ -527,6 +549,7 @@
           </w:tcPr>
           <w:p>
             <w:pPr>
+              <w:spacing w:before="0" w:after="0"/>
               <w:jc w:val="right"/>
             </w:pPr>
             <w:r/>
@@ -542,7 +565,7 @@
         </w:tc>
         <w:tc>
           <w:tcPr>
-            <w:tcW w:type="dxa" w:w="1680"/>
+            <w:tcW w:type="dxa" w:w="1584"/>
             <w:vAlign w:val="center"/>
             <w:tcBorders>
               <w:top w:val="single" w:sz="6" w:color="B0B7C3"/>
@@ -554,6 +577,7 @@
           </w:tcPr>
           <w:p>
             <w:pPr>
+              <w:spacing w:before="0" w:after="0"/>
               <w:jc w:val="right"/>
             </w:pPr>
             <w:r/>
@@ -569,9 +593,12 @@
         </w:tc>
       </w:tr>
       <w:tr>
+        <w:trPr>
+          <w:trHeight w:val="400" w:hRule="atLeast"/>
+        </w:trPr>
         <w:tc>
           <w:tcPr>
-            <w:tcW w:type="dxa" w:w="1680"/>
+            <w:tcW w:type="dxa" w:w="2160"/>
             <w:vAlign w:val="center"/>
             <w:tcBorders>
               <w:top w:val="single" w:sz="6" w:color="B0B7C3"/>
@@ -582,6 +609,7 @@
           </w:tcPr>
           <w:p>
             <w:pPr>
+              <w:spacing w:before="0" w:after="0"/>
               <w:jc w:val="left"/>
             </w:pPr>
             <w:r/>
@@ -597,7 +625,7 @@
         </w:tc>
         <w:tc>
           <w:tcPr>
-            <w:tcW w:type="dxa" w:w="1680"/>
+            <w:tcW w:type="dxa" w:w="2016"/>
             <w:vAlign w:val="center"/>
             <w:tcBorders>
               <w:top w:val="single" w:sz="6" w:color="B0B7C3"/>
@@ -608,6 +636,7 @@
           </w:tcPr>
           <w:p>
             <w:pPr>
+              <w:spacing w:before="0" w:after="0"/>
               <w:jc w:val="right"/>
             </w:pPr>
             <w:r/>
@@ -623,7 +652,7 @@
         </w:tc>
         <w:tc>
           <w:tcPr>
-            <w:tcW w:type="dxa" w:w="1680"/>
+            <w:tcW w:type="dxa" w:w="1440"/>
             <w:vAlign w:val="center"/>
             <w:tcBorders>
               <w:top w:val="single" w:sz="6" w:color="B0B7C3"/>
@@ -634,6 +663,7 @@
           </w:tcPr>
           <w:p>
             <w:pPr>
+              <w:spacing w:before="0" w:after="0"/>
               <w:jc w:val="right"/>
             </w:pPr>
             <w:r/>
@@ -649,7 +679,7 @@
         </w:tc>
         <w:tc>
           <w:tcPr>
-            <w:tcW w:type="dxa" w:w="1680"/>
+            <w:tcW w:type="dxa" w:w="2880"/>
             <w:vAlign w:val="center"/>
             <w:tcBorders>
               <w:top w:val="single" w:sz="6" w:color="B0B7C3"/>
@@ -660,6 +690,7 @@
           </w:tcPr>
           <w:p>
             <w:pPr>
+              <w:spacing w:before="0" w:after="0"/>
               <w:jc w:val="right"/>
             </w:pPr>
             <w:r/>
@@ -675,7 +706,7 @@
         </w:tc>
         <w:tc>
           <w:tcPr>
-            <w:tcW w:type="dxa" w:w="1680"/>
+            <w:tcW w:type="dxa" w:w="2448"/>
             <w:vAlign w:val="center"/>
             <w:tcBorders>
               <w:top w:val="single" w:sz="6" w:color="B0B7C3"/>
@@ -686,6 +717,7 @@
           </w:tcPr>
           <w:p>
             <w:pPr>
+              <w:spacing w:before="0" w:after="0"/>
               <w:jc w:val="right"/>
             </w:pPr>
             <w:r/>
@@ -701,7 +733,7 @@
         </w:tc>
         <w:tc>
           <w:tcPr>
-            <w:tcW w:type="dxa" w:w="1680"/>
+            <w:tcW w:type="dxa" w:w="1584"/>
             <w:vAlign w:val="center"/>
             <w:tcBorders>
               <w:top w:val="single" w:sz="6" w:color="B0B7C3"/>
@@ -712,6 +744,7 @@
           </w:tcPr>
           <w:p>
             <w:pPr>
+              <w:spacing w:before="0" w:after="0"/>
               <w:jc w:val="right"/>
             </w:pPr>
             <w:r/>
@@ -727,9 +760,12 @@
         </w:tc>
       </w:tr>
       <w:tr>
+        <w:trPr>
+          <w:trHeight w:val="400" w:hRule="atLeast"/>
+        </w:trPr>
         <w:tc>
           <w:tcPr>
-            <w:tcW w:type="dxa" w:w="1680"/>
+            <w:tcW w:type="dxa" w:w="2160"/>
             <w:vAlign w:val="center"/>
             <w:tcBorders>
               <w:top w:val="single" w:sz="6" w:color="B0B7C3"/>
@@ -741,6 +777,7 @@
           </w:tcPr>
           <w:p>
             <w:pPr>
+              <w:spacing w:before="0" w:after="0"/>
               <w:jc w:val="left"/>
             </w:pPr>
             <w:r/>
@@ -756,7 +793,7 @@
         </w:tc>
         <w:tc>
           <w:tcPr>
-            <w:tcW w:type="dxa" w:w="1680"/>
+            <w:tcW w:type="dxa" w:w="2016"/>
             <w:vAlign w:val="center"/>
             <w:tcBorders>
               <w:top w:val="single" w:sz="6" w:color="B0B7C3"/>
@@ -768,6 +805,7 @@
           </w:tcPr>
           <w:p>
             <w:pPr>
+              <w:spacing w:before="0" w:after="0"/>
               <w:jc w:val="right"/>
             </w:pPr>
             <w:r/>
@@ -783,7 +821,7 @@
         </w:tc>
         <w:tc>
           <w:tcPr>
-            <w:tcW w:type="dxa" w:w="1680"/>
+            <w:tcW w:type="dxa" w:w="1440"/>
             <w:vAlign w:val="center"/>
             <w:tcBorders>
               <w:top w:val="single" w:sz="6" w:color="B0B7C3"/>
@@ -795,6 +833,7 @@
           </w:tcPr>
           <w:p>
             <w:pPr>
+              <w:spacing w:before="0" w:after="0"/>
               <w:jc w:val="right"/>
             </w:pPr>
             <w:r/>
@@ -810,7 +849,7 @@
         </w:tc>
         <w:tc>
           <w:tcPr>
-            <w:tcW w:type="dxa" w:w="1680"/>
+            <w:tcW w:type="dxa" w:w="2880"/>
             <w:vAlign w:val="center"/>
             <w:tcBorders>
               <w:top w:val="single" w:sz="6" w:color="B0B7C3"/>
@@ -822,6 +861,7 @@
           </w:tcPr>
           <w:p>
             <w:pPr>
+              <w:spacing w:before="0" w:after="0"/>
               <w:jc w:val="right"/>
             </w:pPr>
             <w:r/>
@@ -837,7 +877,7 @@
         </w:tc>
         <w:tc>
           <w:tcPr>
-            <w:tcW w:type="dxa" w:w="1680"/>
+            <w:tcW w:type="dxa" w:w="2448"/>
             <w:vAlign w:val="center"/>
             <w:tcBorders>
               <w:top w:val="single" w:sz="6" w:color="B0B7C3"/>
@@ -849,6 +889,7 @@
           </w:tcPr>
           <w:p>
             <w:pPr>
+              <w:spacing w:before="0" w:after="0"/>
               <w:jc w:val="right"/>
             </w:pPr>
             <w:r/>
@@ -864,7 +905,7 @@
         </w:tc>
         <w:tc>
           <w:tcPr>
-            <w:tcW w:type="dxa" w:w="1680"/>
+            <w:tcW w:type="dxa" w:w="1584"/>
             <w:vAlign w:val="center"/>
             <w:tcBorders>
               <w:top w:val="single" w:sz="6" w:color="B0B7C3"/>
@@ -876,6 +917,7 @@
           </w:tcPr>
           <w:p>
             <w:pPr>
+              <w:spacing w:before="0" w:after="0"/>
               <w:jc w:val="right"/>
             </w:pPr>
             <w:r/>
@@ -891,9 +933,12 @@
         </w:tc>
       </w:tr>
       <w:tr>
+        <w:trPr>
+          <w:trHeight w:val="400" w:hRule="atLeast"/>
+        </w:trPr>
         <w:tc>
           <w:tcPr>
-            <w:tcW w:type="dxa" w:w="1680"/>
+            <w:tcW w:type="dxa" w:w="2160"/>
             <w:vAlign w:val="center"/>
             <w:tcBorders>
               <w:top w:val="single" w:sz="6" w:color="B0B7C3"/>
@@ -904,6 +949,7 @@
           </w:tcPr>
           <w:p>
             <w:pPr>
+              <w:spacing w:before="0" w:after="0"/>
               <w:jc w:val="left"/>
             </w:pPr>
             <w:r/>
@@ -919,7 +965,7 @@
         </w:tc>
         <w:tc>
           <w:tcPr>
-            <w:tcW w:type="dxa" w:w="1680"/>
+            <w:tcW w:type="dxa" w:w="2016"/>
             <w:vAlign w:val="center"/>
             <w:tcBorders>
               <w:top w:val="single" w:sz="6" w:color="B0B7C3"/>
@@ -930,6 +976,7 @@
           </w:tcPr>
           <w:p>
             <w:pPr>
+              <w:spacing w:before="0" w:after="0"/>
               <w:jc w:val="right"/>
             </w:pPr>
             <w:r/>
@@ -945,7 +992,7 @@
         </w:tc>
         <w:tc>
           <w:tcPr>
-            <w:tcW w:type="dxa" w:w="1680"/>
+            <w:tcW w:type="dxa" w:w="1440"/>
             <w:vAlign w:val="center"/>
             <w:tcBorders>
               <w:top w:val="single" w:sz="6" w:color="B0B7C3"/>
@@ -956,6 +1003,7 @@
           </w:tcPr>
           <w:p>
             <w:pPr>
+              <w:spacing w:before="0" w:after="0"/>
               <w:jc w:val="right"/>
             </w:pPr>
             <w:r/>
@@ -971,7 +1019,7 @@
         </w:tc>
         <w:tc>
           <w:tcPr>
-            <w:tcW w:type="dxa" w:w="1680"/>
+            <w:tcW w:type="dxa" w:w="2880"/>
             <w:vAlign w:val="center"/>
             <w:tcBorders>
               <w:top w:val="single" w:sz="6" w:color="B0B7C3"/>
@@ -982,6 +1030,7 @@
           </w:tcPr>
           <w:p>
             <w:pPr>
+              <w:spacing w:before="0" w:after="0"/>
               <w:jc w:val="right"/>
             </w:pPr>
             <w:r/>
@@ -997,7 +1046,7 @@
         </w:tc>
         <w:tc>
           <w:tcPr>
-            <w:tcW w:type="dxa" w:w="1680"/>
+            <w:tcW w:type="dxa" w:w="2448"/>
             <w:vAlign w:val="center"/>
             <w:tcBorders>
               <w:top w:val="single" w:sz="6" w:color="B0B7C3"/>
@@ -1008,6 +1057,7 @@
           </w:tcPr>
           <w:p>
             <w:pPr>
+              <w:spacing w:before="0" w:after="0"/>
               <w:jc w:val="right"/>
             </w:pPr>
             <w:r/>
@@ -1023,7 +1073,7 @@
         </w:tc>
         <w:tc>
           <w:tcPr>
-            <w:tcW w:type="dxa" w:w="1680"/>
+            <w:tcW w:type="dxa" w:w="1584"/>
             <w:vAlign w:val="center"/>
             <w:tcBorders>
               <w:top w:val="single" w:sz="6" w:color="B0B7C3"/>
@@ -1034,6 +1084,7 @@
           </w:tcPr>
           <w:p>
             <w:pPr>
+              <w:spacing w:before="0" w:after="0"/>
               <w:jc w:val="right"/>
             </w:pPr>
             <w:r/>
@@ -1049,9 +1100,12 @@
         </w:tc>
       </w:tr>
       <w:tr>
+        <w:trPr>
+          <w:trHeight w:val="400" w:hRule="atLeast"/>
+        </w:trPr>
         <w:tc>
           <w:tcPr>
-            <w:tcW w:type="dxa" w:w="1680"/>
+            <w:tcW w:type="dxa" w:w="2160"/>
             <w:vAlign w:val="center"/>
             <w:tcBorders>
               <w:top w:val="single" w:sz="6" w:color="B0B7C3"/>
@@ -1063,6 +1117,7 @@
           </w:tcPr>
           <w:p>
             <w:pPr>
+              <w:spacing w:before="0" w:after="0"/>
               <w:jc w:val="left"/>
             </w:pPr>
             <w:r/>
@@ -1078,7 +1133,7 @@
         </w:tc>
         <w:tc>
           <w:tcPr>
-            <w:tcW w:type="dxa" w:w="1680"/>
+            <w:tcW w:type="dxa" w:w="2016"/>
             <w:vAlign w:val="center"/>
             <w:tcBorders>
               <w:top w:val="single" w:sz="6" w:color="B0B7C3"/>
@@ -1090,6 +1145,7 @@
           </w:tcPr>
           <w:p>
             <w:pPr>
+              <w:spacing w:before="0" w:after="0"/>
               <w:jc w:val="right"/>
             </w:pPr>
             <w:r/>
@@ -1105,7 +1161,7 @@
         </w:tc>
         <w:tc>
           <w:tcPr>
-            <w:tcW w:type="dxa" w:w="1680"/>
+            <w:tcW w:type="dxa" w:w="1440"/>
             <w:vAlign w:val="center"/>
             <w:tcBorders>
               <w:top w:val="single" w:sz="6" w:color="B0B7C3"/>
@@ -1117,6 +1173,7 @@
           </w:tcPr>
           <w:p>
             <w:pPr>
+              <w:spacing w:before="0" w:after="0"/>
               <w:jc w:val="right"/>
             </w:pPr>
             <w:r/>
@@ -1132,7 +1189,7 @@
         </w:tc>
         <w:tc>
           <w:tcPr>
-            <w:tcW w:type="dxa" w:w="1680"/>
+            <w:tcW w:type="dxa" w:w="2880"/>
             <w:vAlign w:val="center"/>
             <w:tcBorders>
               <w:top w:val="single" w:sz="6" w:color="B0B7C3"/>
@@ -1144,6 +1201,7 @@
           </w:tcPr>
           <w:p>
             <w:pPr>
+              <w:spacing w:before="0" w:after="0"/>
               <w:jc w:val="right"/>
             </w:pPr>
             <w:r/>
@@ -1159,7 +1217,7 @@
         </w:tc>
         <w:tc>
           <w:tcPr>
-            <w:tcW w:type="dxa" w:w="1680"/>
+            <w:tcW w:type="dxa" w:w="2448"/>
             <w:vAlign w:val="center"/>
             <w:tcBorders>
               <w:top w:val="single" w:sz="6" w:color="B0B7C3"/>
@@ -1171,6 +1229,7 @@
           </w:tcPr>
           <w:p>
             <w:pPr>
+              <w:spacing w:before="0" w:after="0"/>
               <w:jc w:val="right"/>
             </w:pPr>
             <w:r/>
@@ -1186,7 +1245,7 @@
         </w:tc>
         <w:tc>
           <w:tcPr>
-            <w:tcW w:type="dxa" w:w="1680"/>
+            <w:tcW w:type="dxa" w:w="1584"/>
             <w:vAlign w:val="center"/>
             <w:tcBorders>
               <w:top w:val="single" w:sz="6" w:color="B0B7C3"/>
@@ -1198,6 +1257,7 @@
           </w:tcPr>
           <w:p>
             <w:pPr>
+              <w:spacing w:before="0" w:after="0"/>
               <w:jc w:val="right"/>
             </w:pPr>
             <w:r/>
@@ -1213,9 +1273,12 @@
         </w:tc>
       </w:tr>
       <w:tr>
+        <w:trPr>
+          <w:trHeight w:val="400" w:hRule="atLeast"/>
+        </w:trPr>
         <w:tc>
           <w:tcPr>
-            <w:tcW w:type="dxa" w:w="1680"/>
+            <w:tcW w:type="dxa" w:w="2160"/>
             <w:vAlign w:val="center"/>
             <w:tcBorders>
               <w:top w:val="single" w:sz="6" w:color="B0B7C3"/>
@@ -1227,6 +1290,7 @@
           </w:tcPr>
           <w:p>
             <w:pPr>
+              <w:spacing w:before="0" w:after="0"/>
               <w:jc w:val="left"/>
             </w:pPr>
             <w:r/>
@@ -1242,7 +1306,7 @@
         </w:tc>
         <w:tc>
           <w:tcPr>
-            <w:tcW w:type="dxa" w:w="1680"/>
+            <w:tcW w:type="dxa" w:w="2016"/>
             <w:vAlign w:val="center"/>
             <w:tcBorders>
               <w:top w:val="single" w:sz="6" w:color="B0B7C3"/>
@@ -1254,6 +1318,7 @@
           </w:tcPr>
           <w:p>
             <w:pPr>
+              <w:spacing w:before="0" w:after="0"/>
               <w:jc w:val="right"/>
             </w:pPr>
             <w:r/>
@@ -1269,7 +1334,7 @@
         </w:tc>
         <w:tc>
           <w:tcPr>
-            <w:tcW w:type="dxa" w:w="1680"/>
+            <w:tcW w:type="dxa" w:w="1440"/>
             <w:vAlign w:val="center"/>
             <w:tcBorders>
               <w:top w:val="single" w:sz="6" w:color="B0B7C3"/>
@@ -1281,6 +1346,7 @@
           </w:tcPr>
           <w:p>
             <w:pPr>
+              <w:spacing w:before="0" w:after="0"/>
               <w:jc w:val="right"/>
             </w:pPr>
             <w:r/>
@@ -1296,7 +1362,7 @@
         </w:tc>
         <w:tc>
           <w:tcPr>
-            <w:tcW w:type="dxa" w:w="1680"/>
+            <w:tcW w:type="dxa" w:w="2880"/>
             <w:vAlign w:val="center"/>
             <w:tcBorders>
               <w:top w:val="single" w:sz="6" w:color="B0B7C3"/>
@@ -1308,6 +1374,7 @@
           </w:tcPr>
           <w:p>
             <w:pPr>
+              <w:spacing w:before="0" w:after="0"/>
               <w:jc w:val="right"/>
             </w:pPr>
             <w:r/>
@@ -1323,7 +1390,7 @@
         </w:tc>
         <w:tc>
           <w:tcPr>
-            <w:tcW w:type="dxa" w:w="1680"/>
+            <w:tcW w:type="dxa" w:w="2448"/>
             <w:vAlign w:val="center"/>
             <w:tcBorders>
               <w:top w:val="single" w:sz="6" w:color="B0B7C3"/>
@@ -1335,6 +1402,7 @@
           </w:tcPr>
           <w:p>
             <w:pPr>
+              <w:spacing w:before="0" w:after="0"/>
               <w:jc w:val="right"/>
             </w:pPr>
             <w:r/>
@@ -1350,7 +1418,7 @@
         </w:tc>
         <w:tc>
           <w:tcPr>
-            <w:tcW w:type="dxa" w:w="1680"/>
+            <w:tcW w:type="dxa" w:w="1584"/>
             <w:vAlign w:val="center"/>
             <w:tcBorders>
               <w:top w:val="single" w:sz="6" w:color="B0B7C3"/>
@@ -1362,6 +1430,7 @@
           </w:tcPr>
           <w:p>
             <w:pPr>
+              <w:spacing w:before="0" w:after="0"/>
               <w:jc w:val="right"/>
             </w:pPr>
             <w:r/>
@@ -1387,7 +1456,7 @@
           <w:color w:val="2F4A7C"/>
           <w:sz w:val="28"/>
         </w:rPr>
-        <w:t>2. R3 Listcodes by Contact-Count Range</w:t>
+        <w:t>2. Excluded List Codes by Contact Count</w:t>
       </w:r>
     </w:p>
     <w:p>
@@ -1398,7 +1467,7 @@
         <w:rPr>
           <w:sz w:val="22"/>
         </w:rPr>
-        <w:t>For each R3-excluded listcode, CMFs and orders split by active-contact range. Distributors removed per Action 1.</w:t>
+        <w:t>The list codes below are excluded from Shipping Location View. For each, the number of customer locations and orders are broken out by active-contact range.</w:t>
       </w:r>
     </w:p>
     <w:tbl>
@@ -1408,20 +1477,20 @@
         <w:tblLook w:firstColumn="1" w:firstRow="1" w:lastColumn="0" w:lastRow="0" w:noHBand="0" w:noVBand="1" w:val="04A0"/>
       </w:tblPr>
       <w:tblGrid>
-        <w:gridCol w:w="792"/>
-        <w:gridCol w:w="2376"/>
-        <w:gridCol w:w="936"/>
-        <w:gridCol w:w="792"/>
-        <w:gridCol w:w="864"/>
-        <w:gridCol w:w="792"/>
+        <w:gridCol w:w="1008"/>
+        <w:gridCol w:w="3312"/>
+        <w:gridCol w:w="1224"/>
         <w:gridCol w:w="1080"/>
-        <w:gridCol w:w="864"/>
-        <w:gridCol w:w="936"/>
-        <w:gridCol w:w="864"/>
+        <w:gridCol w:w="1224"/>
+        <w:gridCol w:w="1080"/>
+        <w:gridCol w:w="1440"/>
+        <w:gridCol w:w="1224"/>
+        <w:gridCol w:w="1368"/>
+        <w:gridCol w:w="1224"/>
       </w:tblGrid>
       <w:tr>
         <w:trPr>
-          <w:trHeight w:val="640" w:hRule="atLeast"/>
+          <w:trHeight w:val="440" w:hRule="atLeast"/>
         </w:trPr>
         <w:tc>
           <w:tcPr>
@@ -1437,6 +1506,7 @@
           </w:tcPr>
           <w:p>
             <w:pPr>
+              <w:spacing w:before="0" w:after="0"/>
               <w:jc w:val="left"/>
             </w:pPr>
             <w:r/>
@@ -1444,15 +1514,15 @@
               <w:rPr>
                 <w:b/>
                 <w:color w:val="FFFFFF"/>
-                <w:sz w:val="19"/>
+                <w:sz w:val="20"/>
               </w:rPr>
-              <w:t>Listcode</w:t>
+              <w:t>List Code</w:t>
             </w:r>
           </w:p>
         </w:tc>
         <w:tc>
           <w:tcPr>
-            <w:tcW w:type="dxa" w:w="1008"/>
+            <w:tcW w:type="dxa" w:w="3312"/>
             <w:vAlign w:val="center"/>
             <w:tcBorders>
               <w:top w:val="single" w:sz="6" w:color="B0B7C3"/>
@@ -1464,6 +1534,7 @@
           </w:tcPr>
           <w:p>
             <w:pPr>
+              <w:spacing w:before="0" w:after="0"/>
               <w:jc w:val="left"/>
             </w:pPr>
             <w:r/>
@@ -1471,7 +1542,7 @@
               <w:rPr>
                 <w:b/>
                 <w:color w:val="FFFFFF"/>
-                <w:sz w:val="19"/>
+                <w:sz w:val="20"/>
               </w:rPr>
               <w:t>Category</w:t>
             </w:r>
@@ -1479,7 +1550,7 @@
         </w:tc>
         <w:tc>
           <w:tcPr>
-            <w:tcW w:type="dxa" w:w="1008"/>
+            <w:tcW w:type="dxa" w:w="1224"/>
             <w:vAlign w:val="center"/>
             <w:tcBorders>
               <w:top w:val="single" w:sz="6" w:color="B0B7C3"/>
@@ -1491,6 +1562,7 @@
           </w:tcPr>
           <w:p>
             <w:pPr>
+              <w:spacing w:before="0" w:after="0"/>
               <w:jc w:val="right"/>
             </w:pPr>
             <w:r/>
@@ -1498,17 +1570,15 @@
               <w:rPr>
                 <w:b/>
                 <w:color w:val="FFFFFF"/>
-                <w:sz w:val="19"/>
+                <w:sz w:val="20"/>
               </w:rPr>
-              <w:t>Total</w:t>
-              <w:br/>
-              <w:t>CMFs</w:t>
+              <w:t>Total CMFs</w:t>
             </w:r>
           </w:p>
         </w:tc>
         <w:tc>
           <w:tcPr>
-            <w:tcW w:type="dxa" w:w="1008"/>
+            <w:tcW w:type="dxa" w:w="1080"/>
             <w:vAlign w:val="center"/>
             <w:tcBorders>
               <w:top w:val="single" w:sz="6" w:color="B0B7C3"/>
@@ -1520,6 +1590,7 @@
           </w:tcPr>
           <w:p>
             <w:pPr>
+              <w:spacing w:before="0" w:after="0"/>
               <w:jc w:val="right"/>
             </w:pPr>
             <w:r/>
@@ -1527,17 +1598,15 @@
               <w:rPr>
                 <w:b/>
                 <w:color w:val="FFFFFF"/>
-                <w:sz w:val="19"/>
+                <w:sz w:val="20"/>
               </w:rPr>
-              <w:t>CMFs</w:t>
-              <w:br/>
-              <w:t>&lt;10</w:t>
+              <w:t>CMFs &lt;10</w:t>
             </w:r>
           </w:p>
         </w:tc>
         <w:tc>
           <w:tcPr>
-            <w:tcW w:type="dxa" w:w="1008"/>
+            <w:tcW w:type="dxa" w:w="1224"/>
             <w:vAlign w:val="center"/>
             <w:tcBorders>
               <w:top w:val="single" w:sz="6" w:color="B0B7C3"/>
@@ -1549,6 +1618,7 @@
           </w:tcPr>
           <w:p>
             <w:pPr>
+              <w:spacing w:before="0" w:after="0"/>
               <w:jc w:val="right"/>
             </w:pPr>
             <w:r/>
@@ -1556,17 +1626,15 @@
               <w:rPr>
                 <w:b/>
                 <w:color w:val="FFFFFF"/>
-                <w:sz w:val="19"/>
+                <w:sz w:val="20"/>
               </w:rPr>
-              <w:t>CMFs</w:t>
-              <w:br/>
-              <w:t>10–25</w:t>
+              <w:t>CMFs 10–25</w:t>
             </w:r>
           </w:p>
         </w:tc>
         <w:tc>
           <w:tcPr>
-            <w:tcW w:type="dxa" w:w="1008"/>
+            <w:tcW w:type="dxa" w:w="1080"/>
             <w:vAlign w:val="center"/>
             <w:tcBorders>
               <w:top w:val="single" w:sz="6" w:color="B0B7C3"/>
@@ -1578,6 +1646,7 @@
           </w:tcPr>
           <w:p>
             <w:pPr>
+              <w:spacing w:before="0" w:after="0"/>
               <w:jc w:val="right"/>
             </w:pPr>
             <w:r/>
@@ -1585,17 +1654,15 @@
               <w:rPr>
                 <w:b/>
                 <w:color w:val="FFFFFF"/>
-                <w:sz w:val="19"/>
+                <w:sz w:val="20"/>
               </w:rPr>
-              <w:t>CMFs</w:t>
-              <w:br/>
-              <w:t>25+</w:t>
+              <w:t>CMFs 25+</w:t>
             </w:r>
           </w:p>
         </w:tc>
         <w:tc>
           <w:tcPr>
-            <w:tcW w:type="dxa" w:w="1008"/>
+            <w:tcW w:type="dxa" w:w="1440"/>
             <w:vAlign w:val="center"/>
             <w:tcBorders>
               <w:top w:val="single" w:sz="6" w:color="B0B7C3"/>
@@ -1607,6 +1674,7 @@
           </w:tcPr>
           <w:p>
             <w:pPr>
+              <w:spacing w:before="0" w:after="0"/>
               <w:jc w:val="right"/>
             </w:pPr>
             <w:r/>
@@ -1614,17 +1682,15 @@
               <w:rPr>
                 <w:b/>
                 <w:color w:val="FFFFFF"/>
-                <w:sz w:val="19"/>
+                <w:sz w:val="20"/>
               </w:rPr>
-              <w:t>Total</w:t>
-              <w:br/>
-              <w:t>Orders</w:t>
+              <w:t>Total Orders</w:t>
             </w:r>
           </w:p>
         </w:tc>
         <w:tc>
           <w:tcPr>
-            <w:tcW w:type="dxa" w:w="1008"/>
+            <w:tcW w:type="dxa" w:w="1224"/>
             <w:vAlign w:val="center"/>
             <w:tcBorders>
               <w:top w:val="single" w:sz="6" w:color="B0B7C3"/>
@@ -1636,6 +1702,7 @@
           </w:tcPr>
           <w:p>
             <w:pPr>
+              <w:spacing w:before="0" w:after="0"/>
               <w:jc w:val="right"/>
             </w:pPr>
             <w:r/>
@@ -1643,17 +1710,15 @@
               <w:rPr>
                 <w:b/>
                 <w:color w:val="FFFFFF"/>
-                <w:sz w:val="19"/>
+                <w:sz w:val="20"/>
               </w:rPr>
-              <w:t>Orders</w:t>
-              <w:br/>
-              <w:t>&lt;10</w:t>
+              <w:t>Orders &lt;10</w:t>
             </w:r>
           </w:p>
         </w:tc>
         <w:tc>
           <w:tcPr>
-            <w:tcW w:type="dxa" w:w="1008"/>
+            <w:tcW w:type="dxa" w:w="1368"/>
             <w:vAlign w:val="center"/>
             <w:tcBorders>
               <w:top w:val="single" w:sz="6" w:color="B0B7C3"/>
@@ -1665,6 +1730,7 @@
           </w:tcPr>
           <w:p>
             <w:pPr>
+              <w:spacing w:before="0" w:after="0"/>
               <w:jc w:val="right"/>
             </w:pPr>
             <w:r/>
@@ -1672,17 +1738,15 @@
               <w:rPr>
                 <w:b/>
                 <w:color w:val="FFFFFF"/>
-                <w:sz w:val="19"/>
+                <w:sz w:val="20"/>
               </w:rPr>
-              <w:t>Orders</w:t>
-              <w:br/>
-              <w:t>10–25</w:t>
+              <w:t>Orders 10–25</w:t>
             </w:r>
           </w:p>
         </w:tc>
         <w:tc>
           <w:tcPr>
-            <w:tcW w:type="dxa" w:w="1008"/>
+            <w:tcW w:type="dxa" w:w="1224"/>
             <w:vAlign w:val="center"/>
             <w:tcBorders>
               <w:top w:val="single" w:sz="6" w:color="B0B7C3"/>
@@ -1694,6 +1758,7 @@
           </w:tcPr>
           <w:p>
             <w:pPr>
+              <w:spacing w:before="0" w:after="0"/>
               <w:jc w:val="right"/>
             </w:pPr>
             <w:r/>
@@ -1701,16 +1766,17 @@
               <w:rPr>
                 <w:b/>
                 <w:color w:val="FFFFFF"/>
-                <w:sz w:val="19"/>
+                <w:sz w:val="20"/>
               </w:rPr>
-              <w:t>Orders</w:t>
-              <w:br/>
-              <w:t>25+</w:t>
+              <w:t>Orders 25+</w:t>
             </w:r>
           </w:p>
         </w:tc>
       </w:tr>
       <w:tr>
+        <w:trPr>
+          <w:trHeight w:val="400" w:hRule="atLeast"/>
+        </w:trPr>
         <w:tc>
           <w:tcPr>
             <w:tcW w:type="dxa" w:w="1008"/>
@@ -1724,6 +1790,7 @@
           </w:tcPr>
           <w:p>
             <w:pPr>
+              <w:spacing w:before="0" w:after="0"/>
               <w:jc w:val="left"/>
             </w:pPr>
             <w:r/>
@@ -1731,7 +1798,7 @@
               <w:rPr>
                 <w:b w:val="0"/>
                 <w:color w:val="1A1A1A"/>
-                <w:sz w:val="19"/>
+                <w:sz w:val="20"/>
               </w:rPr>
               <w:t>05</w:t>
             </w:r>
@@ -1739,7 +1806,7 @@
         </w:tc>
         <w:tc>
           <w:tcPr>
-            <w:tcW w:type="dxa" w:w="1008"/>
+            <w:tcW w:type="dxa" w:w="3312"/>
             <w:vAlign w:val="center"/>
             <w:tcBorders>
               <w:top w:val="single" w:sz="6" w:color="B0B7C3"/>
@@ -1750,6 +1817,7 @@
           </w:tcPr>
           <w:p>
             <w:pPr>
+              <w:spacing w:before="0" w:after="0"/>
               <w:jc w:val="left"/>
             </w:pPr>
             <w:r/>
@@ -1757,7 +1825,7 @@
               <w:rPr>
                 <w:b w:val="0"/>
                 <w:color w:val="1A1A1A"/>
-                <w:sz w:val="19"/>
+                <w:sz w:val="20"/>
               </w:rPr>
               <w:t>Federal Gov (Domestic)</w:t>
             </w:r>
@@ -1765,7 +1833,7 @@
         </w:tc>
         <w:tc>
           <w:tcPr>
-            <w:tcW w:type="dxa" w:w="1008"/>
+            <w:tcW w:type="dxa" w:w="1224"/>
             <w:vAlign w:val="center"/>
             <w:tcBorders>
               <w:top w:val="single" w:sz="6" w:color="B0B7C3"/>
@@ -1776,6 +1844,7 @@
           </w:tcPr>
           <w:p>
             <w:pPr>
+              <w:spacing w:before="0" w:after="0"/>
               <w:jc w:val="right"/>
             </w:pPr>
             <w:r/>
@@ -1783,7 +1852,7 @@
               <w:rPr>
                 <w:b w:val="0"/>
                 <w:color w:val="1A1A1A"/>
-                <w:sz w:val="19"/>
+                <w:sz w:val="20"/>
               </w:rPr>
               <w:t>3,032</w:t>
             </w:r>
@@ -1791,7 +1860,7 @@
         </w:tc>
         <w:tc>
           <w:tcPr>
-            <w:tcW w:type="dxa" w:w="1008"/>
+            <w:tcW w:type="dxa" w:w="1080"/>
             <w:vAlign w:val="center"/>
             <w:tcBorders>
               <w:top w:val="single" w:sz="6" w:color="B0B7C3"/>
@@ -1802,6 +1871,7 @@
           </w:tcPr>
           <w:p>
             <w:pPr>
+              <w:spacing w:before="0" w:after="0"/>
               <w:jc w:val="right"/>
             </w:pPr>
             <w:r/>
@@ -1809,7 +1879,7 @@
               <w:rPr>
                 <w:b w:val="0"/>
                 <w:color w:val="1A1A1A"/>
-                <w:sz w:val="19"/>
+                <w:sz w:val="20"/>
               </w:rPr>
               <w:t>2,924</w:t>
             </w:r>
@@ -1817,7 +1887,7 @@
         </w:tc>
         <w:tc>
           <w:tcPr>
-            <w:tcW w:type="dxa" w:w="1008"/>
+            <w:tcW w:type="dxa" w:w="1224"/>
             <w:vAlign w:val="center"/>
             <w:tcBorders>
               <w:top w:val="single" w:sz="6" w:color="B0B7C3"/>
@@ -1828,6 +1898,7 @@
           </w:tcPr>
           <w:p>
             <w:pPr>
+              <w:spacing w:before="0" w:after="0"/>
               <w:jc w:val="right"/>
             </w:pPr>
             <w:r/>
@@ -1835,7 +1906,7 @@
               <w:rPr>
                 <w:b w:val="0"/>
                 <w:color w:val="1A1A1A"/>
-                <w:sz w:val="19"/>
+                <w:sz w:val="20"/>
               </w:rPr>
               <w:t>87</w:t>
             </w:r>
@@ -1843,7 +1914,7 @@
         </w:tc>
         <w:tc>
           <w:tcPr>
-            <w:tcW w:type="dxa" w:w="1008"/>
+            <w:tcW w:type="dxa" w:w="1080"/>
             <w:vAlign w:val="center"/>
             <w:tcBorders>
               <w:top w:val="single" w:sz="6" w:color="B0B7C3"/>
@@ -1854,6 +1925,7 @@
           </w:tcPr>
           <w:p>
             <w:pPr>
+              <w:spacing w:before="0" w:after="0"/>
               <w:jc w:val="right"/>
             </w:pPr>
             <w:r/>
@@ -1861,7 +1933,7 @@
               <w:rPr>
                 <w:b w:val="0"/>
                 <w:color w:val="1A1A1A"/>
-                <w:sz w:val="19"/>
+                <w:sz w:val="20"/>
               </w:rPr>
               <w:t>21</w:t>
             </w:r>
@@ -1869,7 +1941,7 @@
         </w:tc>
         <w:tc>
           <w:tcPr>
-            <w:tcW w:type="dxa" w:w="1008"/>
+            <w:tcW w:type="dxa" w:w="1440"/>
             <w:vAlign w:val="center"/>
             <w:tcBorders>
               <w:top w:val="single" w:sz="6" w:color="B0B7C3"/>
@@ -1880,6 +1952,7 @@
           </w:tcPr>
           <w:p>
             <w:pPr>
+              <w:spacing w:before="0" w:after="0"/>
               <w:jc w:val="right"/>
             </w:pPr>
             <w:r/>
@@ -1887,7 +1960,7 @@
               <w:rPr>
                 <w:b w:val="0"/>
                 <w:color w:val="1A1A1A"/>
-                <w:sz w:val="19"/>
+                <w:sz w:val="20"/>
               </w:rPr>
               <w:t>58,169</w:t>
             </w:r>
@@ -1895,7 +1968,7 @@
         </w:tc>
         <w:tc>
           <w:tcPr>
-            <w:tcW w:type="dxa" w:w="1008"/>
+            <w:tcW w:type="dxa" w:w="1224"/>
             <w:vAlign w:val="center"/>
             <w:tcBorders>
               <w:top w:val="single" w:sz="6" w:color="B0B7C3"/>
@@ -1906,6 +1979,7 @@
           </w:tcPr>
           <w:p>
             <w:pPr>
+              <w:spacing w:before="0" w:after="0"/>
               <w:jc w:val="right"/>
             </w:pPr>
             <w:r/>
@@ -1913,7 +1987,7 @@
               <w:rPr>
                 <w:b w:val="0"/>
                 <w:color w:val="1A1A1A"/>
-                <w:sz w:val="19"/>
+                <w:sz w:val="20"/>
               </w:rPr>
               <w:t>23,278</w:t>
             </w:r>
@@ -1921,7 +1995,7 @@
         </w:tc>
         <w:tc>
           <w:tcPr>
-            <w:tcW w:type="dxa" w:w="1008"/>
+            <w:tcW w:type="dxa" w:w="1368"/>
             <w:vAlign w:val="center"/>
             <w:tcBorders>
               <w:top w:val="single" w:sz="6" w:color="B0B7C3"/>
@@ -1932,6 +2006,7 @@
           </w:tcPr>
           <w:p>
             <w:pPr>
+              <w:spacing w:before="0" w:after="0"/>
               <w:jc w:val="right"/>
             </w:pPr>
             <w:r/>
@@ -1939,7 +2014,7 @@
               <w:rPr>
                 <w:b w:val="0"/>
                 <w:color w:val="1A1A1A"/>
-                <w:sz w:val="19"/>
+                <w:sz w:val="20"/>
               </w:rPr>
               <w:t>11,401</w:t>
             </w:r>
@@ -1947,7 +2022,7 @@
         </w:tc>
         <w:tc>
           <w:tcPr>
-            <w:tcW w:type="dxa" w:w="1008"/>
+            <w:tcW w:type="dxa" w:w="1224"/>
             <w:vAlign w:val="center"/>
             <w:tcBorders>
               <w:top w:val="single" w:sz="6" w:color="B0B7C3"/>
@@ -1958,6 +2033,7 @@
           </w:tcPr>
           <w:p>
             <w:pPr>
+              <w:spacing w:before="0" w:after="0"/>
               <w:jc w:val="right"/>
             </w:pPr>
             <w:r/>
@@ -1965,7 +2041,7 @@
               <w:rPr>
                 <w:b w:val="0"/>
                 <w:color w:val="1A1A1A"/>
-                <w:sz w:val="19"/>
+                <w:sz w:val="20"/>
               </w:rPr>
               <w:t>23,490</w:t>
             </w:r>
@@ -1973,6 +2049,9 @@
         </w:tc>
       </w:tr>
       <w:tr>
+        <w:trPr>
+          <w:trHeight w:val="400" w:hRule="atLeast"/>
+        </w:trPr>
         <w:tc>
           <w:tcPr>
             <w:tcW w:type="dxa" w:w="1008"/>
@@ -1987,6 +2066,7 @@
           </w:tcPr>
           <w:p>
             <w:pPr>
+              <w:spacing w:before="0" w:after="0"/>
               <w:jc w:val="left"/>
             </w:pPr>
             <w:r/>
@@ -1994,12 +2074,544 @@
               <w:rPr>
                 <w:b w:val="0"/>
                 <w:color w:val="1A1A1A"/>
-                <w:sz w:val="19"/>
+                <w:sz w:val="20"/>
               </w:rPr>
               <w:t>06</w:t>
             </w:r>
           </w:p>
         </w:tc>
+        <w:tc>
+          <w:tcPr>
+            <w:tcW w:type="dxa" w:w="3312"/>
+            <w:vAlign w:val="center"/>
+            <w:tcBorders>
+              <w:top w:val="single" w:sz="6" w:color="B0B7C3"/>
+              <w:left w:val="single" w:sz="6" w:color="B0B7C3"/>
+              <w:bottom w:val="single" w:sz="6" w:color="B0B7C3"/>
+              <w:right w:val="single" w:sz="6" w:color="B0B7C3"/>
+            </w:tcBorders>
+            <w:shd w:fill="F6F7FA" w:val="clear"/>
+          </w:tcPr>
+          <w:p>
+            <w:pPr>
+              <w:spacing w:before="0" w:after="0"/>
+              <w:jc w:val="left"/>
+            </w:pPr>
+            <w:r/>
+            <w:r>
+              <w:rPr>
+                <w:b w:val="0"/>
+                <w:color w:val="1A1A1A"/>
+                <w:sz w:val="20"/>
+              </w:rPr>
+              <w:t>Federal Gov (APO/FPO)</w:t>
+            </w:r>
+          </w:p>
+        </w:tc>
+        <w:tc>
+          <w:tcPr>
+            <w:tcW w:type="dxa" w:w="1224"/>
+            <w:vAlign w:val="center"/>
+            <w:tcBorders>
+              <w:top w:val="single" w:sz="6" w:color="B0B7C3"/>
+              <w:left w:val="single" w:sz="6" w:color="B0B7C3"/>
+              <w:bottom w:val="single" w:sz="6" w:color="B0B7C3"/>
+              <w:right w:val="single" w:sz="6" w:color="B0B7C3"/>
+            </w:tcBorders>
+            <w:shd w:fill="F6F7FA" w:val="clear"/>
+          </w:tcPr>
+          <w:p>
+            <w:pPr>
+              <w:spacing w:before="0" w:after="0"/>
+              <w:jc w:val="right"/>
+            </w:pPr>
+            <w:r/>
+            <w:r>
+              <w:rPr>
+                <w:b w:val="0"/>
+                <w:color w:val="1A1A1A"/>
+                <w:sz w:val="20"/>
+              </w:rPr>
+              <w:t>186</w:t>
+            </w:r>
+          </w:p>
+        </w:tc>
+        <w:tc>
+          <w:tcPr>
+            <w:tcW w:type="dxa" w:w="1080"/>
+            <w:vAlign w:val="center"/>
+            <w:tcBorders>
+              <w:top w:val="single" w:sz="6" w:color="B0B7C3"/>
+              <w:left w:val="single" w:sz="6" w:color="B0B7C3"/>
+              <w:bottom w:val="single" w:sz="6" w:color="B0B7C3"/>
+              <w:right w:val="single" w:sz="6" w:color="B0B7C3"/>
+            </w:tcBorders>
+            <w:shd w:fill="F6F7FA" w:val="clear"/>
+          </w:tcPr>
+          <w:p>
+            <w:pPr>
+              <w:spacing w:before="0" w:after="0"/>
+              <w:jc w:val="right"/>
+            </w:pPr>
+            <w:r/>
+            <w:r>
+              <w:rPr>
+                <w:b w:val="0"/>
+                <w:color w:val="1A1A1A"/>
+                <w:sz w:val="20"/>
+              </w:rPr>
+              <w:t>185</w:t>
+            </w:r>
+          </w:p>
+        </w:tc>
+        <w:tc>
+          <w:tcPr>
+            <w:tcW w:type="dxa" w:w="1224"/>
+            <w:vAlign w:val="center"/>
+            <w:tcBorders>
+              <w:top w:val="single" w:sz="6" w:color="B0B7C3"/>
+              <w:left w:val="single" w:sz="6" w:color="B0B7C3"/>
+              <w:bottom w:val="single" w:sz="6" w:color="B0B7C3"/>
+              <w:right w:val="single" w:sz="6" w:color="B0B7C3"/>
+            </w:tcBorders>
+            <w:shd w:fill="F6F7FA" w:val="clear"/>
+          </w:tcPr>
+          <w:p>
+            <w:pPr>
+              <w:spacing w:before="0" w:after="0"/>
+              <w:jc w:val="right"/>
+            </w:pPr>
+            <w:r/>
+            <w:r>
+              <w:rPr>
+                <w:b w:val="0"/>
+                <w:color w:val="1A1A1A"/>
+                <w:sz w:val="20"/>
+              </w:rPr>
+              <w:t>1</w:t>
+            </w:r>
+          </w:p>
+        </w:tc>
+        <w:tc>
+          <w:tcPr>
+            <w:tcW w:type="dxa" w:w="1080"/>
+            <w:vAlign w:val="center"/>
+            <w:tcBorders>
+              <w:top w:val="single" w:sz="6" w:color="B0B7C3"/>
+              <w:left w:val="single" w:sz="6" w:color="B0B7C3"/>
+              <w:bottom w:val="single" w:sz="6" w:color="B0B7C3"/>
+              <w:right w:val="single" w:sz="6" w:color="B0B7C3"/>
+            </w:tcBorders>
+            <w:shd w:fill="F6F7FA" w:val="clear"/>
+          </w:tcPr>
+          <w:p>
+            <w:pPr>
+              <w:spacing w:before="0" w:after="0"/>
+              <w:jc w:val="right"/>
+            </w:pPr>
+            <w:r/>
+            <w:r>
+              <w:rPr>
+                <w:b w:val="0"/>
+                <w:color w:val="1A1A1A"/>
+                <w:sz w:val="20"/>
+              </w:rPr>
+              <w:t>0</w:t>
+            </w:r>
+          </w:p>
+        </w:tc>
+        <w:tc>
+          <w:tcPr>
+            <w:tcW w:type="dxa" w:w="1440"/>
+            <w:vAlign w:val="center"/>
+            <w:tcBorders>
+              <w:top w:val="single" w:sz="6" w:color="B0B7C3"/>
+              <w:left w:val="single" w:sz="6" w:color="B0B7C3"/>
+              <w:bottom w:val="single" w:sz="6" w:color="B0B7C3"/>
+              <w:right w:val="single" w:sz="6" w:color="B0B7C3"/>
+            </w:tcBorders>
+            <w:shd w:fill="F6F7FA" w:val="clear"/>
+          </w:tcPr>
+          <w:p>
+            <w:pPr>
+              <w:spacing w:before="0" w:after="0"/>
+              <w:jc w:val="right"/>
+            </w:pPr>
+            <w:r/>
+            <w:r>
+              <w:rPr>
+                <w:b w:val="0"/>
+                <w:color w:val="1A1A1A"/>
+                <w:sz w:val="20"/>
+              </w:rPr>
+              <w:t>786</w:t>
+            </w:r>
+          </w:p>
+        </w:tc>
+        <w:tc>
+          <w:tcPr>
+            <w:tcW w:type="dxa" w:w="1224"/>
+            <w:vAlign w:val="center"/>
+            <w:tcBorders>
+              <w:top w:val="single" w:sz="6" w:color="B0B7C3"/>
+              <w:left w:val="single" w:sz="6" w:color="B0B7C3"/>
+              <w:bottom w:val="single" w:sz="6" w:color="B0B7C3"/>
+              <w:right w:val="single" w:sz="6" w:color="B0B7C3"/>
+            </w:tcBorders>
+            <w:shd w:fill="F6F7FA" w:val="clear"/>
+          </w:tcPr>
+          <w:p>
+            <w:pPr>
+              <w:spacing w:before="0" w:after="0"/>
+              <w:jc w:val="right"/>
+            </w:pPr>
+            <w:r/>
+            <w:r>
+              <w:rPr>
+                <w:b w:val="0"/>
+                <w:color w:val="1A1A1A"/>
+                <w:sz w:val="20"/>
+              </w:rPr>
+              <w:t>705</w:t>
+            </w:r>
+          </w:p>
+        </w:tc>
+        <w:tc>
+          <w:tcPr>
+            <w:tcW w:type="dxa" w:w="1368"/>
+            <w:vAlign w:val="center"/>
+            <w:tcBorders>
+              <w:top w:val="single" w:sz="6" w:color="B0B7C3"/>
+              <w:left w:val="single" w:sz="6" w:color="B0B7C3"/>
+              <w:bottom w:val="single" w:sz="6" w:color="B0B7C3"/>
+              <w:right w:val="single" w:sz="6" w:color="B0B7C3"/>
+            </w:tcBorders>
+            <w:shd w:fill="F6F7FA" w:val="clear"/>
+          </w:tcPr>
+          <w:p>
+            <w:pPr>
+              <w:spacing w:before="0" w:after="0"/>
+              <w:jc w:val="right"/>
+            </w:pPr>
+            <w:r/>
+            <w:r>
+              <w:rPr>
+                <w:b w:val="0"/>
+                <w:color w:val="1A1A1A"/>
+                <w:sz w:val="20"/>
+              </w:rPr>
+              <w:t>81</w:t>
+            </w:r>
+          </w:p>
+        </w:tc>
+        <w:tc>
+          <w:tcPr>
+            <w:tcW w:type="dxa" w:w="1224"/>
+            <w:vAlign w:val="center"/>
+            <w:tcBorders>
+              <w:top w:val="single" w:sz="6" w:color="B0B7C3"/>
+              <w:left w:val="single" w:sz="6" w:color="B0B7C3"/>
+              <w:bottom w:val="single" w:sz="6" w:color="B0B7C3"/>
+              <w:right w:val="single" w:sz="6" w:color="B0B7C3"/>
+            </w:tcBorders>
+            <w:shd w:fill="F6F7FA" w:val="clear"/>
+          </w:tcPr>
+          <w:p>
+            <w:pPr>
+              <w:spacing w:before="0" w:after="0"/>
+              <w:jc w:val="right"/>
+            </w:pPr>
+            <w:r/>
+            <w:r>
+              <w:rPr>
+                <w:b w:val="0"/>
+                <w:color w:val="1A1A1A"/>
+                <w:sz w:val="20"/>
+              </w:rPr>
+              <w:t>0</w:t>
+            </w:r>
+          </w:p>
+        </w:tc>
+      </w:tr>
+      <w:tr>
+        <w:trPr>
+          <w:trHeight w:val="400" w:hRule="atLeast"/>
+        </w:trPr>
+        <w:tc>
+          <w:tcPr>
+            <w:tcW w:type="dxa" w:w="1008"/>
+            <w:vAlign w:val="center"/>
+            <w:tcBorders>
+              <w:top w:val="single" w:sz="6" w:color="B0B7C3"/>
+              <w:left w:val="single" w:sz="6" w:color="B0B7C3"/>
+              <w:bottom w:val="single" w:sz="6" w:color="B0B7C3"/>
+              <w:right w:val="single" w:sz="6" w:color="B0B7C3"/>
+            </w:tcBorders>
+          </w:tcPr>
+          <w:p>
+            <w:pPr>
+              <w:spacing w:before="0" w:after="0"/>
+              <w:jc w:val="left"/>
+            </w:pPr>
+            <w:r/>
+            <w:r>
+              <w:rPr>
+                <w:b w:val="0"/>
+                <w:color w:val="1A1A1A"/>
+                <w:sz w:val="20"/>
+              </w:rPr>
+              <w:t>07</w:t>
+            </w:r>
+          </w:p>
+        </w:tc>
+        <w:tc>
+          <w:tcPr>
+            <w:tcW w:type="dxa" w:w="3312"/>
+            <w:vAlign w:val="center"/>
+            <w:tcBorders>
+              <w:top w:val="single" w:sz="6" w:color="B0B7C3"/>
+              <w:left w:val="single" w:sz="6" w:color="B0B7C3"/>
+              <w:bottom w:val="single" w:sz="6" w:color="B0B7C3"/>
+              <w:right w:val="single" w:sz="6" w:color="B0B7C3"/>
+            </w:tcBorders>
+          </w:tcPr>
+          <w:p>
+            <w:pPr>
+              <w:spacing w:before="0" w:after="0"/>
+              <w:jc w:val="left"/>
+            </w:pPr>
+            <w:r/>
+            <w:r>
+              <w:rPr>
+                <w:b w:val="0"/>
+                <w:color w:val="1A1A1A"/>
+                <w:sz w:val="20"/>
+              </w:rPr>
+              <w:t>State Gov</w:t>
+            </w:r>
+          </w:p>
+        </w:tc>
+        <w:tc>
+          <w:tcPr>
+            <w:tcW w:type="dxa" w:w="1224"/>
+            <w:vAlign w:val="center"/>
+            <w:tcBorders>
+              <w:top w:val="single" w:sz="6" w:color="B0B7C3"/>
+              <w:left w:val="single" w:sz="6" w:color="B0B7C3"/>
+              <w:bottom w:val="single" w:sz="6" w:color="B0B7C3"/>
+              <w:right w:val="single" w:sz="6" w:color="B0B7C3"/>
+            </w:tcBorders>
+          </w:tcPr>
+          <w:p>
+            <w:pPr>
+              <w:spacing w:before="0" w:after="0"/>
+              <w:jc w:val="right"/>
+            </w:pPr>
+            <w:r/>
+            <w:r>
+              <w:rPr>
+                <w:b w:val="0"/>
+                <w:color w:val="1A1A1A"/>
+                <w:sz w:val="20"/>
+              </w:rPr>
+              <w:t>6,798</w:t>
+            </w:r>
+          </w:p>
+        </w:tc>
+        <w:tc>
+          <w:tcPr>
+            <w:tcW w:type="dxa" w:w="1080"/>
+            <w:vAlign w:val="center"/>
+            <w:tcBorders>
+              <w:top w:val="single" w:sz="6" w:color="B0B7C3"/>
+              <w:left w:val="single" w:sz="6" w:color="B0B7C3"/>
+              <w:bottom w:val="single" w:sz="6" w:color="B0B7C3"/>
+              <w:right w:val="single" w:sz="6" w:color="B0B7C3"/>
+            </w:tcBorders>
+          </w:tcPr>
+          <w:p>
+            <w:pPr>
+              <w:spacing w:before="0" w:after="0"/>
+              <w:jc w:val="right"/>
+            </w:pPr>
+            <w:r/>
+            <w:r>
+              <w:rPr>
+                <w:b w:val="0"/>
+                <w:color w:val="1A1A1A"/>
+                <w:sz w:val="20"/>
+              </w:rPr>
+              <w:t>6,282</w:t>
+            </w:r>
+          </w:p>
+        </w:tc>
+        <w:tc>
+          <w:tcPr>
+            <w:tcW w:type="dxa" w:w="1224"/>
+            <w:vAlign w:val="center"/>
+            <w:tcBorders>
+              <w:top w:val="single" w:sz="6" w:color="B0B7C3"/>
+              <w:left w:val="single" w:sz="6" w:color="B0B7C3"/>
+              <w:bottom w:val="single" w:sz="6" w:color="B0B7C3"/>
+              <w:right w:val="single" w:sz="6" w:color="B0B7C3"/>
+            </w:tcBorders>
+          </w:tcPr>
+          <w:p>
+            <w:pPr>
+              <w:spacing w:before="0" w:after="0"/>
+              <w:jc w:val="right"/>
+            </w:pPr>
+            <w:r/>
+            <w:r>
+              <w:rPr>
+                <w:b w:val="0"/>
+                <w:color w:val="1A1A1A"/>
+                <w:sz w:val="20"/>
+              </w:rPr>
+              <w:t>382</w:t>
+            </w:r>
+          </w:p>
+        </w:tc>
+        <w:tc>
+          <w:tcPr>
+            <w:tcW w:type="dxa" w:w="1080"/>
+            <w:vAlign w:val="center"/>
+            <w:tcBorders>
+              <w:top w:val="single" w:sz="6" w:color="B0B7C3"/>
+              <w:left w:val="single" w:sz="6" w:color="B0B7C3"/>
+              <w:bottom w:val="single" w:sz="6" w:color="B0B7C3"/>
+              <w:right w:val="single" w:sz="6" w:color="B0B7C3"/>
+            </w:tcBorders>
+          </w:tcPr>
+          <w:p>
+            <w:pPr>
+              <w:spacing w:before="0" w:after="0"/>
+              <w:jc w:val="right"/>
+            </w:pPr>
+            <w:r/>
+            <w:r>
+              <w:rPr>
+                <w:b w:val="0"/>
+                <w:color w:val="1A1A1A"/>
+                <w:sz w:val="20"/>
+              </w:rPr>
+              <w:t>134</w:t>
+            </w:r>
+          </w:p>
+        </w:tc>
+        <w:tc>
+          <w:tcPr>
+            <w:tcW w:type="dxa" w:w="1440"/>
+            <w:vAlign w:val="center"/>
+            <w:tcBorders>
+              <w:top w:val="single" w:sz="6" w:color="B0B7C3"/>
+              <w:left w:val="single" w:sz="6" w:color="B0B7C3"/>
+              <w:bottom w:val="single" w:sz="6" w:color="B0B7C3"/>
+              <w:right w:val="single" w:sz="6" w:color="B0B7C3"/>
+            </w:tcBorders>
+          </w:tcPr>
+          <w:p>
+            <w:pPr>
+              <w:spacing w:before="0" w:after="0"/>
+              <w:jc w:val="right"/>
+            </w:pPr>
+            <w:r/>
+            <w:r>
+              <w:rPr>
+                <w:b w:val="0"/>
+                <w:color w:val="1A1A1A"/>
+                <w:sz w:val="20"/>
+              </w:rPr>
+              <w:t>184,911</w:t>
+            </w:r>
+          </w:p>
+        </w:tc>
+        <w:tc>
+          <w:tcPr>
+            <w:tcW w:type="dxa" w:w="1224"/>
+            <w:vAlign w:val="center"/>
+            <w:tcBorders>
+              <w:top w:val="single" w:sz="6" w:color="B0B7C3"/>
+              <w:left w:val="single" w:sz="6" w:color="B0B7C3"/>
+              <w:bottom w:val="single" w:sz="6" w:color="B0B7C3"/>
+              <w:right w:val="single" w:sz="6" w:color="B0B7C3"/>
+            </w:tcBorders>
+          </w:tcPr>
+          <w:p>
+            <w:pPr>
+              <w:spacing w:before="0" w:after="0"/>
+              <w:jc w:val="right"/>
+            </w:pPr>
+            <w:r/>
+            <w:r>
+              <w:rPr>
+                <w:b w:val="0"/>
+                <w:color w:val="1A1A1A"/>
+                <w:sz w:val="20"/>
+              </w:rPr>
+              <w:t>86,816</w:t>
+            </w:r>
+          </w:p>
+        </w:tc>
+        <w:tc>
+          <w:tcPr>
+            <w:tcW w:type="dxa" w:w="1368"/>
+            <w:vAlign w:val="center"/>
+            <w:tcBorders>
+              <w:top w:val="single" w:sz="6" w:color="B0B7C3"/>
+              <w:left w:val="single" w:sz="6" w:color="B0B7C3"/>
+              <w:bottom w:val="single" w:sz="6" w:color="B0B7C3"/>
+              <w:right w:val="single" w:sz="6" w:color="B0B7C3"/>
+            </w:tcBorders>
+          </w:tcPr>
+          <w:p>
+            <w:pPr>
+              <w:spacing w:before="0" w:after="0"/>
+              <w:jc w:val="right"/>
+            </w:pPr>
+            <w:r/>
+            <w:r>
+              <w:rPr>
+                <w:b w:val="0"/>
+                <w:color w:val="1A1A1A"/>
+                <w:sz w:val="20"/>
+              </w:rPr>
+              <w:t>43,295</w:t>
+            </w:r>
+          </w:p>
+        </w:tc>
+        <w:tc>
+          <w:tcPr>
+            <w:tcW w:type="dxa" w:w="1224"/>
+            <w:vAlign w:val="center"/>
+            <w:tcBorders>
+              <w:top w:val="single" w:sz="6" w:color="B0B7C3"/>
+              <w:left w:val="single" w:sz="6" w:color="B0B7C3"/>
+              <w:bottom w:val="single" w:sz="6" w:color="B0B7C3"/>
+              <w:right w:val="single" w:sz="6" w:color="B0B7C3"/>
+            </w:tcBorders>
+          </w:tcPr>
+          <w:p>
+            <w:pPr>
+              <w:spacing w:before="0" w:after="0"/>
+              <w:jc w:val="right"/>
+            </w:pPr>
+            <w:r/>
+            <w:r>
+              <w:rPr>
+                <w:b w:val="0"/>
+                <w:color w:val="1A1A1A"/>
+                <w:sz w:val="20"/>
+              </w:rPr>
+              <w:t>54,800</w:t>
+            </w:r>
+          </w:p>
+        </w:tc>
+      </w:tr>
+      <w:tr>
+        <w:trPr>
+          <w:trHeight w:val="400" w:hRule="atLeast"/>
+        </w:trPr>
         <w:tc>
           <w:tcPr>
             <w:tcW w:type="dxa" w:w="1008"/>
@@ -2014,6 +2626,7 @@
           </w:tcPr>
           <w:p>
             <w:pPr>
+              <w:spacing w:before="0" w:after="0"/>
               <w:jc w:val="left"/>
             </w:pPr>
             <w:r/>
@@ -2021,15 +2634,15 @@
               <w:rPr>
                 <w:b w:val="0"/>
                 <w:color w:val="1A1A1A"/>
-                <w:sz w:val="19"/>
+                <w:sz w:val="20"/>
               </w:rPr>
-              <w:t>Federal Gov (APO/FPO)</w:t>
+              <w:t>08</w:t>
             </w:r>
           </w:p>
         </w:tc>
         <w:tc>
           <w:tcPr>
-            <w:tcW w:type="dxa" w:w="1008"/>
+            <w:tcW w:type="dxa" w:w="3312"/>
             <w:vAlign w:val="center"/>
             <w:tcBorders>
               <w:top w:val="single" w:sz="6" w:color="B0B7C3"/>
@@ -2041,22 +2654,23 @@
           </w:tcPr>
           <w:p>
             <w:pPr>
-              <w:jc w:val="right"/>
+              <w:spacing w:before="0" w:after="0"/>
+              <w:jc w:val="left"/>
             </w:pPr>
             <w:r/>
             <w:r>
               <w:rPr>
                 <w:b w:val="0"/>
                 <w:color w:val="1A1A1A"/>
-                <w:sz w:val="19"/>
+                <w:sz w:val="20"/>
               </w:rPr>
-              <w:t>186</w:t>
+              <w:t>Municipal / Private Institute</w:t>
             </w:r>
           </w:p>
         </w:tc>
         <w:tc>
           <w:tcPr>
-            <w:tcW w:type="dxa" w:w="1008"/>
+            <w:tcW w:type="dxa" w:w="1224"/>
             <w:vAlign w:val="center"/>
             <w:tcBorders>
               <w:top w:val="single" w:sz="6" w:color="B0B7C3"/>
@@ -2068,6 +2682,7 @@
           </w:tcPr>
           <w:p>
             <w:pPr>
+              <w:spacing w:before="0" w:after="0"/>
               <w:jc w:val="right"/>
             </w:pPr>
             <w:r/>
@@ -2075,15 +2690,15 @@
               <w:rPr>
                 <w:b w:val="0"/>
                 <w:color w:val="1A1A1A"/>
-                <w:sz w:val="19"/>
+                <w:sz w:val="20"/>
               </w:rPr>
-              <w:t>185</w:t>
+              <w:t>16,009</w:t>
             </w:r>
           </w:p>
         </w:tc>
         <w:tc>
           <w:tcPr>
-            <w:tcW w:type="dxa" w:w="1008"/>
+            <w:tcW w:type="dxa" w:w="1080"/>
             <w:vAlign w:val="center"/>
             <w:tcBorders>
               <w:top w:val="single" w:sz="6" w:color="B0B7C3"/>
@@ -2095,6 +2710,7 @@
           </w:tcPr>
           <w:p>
             <w:pPr>
+              <w:spacing w:before="0" w:after="0"/>
               <w:jc w:val="right"/>
             </w:pPr>
             <w:r/>
@@ -2102,15 +2718,15 @@
               <w:rPr>
                 <w:b w:val="0"/>
                 <w:color w:val="1A1A1A"/>
-                <w:sz w:val="19"/>
+                <w:sz w:val="20"/>
               </w:rPr>
-              <w:t>1</w:t>
+              <w:t>15,787</w:t>
             </w:r>
           </w:p>
         </w:tc>
         <w:tc>
           <w:tcPr>
-            <w:tcW w:type="dxa" w:w="1008"/>
+            <w:tcW w:type="dxa" w:w="1224"/>
             <w:vAlign w:val="center"/>
             <w:tcBorders>
               <w:top w:val="single" w:sz="6" w:color="B0B7C3"/>
@@ -2122,6 +2738,7 @@
           </w:tcPr>
           <w:p>
             <w:pPr>
+              <w:spacing w:before="0" w:after="0"/>
               <w:jc w:val="right"/>
             </w:pPr>
             <w:r/>
@@ -2129,15 +2746,15 @@
               <w:rPr>
                 <w:b w:val="0"/>
                 <w:color w:val="1A1A1A"/>
-                <w:sz w:val="19"/>
+                <w:sz w:val="20"/>
               </w:rPr>
-              <w:t>0</w:t>
+              <w:t>176</w:t>
             </w:r>
           </w:p>
         </w:tc>
         <w:tc>
           <w:tcPr>
-            <w:tcW w:type="dxa" w:w="1008"/>
+            <w:tcW w:type="dxa" w:w="1080"/>
             <w:vAlign w:val="center"/>
             <w:tcBorders>
               <w:top w:val="single" w:sz="6" w:color="B0B7C3"/>
@@ -2149,6 +2766,7 @@
           </w:tcPr>
           <w:p>
             <w:pPr>
+              <w:spacing w:before="0" w:after="0"/>
               <w:jc w:val="right"/>
             </w:pPr>
             <w:r/>
@@ -2156,15 +2774,15 @@
               <w:rPr>
                 <w:b w:val="0"/>
                 <w:color w:val="1A1A1A"/>
-                <w:sz w:val="19"/>
+                <w:sz w:val="20"/>
               </w:rPr>
-              <w:t>786</w:t>
+              <w:t>46</w:t>
             </w:r>
           </w:p>
         </w:tc>
         <w:tc>
           <w:tcPr>
-            <w:tcW w:type="dxa" w:w="1008"/>
+            <w:tcW w:type="dxa" w:w="1440"/>
             <w:vAlign w:val="center"/>
             <w:tcBorders>
               <w:top w:val="single" w:sz="6" w:color="B0B7C3"/>
@@ -2176,6 +2794,7 @@
           </w:tcPr>
           <w:p>
             <w:pPr>
+              <w:spacing w:before="0" w:after="0"/>
               <w:jc w:val="right"/>
             </w:pPr>
             <w:r/>
@@ -2183,15 +2802,15 @@
               <w:rPr>
                 <w:b w:val="0"/>
                 <w:color w:val="1A1A1A"/>
-                <w:sz w:val="19"/>
+                <w:sz w:val="20"/>
               </w:rPr>
-              <w:t>705</w:t>
+              <w:t>222,199</w:t>
             </w:r>
           </w:p>
         </w:tc>
         <w:tc>
           <w:tcPr>
-            <w:tcW w:type="dxa" w:w="1008"/>
+            <w:tcW w:type="dxa" w:w="1224"/>
             <w:vAlign w:val="center"/>
             <w:tcBorders>
               <w:top w:val="single" w:sz="6" w:color="B0B7C3"/>
@@ -2203,6 +2822,7 @@
           </w:tcPr>
           <w:p>
             <w:pPr>
+              <w:spacing w:before="0" w:after="0"/>
               <w:jc w:val="right"/>
             </w:pPr>
             <w:r/>
@@ -2210,15 +2830,15 @@
               <w:rPr>
                 <w:b w:val="0"/>
                 <w:color w:val="1A1A1A"/>
-                <w:sz w:val="19"/>
+                <w:sz w:val="20"/>
               </w:rPr>
-              <w:t>81</w:t>
+              <w:t>151,639</w:t>
             </w:r>
           </w:p>
         </w:tc>
         <w:tc>
           <w:tcPr>
-            <w:tcW w:type="dxa" w:w="1008"/>
+            <w:tcW w:type="dxa" w:w="1368"/>
             <w:vAlign w:val="center"/>
             <w:tcBorders>
               <w:top w:val="single" w:sz="6" w:color="B0B7C3"/>
@@ -2230,6 +2850,7 @@
           </w:tcPr>
           <w:p>
             <w:pPr>
+              <w:spacing w:before="0" w:after="0"/>
               <w:jc w:val="right"/>
             </w:pPr>
             <w:r/>
@@ -2237,14 +2858,45 @@
               <w:rPr>
                 <w:b w:val="0"/>
                 <w:color w:val="1A1A1A"/>
-                <w:sz w:val="19"/>
+                <w:sz w:val="20"/>
               </w:rPr>
-              <w:t>0</w:t>
+              <w:t>22,623</w:t>
+            </w:r>
+          </w:p>
+        </w:tc>
+        <w:tc>
+          <w:tcPr>
+            <w:tcW w:type="dxa" w:w="1224"/>
+            <w:vAlign w:val="center"/>
+            <w:tcBorders>
+              <w:top w:val="single" w:sz="6" w:color="B0B7C3"/>
+              <w:left w:val="single" w:sz="6" w:color="B0B7C3"/>
+              <w:bottom w:val="single" w:sz="6" w:color="B0B7C3"/>
+              <w:right w:val="single" w:sz="6" w:color="B0B7C3"/>
+            </w:tcBorders>
+            <w:shd w:fill="F6F7FA" w:val="clear"/>
+          </w:tcPr>
+          <w:p>
+            <w:pPr>
+              <w:spacing w:before="0" w:after="0"/>
+              <w:jc w:val="right"/>
+            </w:pPr>
+            <w:r/>
+            <w:r>
+              <w:rPr>
+                <w:b w:val="0"/>
+                <w:color w:val="1A1A1A"/>
+                <w:sz w:val="20"/>
+              </w:rPr>
+              <w:t>47,937</w:t>
             </w:r>
           </w:p>
         </w:tc>
       </w:tr>
       <w:tr>
+        <w:trPr>
+          <w:trHeight w:val="400" w:hRule="atLeast"/>
+        </w:trPr>
         <w:tc>
           <w:tcPr>
             <w:tcW w:type="dxa" w:w="1008"/>
@@ -2258,6 +2910,7 @@
           </w:tcPr>
           <w:p>
             <w:pPr>
+              <w:spacing w:before="0" w:after="0"/>
               <w:jc w:val="left"/>
             </w:pPr>
             <w:r/>
@@ -2265,15 +2918,15 @@
               <w:rPr>
                 <w:b w:val="0"/>
                 <w:color w:val="1A1A1A"/>
-                <w:sz w:val="19"/>
+                <w:sz w:val="20"/>
               </w:rPr>
-              <w:t>07</w:t>
+              <w:t>09</w:t>
             </w:r>
           </w:p>
         </w:tc>
         <w:tc>
           <w:tcPr>
-            <w:tcW w:type="dxa" w:w="1008"/>
+            <w:tcW w:type="dxa" w:w="3312"/>
             <w:vAlign w:val="center"/>
             <w:tcBorders>
               <w:top w:val="single" w:sz="6" w:color="B0B7C3"/>
@@ -2284,6 +2937,7 @@
           </w:tcPr>
           <w:p>
             <w:pPr>
+              <w:spacing w:before="0" w:after="0"/>
               <w:jc w:val="left"/>
             </w:pPr>
             <w:r/>
@@ -2291,15 +2945,15 @@
               <w:rPr>
                 <w:b w:val="0"/>
                 <w:color w:val="1A1A1A"/>
-                <w:sz w:val="19"/>
+                <w:sz w:val="20"/>
               </w:rPr>
-              <w:t>State Gov</w:t>
+              <w:t>Private College / University</w:t>
             </w:r>
           </w:p>
         </w:tc>
         <w:tc>
           <w:tcPr>
-            <w:tcW w:type="dxa" w:w="1008"/>
+            <w:tcW w:type="dxa" w:w="1224"/>
             <w:vAlign w:val="center"/>
             <w:tcBorders>
               <w:top w:val="single" w:sz="6" w:color="B0B7C3"/>
@@ -2310,6 +2964,7 @@
           </w:tcPr>
           <w:p>
             <w:pPr>
+              <w:spacing w:before="0" w:after="0"/>
               <w:jc w:val="right"/>
             </w:pPr>
             <w:r/>
@@ -2317,15 +2972,15 @@
               <w:rPr>
                 <w:b w:val="0"/>
                 <w:color w:val="1A1A1A"/>
-                <w:sz w:val="19"/>
+                <w:sz w:val="20"/>
               </w:rPr>
-              <w:t>6,798</w:t>
+              <w:t>2,423</w:t>
             </w:r>
           </w:p>
         </w:tc>
         <w:tc>
           <w:tcPr>
-            <w:tcW w:type="dxa" w:w="1008"/>
+            <w:tcW w:type="dxa" w:w="1080"/>
             <w:vAlign w:val="center"/>
             <w:tcBorders>
               <w:top w:val="single" w:sz="6" w:color="B0B7C3"/>
@@ -2336,6 +2991,7 @@
           </w:tcPr>
           <w:p>
             <w:pPr>
+              <w:spacing w:before="0" w:after="0"/>
               <w:jc w:val="right"/>
             </w:pPr>
             <w:r/>
@@ -2343,15 +2999,15 @@
               <w:rPr>
                 <w:b w:val="0"/>
                 <w:color w:val="1A1A1A"/>
-                <w:sz w:val="19"/>
+                <w:sz w:val="20"/>
               </w:rPr>
-              <w:t>6,282</w:t>
+              <w:t>2,160</w:t>
             </w:r>
           </w:p>
         </w:tc>
         <w:tc>
           <w:tcPr>
-            <w:tcW w:type="dxa" w:w="1008"/>
+            <w:tcW w:type="dxa" w:w="1224"/>
             <w:vAlign w:val="center"/>
             <w:tcBorders>
               <w:top w:val="single" w:sz="6" w:color="B0B7C3"/>
@@ -2362,6 +3018,7 @@
           </w:tcPr>
           <w:p>
             <w:pPr>
+              <w:spacing w:before="0" w:after="0"/>
               <w:jc w:val="right"/>
             </w:pPr>
             <w:r/>
@@ -2369,15 +3026,15 @@
               <w:rPr>
                 <w:b w:val="0"/>
                 <w:color w:val="1A1A1A"/>
-                <w:sz w:val="19"/>
+                <w:sz w:val="20"/>
               </w:rPr>
-              <w:t>382</w:t>
+              <w:t>171</w:t>
             </w:r>
           </w:p>
         </w:tc>
         <w:tc>
           <w:tcPr>
-            <w:tcW w:type="dxa" w:w="1008"/>
+            <w:tcW w:type="dxa" w:w="1080"/>
             <w:vAlign w:val="center"/>
             <w:tcBorders>
               <w:top w:val="single" w:sz="6" w:color="B0B7C3"/>
@@ -2388,6 +3045,7 @@
           </w:tcPr>
           <w:p>
             <w:pPr>
+              <w:spacing w:before="0" w:after="0"/>
               <w:jc w:val="right"/>
             </w:pPr>
             <w:r/>
@@ -2395,15 +3053,15 @@
               <w:rPr>
                 <w:b w:val="0"/>
                 <w:color w:val="1A1A1A"/>
-                <w:sz w:val="19"/>
+                <w:sz w:val="20"/>
               </w:rPr>
-              <w:t>134</w:t>
+              <w:t>92</w:t>
             </w:r>
           </w:p>
         </w:tc>
         <w:tc>
           <w:tcPr>
-            <w:tcW w:type="dxa" w:w="1008"/>
+            <w:tcW w:type="dxa" w:w="1440"/>
             <w:vAlign w:val="center"/>
             <w:tcBorders>
               <w:top w:val="single" w:sz="6" w:color="B0B7C3"/>
@@ -2414,6 +3072,7 @@
           </w:tcPr>
           <w:p>
             <w:pPr>
+              <w:spacing w:before="0" w:after="0"/>
               <w:jc w:val="right"/>
             </w:pPr>
             <w:r/>
@@ -2421,15 +3080,15 @@
               <w:rPr>
                 <w:b w:val="0"/>
                 <w:color w:val="1A1A1A"/>
-                <w:sz w:val="19"/>
+                <w:sz w:val="20"/>
               </w:rPr>
-              <w:t>184,911</w:t>
+              <w:t>112,332</w:t>
             </w:r>
           </w:p>
         </w:tc>
         <w:tc>
           <w:tcPr>
-            <w:tcW w:type="dxa" w:w="1008"/>
+            <w:tcW w:type="dxa" w:w="1224"/>
             <w:vAlign w:val="center"/>
             <w:tcBorders>
               <w:top w:val="single" w:sz="6" w:color="B0B7C3"/>
@@ -2440,6 +3099,7 @@
           </w:tcPr>
           <w:p>
             <w:pPr>
+              <w:spacing w:before="0" w:after="0"/>
               <w:jc w:val="right"/>
             </w:pPr>
             <w:r/>
@@ -2447,15 +3107,15 @@
               <w:rPr>
                 <w:b w:val="0"/>
                 <w:color w:val="1A1A1A"/>
-                <w:sz w:val="19"/>
+                <w:sz w:val="20"/>
               </w:rPr>
-              <w:t>86,816</w:t>
+              <w:t>32,102</w:t>
             </w:r>
           </w:p>
         </w:tc>
         <w:tc>
           <w:tcPr>
-            <w:tcW w:type="dxa" w:w="1008"/>
+            <w:tcW w:type="dxa" w:w="1368"/>
             <w:vAlign w:val="center"/>
             <w:tcBorders>
               <w:top w:val="single" w:sz="6" w:color="B0B7C3"/>
@@ -2466,6 +3126,7 @@
           </w:tcPr>
           <w:p>
             <w:pPr>
+              <w:spacing w:before="0" w:after="0"/>
               <w:jc w:val="right"/>
             </w:pPr>
             <w:r/>
@@ -2473,15 +3134,15 @@
               <w:rPr>
                 <w:b w:val="0"/>
                 <w:color w:val="1A1A1A"/>
-                <w:sz w:val="19"/>
+                <w:sz w:val="20"/>
               </w:rPr>
-              <w:t>43,295</w:t>
+              <w:t>17,286</w:t>
             </w:r>
           </w:p>
         </w:tc>
         <w:tc>
           <w:tcPr>
-            <w:tcW w:type="dxa" w:w="1008"/>
+            <w:tcW w:type="dxa" w:w="1224"/>
             <w:vAlign w:val="center"/>
             <w:tcBorders>
               <w:top w:val="single" w:sz="6" w:color="B0B7C3"/>
@@ -2492,6 +3153,7 @@
           </w:tcPr>
           <w:p>
             <w:pPr>
+              <w:spacing w:before="0" w:after="0"/>
               <w:jc w:val="right"/>
             </w:pPr>
             <w:r/>
@@ -2499,541 +3161,7 @@
               <w:rPr>
                 <w:b w:val="0"/>
                 <w:color w:val="1A1A1A"/>
-                <w:sz w:val="19"/>
-              </w:rPr>
-              <w:t>54,800</w:t>
-            </w:r>
-          </w:p>
-        </w:tc>
-      </w:tr>
-      <w:tr>
-        <w:tc>
-          <w:tcPr>
-            <w:tcW w:type="dxa" w:w="1008"/>
-            <w:vAlign w:val="center"/>
-            <w:tcBorders>
-              <w:top w:val="single" w:sz="6" w:color="B0B7C3"/>
-              <w:left w:val="single" w:sz="6" w:color="B0B7C3"/>
-              <w:bottom w:val="single" w:sz="6" w:color="B0B7C3"/>
-              <w:right w:val="single" w:sz="6" w:color="B0B7C3"/>
-            </w:tcBorders>
-            <w:shd w:fill="F6F7FA" w:val="clear"/>
-          </w:tcPr>
-          <w:p>
-            <w:pPr>
-              <w:jc w:val="left"/>
-            </w:pPr>
-            <w:r/>
-            <w:r>
-              <w:rPr>
-                <w:b w:val="0"/>
-                <w:color w:val="1A1A1A"/>
-                <w:sz w:val="19"/>
-              </w:rPr>
-              <w:t>08</w:t>
-            </w:r>
-          </w:p>
-        </w:tc>
-        <w:tc>
-          <w:tcPr>
-            <w:tcW w:type="dxa" w:w="1008"/>
-            <w:vAlign w:val="center"/>
-            <w:tcBorders>
-              <w:top w:val="single" w:sz="6" w:color="B0B7C3"/>
-              <w:left w:val="single" w:sz="6" w:color="B0B7C3"/>
-              <w:bottom w:val="single" w:sz="6" w:color="B0B7C3"/>
-              <w:right w:val="single" w:sz="6" w:color="B0B7C3"/>
-            </w:tcBorders>
-            <w:shd w:fill="F6F7FA" w:val="clear"/>
-          </w:tcPr>
-          <w:p>
-            <w:pPr>
-              <w:jc w:val="left"/>
-            </w:pPr>
-            <w:r/>
-            <w:r>
-              <w:rPr>
-                <w:b w:val="0"/>
-                <w:color w:val="1A1A1A"/>
-                <w:sz w:val="19"/>
-              </w:rPr>
-              <w:t>Municipal / Private Institute</w:t>
-            </w:r>
-          </w:p>
-        </w:tc>
-        <w:tc>
-          <w:tcPr>
-            <w:tcW w:type="dxa" w:w="1008"/>
-            <w:vAlign w:val="center"/>
-            <w:tcBorders>
-              <w:top w:val="single" w:sz="6" w:color="B0B7C3"/>
-              <w:left w:val="single" w:sz="6" w:color="B0B7C3"/>
-              <w:bottom w:val="single" w:sz="6" w:color="B0B7C3"/>
-              <w:right w:val="single" w:sz="6" w:color="B0B7C3"/>
-            </w:tcBorders>
-            <w:shd w:fill="F6F7FA" w:val="clear"/>
-          </w:tcPr>
-          <w:p>
-            <w:pPr>
-              <w:jc w:val="right"/>
-            </w:pPr>
-            <w:r/>
-            <w:r>
-              <w:rPr>
-                <w:b w:val="0"/>
-                <w:color w:val="1A1A1A"/>
-                <w:sz w:val="19"/>
-              </w:rPr>
-              <w:t>16,009</w:t>
-            </w:r>
-          </w:p>
-        </w:tc>
-        <w:tc>
-          <w:tcPr>
-            <w:tcW w:type="dxa" w:w="1008"/>
-            <w:vAlign w:val="center"/>
-            <w:tcBorders>
-              <w:top w:val="single" w:sz="6" w:color="B0B7C3"/>
-              <w:left w:val="single" w:sz="6" w:color="B0B7C3"/>
-              <w:bottom w:val="single" w:sz="6" w:color="B0B7C3"/>
-              <w:right w:val="single" w:sz="6" w:color="B0B7C3"/>
-            </w:tcBorders>
-            <w:shd w:fill="F6F7FA" w:val="clear"/>
-          </w:tcPr>
-          <w:p>
-            <w:pPr>
-              <w:jc w:val="right"/>
-            </w:pPr>
-            <w:r/>
-            <w:r>
-              <w:rPr>
-                <w:b w:val="0"/>
-                <w:color w:val="1A1A1A"/>
-                <w:sz w:val="19"/>
-              </w:rPr>
-              <w:t>15,787</w:t>
-            </w:r>
-          </w:p>
-        </w:tc>
-        <w:tc>
-          <w:tcPr>
-            <w:tcW w:type="dxa" w:w="1008"/>
-            <w:vAlign w:val="center"/>
-            <w:tcBorders>
-              <w:top w:val="single" w:sz="6" w:color="B0B7C3"/>
-              <w:left w:val="single" w:sz="6" w:color="B0B7C3"/>
-              <w:bottom w:val="single" w:sz="6" w:color="B0B7C3"/>
-              <w:right w:val="single" w:sz="6" w:color="B0B7C3"/>
-            </w:tcBorders>
-            <w:shd w:fill="F6F7FA" w:val="clear"/>
-          </w:tcPr>
-          <w:p>
-            <w:pPr>
-              <w:jc w:val="right"/>
-            </w:pPr>
-            <w:r/>
-            <w:r>
-              <w:rPr>
-                <w:b w:val="0"/>
-                <w:color w:val="1A1A1A"/>
-                <w:sz w:val="19"/>
-              </w:rPr>
-              <w:t>176</w:t>
-            </w:r>
-          </w:p>
-        </w:tc>
-        <w:tc>
-          <w:tcPr>
-            <w:tcW w:type="dxa" w:w="1008"/>
-            <w:vAlign w:val="center"/>
-            <w:tcBorders>
-              <w:top w:val="single" w:sz="6" w:color="B0B7C3"/>
-              <w:left w:val="single" w:sz="6" w:color="B0B7C3"/>
-              <w:bottom w:val="single" w:sz="6" w:color="B0B7C3"/>
-              <w:right w:val="single" w:sz="6" w:color="B0B7C3"/>
-            </w:tcBorders>
-            <w:shd w:fill="F6F7FA" w:val="clear"/>
-          </w:tcPr>
-          <w:p>
-            <w:pPr>
-              <w:jc w:val="right"/>
-            </w:pPr>
-            <w:r/>
-            <w:r>
-              <w:rPr>
-                <w:b w:val="0"/>
-                <w:color w:val="1A1A1A"/>
-                <w:sz w:val="19"/>
-              </w:rPr>
-              <w:t>46</w:t>
-            </w:r>
-          </w:p>
-        </w:tc>
-        <w:tc>
-          <w:tcPr>
-            <w:tcW w:type="dxa" w:w="1008"/>
-            <w:vAlign w:val="center"/>
-            <w:tcBorders>
-              <w:top w:val="single" w:sz="6" w:color="B0B7C3"/>
-              <w:left w:val="single" w:sz="6" w:color="B0B7C3"/>
-              <w:bottom w:val="single" w:sz="6" w:color="B0B7C3"/>
-              <w:right w:val="single" w:sz="6" w:color="B0B7C3"/>
-            </w:tcBorders>
-            <w:shd w:fill="F6F7FA" w:val="clear"/>
-          </w:tcPr>
-          <w:p>
-            <w:pPr>
-              <w:jc w:val="right"/>
-            </w:pPr>
-            <w:r/>
-            <w:r>
-              <w:rPr>
-                <w:b w:val="0"/>
-                <w:color w:val="1A1A1A"/>
-                <w:sz w:val="19"/>
-              </w:rPr>
-              <w:t>222,199</w:t>
-            </w:r>
-          </w:p>
-        </w:tc>
-        <w:tc>
-          <w:tcPr>
-            <w:tcW w:type="dxa" w:w="1008"/>
-            <w:vAlign w:val="center"/>
-            <w:tcBorders>
-              <w:top w:val="single" w:sz="6" w:color="B0B7C3"/>
-              <w:left w:val="single" w:sz="6" w:color="B0B7C3"/>
-              <w:bottom w:val="single" w:sz="6" w:color="B0B7C3"/>
-              <w:right w:val="single" w:sz="6" w:color="B0B7C3"/>
-            </w:tcBorders>
-            <w:shd w:fill="F6F7FA" w:val="clear"/>
-          </w:tcPr>
-          <w:p>
-            <w:pPr>
-              <w:jc w:val="right"/>
-            </w:pPr>
-            <w:r/>
-            <w:r>
-              <w:rPr>
-                <w:b w:val="0"/>
-                <w:color w:val="1A1A1A"/>
-                <w:sz w:val="19"/>
-              </w:rPr>
-              <w:t>151,639</w:t>
-            </w:r>
-          </w:p>
-        </w:tc>
-        <w:tc>
-          <w:tcPr>
-            <w:tcW w:type="dxa" w:w="1008"/>
-            <w:vAlign w:val="center"/>
-            <w:tcBorders>
-              <w:top w:val="single" w:sz="6" w:color="B0B7C3"/>
-              <w:left w:val="single" w:sz="6" w:color="B0B7C3"/>
-              <w:bottom w:val="single" w:sz="6" w:color="B0B7C3"/>
-              <w:right w:val="single" w:sz="6" w:color="B0B7C3"/>
-            </w:tcBorders>
-            <w:shd w:fill="F6F7FA" w:val="clear"/>
-          </w:tcPr>
-          <w:p>
-            <w:pPr>
-              <w:jc w:val="right"/>
-            </w:pPr>
-            <w:r/>
-            <w:r>
-              <w:rPr>
-                <w:b w:val="0"/>
-                <w:color w:val="1A1A1A"/>
-                <w:sz w:val="19"/>
-              </w:rPr>
-              <w:t>22,623</w:t>
-            </w:r>
-          </w:p>
-        </w:tc>
-        <w:tc>
-          <w:tcPr>
-            <w:tcW w:type="dxa" w:w="1008"/>
-            <w:vAlign w:val="center"/>
-            <w:tcBorders>
-              <w:top w:val="single" w:sz="6" w:color="B0B7C3"/>
-              <w:left w:val="single" w:sz="6" w:color="B0B7C3"/>
-              <w:bottom w:val="single" w:sz="6" w:color="B0B7C3"/>
-              <w:right w:val="single" w:sz="6" w:color="B0B7C3"/>
-            </w:tcBorders>
-            <w:shd w:fill="F6F7FA" w:val="clear"/>
-          </w:tcPr>
-          <w:p>
-            <w:pPr>
-              <w:jc w:val="right"/>
-            </w:pPr>
-            <w:r/>
-            <w:r>
-              <w:rPr>
-                <w:b w:val="0"/>
-                <w:color w:val="1A1A1A"/>
-                <w:sz w:val="19"/>
-              </w:rPr>
-              <w:t>47,937</w:t>
-            </w:r>
-          </w:p>
-        </w:tc>
-      </w:tr>
-      <w:tr>
-        <w:tc>
-          <w:tcPr>
-            <w:tcW w:type="dxa" w:w="1008"/>
-            <w:vAlign w:val="center"/>
-            <w:tcBorders>
-              <w:top w:val="single" w:sz="6" w:color="B0B7C3"/>
-              <w:left w:val="single" w:sz="6" w:color="B0B7C3"/>
-              <w:bottom w:val="single" w:sz="6" w:color="B0B7C3"/>
-              <w:right w:val="single" w:sz="6" w:color="B0B7C3"/>
-            </w:tcBorders>
-          </w:tcPr>
-          <w:p>
-            <w:pPr>
-              <w:jc w:val="left"/>
-            </w:pPr>
-            <w:r/>
-            <w:r>
-              <w:rPr>
-                <w:b w:val="0"/>
-                <w:color w:val="1A1A1A"/>
-                <w:sz w:val="19"/>
-              </w:rPr>
-              <w:t>09</w:t>
-            </w:r>
-          </w:p>
-        </w:tc>
-        <w:tc>
-          <w:tcPr>
-            <w:tcW w:type="dxa" w:w="1008"/>
-            <w:vAlign w:val="center"/>
-            <w:tcBorders>
-              <w:top w:val="single" w:sz="6" w:color="B0B7C3"/>
-              <w:left w:val="single" w:sz="6" w:color="B0B7C3"/>
-              <w:bottom w:val="single" w:sz="6" w:color="B0B7C3"/>
-              <w:right w:val="single" w:sz="6" w:color="B0B7C3"/>
-            </w:tcBorders>
-          </w:tcPr>
-          <w:p>
-            <w:pPr>
-              <w:jc w:val="left"/>
-            </w:pPr>
-            <w:r/>
-            <w:r>
-              <w:rPr>
-                <w:b w:val="0"/>
-                <w:color w:val="1A1A1A"/>
-                <w:sz w:val="19"/>
-              </w:rPr>
-              <w:t>Private College / University</w:t>
-            </w:r>
-          </w:p>
-        </w:tc>
-        <w:tc>
-          <w:tcPr>
-            <w:tcW w:type="dxa" w:w="1008"/>
-            <w:vAlign w:val="center"/>
-            <w:tcBorders>
-              <w:top w:val="single" w:sz="6" w:color="B0B7C3"/>
-              <w:left w:val="single" w:sz="6" w:color="B0B7C3"/>
-              <w:bottom w:val="single" w:sz="6" w:color="B0B7C3"/>
-              <w:right w:val="single" w:sz="6" w:color="B0B7C3"/>
-            </w:tcBorders>
-          </w:tcPr>
-          <w:p>
-            <w:pPr>
-              <w:jc w:val="right"/>
-            </w:pPr>
-            <w:r/>
-            <w:r>
-              <w:rPr>
-                <w:b w:val="0"/>
-                <w:color w:val="1A1A1A"/>
-                <w:sz w:val="19"/>
-              </w:rPr>
-              <w:t>2,423</w:t>
-            </w:r>
-          </w:p>
-        </w:tc>
-        <w:tc>
-          <w:tcPr>
-            <w:tcW w:type="dxa" w:w="1008"/>
-            <w:vAlign w:val="center"/>
-            <w:tcBorders>
-              <w:top w:val="single" w:sz="6" w:color="B0B7C3"/>
-              <w:left w:val="single" w:sz="6" w:color="B0B7C3"/>
-              <w:bottom w:val="single" w:sz="6" w:color="B0B7C3"/>
-              <w:right w:val="single" w:sz="6" w:color="B0B7C3"/>
-            </w:tcBorders>
-          </w:tcPr>
-          <w:p>
-            <w:pPr>
-              <w:jc w:val="right"/>
-            </w:pPr>
-            <w:r/>
-            <w:r>
-              <w:rPr>
-                <w:b w:val="0"/>
-                <w:color w:val="1A1A1A"/>
-                <w:sz w:val="19"/>
-              </w:rPr>
-              <w:t>2,160</w:t>
-            </w:r>
-          </w:p>
-        </w:tc>
-        <w:tc>
-          <w:tcPr>
-            <w:tcW w:type="dxa" w:w="1008"/>
-            <w:vAlign w:val="center"/>
-            <w:tcBorders>
-              <w:top w:val="single" w:sz="6" w:color="B0B7C3"/>
-              <w:left w:val="single" w:sz="6" w:color="B0B7C3"/>
-              <w:bottom w:val="single" w:sz="6" w:color="B0B7C3"/>
-              <w:right w:val="single" w:sz="6" w:color="B0B7C3"/>
-            </w:tcBorders>
-          </w:tcPr>
-          <w:p>
-            <w:pPr>
-              <w:jc w:val="right"/>
-            </w:pPr>
-            <w:r/>
-            <w:r>
-              <w:rPr>
-                <w:b w:val="0"/>
-                <w:color w:val="1A1A1A"/>
-                <w:sz w:val="19"/>
-              </w:rPr>
-              <w:t>171</w:t>
-            </w:r>
-          </w:p>
-        </w:tc>
-        <w:tc>
-          <w:tcPr>
-            <w:tcW w:type="dxa" w:w="1008"/>
-            <w:vAlign w:val="center"/>
-            <w:tcBorders>
-              <w:top w:val="single" w:sz="6" w:color="B0B7C3"/>
-              <w:left w:val="single" w:sz="6" w:color="B0B7C3"/>
-              <w:bottom w:val="single" w:sz="6" w:color="B0B7C3"/>
-              <w:right w:val="single" w:sz="6" w:color="B0B7C3"/>
-            </w:tcBorders>
-          </w:tcPr>
-          <w:p>
-            <w:pPr>
-              <w:jc w:val="right"/>
-            </w:pPr>
-            <w:r/>
-            <w:r>
-              <w:rPr>
-                <w:b w:val="0"/>
-                <w:color w:val="1A1A1A"/>
-                <w:sz w:val="19"/>
-              </w:rPr>
-              <w:t>92</w:t>
-            </w:r>
-          </w:p>
-        </w:tc>
-        <w:tc>
-          <w:tcPr>
-            <w:tcW w:type="dxa" w:w="1008"/>
-            <w:vAlign w:val="center"/>
-            <w:tcBorders>
-              <w:top w:val="single" w:sz="6" w:color="B0B7C3"/>
-              <w:left w:val="single" w:sz="6" w:color="B0B7C3"/>
-              <w:bottom w:val="single" w:sz="6" w:color="B0B7C3"/>
-              <w:right w:val="single" w:sz="6" w:color="B0B7C3"/>
-            </w:tcBorders>
-          </w:tcPr>
-          <w:p>
-            <w:pPr>
-              <w:jc w:val="right"/>
-            </w:pPr>
-            <w:r/>
-            <w:r>
-              <w:rPr>
-                <w:b w:val="0"/>
-                <w:color w:val="1A1A1A"/>
-                <w:sz w:val="19"/>
-              </w:rPr>
-              <w:t>112,332</w:t>
-            </w:r>
-          </w:p>
-        </w:tc>
-        <w:tc>
-          <w:tcPr>
-            <w:tcW w:type="dxa" w:w="1008"/>
-            <w:vAlign w:val="center"/>
-            <w:tcBorders>
-              <w:top w:val="single" w:sz="6" w:color="B0B7C3"/>
-              <w:left w:val="single" w:sz="6" w:color="B0B7C3"/>
-              <w:bottom w:val="single" w:sz="6" w:color="B0B7C3"/>
-              <w:right w:val="single" w:sz="6" w:color="B0B7C3"/>
-            </w:tcBorders>
-          </w:tcPr>
-          <w:p>
-            <w:pPr>
-              <w:jc w:val="right"/>
-            </w:pPr>
-            <w:r/>
-            <w:r>
-              <w:rPr>
-                <w:b w:val="0"/>
-                <w:color w:val="1A1A1A"/>
-                <w:sz w:val="19"/>
-              </w:rPr>
-              <w:t>32,102</w:t>
-            </w:r>
-          </w:p>
-        </w:tc>
-        <w:tc>
-          <w:tcPr>
-            <w:tcW w:type="dxa" w:w="1008"/>
-            <w:vAlign w:val="center"/>
-            <w:tcBorders>
-              <w:top w:val="single" w:sz="6" w:color="B0B7C3"/>
-              <w:left w:val="single" w:sz="6" w:color="B0B7C3"/>
-              <w:bottom w:val="single" w:sz="6" w:color="B0B7C3"/>
-              <w:right w:val="single" w:sz="6" w:color="B0B7C3"/>
-            </w:tcBorders>
-          </w:tcPr>
-          <w:p>
-            <w:pPr>
-              <w:jc w:val="right"/>
-            </w:pPr>
-            <w:r/>
-            <w:r>
-              <w:rPr>
-                <w:b w:val="0"/>
-                <w:color w:val="1A1A1A"/>
-                <w:sz w:val="19"/>
-              </w:rPr>
-              <w:t>17,286</w:t>
-            </w:r>
-          </w:p>
-        </w:tc>
-        <w:tc>
-          <w:tcPr>
-            <w:tcW w:type="dxa" w:w="1008"/>
-            <w:vAlign w:val="center"/>
-            <w:tcBorders>
-              <w:top w:val="single" w:sz="6" w:color="B0B7C3"/>
-              <w:left w:val="single" w:sz="6" w:color="B0B7C3"/>
-              <w:bottom w:val="single" w:sz="6" w:color="B0B7C3"/>
-              <w:right w:val="single" w:sz="6" w:color="B0B7C3"/>
-            </w:tcBorders>
-          </w:tcPr>
-          <w:p>
-            <w:pPr>
-              <w:jc w:val="right"/>
-            </w:pPr>
-            <w:r/>
-            <w:r>
-              <w:rPr>
-                <w:b w:val="0"/>
-                <w:color w:val="1A1A1A"/>
-                <w:sz w:val="19"/>
+                <w:sz w:val="20"/>
               </w:rPr>
               <w:t>62,944</w:t>
             </w:r>
@@ -3041,6 +3169,9 @@
         </w:tc>
       </w:tr>
       <w:tr>
+        <w:trPr>
+          <w:trHeight w:val="400" w:hRule="atLeast"/>
+        </w:trPr>
         <w:tc>
           <w:tcPr>
             <w:tcW w:type="dxa" w:w="1008"/>
@@ -3055,6 +3186,7 @@
           </w:tcPr>
           <w:p>
             <w:pPr>
+              <w:spacing w:before="0" w:after="0"/>
               <w:jc w:val="left"/>
             </w:pPr>
             <w:r/>
@@ -3062,12 +3194,269 @@
               <w:rPr>
                 <w:b w:val="0"/>
                 <w:color w:val="1A1A1A"/>
-                <w:sz w:val="19"/>
+                <w:sz w:val="20"/>
               </w:rPr>
               <w:t>15</w:t>
             </w:r>
           </w:p>
         </w:tc>
+        <w:tc>
+          <w:tcPr>
+            <w:tcW w:type="dxa" w:w="3312"/>
+            <w:vAlign w:val="center"/>
+            <w:tcBorders>
+              <w:top w:val="single" w:sz="6" w:color="B0B7C3"/>
+              <w:left w:val="single" w:sz="6" w:color="B0B7C3"/>
+              <w:bottom w:val="single" w:sz="6" w:color="B0B7C3"/>
+              <w:right w:val="single" w:sz="6" w:color="B0B7C3"/>
+            </w:tcBorders>
+            <w:shd w:fill="FDF3D3" w:val="clear"/>
+          </w:tcPr>
+          <w:p>
+            <w:pPr>
+              <w:spacing w:before="0" w:after="0"/>
+              <w:jc w:val="left"/>
+            </w:pPr>
+            <w:r/>
+            <w:r>
+              <w:rPr>
+                <w:b/>
+                <w:color w:val="1A1A1A"/>
+                <w:sz w:val="20"/>
+              </w:rPr>
+              <w:t>McMaster-Carr Internal</w:t>
+            </w:r>
+          </w:p>
+        </w:tc>
+        <w:tc>
+          <w:tcPr>
+            <w:tcW w:type="dxa" w:w="1224"/>
+            <w:vAlign w:val="center"/>
+            <w:tcBorders>
+              <w:top w:val="single" w:sz="6" w:color="B0B7C3"/>
+              <w:left w:val="single" w:sz="6" w:color="B0B7C3"/>
+              <w:bottom w:val="single" w:sz="6" w:color="B0B7C3"/>
+              <w:right w:val="single" w:sz="6" w:color="B0B7C3"/>
+            </w:tcBorders>
+            <w:shd w:fill="FDF3D3" w:val="clear"/>
+          </w:tcPr>
+          <w:p>
+            <w:pPr>
+              <w:spacing w:before="0" w:after="0"/>
+              <w:jc w:val="right"/>
+            </w:pPr>
+            <w:r/>
+            <w:r>
+              <w:rPr>
+                <w:b/>
+                <w:color w:val="1A1A1A"/>
+                <w:sz w:val="20"/>
+              </w:rPr>
+              <w:t>5</w:t>
+            </w:r>
+          </w:p>
+        </w:tc>
+        <w:tc>
+          <w:tcPr>
+            <w:tcW w:type="dxa" w:w="1080"/>
+            <w:vAlign w:val="center"/>
+            <w:tcBorders>
+              <w:top w:val="single" w:sz="6" w:color="B0B7C3"/>
+              <w:left w:val="single" w:sz="6" w:color="B0B7C3"/>
+              <w:bottom w:val="single" w:sz="6" w:color="B0B7C3"/>
+              <w:right w:val="single" w:sz="6" w:color="B0B7C3"/>
+            </w:tcBorders>
+            <w:shd w:fill="FDF3D3" w:val="clear"/>
+          </w:tcPr>
+          <w:p>
+            <w:pPr>
+              <w:spacing w:before="0" w:after="0"/>
+              <w:jc w:val="right"/>
+            </w:pPr>
+            <w:r/>
+            <w:r>
+              <w:rPr>
+                <w:b/>
+                <w:color w:val="1A1A1A"/>
+                <w:sz w:val="20"/>
+              </w:rPr>
+              <w:t>0</w:t>
+            </w:r>
+          </w:p>
+        </w:tc>
+        <w:tc>
+          <w:tcPr>
+            <w:tcW w:type="dxa" w:w="1224"/>
+            <w:vAlign w:val="center"/>
+            <w:tcBorders>
+              <w:top w:val="single" w:sz="6" w:color="B0B7C3"/>
+              <w:left w:val="single" w:sz="6" w:color="B0B7C3"/>
+              <w:bottom w:val="single" w:sz="6" w:color="B0B7C3"/>
+              <w:right w:val="single" w:sz="6" w:color="B0B7C3"/>
+            </w:tcBorders>
+            <w:shd w:fill="FDF3D3" w:val="clear"/>
+          </w:tcPr>
+          <w:p>
+            <w:pPr>
+              <w:spacing w:before="0" w:after="0"/>
+              <w:jc w:val="right"/>
+            </w:pPr>
+            <w:r/>
+            <w:r>
+              <w:rPr>
+                <w:b/>
+                <w:color w:val="1A1A1A"/>
+                <w:sz w:val="20"/>
+              </w:rPr>
+              <w:t>0</w:t>
+            </w:r>
+          </w:p>
+        </w:tc>
+        <w:tc>
+          <w:tcPr>
+            <w:tcW w:type="dxa" w:w="1080"/>
+            <w:vAlign w:val="center"/>
+            <w:tcBorders>
+              <w:top w:val="single" w:sz="6" w:color="B0B7C3"/>
+              <w:left w:val="single" w:sz="6" w:color="B0B7C3"/>
+              <w:bottom w:val="single" w:sz="6" w:color="B0B7C3"/>
+              <w:right w:val="single" w:sz="6" w:color="B0B7C3"/>
+            </w:tcBorders>
+            <w:shd w:fill="FDF3D3" w:val="clear"/>
+          </w:tcPr>
+          <w:p>
+            <w:pPr>
+              <w:spacing w:before="0" w:after="0"/>
+              <w:jc w:val="right"/>
+            </w:pPr>
+            <w:r/>
+            <w:r>
+              <w:rPr>
+                <w:b/>
+                <w:color w:val="1A1A1A"/>
+                <w:sz w:val="20"/>
+              </w:rPr>
+              <w:t>5</w:t>
+            </w:r>
+          </w:p>
+        </w:tc>
+        <w:tc>
+          <w:tcPr>
+            <w:tcW w:type="dxa" w:w="1440"/>
+            <w:vAlign w:val="center"/>
+            <w:tcBorders>
+              <w:top w:val="single" w:sz="6" w:color="B0B7C3"/>
+              <w:left w:val="single" w:sz="6" w:color="B0B7C3"/>
+              <w:bottom w:val="single" w:sz="6" w:color="B0B7C3"/>
+              <w:right w:val="single" w:sz="6" w:color="B0B7C3"/>
+            </w:tcBorders>
+            <w:shd w:fill="FDF3D3" w:val="clear"/>
+          </w:tcPr>
+          <w:p>
+            <w:pPr>
+              <w:spacing w:before="0" w:after="0"/>
+              <w:jc w:val="right"/>
+            </w:pPr>
+            <w:r/>
+            <w:r>
+              <w:rPr>
+                <w:b/>
+                <w:color w:val="1A1A1A"/>
+                <w:sz w:val="20"/>
+              </w:rPr>
+              <w:t>42,130</w:t>
+            </w:r>
+          </w:p>
+        </w:tc>
+        <w:tc>
+          <w:tcPr>
+            <w:tcW w:type="dxa" w:w="1224"/>
+            <w:vAlign w:val="center"/>
+            <w:tcBorders>
+              <w:top w:val="single" w:sz="6" w:color="B0B7C3"/>
+              <w:left w:val="single" w:sz="6" w:color="B0B7C3"/>
+              <w:bottom w:val="single" w:sz="6" w:color="B0B7C3"/>
+              <w:right w:val="single" w:sz="6" w:color="B0B7C3"/>
+            </w:tcBorders>
+            <w:shd w:fill="FDF3D3" w:val="clear"/>
+          </w:tcPr>
+          <w:p>
+            <w:pPr>
+              <w:spacing w:before="0" w:after="0"/>
+              <w:jc w:val="right"/>
+            </w:pPr>
+            <w:r/>
+            <w:r>
+              <w:rPr>
+                <w:b/>
+                <w:color w:val="1A1A1A"/>
+                <w:sz w:val="20"/>
+              </w:rPr>
+              <w:t>0</w:t>
+            </w:r>
+          </w:p>
+        </w:tc>
+        <w:tc>
+          <w:tcPr>
+            <w:tcW w:type="dxa" w:w="1368"/>
+            <w:vAlign w:val="center"/>
+            <w:tcBorders>
+              <w:top w:val="single" w:sz="6" w:color="B0B7C3"/>
+              <w:left w:val="single" w:sz="6" w:color="B0B7C3"/>
+              <w:bottom w:val="single" w:sz="6" w:color="B0B7C3"/>
+              <w:right w:val="single" w:sz="6" w:color="B0B7C3"/>
+            </w:tcBorders>
+            <w:shd w:fill="FDF3D3" w:val="clear"/>
+          </w:tcPr>
+          <w:p>
+            <w:pPr>
+              <w:spacing w:before="0" w:after="0"/>
+              <w:jc w:val="right"/>
+            </w:pPr>
+            <w:r/>
+            <w:r>
+              <w:rPr>
+                <w:b/>
+                <w:color w:val="1A1A1A"/>
+                <w:sz w:val="20"/>
+              </w:rPr>
+              <w:t>0</w:t>
+            </w:r>
+          </w:p>
+        </w:tc>
+        <w:tc>
+          <w:tcPr>
+            <w:tcW w:type="dxa" w:w="1224"/>
+            <w:vAlign w:val="center"/>
+            <w:tcBorders>
+              <w:top w:val="single" w:sz="6" w:color="B0B7C3"/>
+              <w:left w:val="single" w:sz="6" w:color="B0B7C3"/>
+              <w:bottom w:val="single" w:sz="6" w:color="B0B7C3"/>
+              <w:right w:val="single" w:sz="6" w:color="B0B7C3"/>
+            </w:tcBorders>
+            <w:shd w:fill="FDF3D3" w:val="clear"/>
+          </w:tcPr>
+          <w:p>
+            <w:pPr>
+              <w:spacing w:before="0" w:after="0"/>
+              <w:jc w:val="right"/>
+            </w:pPr>
+            <w:r/>
+            <w:r>
+              <w:rPr>
+                <w:b/>
+                <w:color w:val="1A1A1A"/>
+                <w:sz w:val="20"/>
+              </w:rPr>
+              <w:t>42,130</w:t>
+            </w:r>
+          </w:p>
+        </w:tc>
+      </w:tr>
+      <w:tr>
+        <w:trPr>
+          <w:trHeight w:val="400" w:hRule="atLeast"/>
+        </w:trPr>
         <w:tc>
           <w:tcPr>
             <w:tcW w:type="dxa" w:w="1008"/>
@@ -3082,22 +3471,23 @@
           </w:tcPr>
           <w:p>
             <w:pPr>
+              <w:spacing w:before="0" w:after="0"/>
               <w:jc w:val="left"/>
             </w:pPr>
             <w:r/>
             <w:r>
               <w:rPr>
-                <w:b/>
+                <w:b w:val="0"/>
                 <w:color w:val="1A1A1A"/>
-                <w:sz w:val="19"/>
+                <w:sz w:val="20"/>
               </w:rPr>
-              <w:t>McMaster-Carr internal</w:t>
+              <w:t>—</w:t>
             </w:r>
           </w:p>
         </w:tc>
         <w:tc>
           <w:tcPr>
-            <w:tcW w:type="dxa" w:w="1008"/>
+            <w:tcW w:type="dxa" w:w="3312"/>
             <w:vAlign w:val="center"/>
             <w:tcBorders>
               <w:top w:val="single" w:sz="6" w:color="B0B7C3"/>
@@ -3109,22 +3499,23 @@
           </w:tcPr>
           <w:p>
             <w:pPr>
-              <w:jc w:val="right"/>
+              <w:spacing w:before="0" w:after="0"/>
+              <w:jc w:val="left"/>
             </w:pPr>
             <w:r/>
             <w:r>
               <w:rPr>
                 <w:b/>
                 <w:color w:val="1A1A1A"/>
-                <w:sz w:val="19"/>
+                <w:sz w:val="20"/>
               </w:rPr>
-              <w:t>5</w:t>
+              <w:t>Total</w:t>
             </w:r>
           </w:p>
         </w:tc>
         <w:tc>
           <w:tcPr>
-            <w:tcW w:type="dxa" w:w="1008"/>
+            <w:tcW w:type="dxa" w:w="1224"/>
             <w:vAlign w:val="center"/>
             <w:tcBorders>
               <w:top w:val="single" w:sz="6" w:color="B0B7C3"/>
@@ -3136,6 +3527,7 @@
           </w:tcPr>
           <w:p>
             <w:pPr>
+              <w:spacing w:before="0" w:after="0"/>
               <w:jc w:val="right"/>
             </w:pPr>
             <w:r/>
@@ -3143,15 +3535,15 @@
               <w:rPr>
                 <w:b/>
                 <w:color w:val="1A1A1A"/>
-                <w:sz w:val="19"/>
+                <w:sz w:val="20"/>
               </w:rPr>
-              <w:t>0</w:t>
+              <w:t>28,453</w:t>
             </w:r>
           </w:p>
         </w:tc>
         <w:tc>
           <w:tcPr>
-            <w:tcW w:type="dxa" w:w="1008"/>
+            <w:tcW w:type="dxa" w:w="1080"/>
             <w:vAlign w:val="center"/>
             <w:tcBorders>
               <w:top w:val="single" w:sz="6" w:color="B0B7C3"/>
@@ -3163,6 +3555,7 @@
           </w:tcPr>
           <w:p>
             <w:pPr>
+              <w:spacing w:before="0" w:after="0"/>
               <w:jc w:val="right"/>
             </w:pPr>
             <w:r/>
@@ -3170,15 +3563,15 @@
               <w:rPr>
                 <w:b/>
                 <w:color w:val="1A1A1A"/>
-                <w:sz w:val="19"/>
+                <w:sz w:val="20"/>
               </w:rPr>
-              <w:t>0</w:t>
+              <w:t>27,338</w:t>
             </w:r>
           </w:p>
         </w:tc>
         <w:tc>
           <w:tcPr>
-            <w:tcW w:type="dxa" w:w="1008"/>
+            <w:tcW w:type="dxa" w:w="1224"/>
             <w:vAlign w:val="center"/>
             <w:tcBorders>
               <w:top w:val="single" w:sz="6" w:color="B0B7C3"/>
@@ -3190,6 +3583,7 @@
           </w:tcPr>
           <w:p>
             <w:pPr>
+              <w:spacing w:before="0" w:after="0"/>
               <w:jc w:val="right"/>
             </w:pPr>
             <w:r/>
@@ -3197,15 +3591,15 @@
               <w:rPr>
                 <w:b/>
                 <w:color w:val="1A1A1A"/>
-                <w:sz w:val="19"/>
+                <w:sz w:val="20"/>
               </w:rPr>
-              <w:t>5</w:t>
+              <w:t>817</w:t>
             </w:r>
           </w:p>
         </w:tc>
         <w:tc>
           <w:tcPr>
-            <w:tcW w:type="dxa" w:w="1008"/>
+            <w:tcW w:type="dxa" w:w="1080"/>
             <w:vAlign w:val="center"/>
             <w:tcBorders>
               <w:top w:val="single" w:sz="6" w:color="B0B7C3"/>
@@ -3217,6 +3611,7 @@
           </w:tcPr>
           <w:p>
             <w:pPr>
+              <w:spacing w:before="0" w:after="0"/>
               <w:jc w:val="right"/>
             </w:pPr>
             <w:r/>
@@ -3224,15 +3619,15 @@
               <w:rPr>
                 <w:b/>
                 <w:color w:val="1A1A1A"/>
-                <w:sz w:val="19"/>
+                <w:sz w:val="20"/>
               </w:rPr>
-              <w:t>42,130</w:t>
+              <w:t>298</w:t>
             </w:r>
           </w:p>
         </w:tc>
         <w:tc>
           <w:tcPr>
-            <w:tcW w:type="dxa" w:w="1008"/>
+            <w:tcW w:type="dxa" w:w="1440"/>
             <w:vAlign w:val="center"/>
             <w:tcBorders>
               <w:top w:val="single" w:sz="6" w:color="B0B7C3"/>
@@ -3244,6 +3639,7 @@
           </w:tcPr>
           <w:p>
             <w:pPr>
+              <w:spacing w:before="0" w:after="0"/>
               <w:jc w:val="right"/>
             </w:pPr>
             <w:r/>
@@ -3251,15 +3647,15 @@
               <w:rPr>
                 <w:b/>
                 <w:color w:val="1A1A1A"/>
-                <w:sz w:val="19"/>
+                <w:sz w:val="20"/>
               </w:rPr>
-              <w:t>0</w:t>
+              <w:t>620,527</w:t>
             </w:r>
           </w:p>
         </w:tc>
         <w:tc>
           <w:tcPr>
-            <w:tcW w:type="dxa" w:w="1008"/>
+            <w:tcW w:type="dxa" w:w="1224"/>
             <w:vAlign w:val="center"/>
             <w:tcBorders>
               <w:top w:val="single" w:sz="6" w:color="B0B7C3"/>
@@ -3271,6 +3667,7 @@
           </w:tcPr>
           <w:p>
             <w:pPr>
+              <w:spacing w:before="0" w:after="0"/>
               <w:jc w:val="right"/>
             </w:pPr>
             <w:r/>
@@ -3278,15 +3675,15 @@
               <w:rPr>
                 <w:b/>
                 <w:color w:val="1A1A1A"/>
-                <w:sz w:val="19"/>
+                <w:sz w:val="20"/>
               </w:rPr>
-              <w:t>0</w:t>
+              <w:t>294,540</w:t>
             </w:r>
           </w:p>
         </w:tc>
         <w:tc>
           <w:tcPr>
-            <w:tcW w:type="dxa" w:w="1008"/>
+            <w:tcW w:type="dxa" w:w="1368"/>
             <w:vAlign w:val="center"/>
             <w:tcBorders>
               <w:top w:val="single" w:sz="6" w:color="B0B7C3"/>
@@ -3298,6 +3695,7 @@
           </w:tcPr>
           <w:p>
             <w:pPr>
+              <w:spacing w:before="0" w:after="0"/>
               <w:jc w:val="right"/>
             </w:pPr>
             <w:r/>
@@ -3305,17 +3703,15 @@
               <w:rPr>
                 <w:b/>
                 <w:color w:val="1A1A1A"/>
-                <w:sz w:val="19"/>
+                <w:sz w:val="20"/>
               </w:rPr>
-              <w:t>42,130</w:t>
+              <w:t>94,686</w:t>
             </w:r>
           </w:p>
         </w:tc>
-      </w:tr>
-      <w:tr>
         <w:tc>
           <w:tcPr>
-            <w:tcW w:type="dxa" w:w="1008"/>
+            <w:tcW w:type="dxa" w:w="1224"/>
             <w:vAlign w:val="center"/>
             <w:tcBorders>
               <w:top w:val="single" w:sz="6" w:color="B0B7C3"/>
@@ -3327,60 +3723,7 @@
           </w:tcPr>
           <w:p>
             <w:pPr>
-              <w:jc w:val="left"/>
-            </w:pPr>
-            <w:r/>
-            <w:r>
-              <w:rPr>
-                <w:b w:val="0"/>
-                <w:color w:val="1A1A1A"/>
-                <w:sz w:val="19"/>
-              </w:rPr>
-              <w:t>—</w:t>
-            </w:r>
-          </w:p>
-        </w:tc>
-        <w:tc>
-          <w:tcPr>
-            <w:tcW w:type="dxa" w:w="1008"/>
-            <w:vAlign w:val="center"/>
-            <w:tcBorders>
-              <w:top w:val="single" w:sz="6" w:color="B0B7C3"/>
-              <w:left w:val="single" w:sz="6" w:color="B0B7C3"/>
-              <w:bottom w:val="single" w:sz="6" w:color="B0B7C3"/>
-              <w:right w:val="single" w:sz="6" w:color="B0B7C3"/>
-            </w:tcBorders>
-            <w:shd w:fill="FDF3D3" w:val="clear"/>
-          </w:tcPr>
-          <w:p>
-            <w:pPr>
-              <w:jc w:val="left"/>
-            </w:pPr>
-            <w:r/>
-            <w:r>
-              <w:rPr>
-                <w:b/>
-                <w:color w:val="1A1A1A"/>
-                <w:sz w:val="19"/>
-              </w:rPr>
-              <w:t>Total (ex-distributor)</w:t>
-            </w:r>
-          </w:p>
-        </w:tc>
-        <w:tc>
-          <w:tcPr>
-            <w:tcW w:type="dxa" w:w="1008"/>
-            <w:vAlign w:val="center"/>
-            <w:tcBorders>
-              <w:top w:val="single" w:sz="6" w:color="B0B7C3"/>
-              <w:left w:val="single" w:sz="6" w:color="B0B7C3"/>
-              <w:bottom w:val="single" w:sz="6" w:color="B0B7C3"/>
-              <w:right w:val="single" w:sz="6" w:color="B0B7C3"/>
-            </w:tcBorders>
-            <w:shd w:fill="FDF3D3" w:val="clear"/>
-          </w:tcPr>
-          <w:p>
-            <w:pPr>
+              <w:spacing w:before="0" w:after="0"/>
               <w:jc w:val="right"/>
             </w:pPr>
             <w:r/>
@@ -3388,196 +3731,7 @@
               <w:rPr>
                 <w:b/>
                 <w:color w:val="1A1A1A"/>
-                <w:sz w:val="19"/>
-              </w:rPr>
-              <w:t>28,453</w:t>
-            </w:r>
-          </w:p>
-        </w:tc>
-        <w:tc>
-          <w:tcPr>
-            <w:tcW w:type="dxa" w:w="1008"/>
-            <w:vAlign w:val="center"/>
-            <w:tcBorders>
-              <w:top w:val="single" w:sz="6" w:color="B0B7C3"/>
-              <w:left w:val="single" w:sz="6" w:color="B0B7C3"/>
-              <w:bottom w:val="single" w:sz="6" w:color="B0B7C3"/>
-              <w:right w:val="single" w:sz="6" w:color="B0B7C3"/>
-            </w:tcBorders>
-            <w:shd w:fill="FDF3D3" w:val="clear"/>
-          </w:tcPr>
-          <w:p>
-            <w:pPr>
-              <w:jc w:val="right"/>
-            </w:pPr>
-            <w:r/>
-            <w:r>
-              <w:rPr>
-                <w:b/>
-                <w:color w:val="1A1A1A"/>
-                <w:sz w:val="19"/>
-              </w:rPr>
-              <w:t>27,338</w:t>
-            </w:r>
-          </w:p>
-        </w:tc>
-        <w:tc>
-          <w:tcPr>
-            <w:tcW w:type="dxa" w:w="1008"/>
-            <w:vAlign w:val="center"/>
-            <w:tcBorders>
-              <w:top w:val="single" w:sz="6" w:color="B0B7C3"/>
-              <w:left w:val="single" w:sz="6" w:color="B0B7C3"/>
-              <w:bottom w:val="single" w:sz="6" w:color="B0B7C3"/>
-              <w:right w:val="single" w:sz="6" w:color="B0B7C3"/>
-            </w:tcBorders>
-            <w:shd w:fill="FDF3D3" w:val="clear"/>
-          </w:tcPr>
-          <w:p>
-            <w:pPr>
-              <w:jc w:val="right"/>
-            </w:pPr>
-            <w:r/>
-            <w:r>
-              <w:rPr>
-                <w:b/>
-                <w:color w:val="1A1A1A"/>
-                <w:sz w:val="19"/>
-              </w:rPr>
-              <w:t>817</w:t>
-            </w:r>
-          </w:p>
-        </w:tc>
-        <w:tc>
-          <w:tcPr>
-            <w:tcW w:type="dxa" w:w="1008"/>
-            <w:vAlign w:val="center"/>
-            <w:tcBorders>
-              <w:top w:val="single" w:sz="6" w:color="B0B7C3"/>
-              <w:left w:val="single" w:sz="6" w:color="B0B7C3"/>
-              <w:bottom w:val="single" w:sz="6" w:color="B0B7C3"/>
-              <w:right w:val="single" w:sz="6" w:color="B0B7C3"/>
-            </w:tcBorders>
-            <w:shd w:fill="FDF3D3" w:val="clear"/>
-          </w:tcPr>
-          <w:p>
-            <w:pPr>
-              <w:jc w:val="right"/>
-            </w:pPr>
-            <w:r/>
-            <w:r>
-              <w:rPr>
-                <w:b/>
-                <w:color w:val="1A1A1A"/>
-                <w:sz w:val="19"/>
-              </w:rPr>
-              <w:t>298</w:t>
-            </w:r>
-          </w:p>
-        </w:tc>
-        <w:tc>
-          <w:tcPr>
-            <w:tcW w:type="dxa" w:w="1008"/>
-            <w:vAlign w:val="center"/>
-            <w:tcBorders>
-              <w:top w:val="single" w:sz="6" w:color="B0B7C3"/>
-              <w:left w:val="single" w:sz="6" w:color="B0B7C3"/>
-              <w:bottom w:val="single" w:sz="6" w:color="B0B7C3"/>
-              <w:right w:val="single" w:sz="6" w:color="B0B7C3"/>
-            </w:tcBorders>
-            <w:shd w:fill="FDF3D3" w:val="clear"/>
-          </w:tcPr>
-          <w:p>
-            <w:pPr>
-              <w:jc w:val="right"/>
-            </w:pPr>
-            <w:r/>
-            <w:r>
-              <w:rPr>
-                <w:b/>
-                <w:color w:val="1A1A1A"/>
-                <w:sz w:val="19"/>
-              </w:rPr>
-              <w:t>620,527</w:t>
-            </w:r>
-          </w:p>
-        </w:tc>
-        <w:tc>
-          <w:tcPr>
-            <w:tcW w:type="dxa" w:w="1008"/>
-            <w:vAlign w:val="center"/>
-            <w:tcBorders>
-              <w:top w:val="single" w:sz="6" w:color="B0B7C3"/>
-              <w:left w:val="single" w:sz="6" w:color="B0B7C3"/>
-              <w:bottom w:val="single" w:sz="6" w:color="B0B7C3"/>
-              <w:right w:val="single" w:sz="6" w:color="B0B7C3"/>
-            </w:tcBorders>
-            <w:shd w:fill="FDF3D3" w:val="clear"/>
-          </w:tcPr>
-          <w:p>
-            <w:pPr>
-              <w:jc w:val="right"/>
-            </w:pPr>
-            <w:r/>
-            <w:r>
-              <w:rPr>
-                <w:b/>
-                <w:color w:val="1A1A1A"/>
-                <w:sz w:val="19"/>
-              </w:rPr>
-              <w:t>294,540</w:t>
-            </w:r>
-          </w:p>
-        </w:tc>
-        <w:tc>
-          <w:tcPr>
-            <w:tcW w:type="dxa" w:w="1008"/>
-            <w:vAlign w:val="center"/>
-            <w:tcBorders>
-              <w:top w:val="single" w:sz="6" w:color="B0B7C3"/>
-              <w:left w:val="single" w:sz="6" w:color="B0B7C3"/>
-              <w:bottom w:val="single" w:sz="6" w:color="B0B7C3"/>
-              <w:right w:val="single" w:sz="6" w:color="B0B7C3"/>
-            </w:tcBorders>
-            <w:shd w:fill="FDF3D3" w:val="clear"/>
-          </w:tcPr>
-          <w:p>
-            <w:pPr>
-              <w:jc w:val="right"/>
-            </w:pPr>
-            <w:r/>
-            <w:r>
-              <w:rPr>
-                <w:b/>
-                <w:color w:val="1A1A1A"/>
-                <w:sz w:val="19"/>
-              </w:rPr>
-              <w:t>94,686</w:t>
-            </w:r>
-          </w:p>
-        </w:tc>
-        <w:tc>
-          <w:tcPr>
-            <w:tcW w:type="dxa" w:w="1008"/>
-            <w:vAlign w:val="center"/>
-            <w:tcBorders>
-              <w:top w:val="single" w:sz="6" w:color="B0B7C3"/>
-              <w:left w:val="single" w:sz="6" w:color="B0B7C3"/>
-              <w:bottom w:val="single" w:sz="6" w:color="B0B7C3"/>
-              <w:right w:val="single" w:sz="6" w:color="B0B7C3"/>
-            </w:tcBorders>
-            <w:shd w:fill="FDF3D3" w:val="clear"/>
-          </w:tcPr>
-          <w:p>
-            <w:pPr>
-              <w:jc w:val="right"/>
-            </w:pPr>
-            <w:r/>
-            <w:r>
-              <w:rPr>
-                <w:b/>
-                <w:color w:val="1A1A1A"/>
-                <w:sz w:val="19"/>
+                <w:sz w:val="20"/>
               </w:rPr>
               <w:t>231,301</w:t>
             </w:r>
@@ -3586,8 +3740,8 @@
       </w:tr>
     </w:tbl>
     <w:sectPr>
-      <w:pgSz w:w="12240" w:h="15840"/>
-      <w:pgMar w:top="1008" w:right="1080" w:bottom="1008" w:left="1080" w:header="720" w:footer="720" w:gutter="0"/>
+      <w:pgSz w:w="15840" w:h="12240" w:orient="landscape"/>
+      <w:pgMar w:top="864" w:right="1008" w:bottom="864" w:left="1008" w:header="720" w:footer="720" w:gutter="0"/>
       <w:cols w:space="720"/>
       <w:docGrid w:linePitch="360"/>
     </w:sectPr>

</xml_diff>

<commit_message>
Rewrite SLV doc intro in VP voice; simplify Table 2
- Killed the "Follow-up to the sprint eligibility analysis" subtitle.
- Rewrote intro to anchor on the 2017 introduction of SLV, the fact
  that rules haven't been revisited, the reordering opportunity, and
  frame the two recommendations directly.
- Simplified Table 2 to 6 columns: List Code, Category, Total CMFs,
  Eligible (<10), Ineligible (10+), Total Orders. Dropped the three-
  bucket contact-count split.

https://claude.ai/code/session_01PM89wz7vnfvW2NRaFUoooy
</commit_message>
<xml_diff>
--- a/Updating_SLV_Rules.docx
+++ b/Updating_SLV_Rules.docx
@@ -4,7 +4,10 @@
   <w:body>
     <w:p>
       <w:pPr>
-        <w:spacing w:after="40"/>
+        <w:spacing w:after="240"/>
+        <w:pBdr>
+          <w:bottom w:val="single" w:sz="8" w:color="2F4A7C"/>
+        </w:pBdr>
       </w:pPr>
       <w:r>
         <w:rPr>
@@ -17,28 +20,13 @@
     </w:p>
     <w:p>
       <w:pPr>
-        <w:spacing w:after="280"/>
-        <w:pBdr>
-          <w:bottom w:val="single" w:sz="8" w:color="2F4A7C"/>
-        </w:pBdr>
+        <w:spacing w:after="320"/>
       </w:pPr>
       <w:r>
         <w:rPr>
-          <w:color w:val="555555"/>
           <w:sz w:val="22"/>
         </w:rPr>
-        <w:t>Follow-up to the sprint eligibility analysis</w:t>
-      </w:r>
-    </w:p>
-    <w:p>
-      <w:pPr>
-        <w:spacing w:after="280"/>
-      </w:pPr>
-      <w:r>
-        <w:rPr>
-          <w:color w:val="888888"/>
-        </w:rPr>
-        <w:t>[Intro paragraph]</w:t>
+        <w:t>McMaster-Carr introduced Shipping Location View in 2017 to let coworkers at the same customer location see one another’s order history and reorder from it. The eligibility rules have not been revisited since. As reordering becomes a larger part of how customers use McMaster.com, several of the current thresholds are worth reopening — the rules today keep out customer locations where the original intent (small teams of coworkers sharing an order pad) is already met. This document recommends two changes: raising the active-contact threshold, and refining which list codes are excluded outright.</w:t>
       </w:r>
     </w:p>
     <w:p>
@@ -62,7 +50,7 @@
         <w:rPr>
           <w:sz w:val="22"/>
         </w:rPr>
-        <w:t>The current rule excludes any customer location with 10 or more active ordering contacts. The table shows how many additional customer locations and orders would be included at each higher threshold, and what would remain excluded even at 50 contacts.</w:t>
+        <w:t>The current rule excludes any customer location with 10 or more active ordering contacts. The table shows how many additional customer locations and orders each higher threshold would include, and what would remain excluded even at 50 contacts.</w:t>
       </w:r>
     </w:p>
     <w:tbl>
@@ -1456,7 +1444,7 @@
           <w:color w:val="2F4A7C"/>
           <w:sz w:val="28"/>
         </w:rPr>
-        <w:t>2. Excluded List Codes by Contact Count</w:t>
+        <w:t>2. Excluded List Codes</w:t>
       </w:r>
     </w:p>
     <w:p>
@@ -1467,7 +1455,7 @@
         <w:rPr>
           <w:sz w:val="22"/>
         </w:rPr>
-        <w:t>The list codes below are excluded from Shipping Location View. For each, the number of customer locations and orders are broken out by active-contact range.</w:t>
+        <w:t>The list codes below are excluded from Shipping Location View outright. For each, the table shows how many customer locations would already meet the contact-count rule (fewer than 10) versus those that would still be excluded on it.</w:t>
       </w:r>
     </w:p>
     <w:tbl>
@@ -1477,16 +1465,12 @@
         <w:tblLook w:firstColumn="1" w:firstRow="1" w:lastColumn="0" w:lastRow="0" w:noHBand="0" w:noVBand="1" w:val="04A0"/>
       </w:tblPr>
       <w:tblGrid>
-        <w:gridCol w:w="1008"/>
-        <w:gridCol w:w="3312"/>
-        <w:gridCol w:w="1224"/>
-        <w:gridCol w:w="1080"/>
-        <w:gridCol w:w="1224"/>
-        <w:gridCol w:w="1080"/>
         <w:gridCol w:w="1440"/>
-        <w:gridCol w:w="1224"/>
-        <w:gridCol w:w="1368"/>
-        <w:gridCol w:w="1224"/>
+        <w:gridCol w:w="4320"/>
+        <w:gridCol w:w="1872"/>
+        <w:gridCol w:w="2016"/>
+        <w:gridCol w:w="2016"/>
+        <w:gridCol w:w="2304"/>
       </w:tblGrid>
       <w:tr>
         <w:trPr>
@@ -1494,7 +1478,7 @@
         </w:trPr>
         <w:tc>
           <w:tcPr>
-            <w:tcW w:type="dxa" w:w="1008"/>
+            <w:tcW w:type="dxa" w:w="1440"/>
             <w:vAlign w:val="center"/>
             <w:tcBorders>
               <w:top w:val="single" w:sz="6" w:color="B0B7C3"/>
@@ -1514,7 +1498,7 @@
               <w:rPr>
                 <w:b/>
                 <w:color w:val="FFFFFF"/>
-                <w:sz w:val="20"/>
+                <w:sz w:val="21"/>
               </w:rPr>
               <w:t>List Code</w:t>
             </w:r>
@@ -1522,7 +1506,7 @@
         </w:tc>
         <w:tc>
           <w:tcPr>
-            <w:tcW w:type="dxa" w:w="3312"/>
+            <w:tcW w:type="dxa" w:w="4320"/>
             <w:vAlign w:val="center"/>
             <w:tcBorders>
               <w:top w:val="single" w:sz="6" w:color="B0B7C3"/>
@@ -1542,7 +1526,7 @@
               <w:rPr>
                 <w:b/>
                 <w:color w:val="FFFFFF"/>
-                <w:sz w:val="20"/>
+                <w:sz w:val="21"/>
               </w:rPr>
               <w:t>Category</w:t>
             </w:r>
@@ -1550,7 +1534,7 @@
         </w:tc>
         <w:tc>
           <w:tcPr>
-            <w:tcW w:type="dxa" w:w="1224"/>
+            <w:tcW w:type="dxa" w:w="1872"/>
             <w:vAlign w:val="center"/>
             <w:tcBorders>
               <w:top w:val="single" w:sz="6" w:color="B0B7C3"/>
@@ -1570,7 +1554,7 @@
               <w:rPr>
                 <w:b/>
                 <w:color w:val="FFFFFF"/>
-                <w:sz w:val="20"/>
+                <w:sz w:val="21"/>
               </w:rPr>
               <w:t>Total CMFs</w:t>
             </w:r>
@@ -1578,7 +1562,7 @@
         </w:tc>
         <w:tc>
           <w:tcPr>
-            <w:tcW w:type="dxa" w:w="1080"/>
+            <w:tcW w:type="dxa" w:w="2016"/>
             <w:vAlign w:val="center"/>
             <w:tcBorders>
               <w:top w:val="single" w:sz="6" w:color="B0B7C3"/>
@@ -1598,15 +1582,15 @@
               <w:rPr>
                 <w:b/>
                 <w:color w:val="FFFFFF"/>
-                <w:sz w:val="20"/>
+                <w:sz w:val="21"/>
               </w:rPr>
-              <w:t>CMFs &lt;10</w:t>
+              <w:t>Eligible (&lt;10)</w:t>
             </w:r>
           </w:p>
         </w:tc>
         <w:tc>
           <w:tcPr>
-            <w:tcW w:type="dxa" w:w="1224"/>
+            <w:tcW w:type="dxa" w:w="2016"/>
             <w:vAlign w:val="center"/>
             <w:tcBorders>
               <w:top w:val="single" w:sz="6" w:color="B0B7C3"/>
@@ -1626,15 +1610,15 @@
               <w:rPr>
                 <w:b/>
                 <w:color w:val="FFFFFF"/>
-                <w:sz w:val="20"/>
+                <w:sz w:val="21"/>
               </w:rPr>
-              <w:t>CMFs 10–25</w:t>
+              <w:t>Ineligible (10+)</w:t>
             </w:r>
           </w:p>
         </w:tc>
         <w:tc>
           <w:tcPr>
-            <w:tcW w:type="dxa" w:w="1080"/>
+            <w:tcW w:type="dxa" w:w="2304"/>
             <w:vAlign w:val="center"/>
             <w:tcBorders>
               <w:top w:val="single" w:sz="6" w:color="B0B7C3"/>
@@ -1654,121 +1638,9 @@
               <w:rPr>
                 <w:b/>
                 <w:color w:val="FFFFFF"/>
-                <w:sz w:val="20"/>
-              </w:rPr>
-              <w:t>CMFs 25+</w:t>
-            </w:r>
-          </w:p>
-        </w:tc>
-        <w:tc>
-          <w:tcPr>
-            <w:tcW w:type="dxa" w:w="1440"/>
-            <w:vAlign w:val="center"/>
-            <w:tcBorders>
-              <w:top w:val="single" w:sz="6" w:color="B0B7C3"/>
-              <w:left w:val="single" w:sz="6" w:color="B0B7C3"/>
-              <w:bottom w:val="single" w:sz="6" w:color="B0B7C3"/>
-              <w:right w:val="single" w:sz="6" w:color="B0B7C3"/>
-            </w:tcBorders>
-            <w:shd w:fill="2F4A7C" w:val="clear"/>
-          </w:tcPr>
-          <w:p>
-            <w:pPr>
-              <w:spacing w:before="0" w:after="0"/>
-              <w:jc w:val="right"/>
-            </w:pPr>
-            <w:r/>
-            <w:r>
-              <w:rPr>
-                <w:b/>
-                <w:color w:val="FFFFFF"/>
-                <w:sz w:val="20"/>
+                <w:sz w:val="21"/>
               </w:rPr>
               <w:t>Total Orders</w:t>
-            </w:r>
-          </w:p>
-        </w:tc>
-        <w:tc>
-          <w:tcPr>
-            <w:tcW w:type="dxa" w:w="1224"/>
-            <w:vAlign w:val="center"/>
-            <w:tcBorders>
-              <w:top w:val="single" w:sz="6" w:color="B0B7C3"/>
-              <w:left w:val="single" w:sz="6" w:color="B0B7C3"/>
-              <w:bottom w:val="single" w:sz="6" w:color="B0B7C3"/>
-              <w:right w:val="single" w:sz="6" w:color="B0B7C3"/>
-            </w:tcBorders>
-            <w:shd w:fill="2F4A7C" w:val="clear"/>
-          </w:tcPr>
-          <w:p>
-            <w:pPr>
-              <w:spacing w:before="0" w:after="0"/>
-              <w:jc w:val="right"/>
-            </w:pPr>
-            <w:r/>
-            <w:r>
-              <w:rPr>
-                <w:b/>
-                <w:color w:val="FFFFFF"/>
-                <w:sz w:val="20"/>
-              </w:rPr>
-              <w:t>Orders &lt;10</w:t>
-            </w:r>
-          </w:p>
-        </w:tc>
-        <w:tc>
-          <w:tcPr>
-            <w:tcW w:type="dxa" w:w="1368"/>
-            <w:vAlign w:val="center"/>
-            <w:tcBorders>
-              <w:top w:val="single" w:sz="6" w:color="B0B7C3"/>
-              <w:left w:val="single" w:sz="6" w:color="B0B7C3"/>
-              <w:bottom w:val="single" w:sz="6" w:color="B0B7C3"/>
-              <w:right w:val="single" w:sz="6" w:color="B0B7C3"/>
-            </w:tcBorders>
-            <w:shd w:fill="2F4A7C" w:val="clear"/>
-          </w:tcPr>
-          <w:p>
-            <w:pPr>
-              <w:spacing w:before="0" w:after="0"/>
-              <w:jc w:val="right"/>
-            </w:pPr>
-            <w:r/>
-            <w:r>
-              <w:rPr>
-                <w:b/>
-                <w:color w:val="FFFFFF"/>
-                <w:sz w:val="20"/>
-              </w:rPr>
-              <w:t>Orders 10–25</w:t>
-            </w:r>
-          </w:p>
-        </w:tc>
-        <w:tc>
-          <w:tcPr>
-            <w:tcW w:type="dxa" w:w="1224"/>
-            <w:vAlign w:val="center"/>
-            <w:tcBorders>
-              <w:top w:val="single" w:sz="6" w:color="B0B7C3"/>
-              <w:left w:val="single" w:sz="6" w:color="B0B7C3"/>
-              <w:bottom w:val="single" w:sz="6" w:color="B0B7C3"/>
-              <w:right w:val="single" w:sz="6" w:color="B0B7C3"/>
-            </w:tcBorders>
-            <w:shd w:fill="2F4A7C" w:val="clear"/>
-          </w:tcPr>
-          <w:p>
-            <w:pPr>
-              <w:spacing w:before="0" w:after="0"/>
-              <w:jc w:val="right"/>
-            </w:pPr>
-            <w:r/>
-            <w:r>
-              <w:rPr>
-                <w:b/>
-                <w:color w:val="FFFFFF"/>
-                <w:sz w:val="20"/>
-              </w:rPr>
-              <w:t>Orders 25+</w:t>
             </w:r>
           </w:p>
         </w:tc>
@@ -1779,7 +1651,7 @@
         </w:trPr>
         <w:tc>
           <w:tcPr>
-            <w:tcW w:type="dxa" w:w="1008"/>
+            <w:tcW w:type="dxa" w:w="1440"/>
             <w:vAlign w:val="center"/>
             <w:tcBorders>
               <w:top w:val="single" w:sz="6" w:color="B0B7C3"/>
@@ -1798,7 +1670,7 @@
               <w:rPr>
                 <w:b w:val="0"/>
                 <w:color w:val="1A1A1A"/>
-                <w:sz w:val="20"/>
+                <w:sz w:val="21"/>
               </w:rPr>
               <w:t>05</w:t>
             </w:r>
@@ -1806,7 +1678,7 @@
         </w:tc>
         <w:tc>
           <w:tcPr>
-            <w:tcW w:type="dxa" w:w="3312"/>
+            <w:tcW w:type="dxa" w:w="4320"/>
             <w:vAlign w:val="center"/>
             <w:tcBorders>
               <w:top w:val="single" w:sz="6" w:color="B0B7C3"/>
@@ -1825,15 +1697,15 @@
               <w:rPr>
                 <w:b w:val="0"/>
                 <w:color w:val="1A1A1A"/>
-                <w:sz w:val="20"/>
+                <w:sz w:val="21"/>
               </w:rPr>
-              <w:t>Federal Gov (Domestic)</w:t>
+              <w:t>Federal Government (Domestic)</w:t>
             </w:r>
           </w:p>
         </w:tc>
         <w:tc>
           <w:tcPr>
-            <w:tcW w:type="dxa" w:w="1224"/>
+            <w:tcW w:type="dxa" w:w="1872"/>
             <w:vAlign w:val="center"/>
             <w:tcBorders>
               <w:top w:val="single" w:sz="6" w:color="B0B7C3"/>
@@ -1852,7 +1724,7 @@
               <w:rPr>
                 <w:b w:val="0"/>
                 <w:color w:val="1A1A1A"/>
-                <w:sz w:val="20"/>
+                <w:sz w:val="21"/>
               </w:rPr>
               <w:t>3,032</w:t>
             </w:r>
@@ -1860,7 +1732,7 @@
         </w:tc>
         <w:tc>
           <w:tcPr>
-            <w:tcW w:type="dxa" w:w="1080"/>
+            <w:tcW w:type="dxa" w:w="2016"/>
             <w:vAlign w:val="center"/>
             <w:tcBorders>
               <w:top w:val="single" w:sz="6" w:color="B0B7C3"/>
@@ -1879,7 +1751,7 @@
               <w:rPr>
                 <w:b w:val="0"/>
                 <w:color w:val="1A1A1A"/>
-                <w:sz w:val="20"/>
+                <w:sz w:val="21"/>
               </w:rPr>
               <w:t>2,924</w:t>
             </w:r>
@@ -1887,7 +1759,7 @@
         </w:tc>
         <w:tc>
           <w:tcPr>
-            <w:tcW w:type="dxa" w:w="1224"/>
+            <w:tcW w:type="dxa" w:w="2016"/>
             <w:vAlign w:val="center"/>
             <w:tcBorders>
               <w:top w:val="single" w:sz="6" w:color="B0B7C3"/>
@@ -1906,15 +1778,15 @@
               <w:rPr>
                 <w:b w:val="0"/>
                 <w:color w:val="1A1A1A"/>
-                <w:sz w:val="20"/>
+                <w:sz w:val="21"/>
               </w:rPr>
-              <w:t>87</w:t>
+              <w:t>108</w:t>
             </w:r>
           </w:p>
         </w:tc>
         <w:tc>
           <w:tcPr>
-            <w:tcW w:type="dxa" w:w="1080"/>
+            <w:tcW w:type="dxa" w:w="2304"/>
             <w:vAlign w:val="center"/>
             <w:tcBorders>
               <w:top w:val="single" w:sz="6" w:color="B0B7C3"/>
@@ -1933,117 +1805,9 @@
               <w:rPr>
                 <w:b w:val="0"/>
                 <w:color w:val="1A1A1A"/>
-                <w:sz w:val="20"/>
-              </w:rPr>
-              <w:t>21</w:t>
-            </w:r>
-          </w:p>
-        </w:tc>
-        <w:tc>
-          <w:tcPr>
-            <w:tcW w:type="dxa" w:w="1440"/>
-            <w:vAlign w:val="center"/>
-            <w:tcBorders>
-              <w:top w:val="single" w:sz="6" w:color="B0B7C3"/>
-              <w:left w:val="single" w:sz="6" w:color="B0B7C3"/>
-              <w:bottom w:val="single" w:sz="6" w:color="B0B7C3"/>
-              <w:right w:val="single" w:sz="6" w:color="B0B7C3"/>
-            </w:tcBorders>
-          </w:tcPr>
-          <w:p>
-            <w:pPr>
-              <w:spacing w:before="0" w:after="0"/>
-              <w:jc w:val="right"/>
-            </w:pPr>
-            <w:r/>
-            <w:r>
-              <w:rPr>
-                <w:b w:val="0"/>
-                <w:color w:val="1A1A1A"/>
-                <w:sz w:val="20"/>
+                <w:sz w:val="21"/>
               </w:rPr>
               <w:t>58,169</w:t>
-            </w:r>
-          </w:p>
-        </w:tc>
-        <w:tc>
-          <w:tcPr>
-            <w:tcW w:type="dxa" w:w="1224"/>
-            <w:vAlign w:val="center"/>
-            <w:tcBorders>
-              <w:top w:val="single" w:sz="6" w:color="B0B7C3"/>
-              <w:left w:val="single" w:sz="6" w:color="B0B7C3"/>
-              <w:bottom w:val="single" w:sz="6" w:color="B0B7C3"/>
-              <w:right w:val="single" w:sz="6" w:color="B0B7C3"/>
-            </w:tcBorders>
-          </w:tcPr>
-          <w:p>
-            <w:pPr>
-              <w:spacing w:before="0" w:after="0"/>
-              <w:jc w:val="right"/>
-            </w:pPr>
-            <w:r/>
-            <w:r>
-              <w:rPr>
-                <w:b w:val="0"/>
-                <w:color w:val="1A1A1A"/>
-                <w:sz w:val="20"/>
-              </w:rPr>
-              <w:t>23,278</w:t>
-            </w:r>
-          </w:p>
-        </w:tc>
-        <w:tc>
-          <w:tcPr>
-            <w:tcW w:type="dxa" w:w="1368"/>
-            <w:vAlign w:val="center"/>
-            <w:tcBorders>
-              <w:top w:val="single" w:sz="6" w:color="B0B7C3"/>
-              <w:left w:val="single" w:sz="6" w:color="B0B7C3"/>
-              <w:bottom w:val="single" w:sz="6" w:color="B0B7C3"/>
-              <w:right w:val="single" w:sz="6" w:color="B0B7C3"/>
-            </w:tcBorders>
-          </w:tcPr>
-          <w:p>
-            <w:pPr>
-              <w:spacing w:before="0" w:after="0"/>
-              <w:jc w:val="right"/>
-            </w:pPr>
-            <w:r/>
-            <w:r>
-              <w:rPr>
-                <w:b w:val="0"/>
-                <w:color w:val="1A1A1A"/>
-                <w:sz w:val="20"/>
-              </w:rPr>
-              <w:t>11,401</w:t>
-            </w:r>
-          </w:p>
-        </w:tc>
-        <w:tc>
-          <w:tcPr>
-            <w:tcW w:type="dxa" w:w="1224"/>
-            <w:vAlign w:val="center"/>
-            <w:tcBorders>
-              <w:top w:val="single" w:sz="6" w:color="B0B7C3"/>
-              <w:left w:val="single" w:sz="6" w:color="B0B7C3"/>
-              <w:bottom w:val="single" w:sz="6" w:color="B0B7C3"/>
-              <w:right w:val="single" w:sz="6" w:color="B0B7C3"/>
-            </w:tcBorders>
-          </w:tcPr>
-          <w:p>
-            <w:pPr>
-              <w:spacing w:before="0" w:after="0"/>
-              <w:jc w:val="right"/>
-            </w:pPr>
-            <w:r/>
-            <w:r>
-              <w:rPr>
-                <w:b w:val="0"/>
-                <w:color w:val="1A1A1A"/>
-                <w:sz w:val="20"/>
-              </w:rPr>
-              <w:t>23,490</w:t>
             </w:r>
           </w:p>
         </w:tc>
@@ -2054,7 +1818,7 @@
         </w:trPr>
         <w:tc>
           <w:tcPr>
-            <w:tcW w:type="dxa" w:w="1008"/>
+            <w:tcW w:type="dxa" w:w="1440"/>
             <w:vAlign w:val="center"/>
             <w:tcBorders>
               <w:top w:val="single" w:sz="6" w:color="B0B7C3"/>
@@ -2074,7 +1838,7 @@
               <w:rPr>
                 <w:b w:val="0"/>
                 <w:color w:val="1A1A1A"/>
-                <w:sz w:val="20"/>
+                <w:sz w:val="21"/>
               </w:rPr>
               <w:t>06</w:t>
             </w:r>
@@ -2082,7 +1846,7 @@
         </w:tc>
         <w:tc>
           <w:tcPr>
-            <w:tcW w:type="dxa" w:w="3312"/>
+            <w:tcW w:type="dxa" w:w="4320"/>
             <w:vAlign w:val="center"/>
             <w:tcBorders>
               <w:top w:val="single" w:sz="6" w:color="B0B7C3"/>
@@ -2102,15 +1866,15 @@
               <w:rPr>
                 <w:b w:val="0"/>
                 <w:color w:val="1A1A1A"/>
-                <w:sz w:val="20"/>
+                <w:sz w:val="21"/>
               </w:rPr>
-              <w:t>Federal Gov (APO/FPO)</w:t>
+              <w:t>Federal Government (APO/FPO)</w:t>
             </w:r>
           </w:p>
         </w:tc>
         <w:tc>
           <w:tcPr>
-            <w:tcW w:type="dxa" w:w="1224"/>
+            <w:tcW w:type="dxa" w:w="1872"/>
             <w:vAlign w:val="center"/>
             <w:tcBorders>
               <w:top w:val="single" w:sz="6" w:color="B0B7C3"/>
@@ -2130,7 +1894,7 @@
               <w:rPr>
                 <w:b w:val="0"/>
                 <w:color w:val="1A1A1A"/>
-                <w:sz w:val="20"/>
+                <w:sz w:val="21"/>
               </w:rPr>
               <w:t>186</w:t>
             </w:r>
@@ -2138,7 +1902,7 @@
         </w:tc>
         <w:tc>
           <w:tcPr>
-            <w:tcW w:type="dxa" w:w="1080"/>
+            <w:tcW w:type="dxa" w:w="2016"/>
             <w:vAlign w:val="center"/>
             <w:tcBorders>
               <w:top w:val="single" w:sz="6" w:color="B0B7C3"/>
@@ -2158,7 +1922,7 @@
               <w:rPr>
                 <w:b w:val="0"/>
                 <w:color w:val="1A1A1A"/>
-                <w:sz w:val="20"/>
+                <w:sz w:val="21"/>
               </w:rPr>
               <w:t>185</w:t>
             </w:r>
@@ -2166,7 +1930,7 @@
         </w:tc>
         <w:tc>
           <w:tcPr>
-            <w:tcW w:type="dxa" w:w="1224"/>
+            <w:tcW w:type="dxa" w:w="2016"/>
             <w:vAlign w:val="center"/>
             <w:tcBorders>
               <w:top w:val="single" w:sz="6" w:color="B0B7C3"/>
@@ -2186,7 +1950,7 @@
               <w:rPr>
                 <w:b w:val="0"/>
                 <w:color w:val="1A1A1A"/>
-                <w:sz w:val="20"/>
+                <w:sz w:val="21"/>
               </w:rPr>
               <w:t>1</w:t>
             </w:r>
@@ -2194,7 +1958,7 @@
         </w:tc>
         <w:tc>
           <w:tcPr>
-            <w:tcW w:type="dxa" w:w="1080"/>
+            <w:tcW w:type="dxa" w:w="2304"/>
             <w:vAlign w:val="center"/>
             <w:tcBorders>
               <w:top w:val="single" w:sz="6" w:color="B0B7C3"/>
@@ -2214,15 +1978,243 @@
               <w:rPr>
                 <w:b w:val="0"/>
                 <w:color w:val="1A1A1A"/>
-                <w:sz w:val="20"/>
+                <w:sz w:val="21"/>
               </w:rPr>
-              <w:t>0</w:t>
+              <w:t>786</w:t>
+            </w:r>
+          </w:p>
+        </w:tc>
+      </w:tr>
+      <w:tr>
+        <w:trPr>
+          <w:trHeight w:val="400" w:hRule="atLeast"/>
+        </w:trPr>
+        <w:tc>
+          <w:tcPr>
+            <w:tcW w:type="dxa" w:w="1440"/>
+            <w:vAlign w:val="center"/>
+            <w:tcBorders>
+              <w:top w:val="single" w:sz="6" w:color="B0B7C3"/>
+              <w:left w:val="single" w:sz="6" w:color="B0B7C3"/>
+              <w:bottom w:val="single" w:sz="6" w:color="B0B7C3"/>
+              <w:right w:val="single" w:sz="6" w:color="B0B7C3"/>
+            </w:tcBorders>
+          </w:tcPr>
+          <w:p>
+            <w:pPr>
+              <w:spacing w:before="0" w:after="0"/>
+              <w:jc w:val="left"/>
+            </w:pPr>
+            <w:r/>
+            <w:r>
+              <w:rPr>
+                <w:b w:val="0"/>
+                <w:color w:val="1A1A1A"/>
+                <w:sz w:val="21"/>
+              </w:rPr>
+              <w:t>07</w:t>
             </w:r>
           </w:p>
         </w:tc>
         <w:tc>
           <w:tcPr>
+            <w:tcW w:type="dxa" w:w="4320"/>
+            <w:vAlign w:val="center"/>
+            <w:tcBorders>
+              <w:top w:val="single" w:sz="6" w:color="B0B7C3"/>
+              <w:left w:val="single" w:sz="6" w:color="B0B7C3"/>
+              <w:bottom w:val="single" w:sz="6" w:color="B0B7C3"/>
+              <w:right w:val="single" w:sz="6" w:color="B0B7C3"/>
+            </w:tcBorders>
+          </w:tcPr>
+          <w:p>
+            <w:pPr>
+              <w:spacing w:before="0" w:after="0"/>
+              <w:jc w:val="left"/>
+            </w:pPr>
+            <w:r/>
+            <w:r>
+              <w:rPr>
+                <w:b w:val="0"/>
+                <w:color w:val="1A1A1A"/>
+                <w:sz w:val="21"/>
+              </w:rPr>
+              <w:t>State Government</w:t>
+            </w:r>
+          </w:p>
+        </w:tc>
+        <w:tc>
+          <w:tcPr>
+            <w:tcW w:type="dxa" w:w="1872"/>
+            <w:vAlign w:val="center"/>
+            <w:tcBorders>
+              <w:top w:val="single" w:sz="6" w:color="B0B7C3"/>
+              <w:left w:val="single" w:sz="6" w:color="B0B7C3"/>
+              <w:bottom w:val="single" w:sz="6" w:color="B0B7C3"/>
+              <w:right w:val="single" w:sz="6" w:color="B0B7C3"/>
+            </w:tcBorders>
+          </w:tcPr>
+          <w:p>
+            <w:pPr>
+              <w:spacing w:before="0" w:after="0"/>
+              <w:jc w:val="right"/>
+            </w:pPr>
+            <w:r/>
+            <w:r>
+              <w:rPr>
+                <w:b w:val="0"/>
+                <w:color w:val="1A1A1A"/>
+                <w:sz w:val="21"/>
+              </w:rPr>
+              <w:t>6,798</w:t>
+            </w:r>
+          </w:p>
+        </w:tc>
+        <w:tc>
+          <w:tcPr>
+            <w:tcW w:type="dxa" w:w="2016"/>
+            <w:vAlign w:val="center"/>
+            <w:tcBorders>
+              <w:top w:val="single" w:sz="6" w:color="B0B7C3"/>
+              <w:left w:val="single" w:sz="6" w:color="B0B7C3"/>
+              <w:bottom w:val="single" w:sz="6" w:color="B0B7C3"/>
+              <w:right w:val="single" w:sz="6" w:color="B0B7C3"/>
+            </w:tcBorders>
+          </w:tcPr>
+          <w:p>
+            <w:pPr>
+              <w:spacing w:before="0" w:after="0"/>
+              <w:jc w:val="right"/>
+            </w:pPr>
+            <w:r/>
+            <w:r>
+              <w:rPr>
+                <w:b w:val="0"/>
+                <w:color w:val="1A1A1A"/>
+                <w:sz w:val="21"/>
+              </w:rPr>
+              <w:t>6,282</w:t>
+            </w:r>
+          </w:p>
+        </w:tc>
+        <w:tc>
+          <w:tcPr>
+            <w:tcW w:type="dxa" w:w="2016"/>
+            <w:vAlign w:val="center"/>
+            <w:tcBorders>
+              <w:top w:val="single" w:sz="6" w:color="B0B7C3"/>
+              <w:left w:val="single" w:sz="6" w:color="B0B7C3"/>
+              <w:bottom w:val="single" w:sz="6" w:color="B0B7C3"/>
+              <w:right w:val="single" w:sz="6" w:color="B0B7C3"/>
+            </w:tcBorders>
+          </w:tcPr>
+          <w:p>
+            <w:pPr>
+              <w:spacing w:before="0" w:after="0"/>
+              <w:jc w:val="right"/>
+            </w:pPr>
+            <w:r/>
+            <w:r>
+              <w:rPr>
+                <w:b w:val="0"/>
+                <w:color w:val="1A1A1A"/>
+                <w:sz w:val="21"/>
+              </w:rPr>
+              <w:t>516</w:t>
+            </w:r>
+          </w:p>
+        </w:tc>
+        <w:tc>
+          <w:tcPr>
+            <w:tcW w:type="dxa" w:w="2304"/>
+            <w:vAlign w:val="center"/>
+            <w:tcBorders>
+              <w:top w:val="single" w:sz="6" w:color="B0B7C3"/>
+              <w:left w:val="single" w:sz="6" w:color="B0B7C3"/>
+              <w:bottom w:val="single" w:sz="6" w:color="B0B7C3"/>
+              <w:right w:val="single" w:sz="6" w:color="B0B7C3"/>
+            </w:tcBorders>
+          </w:tcPr>
+          <w:p>
+            <w:pPr>
+              <w:spacing w:before="0" w:after="0"/>
+              <w:jc w:val="right"/>
+            </w:pPr>
+            <w:r/>
+            <w:r>
+              <w:rPr>
+                <w:b w:val="0"/>
+                <w:color w:val="1A1A1A"/>
+                <w:sz w:val="21"/>
+              </w:rPr>
+              <w:t>184,911</w:t>
+            </w:r>
+          </w:p>
+        </w:tc>
+      </w:tr>
+      <w:tr>
+        <w:trPr>
+          <w:trHeight w:val="400" w:hRule="atLeast"/>
+        </w:trPr>
+        <w:tc>
+          <w:tcPr>
             <w:tcW w:type="dxa" w:w="1440"/>
+            <w:vAlign w:val="center"/>
+            <w:tcBorders>
+              <w:top w:val="single" w:sz="6" w:color="B0B7C3"/>
+              <w:left w:val="single" w:sz="6" w:color="B0B7C3"/>
+              <w:bottom w:val="single" w:sz="6" w:color="B0B7C3"/>
+              <w:right w:val="single" w:sz="6" w:color="B0B7C3"/>
+            </w:tcBorders>
+            <w:shd w:fill="F6F7FA" w:val="clear"/>
+          </w:tcPr>
+          <w:p>
+            <w:pPr>
+              <w:spacing w:before="0" w:after="0"/>
+              <w:jc w:val="left"/>
+            </w:pPr>
+            <w:r/>
+            <w:r>
+              <w:rPr>
+                <w:b w:val="0"/>
+                <w:color w:val="1A1A1A"/>
+                <w:sz w:val="21"/>
+              </w:rPr>
+              <w:t>08</w:t>
+            </w:r>
+          </w:p>
+        </w:tc>
+        <w:tc>
+          <w:tcPr>
+            <w:tcW w:type="dxa" w:w="4320"/>
+            <w:vAlign w:val="center"/>
+            <w:tcBorders>
+              <w:top w:val="single" w:sz="6" w:color="B0B7C3"/>
+              <w:left w:val="single" w:sz="6" w:color="B0B7C3"/>
+              <w:bottom w:val="single" w:sz="6" w:color="B0B7C3"/>
+              <w:right w:val="single" w:sz="6" w:color="B0B7C3"/>
+            </w:tcBorders>
+            <w:shd w:fill="F6F7FA" w:val="clear"/>
+          </w:tcPr>
+          <w:p>
+            <w:pPr>
+              <w:spacing w:before="0" w:after="0"/>
+              <w:jc w:val="left"/>
+            </w:pPr>
+            <w:r/>
+            <w:r>
+              <w:rPr>
+                <w:b w:val="0"/>
+                <w:color w:val="1A1A1A"/>
+                <w:sz w:val="21"/>
+              </w:rPr>
+              <w:t>Municipal / Private Institute</w:t>
+            </w:r>
+          </w:p>
+        </w:tc>
+        <w:tc>
+          <w:tcPr>
+            <w:tcW w:type="dxa" w:w="1872"/>
             <w:vAlign w:val="center"/>
             <w:tcBorders>
               <w:top w:val="single" w:sz="6" w:color="B0B7C3"/>
@@ -2242,15 +2234,15 @@
               <w:rPr>
                 <w:b w:val="0"/>
                 <w:color w:val="1A1A1A"/>
-                <w:sz w:val="20"/>
+                <w:sz w:val="21"/>
               </w:rPr>
-              <w:t>786</w:t>
+              <w:t>16,009</w:t>
             </w:r>
           </w:p>
         </w:tc>
         <w:tc>
           <w:tcPr>
-            <w:tcW w:type="dxa" w:w="1224"/>
+            <w:tcW w:type="dxa" w:w="2016"/>
             <w:vAlign w:val="center"/>
             <w:tcBorders>
               <w:top w:val="single" w:sz="6" w:color="B0B7C3"/>
@@ -2270,15 +2262,15 @@
               <w:rPr>
                 <w:b w:val="0"/>
                 <w:color w:val="1A1A1A"/>
-                <w:sz w:val="20"/>
+                <w:sz w:val="21"/>
               </w:rPr>
-              <w:t>705</w:t>
+              <w:t>15,787</w:t>
             </w:r>
           </w:p>
         </w:tc>
         <w:tc>
           <w:tcPr>
-            <w:tcW w:type="dxa" w:w="1368"/>
+            <w:tcW w:type="dxa" w:w="2016"/>
             <w:vAlign w:val="center"/>
             <w:tcBorders>
               <w:top w:val="single" w:sz="6" w:color="B0B7C3"/>
@@ -2298,15 +2290,15 @@
               <w:rPr>
                 <w:b w:val="0"/>
                 <w:color w:val="1A1A1A"/>
-                <w:sz w:val="20"/>
+                <w:sz w:val="21"/>
               </w:rPr>
-              <w:t>81</w:t>
+              <w:t>222</w:t>
             </w:r>
           </w:p>
         </w:tc>
         <w:tc>
           <w:tcPr>
-            <w:tcW w:type="dxa" w:w="1224"/>
+            <w:tcW w:type="dxa" w:w="2304"/>
             <w:vAlign w:val="center"/>
             <w:tcBorders>
               <w:top w:val="single" w:sz="6" w:color="B0B7C3"/>
@@ -2326,9 +2318,9 @@
               <w:rPr>
                 <w:b w:val="0"/>
                 <w:color w:val="1A1A1A"/>
-                <w:sz w:val="20"/>
+                <w:sz w:val="21"/>
               </w:rPr>
-              <w:t>0</w:t>
+              <w:t>222,199</w:t>
             </w:r>
           </w:p>
         </w:tc>
@@ -2339,7 +2331,7 @@
         </w:trPr>
         <w:tc>
           <w:tcPr>
-            <w:tcW w:type="dxa" w:w="1008"/>
+            <w:tcW w:type="dxa" w:w="1440"/>
             <w:vAlign w:val="center"/>
             <w:tcBorders>
               <w:top w:val="single" w:sz="6" w:color="B0B7C3"/>
@@ -2358,15 +2350,15 @@
               <w:rPr>
                 <w:b w:val="0"/>
                 <w:color w:val="1A1A1A"/>
-                <w:sz w:val="20"/>
+                <w:sz w:val="21"/>
               </w:rPr>
-              <w:t>07</w:t>
+              <w:t>09</w:t>
             </w:r>
           </w:p>
         </w:tc>
         <w:tc>
           <w:tcPr>
-            <w:tcW w:type="dxa" w:w="3312"/>
+            <w:tcW w:type="dxa" w:w="4320"/>
             <w:vAlign w:val="center"/>
             <w:tcBorders>
               <w:top w:val="single" w:sz="6" w:color="B0B7C3"/>
@@ -2385,15 +2377,15 @@
               <w:rPr>
                 <w:b w:val="0"/>
                 <w:color w:val="1A1A1A"/>
-                <w:sz w:val="20"/>
+                <w:sz w:val="21"/>
               </w:rPr>
-              <w:t>State Gov</w:t>
+              <w:t>Private College / University</w:t>
             </w:r>
           </w:p>
         </w:tc>
         <w:tc>
           <w:tcPr>
-            <w:tcW w:type="dxa" w:w="1224"/>
+            <w:tcW w:type="dxa" w:w="1872"/>
             <w:vAlign w:val="center"/>
             <w:tcBorders>
               <w:top w:val="single" w:sz="6" w:color="B0B7C3"/>
@@ -2412,15 +2404,15 @@
               <w:rPr>
                 <w:b w:val="0"/>
                 <w:color w:val="1A1A1A"/>
-                <w:sz w:val="20"/>
+                <w:sz w:val="21"/>
               </w:rPr>
-              <w:t>6,798</w:t>
+              <w:t>2,423</w:t>
             </w:r>
           </w:p>
         </w:tc>
         <w:tc>
           <w:tcPr>
-            <w:tcW w:type="dxa" w:w="1080"/>
+            <w:tcW w:type="dxa" w:w="2016"/>
             <w:vAlign w:val="center"/>
             <w:tcBorders>
               <w:top w:val="single" w:sz="6" w:color="B0B7C3"/>
@@ -2439,15 +2431,15 @@
               <w:rPr>
                 <w:b w:val="0"/>
                 <w:color w:val="1A1A1A"/>
-                <w:sz w:val="20"/>
+                <w:sz w:val="21"/>
               </w:rPr>
-              <w:t>6,282</w:t>
+              <w:t>2,160</w:t>
             </w:r>
           </w:p>
         </w:tc>
         <w:tc>
           <w:tcPr>
-            <w:tcW w:type="dxa" w:w="1224"/>
+            <w:tcW w:type="dxa" w:w="2016"/>
             <w:vAlign w:val="center"/>
             <w:tcBorders>
               <w:top w:val="single" w:sz="6" w:color="B0B7C3"/>
@@ -2466,15 +2458,15 @@
               <w:rPr>
                 <w:b w:val="0"/>
                 <w:color w:val="1A1A1A"/>
-                <w:sz w:val="20"/>
+                <w:sz w:val="21"/>
               </w:rPr>
-              <w:t>382</w:t>
+              <w:t>263</w:t>
             </w:r>
           </w:p>
         </w:tc>
         <w:tc>
           <w:tcPr>
-            <w:tcW w:type="dxa" w:w="1080"/>
+            <w:tcW w:type="dxa" w:w="2304"/>
             <w:vAlign w:val="center"/>
             <w:tcBorders>
               <w:top w:val="single" w:sz="6" w:color="B0B7C3"/>
@@ -2493,117 +2485,9 @@
               <w:rPr>
                 <w:b w:val="0"/>
                 <w:color w:val="1A1A1A"/>
-                <w:sz w:val="20"/>
+                <w:sz w:val="21"/>
               </w:rPr>
-              <w:t>134</w:t>
-            </w:r>
-          </w:p>
-        </w:tc>
-        <w:tc>
-          <w:tcPr>
-            <w:tcW w:type="dxa" w:w="1440"/>
-            <w:vAlign w:val="center"/>
-            <w:tcBorders>
-              <w:top w:val="single" w:sz="6" w:color="B0B7C3"/>
-              <w:left w:val="single" w:sz="6" w:color="B0B7C3"/>
-              <w:bottom w:val="single" w:sz="6" w:color="B0B7C3"/>
-              <w:right w:val="single" w:sz="6" w:color="B0B7C3"/>
-            </w:tcBorders>
-          </w:tcPr>
-          <w:p>
-            <w:pPr>
-              <w:spacing w:before="0" w:after="0"/>
-              <w:jc w:val="right"/>
-            </w:pPr>
-            <w:r/>
-            <w:r>
-              <w:rPr>
-                <w:b w:val="0"/>
-                <w:color w:val="1A1A1A"/>
-                <w:sz w:val="20"/>
-              </w:rPr>
-              <w:t>184,911</w:t>
-            </w:r>
-          </w:p>
-        </w:tc>
-        <w:tc>
-          <w:tcPr>
-            <w:tcW w:type="dxa" w:w="1224"/>
-            <w:vAlign w:val="center"/>
-            <w:tcBorders>
-              <w:top w:val="single" w:sz="6" w:color="B0B7C3"/>
-              <w:left w:val="single" w:sz="6" w:color="B0B7C3"/>
-              <w:bottom w:val="single" w:sz="6" w:color="B0B7C3"/>
-              <w:right w:val="single" w:sz="6" w:color="B0B7C3"/>
-            </w:tcBorders>
-          </w:tcPr>
-          <w:p>
-            <w:pPr>
-              <w:spacing w:before="0" w:after="0"/>
-              <w:jc w:val="right"/>
-            </w:pPr>
-            <w:r/>
-            <w:r>
-              <w:rPr>
-                <w:b w:val="0"/>
-                <w:color w:val="1A1A1A"/>
-                <w:sz w:val="20"/>
-              </w:rPr>
-              <w:t>86,816</w:t>
-            </w:r>
-          </w:p>
-        </w:tc>
-        <w:tc>
-          <w:tcPr>
-            <w:tcW w:type="dxa" w:w="1368"/>
-            <w:vAlign w:val="center"/>
-            <w:tcBorders>
-              <w:top w:val="single" w:sz="6" w:color="B0B7C3"/>
-              <w:left w:val="single" w:sz="6" w:color="B0B7C3"/>
-              <w:bottom w:val="single" w:sz="6" w:color="B0B7C3"/>
-              <w:right w:val="single" w:sz="6" w:color="B0B7C3"/>
-            </w:tcBorders>
-          </w:tcPr>
-          <w:p>
-            <w:pPr>
-              <w:spacing w:before="0" w:after="0"/>
-              <w:jc w:val="right"/>
-            </w:pPr>
-            <w:r/>
-            <w:r>
-              <w:rPr>
-                <w:b w:val="0"/>
-                <w:color w:val="1A1A1A"/>
-                <w:sz w:val="20"/>
-              </w:rPr>
-              <w:t>43,295</w:t>
-            </w:r>
-          </w:p>
-        </w:tc>
-        <w:tc>
-          <w:tcPr>
-            <w:tcW w:type="dxa" w:w="1224"/>
-            <w:vAlign w:val="center"/>
-            <w:tcBorders>
-              <w:top w:val="single" w:sz="6" w:color="B0B7C3"/>
-              <w:left w:val="single" w:sz="6" w:color="B0B7C3"/>
-              <w:bottom w:val="single" w:sz="6" w:color="B0B7C3"/>
-              <w:right w:val="single" w:sz="6" w:color="B0B7C3"/>
-            </w:tcBorders>
-          </w:tcPr>
-          <w:p>
-            <w:pPr>
-              <w:spacing w:before="0" w:after="0"/>
-              <w:jc w:val="right"/>
-            </w:pPr>
-            <w:r/>
-            <w:r>
-              <w:rPr>
-                <w:b w:val="0"/>
-                <w:color w:val="1A1A1A"/>
-                <w:sz w:val="20"/>
-              </w:rPr>
-              <w:t>54,800</w:t>
+              <w:t>112,332</w:t>
             </w:r>
           </w:p>
         </w:tc>
@@ -2614,567 +2498,7 @@
         </w:trPr>
         <w:tc>
           <w:tcPr>
-            <w:tcW w:type="dxa" w:w="1008"/>
-            <w:vAlign w:val="center"/>
-            <w:tcBorders>
-              <w:top w:val="single" w:sz="6" w:color="B0B7C3"/>
-              <w:left w:val="single" w:sz="6" w:color="B0B7C3"/>
-              <w:bottom w:val="single" w:sz="6" w:color="B0B7C3"/>
-              <w:right w:val="single" w:sz="6" w:color="B0B7C3"/>
-            </w:tcBorders>
-            <w:shd w:fill="F6F7FA" w:val="clear"/>
-          </w:tcPr>
-          <w:p>
-            <w:pPr>
-              <w:spacing w:before="0" w:after="0"/>
-              <w:jc w:val="left"/>
-            </w:pPr>
-            <w:r/>
-            <w:r>
-              <w:rPr>
-                <w:b w:val="0"/>
-                <w:color w:val="1A1A1A"/>
-                <w:sz w:val="20"/>
-              </w:rPr>
-              <w:t>08</w:t>
-            </w:r>
-          </w:p>
-        </w:tc>
-        <w:tc>
-          <w:tcPr>
-            <w:tcW w:type="dxa" w:w="3312"/>
-            <w:vAlign w:val="center"/>
-            <w:tcBorders>
-              <w:top w:val="single" w:sz="6" w:color="B0B7C3"/>
-              <w:left w:val="single" w:sz="6" w:color="B0B7C3"/>
-              <w:bottom w:val="single" w:sz="6" w:color="B0B7C3"/>
-              <w:right w:val="single" w:sz="6" w:color="B0B7C3"/>
-            </w:tcBorders>
-            <w:shd w:fill="F6F7FA" w:val="clear"/>
-          </w:tcPr>
-          <w:p>
-            <w:pPr>
-              <w:spacing w:before="0" w:after="0"/>
-              <w:jc w:val="left"/>
-            </w:pPr>
-            <w:r/>
-            <w:r>
-              <w:rPr>
-                <w:b w:val="0"/>
-                <w:color w:val="1A1A1A"/>
-                <w:sz w:val="20"/>
-              </w:rPr>
-              <w:t>Municipal / Private Institute</w:t>
-            </w:r>
-          </w:p>
-        </w:tc>
-        <w:tc>
-          <w:tcPr>
-            <w:tcW w:type="dxa" w:w="1224"/>
-            <w:vAlign w:val="center"/>
-            <w:tcBorders>
-              <w:top w:val="single" w:sz="6" w:color="B0B7C3"/>
-              <w:left w:val="single" w:sz="6" w:color="B0B7C3"/>
-              <w:bottom w:val="single" w:sz="6" w:color="B0B7C3"/>
-              <w:right w:val="single" w:sz="6" w:color="B0B7C3"/>
-            </w:tcBorders>
-            <w:shd w:fill="F6F7FA" w:val="clear"/>
-          </w:tcPr>
-          <w:p>
-            <w:pPr>
-              <w:spacing w:before="0" w:after="0"/>
-              <w:jc w:val="right"/>
-            </w:pPr>
-            <w:r/>
-            <w:r>
-              <w:rPr>
-                <w:b w:val="0"/>
-                <w:color w:val="1A1A1A"/>
-                <w:sz w:val="20"/>
-              </w:rPr>
-              <w:t>16,009</w:t>
-            </w:r>
-          </w:p>
-        </w:tc>
-        <w:tc>
-          <w:tcPr>
-            <w:tcW w:type="dxa" w:w="1080"/>
-            <w:vAlign w:val="center"/>
-            <w:tcBorders>
-              <w:top w:val="single" w:sz="6" w:color="B0B7C3"/>
-              <w:left w:val="single" w:sz="6" w:color="B0B7C3"/>
-              <w:bottom w:val="single" w:sz="6" w:color="B0B7C3"/>
-              <w:right w:val="single" w:sz="6" w:color="B0B7C3"/>
-            </w:tcBorders>
-            <w:shd w:fill="F6F7FA" w:val="clear"/>
-          </w:tcPr>
-          <w:p>
-            <w:pPr>
-              <w:spacing w:before="0" w:after="0"/>
-              <w:jc w:val="right"/>
-            </w:pPr>
-            <w:r/>
-            <w:r>
-              <w:rPr>
-                <w:b w:val="0"/>
-                <w:color w:val="1A1A1A"/>
-                <w:sz w:val="20"/>
-              </w:rPr>
-              <w:t>15,787</w:t>
-            </w:r>
-          </w:p>
-        </w:tc>
-        <w:tc>
-          <w:tcPr>
-            <w:tcW w:type="dxa" w:w="1224"/>
-            <w:vAlign w:val="center"/>
-            <w:tcBorders>
-              <w:top w:val="single" w:sz="6" w:color="B0B7C3"/>
-              <w:left w:val="single" w:sz="6" w:color="B0B7C3"/>
-              <w:bottom w:val="single" w:sz="6" w:color="B0B7C3"/>
-              <w:right w:val="single" w:sz="6" w:color="B0B7C3"/>
-            </w:tcBorders>
-            <w:shd w:fill="F6F7FA" w:val="clear"/>
-          </w:tcPr>
-          <w:p>
-            <w:pPr>
-              <w:spacing w:before="0" w:after="0"/>
-              <w:jc w:val="right"/>
-            </w:pPr>
-            <w:r/>
-            <w:r>
-              <w:rPr>
-                <w:b w:val="0"/>
-                <w:color w:val="1A1A1A"/>
-                <w:sz w:val="20"/>
-              </w:rPr>
-              <w:t>176</w:t>
-            </w:r>
-          </w:p>
-        </w:tc>
-        <w:tc>
-          <w:tcPr>
-            <w:tcW w:type="dxa" w:w="1080"/>
-            <w:vAlign w:val="center"/>
-            <w:tcBorders>
-              <w:top w:val="single" w:sz="6" w:color="B0B7C3"/>
-              <w:left w:val="single" w:sz="6" w:color="B0B7C3"/>
-              <w:bottom w:val="single" w:sz="6" w:color="B0B7C3"/>
-              <w:right w:val="single" w:sz="6" w:color="B0B7C3"/>
-            </w:tcBorders>
-            <w:shd w:fill="F6F7FA" w:val="clear"/>
-          </w:tcPr>
-          <w:p>
-            <w:pPr>
-              <w:spacing w:before="0" w:after="0"/>
-              <w:jc w:val="right"/>
-            </w:pPr>
-            <w:r/>
-            <w:r>
-              <w:rPr>
-                <w:b w:val="0"/>
-                <w:color w:val="1A1A1A"/>
-                <w:sz w:val="20"/>
-              </w:rPr>
-              <w:t>46</w:t>
-            </w:r>
-          </w:p>
-        </w:tc>
-        <w:tc>
-          <w:tcPr>
             <w:tcW w:type="dxa" w:w="1440"/>
-            <w:vAlign w:val="center"/>
-            <w:tcBorders>
-              <w:top w:val="single" w:sz="6" w:color="B0B7C3"/>
-              <w:left w:val="single" w:sz="6" w:color="B0B7C3"/>
-              <w:bottom w:val="single" w:sz="6" w:color="B0B7C3"/>
-              <w:right w:val="single" w:sz="6" w:color="B0B7C3"/>
-            </w:tcBorders>
-            <w:shd w:fill="F6F7FA" w:val="clear"/>
-          </w:tcPr>
-          <w:p>
-            <w:pPr>
-              <w:spacing w:before="0" w:after="0"/>
-              <w:jc w:val="right"/>
-            </w:pPr>
-            <w:r/>
-            <w:r>
-              <w:rPr>
-                <w:b w:val="0"/>
-                <w:color w:val="1A1A1A"/>
-                <w:sz w:val="20"/>
-              </w:rPr>
-              <w:t>222,199</w:t>
-            </w:r>
-          </w:p>
-        </w:tc>
-        <w:tc>
-          <w:tcPr>
-            <w:tcW w:type="dxa" w:w="1224"/>
-            <w:vAlign w:val="center"/>
-            <w:tcBorders>
-              <w:top w:val="single" w:sz="6" w:color="B0B7C3"/>
-              <w:left w:val="single" w:sz="6" w:color="B0B7C3"/>
-              <w:bottom w:val="single" w:sz="6" w:color="B0B7C3"/>
-              <w:right w:val="single" w:sz="6" w:color="B0B7C3"/>
-            </w:tcBorders>
-            <w:shd w:fill="F6F7FA" w:val="clear"/>
-          </w:tcPr>
-          <w:p>
-            <w:pPr>
-              <w:spacing w:before="0" w:after="0"/>
-              <w:jc w:val="right"/>
-            </w:pPr>
-            <w:r/>
-            <w:r>
-              <w:rPr>
-                <w:b w:val="0"/>
-                <w:color w:val="1A1A1A"/>
-                <w:sz w:val="20"/>
-              </w:rPr>
-              <w:t>151,639</w:t>
-            </w:r>
-          </w:p>
-        </w:tc>
-        <w:tc>
-          <w:tcPr>
-            <w:tcW w:type="dxa" w:w="1368"/>
-            <w:vAlign w:val="center"/>
-            <w:tcBorders>
-              <w:top w:val="single" w:sz="6" w:color="B0B7C3"/>
-              <w:left w:val="single" w:sz="6" w:color="B0B7C3"/>
-              <w:bottom w:val="single" w:sz="6" w:color="B0B7C3"/>
-              <w:right w:val="single" w:sz="6" w:color="B0B7C3"/>
-            </w:tcBorders>
-            <w:shd w:fill="F6F7FA" w:val="clear"/>
-          </w:tcPr>
-          <w:p>
-            <w:pPr>
-              <w:spacing w:before="0" w:after="0"/>
-              <w:jc w:val="right"/>
-            </w:pPr>
-            <w:r/>
-            <w:r>
-              <w:rPr>
-                <w:b w:val="0"/>
-                <w:color w:val="1A1A1A"/>
-                <w:sz w:val="20"/>
-              </w:rPr>
-              <w:t>22,623</w:t>
-            </w:r>
-          </w:p>
-        </w:tc>
-        <w:tc>
-          <w:tcPr>
-            <w:tcW w:type="dxa" w:w="1224"/>
-            <w:vAlign w:val="center"/>
-            <w:tcBorders>
-              <w:top w:val="single" w:sz="6" w:color="B0B7C3"/>
-              <w:left w:val="single" w:sz="6" w:color="B0B7C3"/>
-              <w:bottom w:val="single" w:sz="6" w:color="B0B7C3"/>
-              <w:right w:val="single" w:sz="6" w:color="B0B7C3"/>
-            </w:tcBorders>
-            <w:shd w:fill="F6F7FA" w:val="clear"/>
-          </w:tcPr>
-          <w:p>
-            <w:pPr>
-              <w:spacing w:before="0" w:after="0"/>
-              <w:jc w:val="right"/>
-            </w:pPr>
-            <w:r/>
-            <w:r>
-              <w:rPr>
-                <w:b w:val="0"/>
-                <w:color w:val="1A1A1A"/>
-                <w:sz w:val="20"/>
-              </w:rPr>
-              <w:t>47,937</w:t>
-            </w:r>
-          </w:p>
-        </w:tc>
-      </w:tr>
-      <w:tr>
-        <w:trPr>
-          <w:trHeight w:val="400" w:hRule="atLeast"/>
-        </w:trPr>
-        <w:tc>
-          <w:tcPr>
-            <w:tcW w:type="dxa" w:w="1008"/>
-            <w:vAlign w:val="center"/>
-            <w:tcBorders>
-              <w:top w:val="single" w:sz="6" w:color="B0B7C3"/>
-              <w:left w:val="single" w:sz="6" w:color="B0B7C3"/>
-              <w:bottom w:val="single" w:sz="6" w:color="B0B7C3"/>
-              <w:right w:val="single" w:sz="6" w:color="B0B7C3"/>
-            </w:tcBorders>
-          </w:tcPr>
-          <w:p>
-            <w:pPr>
-              <w:spacing w:before="0" w:after="0"/>
-              <w:jc w:val="left"/>
-            </w:pPr>
-            <w:r/>
-            <w:r>
-              <w:rPr>
-                <w:b w:val="0"/>
-                <w:color w:val="1A1A1A"/>
-                <w:sz w:val="20"/>
-              </w:rPr>
-              <w:t>09</w:t>
-            </w:r>
-          </w:p>
-        </w:tc>
-        <w:tc>
-          <w:tcPr>
-            <w:tcW w:type="dxa" w:w="3312"/>
-            <w:vAlign w:val="center"/>
-            <w:tcBorders>
-              <w:top w:val="single" w:sz="6" w:color="B0B7C3"/>
-              <w:left w:val="single" w:sz="6" w:color="B0B7C3"/>
-              <w:bottom w:val="single" w:sz="6" w:color="B0B7C3"/>
-              <w:right w:val="single" w:sz="6" w:color="B0B7C3"/>
-            </w:tcBorders>
-          </w:tcPr>
-          <w:p>
-            <w:pPr>
-              <w:spacing w:before="0" w:after="0"/>
-              <w:jc w:val="left"/>
-            </w:pPr>
-            <w:r/>
-            <w:r>
-              <w:rPr>
-                <w:b w:val="0"/>
-                <w:color w:val="1A1A1A"/>
-                <w:sz w:val="20"/>
-              </w:rPr>
-              <w:t>Private College / University</w:t>
-            </w:r>
-          </w:p>
-        </w:tc>
-        <w:tc>
-          <w:tcPr>
-            <w:tcW w:type="dxa" w:w="1224"/>
-            <w:vAlign w:val="center"/>
-            <w:tcBorders>
-              <w:top w:val="single" w:sz="6" w:color="B0B7C3"/>
-              <w:left w:val="single" w:sz="6" w:color="B0B7C3"/>
-              <w:bottom w:val="single" w:sz="6" w:color="B0B7C3"/>
-              <w:right w:val="single" w:sz="6" w:color="B0B7C3"/>
-            </w:tcBorders>
-          </w:tcPr>
-          <w:p>
-            <w:pPr>
-              <w:spacing w:before="0" w:after="0"/>
-              <w:jc w:val="right"/>
-            </w:pPr>
-            <w:r/>
-            <w:r>
-              <w:rPr>
-                <w:b w:val="0"/>
-                <w:color w:val="1A1A1A"/>
-                <w:sz w:val="20"/>
-              </w:rPr>
-              <w:t>2,423</w:t>
-            </w:r>
-          </w:p>
-        </w:tc>
-        <w:tc>
-          <w:tcPr>
-            <w:tcW w:type="dxa" w:w="1080"/>
-            <w:vAlign w:val="center"/>
-            <w:tcBorders>
-              <w:top w:val="single" w:sz="6" w:color="B0B7C3"/>
-              <w:left w:val="single" w:sz="6" w:color="B0B7C3"/>
-              <w:bottom w:val="single" w:sz="6" w:color="B0B7C3"/>
-              <w:right w:val="single" w:sz="6" w:color="B0B7C3"/>
-            </w:tcBorders>
-          </w:tcPr>
-          <w:p>
-            <w:pPr>
-              <w:spacing w:before="0" w:after="0"/>
-              <w:jc w:val="right"/>
-            </w:pPr>
-            <w:r/>
-            <w:r>
-              <w:rPr>
-                <w:b w:val="0"/>
-                <w:color w:val="1A1A1A"/>
-                <w:sz w:val="20"/>
-              </w:rPr>
-              <w:t>2,160</w:t>
-            </w:r>
-          </w:p>
-        </w:tc>
-        <w:tc>
-          <w:tcPr>
-            <w:tcW w:type="dxa" w:w="1224"/>
-            <w:vAlign w:val="center"/>
-            <w:tcBorders>
-              <w:top w:val="single" w:sz="6" w:color="B0B7C3"/>
-              <w:left w:val="single" w:sz="6" w:color="B0B7C3"/>
-              <w:bottom w:val="single" w:sz="6" w:color="B0B7C3"/>
-              <w:right w:val="single" w:sz="6" w:color="B0B7C3"/>
-            </w:tcBorders>
-          </w:tcPr>
-          <w:p>
-            <w:pPr>
-              <w:spacing w:before="0" w:after="0"/>
-              <w:jc w:val="right"/>
-            </w:pPr>
-            <w:r/>
-            <w:r>
-              <w:rPr>
-                <w:b w:val="0"/>
-                <w:color w:val="1A1A1A"/>
-                <w:sz w:val="20"/>
-              </w:rPr>
-              <w:t>171</w:t>
-            </w:r>
-          </w:p>
-        </w:tc>
-        <w:tc>
-          <w:tcPr>
-            <w:tcW w:type="dxa" w:w="1080"/>
-            <w:vAlign w:val="center"/>
-            <w:tcBorders>
-              <w:top w:val="single" w:sz="6" w:color="B0B7C3"/>
-              <w:left w:val="single" w:sz="6" w:color="B0B7C3"/>
-              <w:bottom w:val="single" w:sz="6" w:color="B0B7C3"/>
-              <w:right w:val="single" w:sz="6" w:color="B0B7C3"/>
-            </w:tcBorders>
-          </w:tcPr>
-          <w:p>
-            <w:pPr>
-              <w:spacing w:before="0" w:after="0"/>
-              <w:jc w:val="right"/>
-            </w:pPr>
-            <w:r/>
-            <w:r>
-              <w:rPr>
-                <w:b w:val="0"/>
-                <w:color w:val="1A1A1A"/>
-                <w:sz w:val="20"/>
-              </w:rPr>
-              <w:t>92</w:t>
-            </w:r>
-          </w:p>
-        </w:tc>
-        <w:tc>
-          <w:tcPr>
-            <w:tcW w:type="dxa" w:w="1440"/>
-            <w:vAlign w:val="center"/>
-            <w:tcBorders>
-              <w:top w:val="single" w:sz="6" w:color="B0B7C3"/>
-              <w:left w:val="single" w:sz="6" w:color="B0B7C3"/>
-              <w:bottom w:val="single" w:sz="6" w:color="B0B7C3"/>
-              <w:right w:val="single" w:sz="6" w:color="B0B7C3"/>
-            </w:tcBorders>
-          </w:tcPr>
-          <w:p>
-            <w:pPr>
-              <w:spacing w:before="0" w:after="0"/>
-              <w:jc w:val="right"/>
-            </w:pPr>
-            <w:r/>
-            <w:r>
-              <w:rPr>
-                <w:b w:val="0"/>
-                <w:color w:val="1A1A1A"/>
-                <w:sz w:val="20"/>
-              </w:rPr>
-              <w:t>112,332</w:t>
-            </w:r>
-          </w:p>
-        </w:tc>
-        <w:tc>
-          <w:tcPr>
-            <w:tcW w:type="dxa" w:w="1224"/>
-            <w:vAlign w:val="center"/>
-            <w:tcBorders>
-              <w:top w:val="single" w:sz="6" w:color="B0B7C3"/>
-              <w:left w:val="single" w:sz="6" w:color="B0B7C3"/>
-              <w:bottom w:val="single" w:sz="6" w:color="B0B7C3"/>
-              <w:right w:val="single" w:sz="6" w:color="B0B7C3"/>
-            </w:tcBorders>
-          </w:tcPr>
-          <w:p>
-            <w:pPr>
-              <w:spacing w:before="0" w:after="0"/>
-              <w:jc w:val="right"/>
-            </w:pPr>
-            <w:r/>
-            <w:r>
-              <w:rPr>
-                <w:b w:val="0"/>
-                <w:color w:val="1A1A1A"/>
-                <w:sz w:val="20"/>
-              </w:rPr>
-              <w:t>32,102</w:t>
-            </w:r>
-          </w:p>
-        </w:tc>
-        <w:tc>
-          <w:tcPr>
-            <w:tcW w:type="dxa" w:w="1368"/>
-            <w:vAlign w:val="center"/>
-            <w:tcBorders>
-              <w:top w:val="single" w:sz="6" w:color="B0B7C3"/>
-              <w:left w:val="single" w:sz="6" w:color="B0B7C3"/>
-              <w:bottom w:val="single" w:sz="6" w:color="B0B7C3"/>
-              <w:right w:val="single" w:sz="6" w:color="B0B7C3"/>
-            </w:tcBorders>
-          </w:tcPr>
-          <w:p>
-            <w:pPr>
-              <w:spacing w:before="0" w:after="0"/>
-              <w:jc w:val="right"/>
-            </w:pPr>
-            <w:r/>
-            <w:r>
-              <w:rPr>
-                <w:b w:val="0"/>
-                <w:color w:val="1A1A1A"/>
-                <w:sz w:val="20"/>
-              </w:rPr>
-              <w:t>17,286</w:t>
-            </w:r>
-          </w:p>
-        </w:tc>
-        <w:tc>
-          <w:tcPr>
-            <w:tcW w:type="dxa" w:w="1224"/>
-            <w:vAlign w:val="center"/>
-            <w:tcBorders>
-              <w:top w:val="single" w:sz="6" w:color="B0B7C3"/>
-              <w:left w:val="single" w:sz="6" w:color="B0B7C3"/>
-              <w:bottom w:val="single" w:sz="6" w:color="B0B7C3"/>
-              <w:right w:val="single" w:sz="6" w:color="B0B7C3"/>
-            </w:tcBorders>
-          </w:tcPr>
-          <w:p>
-            <w:pPr>
-              <w:spacing w:before="0" w:after="0"/>
-              <w:jc w:val="right"/>
-            </w:pPr>
-            <w:r/>
-            <w:r>
-              <w:rPr>
-                <w:b w:val="0"/>
-                <w:color w:val="1A1A1A"/>
-                <w:sz w:val="20"/>
-              </w:rPr>
-              <w:t>62,944</w:t>
-            </w:r>
-          </w:p>
-        </w:tc>
-      </w:tr>
-      <w:tr>
-        <w:trPr>
-          <w:trHeight w:val="400" w:hRule="atLeast"/>
-        </w:trPr>
-        <w:tc>
-          <w:tcPr>
-            <w:tcW w:type="dxa" w:w="1008"/>
             <w:vAlign w:val="center"/>
             <w:tcBorders>
               <w:top w:val="single" w:sz="6" w:color="B0B7C3"/>
@@ -3194,7 +2518,7 @@
               <w:rPr>
                 <w:b w:val="0"/>
                 <w:color w:val="1A1A1A"/>
-                <w:sz w:val="20"/>
+                <w:sz w:val="21"/>
               </w:rPr>
               <w:t>15</w:t>
             </w:r>
@@ -3202,7 +2526,7 @@
         </w:tc>
         <w:tc>
           <w:tcPr>
-            <w:tcW w:type="dxa" w:w="3312"/>
+            <w:tcW w:type="dxa" w:w="4320"/>
             <w:vAlign w:val="center"/>
             <w:tcBorders>
               <w:top w:val="single" w:sz="6" w:color="B0B7C3"/>
@@ -3222,7 +2546,7 @@
               <w:rPr>
                 <w:b/>
                 <w:color w:val="1A1A1A"/>
-                <w:sz w:val="20"/>
+                <w:sz w:val="21"/>
               </w:rPr>
               <w:t>McMaster-Carr Internal</w:t>
             </w:r>
@@ -3230,7 +2554,7 @@
         </w:tc>
         <w:tc>
           <w:tcPr>
-            <w:tcW w:type="dxa" w:w="1224"/>
+            <w:tcW w:type="dxa" w:w="1872"/>
             <w:vAlign w:val="center"/>
             <w:tcBorders>
               <w:top w:val="single" w:sz="6" w:color="B0B7C3"/>
@@ -3250,7 +2574,7 @@
               <w:rPr>
                 <w:b/>
                 <w:color w:val="1A1A1A"/>
-                <w:sz w:val="20"/>
+                <w:sz w:val="21"/>
               </w:rPr>
               <w:t>5</w:t>
             </w:r>
@@ -3258,7 +2582,7 @@
         </w:tc>
         <w:tc>
           <w:tcPr>
-            <w:tcW w:type="dxa" w:w="1080"/>
+            <w:tcW w:type="dxa" w:w="2016"/>
             <w:vAlign w:val="center"/>
             <w:tcBorders>
               <w:top w:val="single" w:sz="6" w:color="B0B7C3"/>
@@ -3278,7 +2602,7 @@
               <w:rPr>
                 <w:b/>
                 <w:color w:val="1A1A1A"/>
-                <w:sz w:val="20"/>
+                <w:sz w:val="21"/>
               </w:rPr>
               <w:t>0</w:t>
             </w:r>
@@ -3286,7 +2610,7 @@
         </w:tc>
         <w:tc>
           <w:tcPr>
-            <w:tcW w:type="dxa" w:w="1224"/>
+            <w:tcW w:type="dxa" w:w="2016"/>
             <w:vAlign w:val="center"/>
             <w:tcBorders>
               <w:top w:val="single" w:sz="6" w:color="B0B7C3"/>
@@ -3306,15 +2630,15 @@
               <w:rPr>
                 <w:b/>
                 <w:color w:val="1A1A1A"/>
-                <w:sz w:val="20"/>
+                <w:sz w:val="21"/>
               </w:rPr>
-              <w:t>0</w:t>
+              <w:t>5</w:t>
             </w:r>
           </w:p>
         </w:tc>
         <w:tc>
           <w:tcPr>
-            <w:tcW w:type="dxa" w:w="1080"/>
+            <w:tcW w:type="dxa" w:w="2304"/>
             <w:vAlign w:val="center"/>
             <w:tcBorders>
               <w:top w:val="single" w:sz="6" w:color="B0B7C3"/>
@@ -3334,15 +2658,76 @@
               <w:rPr>
                 <w:b/>
                 <w:color w:val="1A1A1A"/>
-                <w:sz w:val="20"/>
+                <w:sz w:val="21"/>
               </w:rPr>
-              <w:t>5</w:t>
+              <w:t>42,130</w:t>
+            </w:r>
+          </w:p>
+        </w:tc>
+      </w:tr>
+      <w:tr>
+        <w:trPr>
+          <w:trHeight w:val="400" w:hRule="atLeast"/>
+        </w:trPr>
+        <w:tc>
+          <w:tcPr>
+            <w:tcW w:type="dxa" w:w="1440"/>
+            <w:vAlign w:val="center"/>
+            <w:tcBorders>
+              <w:top w:val="single" w:sz="6" w:color="B0B7C3"/>
+              <w:left w:val="single" w:sz="6" w:color="B0B7C3"/>
+              <w:bottom w:val="single" w:sz="6" w:color="B0B7C3"/>
+              <w:right w:val="single" w:sz="6" w:color="B0B7C3"/>
+            </w:tcBorders>
+            <w:shd w:fill="FDF3D3" w:val="clear"/>
+          </w:tcPr>
+          <w:p>
+            <w:pPr>
+              <w:spacing w:before="0" w:after="0"/>
+              <w:jc w:val="left"/>
+            </w:pPr>
+            <w:r/>
+            <w:r>
+              <w:rPr>
+                <w:b w:val="0"/>
+                <w:color w:val="1A1A1A"/>
+                <w:sz w:val="21"/>
+              </w:rPr>
+              <w:t>—</w:t>
             </w:r>
           </w:p>
         </w:tc>
         <w:tc>
           <w:tcPr>
-            <w:tcW w:type="dxa" w:w="1440"/>
+            <w:tcW w:type="dxa" w:w="4320"/>
+            <w:vAlign w:val="center"/>
+            <w:tcBorders>
+              <w:top w:val="single" w:sz="6" w:color="B0B7C3"/>
+              <w:left w:val="single" w:sz="6" w:color="B0B7C3"/>
+              <w:bottom w:val="single" w:sz="6" w:color="B0B7C3"/>
+              <w:right w:val="single" w:sz="6" w:color="B0B7C3"/>
+            </w:tcBorders>
+            <w:shd w:fill="FDF3D3" w:val="clear"/>
+          </w:tcPr>
+          <w:p>
+            <w:pPr>
+              <w:spacing w:before="0" w:after="0"/>
+              <w:jc w:val="left"/>
+            </w:pPr>
+            <w:r/>
+            <w:r>
+              <w:rPr>
+                <w:b/>
+                <w:color w:val="1A1A1A"/>
+                <w:sz w:val="21"/>
+              </w:rPr>
+              <w:t>Total</w:t>
+            </w:r>
+          </w:p>
+        </w:tc>
+        <w:tc>
+          <w:tcPr>
+            <w:tcW w:type="dxa" w:w="1872"/>
             <w:vAlign w:val="center"/>
             <w:tcBorders>
               <w:top w:val="single" w:sz="6" w:color="B0B7C3"/>
@@ -3362,15 +2747,15 @@
               <w:rPr>
                 <w:b/>
                 <w:color w:val="1A1A1A"/>
-                <w:sz w:val="20"/>
+                <w:sz w:val="21"/>
               </w:rPr>
-              <w:t>42,130</w:t>
+              <w:t>28,453</w:t>
             </w:r>
           </w:p>
         </w:tc>
         <w:tc>
           <w:tcPr>
-            <w:tcW w:type="dxa" w:w="1224"/>
+            <w:tcW w:type="dxa" w:w="2016"/>
             <w:vAlign w:val="center"/>
             <w:tcBorders>
               <w:top w:val="single" w:sz="6" w:color="B0B7C3"/>
@@ -3390,15 +2775,15 @@
               <w:rPr>
                 <w:b/>
                 <w:color w:val="1A1A1A"/>
-                <w:sz w:val="20"/>
+                <w:sz w:val="21"/>
               </w:rPr>
-              <w:t>0</w:t>
+              <w:t>27,338</w:t>
             </w:r>
           </w:p>
         </w:tc>
         <w:tc>
           <w:tcPr>
-            <w:tcW w:type="dxa" w:w="1368"/>
+            <w:tcW w:type="dxa" w:w="2016"/>
             <w:vAlign w:val="center"/>
             <w:tcBorders>
               <w:top w:val="single" w:sz="6" w:color="B0B7C3"/>
@@ -3418,15 +2803,15 @@
               <w:rPr>
                 <w:b/>
                 <w:color w:val="1A1A1A"/>
-                <w:sz w:val="20"/>
+                <w:sz w:val="21"/>
               </w:rPr>
-              <w:t>0</w:t>
+              <w:t>1,115</w:t>
             </w:r>
           </w:p>
         </w:tc>
         <w:tc>
           <w:tcPr>
-            <w:tcW w:type="dxa" w:w="1224"/>
+            <w:tcW w:type="dxa" w:w="2304"/>
             <w:vAlign w:val="center"/>
             <w:tcBorders>
               <w:top w:val="single" w:sz="6" w:color="B0B7C3"/>
@@ -3446,294 +2831,9 @@
               <w:rPr>
                 <w:b/>
                 <w:color w:val="1A1A1A"/>
-                <w:sz w:val="20"/>
-              </w:rPr>
-              <w:t>42,130</w:t>
-            </w:r>
-          </w:p>
-        </w:tc>
-      </w:tr>
-      <w:tr>
-        <w:trPr>
-          <w:trHeight w:val="400" w:hRule="atLeast"/>
-        </w:trPr>
-        <w:tc>
-          <w:tcPr>
-            <w:tcW w:type="dxa" w:w="1008"/>
-            <w:vAlign w:val="center"/>
-            <w:tcBorders>
-              <w:top w:val="single" w:sz="6" w:color="B0B7C3"/>
-              <w:left w:val="single" w:sz="6" w:color="B0B7C3"/>
-              <w:bottom w:val="single" w:sz="6" w:color="B0B7C3"/>
-              <w:right w:val="single" w:sz="6" w:color="B0B7C3"/>
-            </w:tcBorders>
-            <w:shd w:fill="FDF3D3" w:val="clear"/>
-          </w:tcPr>
-          <w:p>
-            <w:pPr>
-              <w:spacing w:before="0" w:after="0"/>
-              <w:jc w:val="left"/>
-            </w:pPr>
-            <w:r/>
-            <w:r>
-              <w:rPr>
-                <w:b w:val="0"/>
-                <w:color w:val="1A1A1A"/>
-                <w:sz w:val="20"/>
-              </w:rPr>
-              <w:t>—</w:t>
-            </w:r>
-          </w:p>
-        </w:tc>
-        <w:tc>
-          <w:tcPr>
-            <w:tcW w:type="dxa" w:w="3312"/>
-            <w:vAlign w:val="center"/>
-            <w:tcBorders>
-              <w:top w:val="single" w:sz="6" w:color="B0B7C3"/>
-              <w:left w:val="single" w:sz="6" w:color="B0B7C3"/>
-              <w:bottom w:val="single" w:sz="6" w:color="B0B7C3"/>
-              <w:right w:val="single" w:sz="6" w:color="B0B7C3"/>
-            </w:tcBorders>
-            <w:shd w:fill="FDF3D3" w:val="clear"/>
-          </w:tcPr>
-          <w:p>
-            <w:pPr>
-              <w:spacing w:before="0" w:after="0"/>
-              <w:jc w:val="left"/>
-            </w:pPr>
-            <w:r/>
-            <w:r>
-              <w:rPr>
-                <w:b/>
-                <w:color w:val="1A1A1A"/>
-                <w:sz w:val="20"/>
-              </w:rPr>
-              <w:t>Total</w:t>
-            </w:r>
-          </w:p>
-        </w:tc>
-        <w:tc>
-          <w:tcPr>
-            <w:tcW w:type="dxa" w:w="1224"/>
-            <w:vAlign w:val="center"/>
-            <w:tcBorders>
-              <w:top w:val="single" w:sz="6" w:color="B0B7C3"/>
-              <w:left w:val="single" w:sz="6" w:color="B0B7C3"/>
-              <w:bottom w:val="single" w:sz="6" w:color="B0B7C3"/>
-              <w:right w:val="single" w:sz="6" w:color="B0B7C3"/>
-            </w:tcBorders>
-            <w:shd w:fill="FDF3D3" w:val="clear"/>
-          </w:tcPr>
-          <w:p>
-            <w:pPr>
-              <w:spacing w:before="0" w:after="0"/>
-              <w:jc w:val="right"/>
-            </w:pPr>
-            <w:r/>
-            <w:r>
-              <w:rPr>
-                <w:b/>
-                <w:color w:val="1A1A1A"/>
-                <w:sz w:val="20"/>
-              </w:rPr>
-              <w:t>28,453</w:t>
-            </w:r>
-          </w:p>
-        </w:tc>
-        <w:tc>
-          <w:tcPr>
-            <w:tcW w:type="dxa" w:w="1080"/>
-            <w:vAlign w:val="center"/>
-            <w:tcBorders>
-              <w:top w:val="single" w:sz="6" w:color="B0B7C3"/>
-              <w:left w:val="single" w:sz="6" w:color="B0B7C3"/>
-              <w:bottom w:val="single" w:sz="6" w:color="B0B7C3"/>
-              <w:right w:val="single" w:sz="6" w:color="B0B7C3"/>
-            </w:tcBorders>
-            <w:shd w:fill="FDF3D3" w:val="clear"/>
-          </w:tcPr>
-          <w:p>
-            <w:pPr>
-              <w:spacing w:before="0" w:after="0"/>
-              <w:jc w:val="right"/>
-            </w:pPr>
-            <w:r/>
-            <w:r>
-              <w:rPr>
-                <w:b/>
-                <w:color w:val="1A1A1A"/>
-                <w:sz w:val="20"/>
-              </w:rPr>
-              <w:t>27,338</w:t>
-            </w:r>
-          </w:p>
-        </w:tc>
-        <w:tc>
-          <w:tcPr>
-            <w:tcW w:type="dxa" w:w="1224"/>
-            <w:vAlign w:val="center"/>
-            <w:tcBorders>
-              <w:top w:val="single" w:sz="6" w:color="B0B7C3"/>
-              <w:left w:val="single" w:sz="6" w:color="B0B7C3"/>
-              <w:bottom w:val="single" w:sz="6" w:color="B0B7C3"/>
-              <w:right w:val="single" w:sz="6" w:color="B0B7C3"/>
-            </w:tcBorders>
-            <w:shd w:fill="FDF3D3" w:val="clear"/>
-          </w:tcPr>
-          <w:p>
-            <w:pPr>
-              <w:spacing w:before="0" w:after="0"/>
-              <w:jc w:val="right"/>
-            </w:pPr>
-            <w:r/>
-            <w:r>
-              <w:rPr>
-                <w:b/>
-                <w:color w:val="1A1A1A"/>
-                <w:sz w:val="20"/>
-              </w:rPr>
-              <w:t>817</w:t>
-            </w:r>
-          </w:p>
-        </w:tc>
-        <w:tc>
-          <w:tcPr>
-            <w:tcW w:type="dxa" w:w="1080"/>
-            <w:vAlign w:val="center"/>
-            <w:tcBorders>
-              <w:top w:val="single" w:sz="6" w:color="B0B7C3"/>
-              <w:left w:val="single" w:sz="6" w:color="B0B7C3"/>
-              <w:bottom w:val="single" w:sz="6" w:color="B0B7C3"/>
-              <w:right w:val="single" w:sz="6" w:color="B0B7C3"/>
-            </w:tcBorders>
-            <w:shd w:fill="FDF3D3" w:val="clear"/>
-          </w:tcPr>
-          <w:p>
-            <w:pPr>
-              <w:spacing w:before="0" w:after="0"/>
-              <w:jc w:val="right"/>
-            </w:pPr>
-            <w:r/>
-            <w:r>
-              <w:rPr>
-                <w:b/>
-                <w:color w:val="1A1A1A"/>
-                <w:sz w:val="20"/>
-              </w:rPr>
-              <w:t>298</w:t>
-            </w:r>
-          </w:p>
-        </w:tc>
-        <w:tc>
-          <w:tcPr>
-            <w:tcW w:type="dxa" w:w="1440"/>
-            <w:vAlign w:val="center"/>
-            <w:tcBorders>
-              <w:top w:val="single" w:sz="6" w:color="B0B7C3"/>
-              <w:left w:val="single" w:sz="6" w:color="B0B7C3"/>
-              <w:bottom w:val="single" w:sz="6" w:color="B0B7C3"/>
-              <w:right w:val="single" w:sz="6" w:color="B0B7C3"/>
-            </w:tcBorders>
-            <w:shd w:fill="FDF3D3" w:val="clear"/>
-          </w:tcPr>
-          <w:p>
-            <w:pPr>
-              <w:spacing w:before="0" w:after="0"/>
-              <w:jc w:val="right"/>
-            </w:pPr>
-            <w:r/>
-            <w:r>
-              <w:rPr>
-                <w:b/>
-                <w:color w:val="1A1A1A"/>
-                <w:sz w:val="20"/>
+                <w:sz w:val="21"/>
               </w:rPr>
               <w:t>620,527</w:t>
-            </w:r>
-          </w:p>
-        </w:tc>
-        <w:tc>
-          <w:tcPr>
-            <w:tcW w:type="dxa" w:w="1224"/>
-            <w:vAlign w:val="center"/>
-            <w:tcBorders>
-              <w:top w:val="single" w:sz="6" w:color="B0B7C3"/>
-              <w:left w:val="single" w:sz="6" w:color="B0B7C3"/>
-              <w:bottom w:val="single" w:sz="6" w:color="B0B7C3"/>
-              <w:right w:val="single" w:sz="6" w:color="B0B7C3"/>
-            </w:tcBorders>
-            <w:shd w:fill="FDF3D3" w:val="clear"/>
-          </w:tcPr>
-          <w:p>
-            <w:pPr>
-              <w:spacing w:before="0" w:after="0"/>
-              <w:jc w:val="right"/>
-            </w:pPr>
-            <w:r/>
-            <w:r>
-              <w:rPr>
-                <w:b/>
-                <w:color w:val="1A1A1A"/>
-                <w:sz w:val="20"/>
-              </w:rPr>
-              <w:t>294,540</w:t>
-            </w:r>
-          </w:p>
-        </w:tc>
-        <w:tc>
-          <w:tcPr>
-            <w:tcW w:type="dxa" w:w="1368"/>
-            <w:vAlign w:val="center"/>
-            <w:tcBorders>
-              <w:top w:val="single" w:sz="6" w:color="B0B7C3"/>
-              <w:left w:val="single" w:sz="6" w:color="B0B7C3"/>
-              <w:bottom w:val="single" w:sz="6" w:color="B0B7C3"/>
-              <w:right w:val="single" w:sz="6" w:color="B0B7C3"/>
-            </w:tcBorders>
-            <w:shd w:fill="FDF3D3" w:val="clear"/>
-          </w:tcPr>
-          <w:p>
-            <w:pPr>
-              <w:spacing w:before="0" w:after="0"/>
-              <w:jc w:val="right"/>
-            </w:pPr>
-            <w:r/>
-            <w:r>
-              <w:rPr>
-                <w:b/>
-                <w:color w:val="1A1A1A"/>
-                <w:sz w:val="20"/>
-              </w:rPr>
-              <w:t>94,686</w:t>
-            </w:r>
-          </w:p>
-        </w:tc>
-        <w:tc>
-          <w:tcPr>
-            <w:tcW w:type="dxa" w:w="1224"/>
-            <w:vAlign w:val="center"/>
-            <w:tcBorders>
-              <w:top w:val="single" w:sz="6" w:color="B0B7C3"/>
-              <w:left w:val="single" w:sz="6" w:color="B0B7C3"/>
-              <w:bottom w:val="single" w:sz="6" w:color="B0B7C3"/>
-              <w:right w:val="single" w:sz="6" w:color="B0B7C3"/>
-            </w:tcBorders>
-            <w:shd w:fill="FDF3D3" w:val="clear"/>
-          </w:tcPr>
-          <w:p>
-            <w:pPr>
-              <w:spacing w:before="0" w:after="0"/>
-              <w:jc w:val="right"/>
-            </w:pPr>
-            <w:r/>
-            <w:r>
-              <w:rPr>
-                <w:b/>
-                <w:color w:val="1A1A1A"/>
-                <w:sz w:val="20"/>
-              </w:rPr>
-              <w:t>231,301</w:t>
             </w:r>
           </w:p>
         </w:tc>
@@ -3741,7 +2841,7 @@
     </w:tbl>
     <w:sectPr>
       <w:pgSz w:w="15840" w:h="12240" w:orient="landscape"/>
-      <w:pgMar w:top="864" w:right="1008" w:bottom="864" w:left="1008" w:header="720" w:footer="720" w:gutter="0"/>
+      <w:pgMar w:top="864" w:right="1080" w:bottom="864" w:left="1080" w:header="720" w:footer="720" w:gutter="0"/>
       <w:cols w:space="720"/>
       <w:docGrid w:linePitch="360"/>
     </w:sectPr>

</xml_diff>

<commit_message>
Full list code table with excluded/not-excluded visual blocks
Section 2 now shows every list code, grouped into two visual blocks:
- Excluded (05, 06, 07, 08, 09, 15, 97) shaded cream at top with a
  cream-highlighted subtotal row.
- Not excluded (01/02 Regular, 14/90/98 Interbranch, 11/12/13 Export,
  03 Utility, 10 Hospital, 04 Railroad) below in normal shading with
  a light-blue subtotal.
Grand total row at bottom.

https://claude.ai/code/session_01PM89wz7vnfvW2NRaFUoooy
</commit_message>
<xml_diff>
--- a/Updating_SLV_Rules.docx
+++ b/Updating_SLV_Rules.docx
@@ -20,7 +20,7 @@
     </w:p>
     <w:p>
       <w:pPr>
-        <w:spacing w:after="320"/>
+        <w:spacing w:after="280"/>
       </w:pPr>
       <w:r>
         <w:rPr>
@@ -50,7 +50,7 @@
         <w:rPr>
           <w:sz w:val="22"/>
         </w:rPr>
-        <w:t>The current rule excludes any customer location with 10 or more active ordering contacts. The table shows how many additional customer locations and orders each higher threshold would include, and what would remain excluded even at 50 contacts.</w:t>
+        <w:t>The current rule excludes any shipping location with 10 or more active ordering contacts. The table shows how many additional shipping locations and orders each higher threshold would include, and what would remain excluded even at 50 contacts.</w:t>
       </w:r>
     </w:p>
     <w:tbl>
@@ -1444,7 +1444,7 @@
           <w:color w:val="2F4A7C"/>
           <w:sz w:val="28"/>
         </w:rPr>
-        <w:t>2. Excluded List Codes</w:t>
+        <w:t>2. List Codes by Contact Count</w:t>
       </w:r>
     </w:p>
     <w:p>
@@ -1455,7 +1455,7 @@
         <w:rPr>
           <w:sz w:val="22"/>
         </w:rPr>
-        <w:t>The list codes below are excluded from Shipping Location View outright. For each, the table shows how many customer locations would already meet the contact-count rule (fewer than 10) versus those that would still be excluded on it.</w:t>
+        <w:t>Every list code, split by whether its shipping locations already meet the contact-count rule (fewer than 10) or do not (10 or more). The highlighted rows are the list codes excluded from Shipping Location View.</w:t>
       </w:r>
     </w:p>
     <w:tbl>
@@ -1466,11 +1466,11 @@
       </w:tblPr>
       <w:tblGrid>
         <w:gridCol w:w="1440"/>
-        <w:gridCol w:w="4320"/>
+        <w:gridCol w:w="4608"/>
+        <w:gridCol w:w="1728"/>
         <w:gridCol w:w="1872"/>
         <w:gridCol w:w="2016"/>
-        <w:gridCol w:w="2016"/>
-        <w:gridCol w:w="2304"/>
+        <w:gridCol w:w="2160"/>
       </w:tblGrid>
       <w:tr>
         <w:trPr>
@@ -1506,7 +1506,7 @@
         </w:tc>
         <w:tc>
           <w:tcPr>
-            <w:tcW w:type="dxa" w:w="4320"/>
+            <w:tcW w:type="dxa" w:w="4608"/>
             <w:vAlign w:val="center"/>
             <w:tcBorders>
               <w:top w:val="single" w:sz="6" w:color="B0B7C3"/>
@@ -1534,7 +1534,7 @@
         </w:tc>
         <w:tc>
           <w:tcPr>
-            <w:tcW w:type="dxa" w:w="1872"/>
+            <w:tcW w:type="dxa" w:w="1728"/>
             <w:vAlign w:val="center"/>
             <w:tcBorders>
               <w:top w:val="single" w:sz="6" w:color="B0B7C3"/>
@@ -1562,7 +1562,7 @@
         </w:tc>
         <w:tc>
           <w:tcPr>
-            <w:tcW w:type="dxa" w:w="2016"/>
+            <w:tcW w:type="dxa" w:w="1872"/>
             <w:vAlign w:val="center"/>
             <w:tcBorders>
               <w:top w:val="single" w:sz="6" w:color="B0B7C3"/>
@@ -1618,7 +1618,7 @@
         </w:tc>
         <w:tc>
           <w:tcPr>
-            <w:tcW w:type="dxa" w:w="2304"/>
+            <w:tcW w:type="dxa" w:w="2160"/>
             <w:vAlign w:val="center"/>
             <w:tcBorders>
               <w:top w:val="single" w:sz="6" w:color="B0B7C3"/>
@@ -1647,7 +1647,7 @@
       </w:tr>
       <w:tr>
         <w:trPr>
-          <w:trHeight w:val="400" w:hRule="atLeast"/>
+          <w:trHeight w:val="360" w:hRule="atLeast"/>
         </w:trPr>
         <w:tc>
           <w:tcPr>
@@ -1659,6 +1659,7 @@
               <w:bottom w:val="single" w:sz="6" w:color="B0B7C3"/>
               <w:right w:val="single" w:sz="6" w:color="B0B7C3"/>
             </w:tcBorders>
+            <w:shd w:fill="FDF3D3" w:val="clear"/>
           </w:tcPr>
           <w:p>
             <w:pPr>
@@ -1678,7 +1679,7 @@
         </w:tc>
         <w:tc>
           <w:tcPr>
-            <w:tcW w:type="dxa" w:w="4320"/>
+            <w:tcW w:type="dxa" w:w="4608"/>
             <w:vAlign w:val="center"/>
             <w:tcBorders>
               <w:top w:val="single" w:sz="6" w:color="B0B7C3"/>
@@ -1686,6 +1687,7 @@
               <w:bottom w:val="single" w:sz="6" w:color="B0B7C3"/>
               <w:right w:val="single" w:sz="6" w:color="B0B7C3"/>
             </w:tcBorders>
+            <w:shd w:fill="FDF3D3" w:val="clear"/>
           </w:tcPr>
           <w:p>
             <w:pPr>
@@ -1699,13 +1701,13 @@
                 <w:color w:val="1A1A1A"/>
                 <w:sz w:val="21"/>
               </w:rPr>
-              <w:t>Federal Government (Domestic)</w:t>
+              <w:t>Federal Gov (Domestic)</w:t>
             </w:r>
           </w:p>
         </w:tc>
         <w:tc>
           <w:tcPr>
-            <w:tcW w:type="dxa" w:w="1872"/>
+            <w:tcW w:type="dxa" w:w="1728"/>
             <w:vAlign w:val="center"/>
             <w:tcBorders>
               <w:top w:val="single" w:sz="6" w:color="B0B7C3"/>
@@ -1713,6 +1715,7 @@
               <w:bottom w:val="single" w:sz="6" w:color="B0B7C3"/>
               <w:right w:val="single" w:sz="6" w:color="B0B7C3"/>
             </w:tcBorders>
+            <w:shd w:fill="FDF3D3" w:val="clear"/>
           </w:tcPr>
           <w:p>
             <w:pPr>
@@ -1732,7 +1735,7 @@
         </w:tc>
         <w:tc>
           <w:tcPr>
-            <w:tcW w:type="dxa" w:w="2016"/>
+            <w:tcW w:type="dxa" w:w="1872"/>
             <w:vAlign w:val="center"/>
             <w:tcBorders>
               <w:top w:val="single" w:sz="6" w:color="B0B7C3"/>
@@ -1740,6 +1743,7 @@
               <w:bottom w:val="single" w:sz="6" w:color="B0B7C3"/>
               <w:right w:val="single" w:sz="6" w:color="B0B7C3"/>
             </w:tcBorders>
+            <w:shd w:fill="FDF3D3" w:val="clear"/>
           </w:tcPr>
           <w:p>
             <w:pPr>
@@ -1767,6 +1771,7 @@
               <w:bottom w:val="single" w:sz="6" w:color="B0B7C3"/>
               <w:right w:val="single" w:sz="6" w:color="B0B7C3"/>
             </w:tcBorders>
+            <w:shd w:fill="FDF3D3" w:val="clear"/>
           </w:tcPr>
           <w:p>
             <w:pPr>
@@ -1786,7 +1791,7 @@
         </w:tc>
         <w:tc>
           <w:tcPr>
-            <w:tcW w:type="dxa" w:w="2304"/>
+            <w:tcW w:type="dxa" w:w="2160"/>
             <w:vAlign w:val="center"/>
             <w:tcBorders>
               <w:top w:val="single" w:sz="6" w:color="B0B7C3"/>
@@ -1794,6 +1799,7 @@
               <w:bottom w:val="single" w:sz="6" w:color="B0B7C3"/>
               <w:right w:val="single" w:sz="6" w:color="B0B7C3"/>
             </w:tcBorders>
+            <w:shd w:fill="FDF3D3" w:val="clear"/>
           </w:tcPr>
           <w:p>
             <w:pPr>
@@ -1814,7 +1820,7 @@
       </w:tr>
       <w:tr>
         <w:trPr>
-          <w:trHeight w:val="400" w:hRule="atLeast"/>
+          <w:trHeight w:val="360" w:hRule="atLeast"/>
         </w:trPr>
         <w:tc>
           <w:tcPr>
@@ -1826,7 +1832,7 @@
               <w:bottom w:val="single" w:sz="6" w:color="B0B7C3"/>
               <w:right w:val="single" w:sz="6" w:color="B0B7C3"/>
             </w:tcBorders>
-            <w:shd w:fill="F6F7FA" w:val="clear"/>
+            <w:shd w:fill="FDF3D3" w:val="clear"/>
           </w:tcPr>
           <w:p>
             <w:pPr>
@@ -1846,7 +1852,7 @@
         </w:tc>
         <w:tc>
           <w:tcPr>
-            <w:tcW w:type="dxa" w:w="4320"/>
+            <w:tcW w:type="dxa" w:w="4608"/>
             <w:vAlign w:val="center"/>
             <w:tcBorders>
               <w:top w:val="single" w:sz="6" w:color="B0B7C3"/>
@@ -1854,7 +1860,7 @@
               <w:bottom w:val="single" w:sz="6" w:color="B0B7C3"/>
               <w:right w:val="single" w:sz="6" w:color="B0B7C3"/>
             </w:tcBorders>
-            <w:shd w:fill="F6F7FA" w:val="clear"/>
+            <w:shd w:fill="FDF3D3" w:val="clear"/>
           </w:tcPr>
           <w:p>
             <w:pPr>
@@ -1868,13 +1874,13 @@
                 <w:color w:val="1A1A1A"/>
                 <w:sz w:val="21"/>
               </w:rPr>
-              <w:t>Federal Government (APO/FPO)</w:t>
+              <w:t>Federal Gov (APO/FPO)</w:t>
             </w:r>
           </w:p>
         </w:tc>
         <w:tc>
           <w:tcPr>
-            <w:tcW w:type="dxa" w:w="1872"/>
+            <w:tcW w:type="dxa" w:w="1728"/>
             <w:vAlign w:val="center"/>
             <w:tcBorders>
               <w:top w:val="single" w:sz="6" w:color="B0B7C3"/>
@@ -1882,7 +1888,7 @@
               <w:bottom w:val="single" w:sz="6" w:color="B0B7C3"/>
               <w:right w:val="single" w:sz="6" w:color="B0B7C3"/>
             </w:tcBorders>
-            <w:shd w:fill="F6F7FA" w:val="clear"/>
+            <w:shd w:fill="FDF3D3" w:val="clear"/>
           </w:tcPr>
           <w:p>
             <w:pPr>
@@ -1902,7 +1908,7 @@
         </w:tc>
         <w:tc>
           <w:tcPr>
-            <w:tcW w:type="dxa" w:w="2016"/>
+            <w:tcW w:type="dxa" w:w="1872"/>
             <w:vAlign w:val="center"/>
             <w:tcBorders>
               <w:top w:val="single" w:sz="6" w:color="B0B7C3"/>
@@ -1910,7 +1916,7 @@
               <w:bottom w:val="single" w:sz="6" w:color="B0B7C3"/>
               <w:right w:val="single" w:sz="6" w:color="B0B7C3"/>
             </w:tcBorders>
-            <w:shd w:fill="F6F7FA" w:val="clear"/>
+            <w:shd w:fill="FDF3D3" w:val="clear"/>
           </w:tcPr>
           <w:p>
             <w:pPr>
@@ -1938,7 +1944,7 @@
               <w:bottom w:val="single" w:sz="6" w:color="B0B7C3"/>
               <w:right w:val="single" w:sz="6" w:color="B0B7C3"/>
             </w:tcBorders>
-            <w:shd w:fill="F6F7FA" w:val="clear"/>
+            <w:shd w:fill="FDF3D3" w:val="clear"/>
           </w:tcPr>
           <w:p>
             <w:pPr>
@@ -1958,7 +1964,7 @@
         </w:tc>
         <w:tc>
           <w:tcPr>
-            <w:tcW w:type="dxa" w:w="2304"/>
+            <w:tcW w:type="dxa" w:w="2160"/>
             <w:vAlign w:val="center"/>
             <w:tcBorders>
               <w:top w:val="single" w:sz="6" w:color="B0B7C3"/>
@@ -1966,7 +1972,7 @@
               <w:bottom w:val="single" w:sz="6" w:color="B0B7C3"/>
               <w:right w:val="single" w:sz="6" w:color="B0B7C3"/>
             </w:tcBorders>
-            <w:shd w:fill="F6F7FA" w:val="clear"/>
+            <w:shd w:fill="FDF3D3" w:val="clear"/>
           </w:tcPr>
           <w:p>
             <w:pPr>
@@ -1987,7 +1993,7 @@
       </w:tr>
       <w:tr>
         <w:trPr>
-          <w:trHeight w:val="400" w:hRule="atLeast"/>
+          <w:trHeight w:val="360" w:hRule="atLeast"/>
         </w:trPr>
         <w:tc>
           <w:tcPr>
@@ -1999,6 +2005,7 @@
               <w:bottom w:val="single" w:sz="6" w:color="B0B7C3"/>
               <w:right w:val="single" w:sz="6" w:color="B0B7C3"/>
             </w:tcBorders>
+            <w:shd w:fill="FDF3D3" w:val="clear"/>
           </w:tcPr>
           <w:p>
             <w:pPr>
@@ -2018,7 +2025,7 @@
         </w:tc>
         <w:tc>
           <w:tcPr>
-            <w:tcW w:type="dxa" w:w="4320"/>
+            <w:tcW w:type="dxa" w:w="4608"/>
             <w:vAlign w:val="center"/>
             <w:tcBorders>
               <w:top w:val="single" w:sz="6" w:color="B0B7C3"/>
@@ -2026,6 +2033,7 @@
               <w:bottom w:val="single" w:sz="6" w:color="B0B7C3"/>
               <w:right w:val="single" w:sz="6" w:color="B0B7C3"/>
             </w:tcBorders>
+            <w:shd w:fill="FDF3D3" w:val="clear"/>
           </w:tcPr>
           <w:p>
             <w:pPr>
@@ -2039,13 +2047,13 @@
                 <w:color w:val="1A1A1A"/>
                 <w:sz w:val="21"/>
               </w:rPr>
-              <w:t>State Government</w:t>
+              <w:t>State Gov</w:t>
             </w:r>
           </w:p>
         </w:tc>
         <w:tc>
           <w:tcPr>
-            <w:tcW w:type="dxa" w:w="1872"/>
+            <w:tcW w:type="dxa" w:w="1728"/>
             <w:vAlign w:val="center"/>
             <w:tcBorders>
               <w:top w:val="single" w:sz="6" w:color="B0B7C3"/>
@@ -2053,6 +2061,7 @@
               <w:bottom w:val="single" w:sz="6" w:color="B0B7C3"/>
               <w:right w:val="single" w:sz="6" w:color="B0B7C3"/>
             </w:tcBorders>
+            <w:shd w:fill="FDF3D3" w:val="clear"/>
           </w:tcPr>
           <w:p>
             <w:pPr>
@@ -2072,7 +2081,7 @@
         </w:tc>
         <w:tc>
           <w:tcPr>
-            <w:tcW w:type="dxa" w:w="2016"/>
+            <w:tcW w:type="dxa" w:w="1872"/>
             <w:vAlign w:val="center"/>
             <w:tcBorders>
               <w:top w:val="single" w:sz="6" w:color="B0B7C3"/>
@@ -2080,6 +2089,7 @@
               <w:bottom w:val="single" w:sz="6" w:color="B0B7C3"/>
               <w:right w:val="single" w:sz="6" w:color="B0B7C3"/>
             </w:tcBorders>
+            <w:shd w:fill="FDF3D3" w:val="clear"/>
           </w:tcPr>
           <w:p>
             <w:pPr>
@@ -2107,6 +2117,7 @@
               <w:bottom w:val="single" w:sz="6" w:color="B0B7C3"/>
               <w:right w:val="single" w:sz="6" w:color="B0B7C3"/>
             </w:tcBorders>
+            <w:shd w:fill="FDF3D3" w:val="clear"/>
           </w:tcPr>
           <w:p>
             <w:pPr>
@@ -2126,7 +2137,7 @@
         </w:tc>
         <w:tc>
           <w:tcPr>
-            <w:tcW w:type="dxa" w:w="2304"/>
+            <w:tcW w:type="dxa" w:w="2160"/>
             <w:vAlign w:val="center"/>
             <w:tcBorders>
               <w:top w:val="single" w:sz="6" w:color="B0B7C3"/>
@@ -2134,6 +2145,7 @@
               <w:bottom w:val="single" w:sz="6" w:color="B0B7C3"/>
               <w:right w:val="single" w:sz="6" w:color="B0B7C3"/>
             </w:tcBorders>
+            <w:shd w:fill="FDF3D3" w:val="clear"/>
           </w:tcPr>
           <w:p>
             <w:pPr>
@@ -2154,7 +2166,7 @@
       </w:tr>
       <w:tr>
         <w:trPr>
-          <w:trHeight w:val="400" w:hRule="atLeast"/>
+          <w:trHeight w:val="360" w:hRule="atLeast"/>
         </w:trPr>
         <w:tc>
           <w:tcPr>
@@ -2166,7 +2178,7 @@
               <w:bottom w:val="single" w:sz="6" w:color="B0B7C3"/>
               <w:right w:val="single" w:sz="6" w:color="B0B7C3"/>
             </w:tcBorders>
-            <w:shd w:fill="F6F7FA" w:val="clear"/>
+            <w:shd w:fill="FDF3D3" w:val="clear"/>
           </w:tcPr>
           <w:p>
             <w:pPr>
@@ -2186,7 +2198,7 @@
         </w:tc>
         <w:tc>
           <w:tcPr>
-            <w:tcW w:type="dxa" w:w="4320"/>
+            <w:tcW w:type="dxa" w:w="4608"/>
             <w:vAlign w:val="center"/>
             <w:tcBorders>
               <w:top w:val="single" w:sz="6" w:color="B0B7C3"/>
@@ -2194,7 +2206,7 @@
               <w:bottom w:val="single" w:sz="6" w:color="B0B7C3"/>
               <w:right w:val="single" w:sz="6" w:color="B0B7C3"/>
             </w:tcBorders>
-            <w:shd w:fill="F6F7FA" w:val="clear"/>
+            <w:shd w:fill="FDF3D3" w:val="clear"/>
           </w:tcPr>
           <w:p>
             <w:pPr>
@@ -2214,7 +2226,7 @@
         </w:tc>
         <w:tc>
           <w:tcPr>
-            <w:tcW w:type="dxa" w:w="1872"/>
+            <w:tcW w:type="dxa" w:w="1728"/>
             <w:vAlign w:val="center"/>
             <w:tcBorders>
               <w:top w:val="single" w:sz="6" w:color="B0B7C3"/>
@@ -2222,7 +2234,7 @@
               <w:bottom w:val="single" w:sz="6" w:color="B0B7C3"/>
               <w:right w:val="single" w:sz="6" w:color="B0B7C3"/>
             </w:tcBorders>
-            <w:shd w:fill="F6F7FA" w:val="clear"/>
+            <w:shd w:fill="FDF3D3" w:val="clear"/>
           </w:tcPr>
           <w:p>
             <w:pPr>
@@ -2242,7 +2254,7 @@
         </w:tc>
         <w:tc>
           <w:tcPr>
-            <w:tcW w:type="dxa" w:w="2016"/>
+            <w:tcW w:type="dxa" w:w="1872"/>
             <w:vAlign w:val="center"/>
             <w:tcBorders>
               <w:top w:val="single" w:sz="6" w:color="B0B7C3"/>
@@ -2250,7 +2262,7 @@
               <w:bottom w:val="single" w:sz="6" w:color="B0B7C3"/>
               <w:right w:val="single" w:sz="6" w:color="B0B7C3"/>
             </w:tcBorders>
-            <w:shd w:fill="F6F7FA" w:val="clear"/>
+            <w:shd w:fill="FDF3D3" w:val="clear"/>
           </w:tcPr>
           <w:p>
             <w:pPr>
@@ -2278,7 +2290,7 @@
               <w:bottom w:val="single" w:sz="6" w:color="B0B7C3"/>
               <w:right w:val="single" w:sz="6" w:color="B0B7C3"/>
             </w:tcBorders>
-            <w:shd w:fill="F6F7FA" w:val="clear"/>
+            <w:shd w:fill="FDF3D3" w:val="clear"/>
           </w:tcPr>
           <w:p>
             <w:pPr>
@@ -2298,7 +2310,7 @@
         </w:tc>
         <w:tc>
           <w:tcPr>
-            <w:tcW w:type="dxa" w:w="2304"/>
+            <w:tcW w:type="dxa" w:w="2160"/>
             <w:vAlign w:val="center"/>
             <w:tcBorders>
               <w:top w:val="single" w:sz="6" w:color="B0B7C3"/>
@@ -2306,7 +2318,7 @@
               <w:bottom w:val="single" w:sz="6" w:color="B0B7C3"/>
               <w:right w:val="single" w:sz="6" w:color="B0B7C3"/>
             </w:tcBorders>
-            <w:shd w:fill="F6F7FA" w:val="clear"/>
+            <w:shd w:fill="FDF3D3" w:val="clear"/>
           </w:tcPr>
           <w:p>
             <w:pPr>
@@ -2327,7 +2339,7 @@
       </w:tr>
       <w:tr>
         <w:trPr>
-          <w:trHeight w:val="400" w:hRule="atLeast"/>
+          <w:trHeight w:val="360" w:hRule="atLeast"/>
         </w:trPr>
         <w:tc>
           <w:tcPr>
@@ -2339,6 +2351,7 @@
               <w:bottom w:val="single" w:sz="6" w:color="B0B7C3"/>
               <w:right w:val="single" w:sz="6" w:color="B0B7C3"/>
             </w:tcBorders>
+            <w:shd w:fill="FDF3D3" w:val="clear"/>
           </w:tcPr>
           <w:p>
             <w:pPr>
@@ -2358,7 +2371,7 @@
         </w:tc>
         <w:tc>
           <w:tcPr>
-            <w:tcW w:type="dxa" w:w="4320"/>
+            <w:tcW w:type="dxa" w:w="4608"/>
             <w:vAlign w:val="center"/>
             <w:tcBorders>
               <w:top w:val="single" w:sz="6" w:color="B0B7C3"/>
@@ -2366,6 +2379,7 @@
               <w:bottom w:val="single" w:sz="6" w:color="B0B7C3"/>
               <w:right w:val="single" w:sz="6" w:color="B0B7C3"/>
             </w:tcBorders>
+            <w:shd w:fill="FDF3D3" w:val="clear"/>
           </w:tcPr>
           <w:p>
             <w:pPr>
@@ -2385,7 +2399,7 @@
         </w:tc>
         <w:tc>
           <w:tcPr>
-            <w:tcW w:type="dxa" w:w="1872"/>
+            <w:tcW w:type="dxa" w:w="1728"/>
             <w:vAlign w:val="center"/>
             <w:tcBorders>
               <w:top w:val="single" w:sz="6" w:color="B0B7C3"/>
@@ -2393,6 +2407,7 @@
               <w:bottom w:val="single" w:sz="6" w:color="B0B7C3"/>
               <w:right w:val="single" w:sz="6" w:color="B0B7C3"/>
             </w:tcBorders>
+            <w:shd w:fill="FDF3D3" w:val="clear"/>
           </w:tcPr>
           <w:p>
             <w:pPr>
@@ -2412,7 +2427,7 @@
         </w:tc>
         <w:tc>
           <w:tcPr>
-            <w:tcW w:type="dxa" w:w="2016"/>
+            <w:tcW w:type="dxa" w:w="1872"/>
             <w:vAlign w:val="center"/>
             <w:tcBorders>
               <w:top w:val="single" w:sz="6" w:color="B0B7C3"/>
@@ -2420,6 +2435,7 @@
               <w:bottom w:val="single" w:sz="6" w:color="B0B7C3"/>
               <w:right w:val="single" w:sz="6" w:color="B0B7C3"/>
             </w:tcBorders>
+            <w:shd w:fill="FDF3D3" w:val="clear"/>
           </w:tcPr>
           <w:p>
             <w:pPr>
@@ -2447,6 +2463,7 @@
               <w:bottom w:val="single" w:sz="6" w:color="B0B7C3"/>
               <w:right w:val="single" w:sz="6" w:color="B0B7C3"/>
             </w:tcBorders>
+            <w:shd w:fill="FDF3D3" w:val="clear"/>
           </w:tcPr>
           <w:p>
             <w:pPr>
@@ -2466,7 +2483,7 @@
         </w:tc>
         <w:tc>
           <w:tcPr>
-            <w:tcW w:type="dxa" w:w="2304"/>
+            <w:tcW w:type="dxa" w:w="2160"/>
             <w:vAlign w:val="center"/>
             <w:tcBorders>
               <w:top w:val="single" w:sz="6" w:color="B0B7C3"/>
@@ -2474,6 +2491,7 @@
               <w:bottom w:val="single" w:sz="6" w:color="B0B7C3"/>
               <w:right w:val="single" w:sz="6" w:color="B0B7C3"/>
             </w:tcBorders>
+            <w:shd w:fill="FDF3D3" w:val="clear"/>
           </w:tcPr>
           <w:p>
             <w:pPr>
@@ -2494,7 +2512,7 @@
       </w:tr>
       <w:tr>
         <w:trPr>
-          <w:trHeight w:val="400" w:hRule="atLeast"/>
+          <w:trHeight w:val="360" w:hRule="atLeast"/>
         </w:trPr>
         <w:tc>
           <w:tcPr>
@@ -2526,7 +2544,325 @@
         </w:tc>
         <w:tc>
           <w:tcPr>
-            <w:tcW w:type="dxa" w:w="4320"/>
+            <w:tcW w:type="dxa" w:w="4608"/>
+            <w:vAlign w:val="center"/>
+            <w:tcBorders>
+              <w:top w:val="single" w:sz="6" w:color="B0B7C3"/>
+              <w:left w:val="single" w:sz="6" w:color="B0B7C3"/>
+              <w:bottom w:val="single" w:sz="6" w:color="B0B7C3"/>
+              <w:right w:val="single" w:sz="6" w:color="B0B7C3"/>
+            </w:tcBorders>
+            <w:shd w:fill="FDF3D3" w:val="clear"/>
+          </w:tcPr>
+          <w:p>
+            <w:pPr>
+              <w:spacing w:before="0" w:after="0"/>
+              <w:jc w:val="left"/>
+            </w:pPr>
+            <w:r/>
+            <w:r>
+              <w:rPr>
+                <w:b w:val="0"/>
+                <w:color w:val="1A1A1A"/>
+                <w:sz w:val="21"/>
+              </w:rPr>
+              <w:t>McMaster-Carr Internal</w:t>
+            </w:r>
+          </w:p>
+        </w:tc>
+        <w:tc>
+          <w:tcPr>
+            <w:tcW w:type="dxa" w:w="1728"/>
+            <w:vAlign w:val="center"/>
+            <w:tcBorders>
+              <w:top w:val="single" w:sz="6" w:color="B0B7C3"/>
+              <w:left w:val="single" w:sz="6" w:color="B0B7C3"/>
+              <w:bottom w:val="single" w:sz="6" w:color="B0B7C3"/>
+              <w:right w:val="single" w:sz="6" w:color="B0B7C3"/>
+            </w:tcBorders>
+            <w:shd w:fill="FDF3D3" w:val="clear"/>
+          </w:tcPr>
+          <w:p>
+            <w:pPr>
+              <w:spacing w:before="0" w:after="0"/>
+              <w:jc w:val="right"/>
+            </w:pPr>
+            <w:r/>
+            <w:r>
+              <w:rPr>
+                <w:b w:val="0"/>
+                <w:color w:val="1A1A1A"/>
+                <w:sz w:val="21"/>
+              </w:rPr>
+              <w:t>5</w:t>
+            </w:r>
+          </w:p>
+        </w:tc>
+        <w:tc>
+          <w:tcPr>
+            <w:tcW w:type="dxa" w:w="1872"/>
+            <w:vAlign w:val="center"/>
+            <w:tcBorders>
+              <w:top w:val="single" w:sz="6" w:color="B0B7C3"/>
+              <w:left w:val="single" w:sz="6" w:color="B0B7C3"/>
+              <w:bottom w:val="single" w:sz="6" w:color="B0B7C3"/>
+              <w:right w:val="single" w:sz="6" w:color="B0B7C3"/>
+            </w:tcBorders>
+            <w:shd w:fill="FDF3D3" w:val="clear"/>
+          </w:tcPr>
+          <w:p>
+            <w:pPr>
+              <w:spacing w:before="0" w:after="0"/>
+              <w:jc w:val="right"/>
+            </w:pPr>
+            <w:r/>
+            <w:r>
+              <w:rPr>
+                <w:b w:val="0"/>
+                <w:color w:val="1A1A1A"/>
+                <w:sz w:val="21"/>
+              </w:rPr>
+              <w:t>0</w:t>
+            </w:r>
+          </w:p>
+        </w:tc>
+        <w:tc>
+          <w:tcPr>
+            <w:tcW w:type="dxa" w:w="2016"/>
+            <w:vAlign w:val="center"/>
+            <w:tcBorders>
+              <w:top w:val="single" w:sz="6" w:color="B0B7C3"/>
+              <w:left w:val="single" w:sz="6" w:color="B0B7C3"/>
+              <w:bottom w:val="single" w:sz="6" w:color="B0B7C3"/>
+              <w:right w:val="single" w:sz="6" w:color="B0B7C3"/>
+            </w:tcBorders>
+            <w:shd w:fill="FDF3D3" w:val="clear"/>
+          </w:tcPr>
+          <w:p>
+            <w:pPr>
+              <w:spacing w:before="0" w:after="0"/>
+              <w:jc w:val="right"/>
+            </w:pPr>
+            <w:r/>
+            <w:r>
+              <w:rPr>
+                <w:b w:val="0"/>
+                <w:color w:val="1A1A1A"/>
+                <w:sz w:val="21"/>
+              </w:rPr>
+              <w:t>5</w:t>
+            </w:r>
+          </w:p>
+        </w:tc>
+        <w:tc>
+          <w:tcPr>
+            <w:tcW w:type="dxa" w:w="2160"/>
+            <w:vAlign w:val="center"/>
+            <w:tcBorders>
+              <w:top w:val="single" w:sz="6" w:color="B0B7C3"/>
+              <w:left w:val="single" w:sz="6" w:color="B0B7C3"/>
+              <w:bottom w:val="single" w:sz="6" w:color="B0B7C3"/>
+              <w:right w:val="single" w:sz="6" w:color="B0B7C3"/>
+            </w:tcBorders>
+            <w:shd w:fill="FDF3D3" w:val="clear"/>
+          </w:tcPr>
+          <w:p>
+            <w:pPr>
+              <w:spacing w:before="0" w:after="0"/>
+              <w:jc w:val="right"/>
+            </w:pPr>
+            <w:r/>
+            <w:r>
+              <w:rPr>
+                <w:b w:val="0"/>
+                <w:color w:val="1A1A1A"/>
+                <w:sz w:val="21"/>
+              </w:rPr>
+              <w:t>42,130</w:t>
+            </w:r>
+          </w:p>
+        </w:tc>
+      </w:tr>
+      <w:tr>
+        <w:trPr>
+          <w:trHeight w:val="360" w:hRule="atLeast"/>
+        </w:trPr>
+        <w:tc>
+          <w:tcPr>
+            <w:tcW w:type="dxa" w:w="1440"/>
+            <w:vAlign w:val="center"/>
+            <w:tcBorders>
+              <w:top w:val="single" w:sz="6" w:color="B0B7C3"/>
+              <w:left w:val="single" w:sz="6" w:color="B0B7C3"/>
+              <w:bottom w:val="single" w:sz="6" w:color="B0B7C3"/>
+              <w:right w:val="single" w:sz="6" w:color="B0B7C3"/>
+            </w:tcBorders>
+            <w:shd w:fill="FDF3D3" w:val="clear"/>
+          </w:tcPr>
+          <w:p>
+            <w:pPr>
+              <w:spacing w:before="0" w:after="0"/>
+              <w:jc w:val="left"/>
+            </w:pPr>
+            <w:r/>
+            <w:r>
+              <w:rPr>
+                <w:b w:val="0"/>
+                <w:color w:val="1A1A1A"/>
+                <w:sz w:val="21"/>
+              </w:rPr>
+              <w:t>97</w:t>
+            </w:r>
+          </w:p>
+        </w:tc>
+        <w:tc>
+          <w:tcPr>
+            <w:tcW w:type="dxa" w:w="4608"/>
+            <w:vAlign w:val="center"/>
+            <w:tcBorders>
+              <w:top w:val="single" w:sz="6" w:color="B0B7C3"/>
+              <w:left w:val="single" w:sz="6" w:color="B0B7C3"/>
+              <w:bottom w:val="single" w:sz="6" w:color="B0B7C3"/>
+              <w:right w:val="single" w:sz="6" w:color="B0B7C3"/>
+            </w:tcBorders>
+            <w:shd w:fill="FDF3D3" w:val="clear"/>
+          </w:tcPr>
+          <w:p>
+            <w:pPr>
+              <w:spacing w:before="0" w:after="0"/>
+              <w:jc w:val="left"/>
+            </w:pPr>
+            <w:r/>
+            <w:r>
+              <w:rPr>
+                <w:b w:val="0"/>
+                <w:color w:val="1A1A1A"/>
+                <w:sz w:val="21"/>
+              </w:rPr>
+              <w:t>Distributor</w:t>
+            </w:r>
+          </w:p>
+        </w:tc>
+        <w:tc>
+          <w:tcPr>
+            <w:tcW w:type="dxa" w:w="1728"/>
+            <w:vAlign w:val="center"/>
+            <w:tcBorders>
+              <w:top w:val="single" w:sz="6" w:color="B0B7C3"/>
+              <w:left w:val="single" w:sz="6" w:color="B0B7C3"/>
+              <w:bottom w:val="single" w:sz="6" w:color="B0B7C3"/>
+              <w:right w:val="single" w:sz="6" w:color="B0B7C3"/>
+            </w:tcBorders>
+            <w:shd w:fill="FDF3D3" w:val="clear"/>
+          </w:tcPr>
+          <w:p>
+            <w:pPr>
+              <w:spacing w:before="0" w:after="0"/>
+              <w:jc w:val="right"/>
+            </w:pPr>
+            <w:r/>
+            <w:r>
+              <w:rPr>
+                <w:b w:val="0"/>
+                <w:color w:val="1A1A1A"/>
+                <w:sz w:val="21"/>
+              </w:rPr>
+              <w:t>21,547</w:t>
+            </w:r>
+          </w:p>
+        </w:tc>
+        <w:tc>
+          <w:tcPr>
+            <w:tcW w:type="dxa" w:w="1872"/>
+            <w:vAlign w:val="center"/>
+            <w:tcBorders>
+              <w:top w:val="single" w:sz="6" w:color="B0B7C3"/>
+              <w:left w:val="single" w:sz="6" w:color="B0B7C3"/>
+              <w:bottom w:val="single" w:sz="6" w:color="B0B7C3"/>
+              <w:right w:val="single" w:sz="6" w:color="B0B7C3"/>
+            </w:tcBorders>
+            <w:shd w:fill="FDF3D3" w:val="clear"/>
+          </w:tcPr>
+          <w:p>
+            <w:pPr>
+              <w:spacing w:before="0" w:after="0"/>
+              <w:jc w:val="right"/>
+            </w:pPr>
+            <w:r/>
+            <w:r>
+              <w:rPr>
+                <w:b w:val="0"/>
+                <w:color w:val="1A1A1A"/>
+                <w:sz w:val="21"/>
+              </w:rPr>
+              <w:t>21,319</w:t>
+            </w:r>
+          </w:p>
+        </w:tc>
+        <w:tc>
+          <w:tcPr>
+            <w:tcW w:type="dxa" w:w="2016"/>
+            <w:vAlign w:val="center"/>
+            <w:tcBorders>
+              <w:top w:val="single" w:sz="6" w:color="B0B7C3"/>
+              <w:left w:val="single" w:sz="6" w:color="B0B7C3"/>
+              <w:bottom w:val="single" w:sz="6" w:color="B0B7C3"/>
+              <w:right w:val="single" w:sz="6" w:color="B0B7C3"/>
+            </w:tcBorders>
+            <w:shd w:fill="FDF3D3" w:val="clear"/>
+          </w:tcPr>
+          <w:p>
+            <w:pPr>
+              <w:spacing w:before="0" w:after="0"/>
+              <w:jc w:val="right"/>
+            </w:pPr>
+            <w:r/>
+            <w:r>
+              <w:rPr>
+                <w:b w:val="0"/>
+                <w:color w:val="1A1A1A"/>
+                <w:sz w:val="21"/>
+              </w:rPr>
+              <w:t>228</w:t>
+            </w:r>
+          </w:p>
+        </w:tc>
+        <w:tc>
+          <w:tcPr>
+            <w:tcW w:type="dxa" w:w="2160"/>
+            <w:vAlign w:val="center"/>
+            <w:tcBorders>
+              <w:top w:val="single" w:sz="6" w:color="B0B7C3"/>
+              <w:left w:val="single" w:sz="6" w:color="B0B7C3"/>
+              <w:bottom w:val="single" w:sz="6" w:color="B0B7C3"/>
+              <w:right w:val="single" w:sz="6" w:color="B0B7C3"/>
+            </w:tcBorders>
+            <w:shd w:fill="FDF3D3" w:val="clear"/>
+          </w:tcPr>
+          <w:p>
+            <w:pPr>
+              <w:spacing w:before="0" w:after="0"/>
+              <w:jc w:val="right"/>
+            </w:pPr>
+            <w:r/>
+            <w:r>
+              <w:rPr>
+                <w:b w:val="0"/>
+                <w:color w:val="1A1A1A"/>
+                <w:sz w:val="21"/>
+              </w:rPr>
+              <w:t>387,394</w:t>
+            </w:r>
+          </w:p>
+        </w:tc>
+      </w:tr>
+      <w:tr>
+        <w:trPr>
+          <w:trHeight w:val="360" w:hRule="atLeast"/>
+        </w:trPr>
+        <w:tc>
+          <w:tcPr>
+            <w:tcW w:type="dxa" w:w="1440"/>
             <w:vAlign w:val="center"/>
             <w:tcBorders>
               <w:top w:val="single" w:sz="6" w:color="B0B7C3"/>
@@ -2548,7 +2884,63 @@
                 <w:color w:val="1A1A1A"/>
                 <w:sz w:val="21"/>
               </w:rPr>
-              <w:t>McMaster-Carr Internal</w:t>
+              <w:t>—</w:t>
+            </w:r>
+          </w:p>
+        </w:tc>
+        <w:tc>
+          <w:tcPr>
+            <w:tcW w:type="dxa" w:w="4608"/>
+            <w:vAlign w:val="center"/>
+            <w:tcBorders>
+              <w:top w:val="single" w:sz="6" w:color="B0B7C3"/>
+              <w:left w:val="single" w:sz="6" w:color="B0B7C3"/>
+              <w:bottom w:val="single" w:sz="6" w:color="B0B7C3"/>
+              <w:right w:val="single" w:sz="6" w:color="B0B7C3"/>
+            </w:tcBorders>
+            <w:shd w:fill="FDF3D3" w:val="clear"/>
+          </w:tcPr>
+          <w:p>
+            <w:pPr>
+              <w:spacing w:before="0" w:after="0"/>
+              <w:jc w:val="left"/>
+            </w:pPr>
+            <w:r/>
+            <w:r>
+              <w:rPr>
+                <w:b/>
+                <w:color w:val="1A1A1A"/>
+                <w:sz w:val="21"/>
+              </w:rPr>
+              <w:t>Excluded subtotal</w:t>
+            </w:r>
+          </w:p>
+        </w:tc>
+        <w:tc>
+          <w:tcPr>
+            <w:tcW w:type="dxa" w:w="1728"/>
+            <w:vAlign w:val="center"/>
+            <w:tcBorders>
+              <w:top w:val="single" w:sz="6" w:color="B0B7C3"/>
+              <w:left w:val="single" w:sz="6" w:color="B0B7C3"/>
+              <w:bottom w:val="single" w:sz="6" w:color="B0B7C3"/>
+              <w:right w:val="single" w:sz="6" w:color="B0B7C3"/>
+            </w:tcBorders>
+            <w:shd w:fill="FDF3D3" w:val="clear"/>
+          </w:tcPr>
+          <w:p>
+            <w:pPr>
+              <w:spacing w:before="0" w:after="0"/>
+              <w:jc w:val="right"/>
+            </w:pPr>
+            <w:r/>
+            <w:r>
+              <w:rPr>
+                <w:b/>
+                <w:color w:val="1A1A1A"/>
+                <w:sz w:val="21"/>
+              </w:rPr>
+              <w:t>50,000</w:t>
             </w:r>
           </w:p>
         </w:tc>
@@ -2576,7 +2968,7 @@
                 <w:color w:val="1A1A1A"/>
                 <w:sz w:val="21"/>
               </w:rPr>
-              <w:t>5</w:t>
+              <w:t>48,657</w:t>
             </w:r>
           </w:p>
         </w:tc>
@@ -2604,13 +2996,13 @@
                 <w:color w:val="1A1A1A"/>
                 <w:sz w:val="21"/>
               </w:rPr>
-              <w:t>0</w:t>
+              <w:t>1,343</w:t>
             </w:r>
           </w:p>
         </w:tc>
         <w:tc>
           <w:tcPr>
-            <w:tcW w:type="dxa" w:w="2016"/>
+            <w:tcW w:type="dxa" w:w="2160"/>
             <w:vAlign w:val="center"/>
             <w:tcBorders>
               <w:top w:val="single" w:sz="6" w:color="B0B7C3"/>
@@ -2632,13 +3024,18 @@
                 <w:color w:val="1A1A1A"/>
                 <w:sz w:val="21"/>
               </w:rPr>
-              <w:t>5</w:t>
+              <w:t>1,007,921</w:t>
             </w:r>
           </w:p>
         </w:tc>
+      </w:tr>
+      <w:tr>
+        <w:trPr>
+          <w:trHeight w:val="360" w:hRule="atLeast"/>
+        </w:trPr>
         <w:tc>
           <w:tcPr>
-            <w:tcW w:type="dxa" w:w="2304"/>
+            <w:tcW w:type="dxa" w:w="1440"/>
             <w:vAlign w:val="center"/>
             <w:tcBorders>
               <w:top w:val="single" w:sz="6" w:color="B0B7C3"/>
@@ -2646,7 +3043,1083 @@
               <w:bottom w:val="single" w:sz="6" w:color="B0B7C3"/>
               <w:right w:val="single" w:sz="6" w:color="B0B7C3"/>
             </w:tcBorders>
-            <w:shd w:fill="FDF3D3" w:val="clear"/>
+          </w:tcPr>
+          <w:p>
+            <w:pPr>
+              <w:spacing w:before="0" w:after="0"/>
+              <w:jc w:val="left"/>
+            </w:pPr>
+            <w:r/>
+            <w:r>
+              <w:rPr>
+                <w:b w:val="0"/>
+                <w:color w:val="1A1A1A"/>
+                <w:sz w:val="21"/>
+              </w:rPr>
+              <w:t>01, 02</w:t>
+            </w:r>
+          </w:p>
+        </w:tc>
+        <w:tc>
+          <w:tcPr>
+            <w:tcW w:type="dxa" w:w="4608"/>
+            <w:vAlign w:val="center"/>
+            <w:tcBorders>
+              <w:top w:val="single" w:sz="6" w:color="B0B7C3"/>
+              <w:left w:val="single" w:sz="6" w:color="B0B7C3"/>
+              <w:bottom w:val="single" w:sz="6" w:color="B0B7C3"/>
+              <w:right w:val="single" w:sz="6" w:color="B0B7C3"/>
+            </w:tcBorders>
+          </w:tcPr>
+          <w:p>
+            <w:pPr>
+              <w:spacing w:before="0" w:after="0"/>
+              <w:jc w:val="left"/>
+            </w:pPr>
+            <w:r/>
+            <w:r>
+              <w:rPr>
+                <w:b w:val="0"/>
+                <w:color w:val="1A1A1A"/>
+                <w:sz w:val="21"/>
+              </w:rPr>
+              <w:t>Regular / National</w:t>
+            </w:r>
+          </w:p>
+        </w:tc>
+        <w:tc>
+          <w:tcPr>
+            <w:tcW w:type="dxa" w:w="1728"/>
+            <w:vAlign w:val="center"/>
+            <w:tcBorders>
+              <w:top w:val="single" w:sz="6" w:color="B0B7C3"/>
+              <w:left w:val="single" w:sz="6" w:color="B0B7C3"/>
+              <w:bottom w:val="single" w:sz="6" w:color="B0B7C3"/>
+              <w:right w:val="single" w:sz="6" w:color="B0B7C3"/>
+            </w:tcBorders>
+          </w:tcPr>
+          <w:p>
+            <w:pPr>
+              <w:spacing w:before="0" w:after="0"/>
+              <w:jc w:val="right"/>
+            </w:pPr>
+            <w:r/>
+            <w:r>
+              <w:rPr>
+                <w:b w:val="0"/>
+                <w:color w:val="1A1A1A"/>
+                <w:sz w:val="21"/>
+              </w:rPr>
+              <w:t>277,280</w:t>
+            </w:r>
+          </w:p>
+        </w:tc>
+        <w:tc>
+          <w:tcPr>
+            <w:tcW w:type="dxa" w:w="1872"/>
+            <w:vAlign w:val="center"/>
+            <w:tcBorders>
+              <w:top w:val="single" w:sz="6" w:color="B0B7C3"/>
+              <w:left w:val="single" w:sz="6" w:color="B0B7C3"/>
+              <w:bottom w:val="single" w:sz="6" w:color="B0B7C3"/>
+              <w:right w:val="single" w:sz="6" w:color="B0B7C3"/>
+            </w:tcBorders>
+          </w:tcPr>
+          <w:p>
+            <w:pPr>
+              <w:spacing w:before="0" w:after="0"/>
+              <w:jc w:val="right"/>
+            </w:pPr>
+            <w:r/>
+            <w:r>
+              <w:rPr>
+                <w:b w:val="0"/>
+                <w:color w:val="1A1A1A"/>
+                <w:sz w:val="21"/>
+              </w:rPr>
+              <w:t>267,581</w:t>
+            </w:r>
+          </w:p>
+        </w:tc>
+        <w:tc>
+          <w:tcPr>
+            <w:tcW w:type="dxa" w:w="2016"/>
+            <w:vAlign w:val="center"/>
+            <w:tcBorders>
+              <w:top w:val="single" w:sz="6" w:color="B0B7C3"/>
+              <w:left w:val="single" w:sz="6" w:color="B0B7C3"/>
+              <w:bottom w:val="single" w:sz="6" w:color="B0B7C3"/>
+              <w:right w:val="single" w:sz="6" w:color="B0B7C3"/>
+            </w:tcBorders>
+          </w:tcPr>
+          <w:p>
+            <w:pPr>
+              <w:spacing w:before="0" w:after="0"/>
+              <w:jc w:val="right"/>
+            </w:pPr>
+            <w:r/>
+            <w:r>
+              <w:rPr>
+                <w:b w:val="0"/>
+                <w:color w:val="1A1A1A"/>
+                <w:sz w:val="21"/>
+              </w:rPr>
+              <w:t>9,699</w:t>
+            </w:r>
+          </w:p>
+        </w:tc>
+        <w:tc>
+          <w:tcPr>
+            <w:tcW w:type="dxa" w:w="2160"/>
+            <w:vAlign w:val="center"/>
+            <w:tcBorders>
+              <w:top w:val="single" w:sz="6" w:color="B0B7C3"/>
+              <w:left w:val="single" w:sz="6" w:color="B0B7C3"/>
+              <w:bottom w:val="single" w:sz="6" w:color="B0B7C3"/>
+              <w:right w:val="single" w:sz="6" w:color="B0B7C3"/>
+            </w:tcBorders>
+          </w:tcPr>
+          <w:p>
+            <w:pPr>
+              <w:spacing w:before="0" w:after="0"/>
+              <w:jc w:val="right"/>
+            </w:pPr>
+            <w:r/>
+            <w:r>
+              <w:rPr>
+                <w:b w:val="0"/>
+                <w:color w:val="1A1A1A"/>
+                <w:sz w:val="21"/>
+              </w:rPr>
+              <w:t>13,097,828</w:t>
+            </w:r>
+          </w:p>
+        </w:tc>
+      </w:tr>
+      <w:tr>
+        <w:trPr>
+          <w:trHeight w:val="360" w:hRule="atLeast"/>
+        </w:trPr>
+        <w:tc>
+          <w:tcPr>
+            <w:tcW w:type="dxa" w:w="1440"/>
+            <w:vAlign w:val="center"/>
+            <w:tcBorders>
+              <w:top w:val="single" w:sz="6" w:color="B0B7C3"/>
+              <w:left w:val="single" w:sz="6" w:color="B0B7C3"/>
+              <w:bottom w:val="single" w:sz="6" w:color="B0B7C3"/>
+              <w:right w:val="single" w:sz="6" w:color="B0B7C3"/>
+            </w:tcBorders>
+            <w:shd w:fill="F6F7FA" w:val="clear"/>
+          </w:tcPr>
+          <w:p>
+            <w:pPr>
+              <w:spacing w:before="0" w:after="0"/>
+              <w:jc w:val="left"/>
+            </w:pPr>
+            <w:r/>
+            <w:r>
+              <w:rPr>
+                <w:b w:val="0"/>
+                <w:color w:val="1A1A1A"/>
+                <w:sz w:val="21"/>
+              </w:rPr>
+              <w:t>14, 90, 98</w:t>
+            </w:r>
+          </w:p>
+        </w:tc>
+        <w:tc>
+          <w:tcPr>
+            <w:tcW w:type="dxa" w:w="4608"/>
+            <w:vAlign w:val="center"/>
+            <w:tcBorders>
+              <w:top w:val="single" w:sz="6" w:color="B0B7C3"/>
+              <w:left w:val="single" w:sz="6" w:color="B0B7C3"/>
+              <w:bottom w:val="single" w:sz="6" w:color="B0B7C3"/>
+              <w:right w:val="single" w:sz="6" w:color="B0B7C3"/>
+            </w:tcBorders>
+            <w:shd w:fill="F6F7FA" w:val="clear"/>
+          </w:tcPr>
+          <w:p>
+            <w:pPr>
+              <w:spacing w:before="0" w:after="0"/>
+              <w:jc w:val="left"/>
+            </w:pPr>
+            <w:r/>
+            <w:r>
+              <w:rPr>
+                <w:b w:val="0"/>
+                <w:color w:val="1A1A1A"/>
+                <w:sz w:val="21"/>
+              </w:rPr>
+              <w:t>Interbranch / Employee / Claims</w:t>
+            </w:r>
+          </w:p>
+        </w:tc>
+        <w:tc>
+          <w:tcPr>
+            <w:tcW w:type="dxa" w:w="1728"/>
+            <w:vAlign w:val="center"/>
+            <w:tcBorders>
+              <w:top w:val="single" w:sz="6" w:color="B0B7C3"/>
+              <w:left w:val="single" w:sz="6" w:color="B0B7C3"/>
+              <w:bottom w:val="single" w:sz="6" w:color="B0B7C3"/>
+              <w:right w:val="single" w:sz="6" w:color="B0B7C3"/>
+            </w:tcBorders>
+            <w:shd w:fill="F6F7FA" w:val="clear"/>
+          </w:tcPr>
+          <w:p>
+            <w:pPr>
+              <w:spacing w:before="0" w:after="0"/>
+              <w:jc w:val="right"/>
+            </w:pPr>
+            <w:r/>
+            <w:r>
+              <w:rPr>
+                <w:b w:val="0"/>
+                <w:color w:val="1A1A1A"/>
+                <w:sz w:val="21"/>
+              </w:rPr>
+              <w:t>163,228</w:t>
+            </w:r>
+          </w:p>
+        </w:tc>
+        <w:tc>
+          <w:tcPr>
+            <w:tcW w:type="dxa" w:w="1872"/>
+            <w:vAlign w:val="center"/>
+            <w:tcBorders>
+              <w:top w:val="single" w:sz="6" w:color="B0B7C3"/>
+              <w:left w:val="single" w:sz="6" w:color="B0B7C3"/>
+              <w:bottom w:val="single" w:sz="6" w:color="B0B7C3"/>
+              <w:right w:val="single" w:sz="6" w:color="B0B7C3"/>
+            </w:tcBorders>
+            <w:shd w:fill="F6F7FA" w:val="clear"/>
+          </w:tcPr>
+          <w:p>
+            <w:pPr>
+              <w:spacing w:before="0" w:after="0"/>
+              <w:jc w:val="right"/>
+            </w:pPr>
+            <w:r/>
+            <w:r>
+              <w:rPr>
+                <w:b w:val="0"/>
+                <w:color w:val="1A1A1A"/>
+                <w:sz w:val="21"/>
+              </w:rPr>
+              <w:t>163,203</w:t>
+            </w:r>
+          </w:p>
+        </w:tc>
+        <w:tc>
+          <w:tcPr>
+            <w:tcW w:type="dxa" w:w="2016"/>
+            <w:vAlign w:val="center"/>
+            <w:tcBorders>
+              <w:top w:val="single" w:sz="6" w:color="B0B7C3"/>
+              <w:left w:val="single" w:sz="6" w:color="B0B7C3"/>
+              <w:bottom w:val="single" w:sz="6" w:color="B0B7C3"/>
+              <w:right w:val="single" w:sz="6" w:color="B0B7C3"/>
+            </w:tcBorders>
+            <w:shd w:fill="F6F7FA" w:val="clear"/>
+          </w:tcPr>
+          <w:p>
+            <w:pPr>
+              <w:spacing w:before="0" w:after="0"/>
+              <w:jc w:val="right"/>
+            </w:pPr>
+            <w:r/>
+            <w:r>
+              <w:rPr>
+                <w:b w:val="0"/>
+                <w:color w:val="1A1A1A"/>
+                <w:sz w:val="21"/>
+              </w:rPr>
+              <w:t>25</w:t>
+            </w:r>
+          </w:p>
+        </w:tc>
+        <w:tc>
+          <w:tcPr>
+            <w:tcW w:type="dxa" w:w="2160"/>
+            <w:vAlign w:val="center"/>
+            <w:tcBorders>
+              <w:top w:val="single" w:sz="6" w:color="B0B7C3"/>
+              <w:left w:val="single" w:sz="6" w:color="B0B7C3"/>
+              <w:bottom w:val="single" w:sz="6" w:color="B0B7C3"/>
+              <w:right w:val="single" w:sz="6" w:color="B0B7C3"/>
+            </w:tcBorders>
+            <w:shd w:fill="F6F7FA" w:val="clear"/>
+          </w:tcPr>
+          <w:p>
+            <w:pPr>
+              <w:spacing w:before="0" w:after="0"/>
+              <w:jc w:val="right"/>
+            </w:pPr>
+            <w:r/>
+            <w:r>
+              <w:rPr>
+                <w:b w:val="0"/>
+                <w:color w:val="1A1A1A"/>
+                <w:sz w:val="21"/>
+              </w:rPr>
+              <w:t>1,710,825</w:t>
+            </w:r>
+          </w:p>
+        </w:tc>
+      </w:tr>
+      <w:tr>
+        <w:trPr>
+          <w:trHeight w:val="360" w:hRule="atLeast"/>
+        </w:trPr>
+        <w:tc>
+          <w:tcPr>
+            <w:tcW w:type="dxa" w:w="1440"/>
+            <w:vAlign w:val="center"/>
+            <w:tcBorders>
+              <w:top w:val="single" w:sz="6" w:color="B0B7C3"/>
+              <w:left w:val="single" w:sz="6" w:color="B0B7C3"/>
+              <w:bottom w:val="single" w:sz="6" w:color="B0B7C3"/>
+              <w:right w:val="single" w:sz="6" w:color="B0B7C3"/>
+            </w:tcBorders>
+          </w:tcPr>
+          <w:p>
+            <w:pPr>
+              <w:spacing w:before="0" w:after="0"/>
+              <w:jc w:val="left"/>
+            </w:pPr>
+            <w:r/>
+            <w:r>
+              <w:rPr>
+                <w:b w:val="0"/>
+                <w:color w:val="1A1A1A"/>
+                <w:sz w:val="21"/>
+              </w:rPr>
+              <w:t>11, 12, 13</w:t>
+            </w:r>
+          </w:p>
+        </w:tc>
+        <w:tc>
+          <w:tcPr>
+            <w:tcW w:type="dxa" w:w="4608"/>
+            <w:vAlign w:val="center"/>
+            <w:tcBorders>
+              <w:top w:val="single" w:sz="6" w:color="B0B7C3"/>
+              <w:left w:val="single" w:sz="6" w:color="B0B7C3"/>
+              <w:bottom w:val="single" w:sz="6" w:color="B0B7C3"/>
+              <w:right w:val="single" w:sz="6" w:color="B0B7C3"/>
+            </w:tcBorders>
+          </w:tcPr>
+          <w:p>
+            <w:pPr>
+              <w:spacing w:before="0" w:after="0"/>
+              <w:jc w:val="left"/>
+            </w:pPr>
+            <w:r/>
+            <w:r>
+              <w:rPr>
+                <w:b w:val="0"/>
+                <w:color w:val="1A1A1A"/>
+                <w:sz w:val="21"/>
+              </w:rPr>
+              <w:t>Export (Mexico / Canada / RoW)</w:t>
+            </w:r>
+          </w:p>
+        </w:tc>
+        <w:tc>
+          <w:tcPr>
+            <w:tcW w:type="dxa" w:w="1728"/>
+            <w:vAlign w:val="center"/>
+            <w:tcBorders>
+              <w:top w:val="single" w:sz="6" w:color="B0B7C3"/>
+              <w:left w:val="single" w:sz="6" w:color="B0B7C3"/>
+              <w:bottom w:val="single" w:sz="6" w:color="B0B7C3"/>
+              <w:right w:val="single" w:sz="6" w:color="B0B7C3"/>
+            </w:tcBorders>
+          </w:tcPr>
+          <w:p>
+            <w:pPr>
+              <w:spacing w:before="0" w:after="0"/>
+              <w:jc w:val="right"/>
+            </w:pPr>
+            <w:r/>
+            <w:r>
+              <w:rPr>
+                <w:b w:val="0"/>
+                <w:color w:val="1A1A1A"/>
+                <w:sz w:val="21"/>
+              </w:rPr>
+              <w:t>56,854</w:t>
+            </w:r>
+          </w:p>
+        </w:tc>
+        <w:tc>
+          <w:tcPr>
+            <w:tcW w:type="dxa" w:w="1872"/>
+            <w:vAlign w:val="center"/>
+            <w:tcBorders>
+              <w:top w:val="single" w:sz="6" w:color="B0B7C3"/>
+              <w:left w:val="single" w:sz="6" w:color="B0B7C3"/>
+              <w:bottom w:val="single" w:sz="6" w:color="B0B7C3"/>
+              <w:right w:val="single" w:sz="6" w:color="B0B7C3"/>
+            </w:tcBorders>
+          </w:tcPr>
+          <w:p>
+            <w:pPr>
+              <w:spacing w:before="0" w:after="0"/>
+              <w:jc w:val="right"/>
+            </w:pPr>
+            <w:r/>
+            <w:r>
+              <w:rPr>
+                <w:b w:val="0"/>
+                <w:color w:val="1A1A1A"/>
+                <w:sz w:val="21"/>
+              </w:rPr>
+              <w:t>55,797</w:t>
+            </w:r>
+          </w:p>
+        </w:tc>
+        <w:tc>
+          <w:tcPr>
+            <w:tcW w:type="dxa" w:w="2016"/>
+            <w:vAlign w:val="center"/>
+            <w:tcBorders>
+              <w:top w:val="single" w:sz="6" w:color="B0B7C3"/>
+              <w:left w:val="single" w:sz="6" w:color="B0B7C3"/>
+              <w:bottom w:val="single" w:sz="6" w:color="B0B7C3"/>
+              <w:right w:val="single" w:sz="6" w:color="B0B7C3"/>
+            </w:tcBorders>
+          </w:tcPr>
+          <w:p>
+            <w:pPr>
+              <w:spacing w:before="0" w:after="0"/>
+              <w:jc w:val="right"/>
+            </w:pPr>
+            <w:r/>
+            <w:r>
+              <w:rPr>
+                <w:b w:val="0"/>
+                <w:color w:val="1A1A1A"/>
+                <w:sz w:val="21"/>
+              </w:rPr>
+              <w:t>1,057</w:t>
+            </w:r>
+          </w:p>
+        </w:tc>
+        <w:tc>
+          <w:tcPr>
+            <w:tcW w:type="dxa" w:w="2160"/>
+            <w:vAlign w:val="center"/>
+            <w:tcBorders>
+              <w:top w:val="single" w:sz="6" w:color="B0B7C3"/>
+              <w:left w:val="single" w:sz="6" w:color="B0B7C3"/>
+              <w:bottom w:val="single" w:sz="6" w:color="B0B7C3"/>
+              <w:right w:val="single" w:sz="6" w:color="B0B7C3"/>
+            </w:tcBorders>
+          </w:tcPr>
+          <w:p>
+            <w:pPr>
+              <w:spacing w:before="0" w:after="0"/>
+              <w:jc w:val="right"/>
+            </w:pPr>
+            <w:r/>
+            <w:r>
+              <w:rPr>
+                <w:b w:val="0"/>
+                <w:color w:val="1A1A1A"/>
+                <w:sz w:val="21"/>
+              </w:rPr>
+              <w:t>1,081,760</w:t>
+            </w:r>
+          </w:p>
+        </w:tc>
+      </w:tr>
+      <w:tr>
+        <w:trPr>
+          <w:trHeight w:val="360" w:hRule="atLeast"/>
+        </w:trPr>
+        <w:tc>
+          <w:tcPr>
+            <w:tcW w:type="dxa" w:w="1440"/>
+            <w:vAlign w:val="center"/>
+            <w:tcBorders>
+              <w:top w:val="single" w:sz="6" w:color="B0B7C3"/>
+              <w:left w:val="single" w:sz="6" w:color="B0B7C3"/>
+              <w:bottom w:val="single" w:sz="6" w:color="B0B7C3"/>
+              <w:right w:val="single" w:sz="6" w:color="B0B7C3"/>
+            </w:tcBorders>
+            <w:shd w:fill="F6F7FA" w:val="clear"/>
+          </w:tcPr>
+          <w:p>
+            <w:pPr>
+              <w:spacing w:before="0" w:after="0"/>
+              <w:jc w:val="left"/>
+            </w:pPr>
+            <w:r/>
+            <w:r>
+              <w:rPr>
+                <w:b w:val="0"/>
+                <w:color w:val="1A1A1A"/>
+                <w:sz w:val="21"/>
+              </w:rPr>
+              <w:t>03</w:t>
+            </w:r>
+          </w:p>
+        </w:tc>
+        <w:tc>
+          <w:tcPr>
+            <w:tcW w:type="dxa" w:w="4608"/>
+            <w:vAlign w:val="center"/>
+            <w:tcBorders>
+              <w:top w:val="single" w:sz="6" w:color="B0B7C3"/>
+              <w:left w:val="single" w:sz="6" w:color="B0B7C3"/>
+              <w:bottom w:val="single" w:sz="6" w:color="B0B7C3"/>
+              <w:right w:val="single" w:sz="6" w:color="B0B7C3"/>
+            </w:tcBorders>
+            <w:shd w:fill="F6F7FA" w:val="clear"/>
+          </w:tcPr>
+          <w:p>
+            <w:pPr>
+              <w:spacing w:before="0" w:after="0"/>
+              <w:jc w:val="left"/>
+            </w:pPr>
+            <w:r/>
+            <w:r>
+              <w:rPr>
+                <w:b w:val="0"/>
+                <w:color w:val="1A1A1A"/>
+                <w:sz w:val="21"/>
+              </w:rPr>
+              <w:t>Utility</w:t>
+            </w:r>
+          </w:p>
+        </w:tc>
+        <w:tc>
+          <w:tcPr>
+            <w:tcW w:type="dxa" w:w="1728"/>
+            <w:vAlign w:val="center"/>
+            <w:tcBorders>
+              <w:top w:val="single" w:sz="6" w:color="B0B7C3"/>
+              <w:left w:val="single" w:sz="6" w:color="B0B7C3"/>
+              <w:bottom w:val="single" w:sz="6" w:color="B0B7C3"/>
+              <w:right w:val="single" w:sz="6" w:color="B0B7C3"/>
+            </w:tcBorders>
+            <w:shd w:fill="F6F7FA" w:val="clear"/>
+          </w:tcPr>
+          <w:p>
+            <w:pPr>
+              <w:spacing w:before="0" w:after="0"/>
+              <w:jc w:val="right"/>
+            </w:pPr>
+            <w:r/>
+            <w:r>
+              <w:rPr>
+                <w:b w:val="0"/>
+                <w:color w:val="1A1A1A"/>
+                <w:sz w:val="21"/>
+              </w:rPr>
+              <w:t>4,310</w:t>
+            </w:r>
+          </w:p>
+        </w:tc>
+        <w:tc>
+          <w:tcPr>
+            <w:tcW w:type="dxa" w:w="1872"/>
+            <w:vAlign w:val="center"/>
+            <w:tcBorders>
+              <w:top w:val="single" w:sz="6" w:color="B0B7C3"/>
+              <w:left w:val="single" w:sz="6" w:color="B0B7C3"/>
+              <w:bottom w:val="single" w:sz="6" w:color="B0B7C3"/>
+              <w:right w:val="single" w:sz="6" w:color="B0B7C3"/>
+            </w:tcBorders>
+            <w:shd w:fill="F6F7FA" w:val="clear"/>
+          </w:tcPr>
+          <w:p>
+            <w:pPr>
+              <w:spacing w:before="0" w:after="0"/>
+              <w:jc w:val="right"/>
+            </w:pPr>
+            <w:r/>
+            <w:r>
+              <w:rPr>
+                <w:b w:val="0"/>
+                <w:color w:val="1A1A1A"/>
+                <w:sz w:val="21"/>
+              </w:rPr>
+              <w:t>4,131</w:t>
+            </w:r>
+          </w:p>
+        </w:tc>
+        <w:tc>
+          <w:tcPr>
+            <w:tcW w:type="dxa" w:w="2016"/>
+            <w:vAlign w:val="center"/>
+            <w:tcBorders>
+              <w:top w:val="single" w:sz="6" w:color="B0B7C3"/>
+              <w:left w:val="single" w:sz="6" w:color="B0B7C3"/>
+              <w:bottom w:val="single" w:sz="6" w:color="B0B7C3"/>
+              <w:right w:val="single" w:sz="6" w:color="B0B7C3"/>
+            </w:tcBorders>
+            <w:shd w:fill="F6F7FA" w:val="clear"/>
+          </w:tcPr>
+          <w:p>
+            <w:pPr>
+              <w:spacing w:before="0" w:after="0"/>
+              <w:jc w:val="right"/>
+            </w:pPr>
+            <w:r/>
+            <w:r>
+              <w:rPr>
+                <w:b w:val="0"/>
+                <w:color w:val="1A1A1A"/>
+                <w:sz w:val="21"/>
+              </w:rPr>
+              <w:t>179</w:t>
+            </w:r>
+          </w:p>
+        </w:tc>
+        <w:tc>
+          <w:tcPr>
+            <w:tcW w:type="dxa" w:w="2160"/>
+            <w:vAlign w:val="center"/>
+            <w:tcBorders>
+              <w:top w:val="single" w:sz="6" w:color="B0B7C3"/>
+              <w:left w:val="single" w:sz="6" w:color="B0B7C3"/>
+              <w:bottom w:val="single" w:sz="6" w:color="B0B7C3"/>
+              <w:right w:val="single" w:sz="6" w:color="B0B7C3"/>
+            </w:tcBorders>
+            <w:shd w:fill="F6F7FA" w:val="clear"/>
+          </w:tcPr>
+          <w:p>
+            <w:pPr>
+              <w:spacing w:before="0" w:after="0"/>
+              <w:jc w:val="right"/>
+            </w:pPr>
+            <w:r/>
+            <w:r>
+              <w:rPr>
+                <w:b w:val="0"/>
+                <w:color w:val="1A1A1A"/>
+                <w:sz w:val="21"/>
+              </w:rPr>
+              <w:t>85,857</w:t>
+            </w:r>
+          </w:p>
+        </w:tc>
+      </w:tr>
+      <w:tr>
+        <w:trPr>
+          <w:trHeight w:val="360" w:hRule="atLeast"/>
+        </w:trPr>
+        <w:tc>
+          <w:tcPr>
+            <w:tcW w:type="dxa" w:w="1440"/>
+            <w:vAlign w:val="center"/>
+            <w:tcBorders>
+              <w:top w:val="single" w:sz="6" w:color="B0B7C3"/>
+              <w:left w:val="single" w:sz="6" w:color="B0B7C3"/>
+              <w:bottom w:val="single" w:sz="6" w:color="B0B7C3"/>
+              <w:right w:val="single" w:sz="6" w:color="B0B7C3"/>
+            </w:tcBorders>
+          </w:tcPr>
+          <w:p>
+            <w:pPr>
+              <w:spacing w:before="0" w:after="0"/>
+              <w:jc w:val="left"/>
+            </w:pPr>
+            <w:r/>
+            <w:r>
+              <w:rPr>
+                <w:b w:val="0"/>
+                <w:color w:val="1A1A1A"/>
+                <w:sz w:val="21"/>
+              </w:rPr>
+              <w:t>10</w:t>
+            </w:r>
+          </w:p>
+        </w:tc>
+        <w:tc>
+          <w:tcPr>
+            <w:tcW w:type="dxa" w:w="4608"/>
+            <w:vAlign w:val="center"/>
+            <w:tcBorders>
+              <w:top w:val="single" w:sz="6" w:color="B0B7C3"/>
+              <w:left w:val="single" w:sz="6" w:color="B0B7C3"/>
+              <w:bottom w:val="single" w:sz="6" w:color="B0B7C3"/>
+              <w:right w:val="single" w:sz="6" w:color="B0B7C3"/>
+            </w:tcBorders>
+          </w:tcPr>
+          <w:p>
+            <w:pPr>
+              <w:spacing w:before="0" w:after="0"/>
+              <w:jc w:val="left"/>
+            </w:pPr>
+            <w:r/>
+            <w:r>
+              <w:rPr>
+                <w:b w:val="0"/>
+                <w:color w:val="1A1A1A"/>
+                <w:sz w:val="21"/>
+              </w:rPr>
+              <w:t>Hospital</w:t>
+            </w:r>
+          </w:p>
+        </w:tc>
+        <w:tc>
+          <w:tcPr>
+            <w:tcW w:type="dxa" w:w="1728"/>
+            <w:vAlign w:val="center"/>
+            <w:tcBorders>
+              <w:top w:val="single" w:sz="6" w:color="B0B7C3"/>
+              <w:left w:val="single" w:sz="6" w:color="B0B7C3"/>
+              <w:bottom w:val="single" w:sz="6" w:color="B0B7C3"/>
+              <w:right w:val="single" w:sz="6" w:color="B0B7C3"/>
+            </w:tcBorders>
+          </w:tcPr>
+          <w:p>
+            <w:pPr>
+              <w:spacing w:before="0" w:after="0"/>
+              <w:jc w:val="right"/>
+            </w:pPr>
+            <w:r/>
+            <w:r>
+              <w:rPr>
+                <w:b w:val="0"/>
+                <w:color w:val="1A1A1A"/>
+                <w:sz w:val="21"/>
+              </w:rPr>
+              <w:t>2,367</w:t>
+            </w:r>
+          </w:p>
+        </w:tc>
+        <w:tc>
+          <w:tcPr>
+            <w:tcW w:type="dxa" w:w="1872"/>
+            <w:vAlign w:val="center"/>
+            <w:tcBorders>
+              <w:top w:val="single" w:sz="6" w:color="B0B7C3"/>
+              <w:left w:val="single" w:sz="6" w:color="B0B7C3"/>
+              <w:bottom w:val="single" w:sz="6" w:color="B0B7C3"/>
+              <w:right w:val="single" w:sz="6" w:color="B0B7C3"/>
+            </w:tcBorders>
+          </w:tcPr>
+          <w:p>
+            <w:pPr>
+              <w:spacing w:before="0" w:after="0"/>
+              <w:jc w:val="right"/>
+            </w:pPr>
+            <w:r/>
+            <w:r>
+              <w:rPr>
+                <w:b w:val="0"/>
+                <w:color w:val="1A1A1A"/>
+                <w:sz w:val="21"/>
+              </w:rPr>
+              <w:t>2,317</w:t>
+            </w:r>
+          </w:p>
+        </w:tc>
+        <w:tc>
+          <w:tcPr>
+            <w:tcW w:type="dxa" w:w="2016"/>
+            <w:vAlign w:val="center"/>
+            <w:tcBorders>
+              <w:top w:val="single" w:sz="6" w:color="B0B7C3"/>
+              <w:left w:val="single" w:sz="6" w:color="B0B7C3"/>
+              <w:bottom w:val="single" w:sz="6" w:color="B0B7C3"/>
+              <w:right w:val="single" w:sz="6" w:color="B0B7C3"/>
+            </w:tcBorders>
+          </w:tcPr>
+          <w:p>
+            <w:pPr>
+              <w:spacing w:before="0" w:after="0"/>
+              <w:jc w:val="right"/>
+            </w:pPr>
+            <w:r/>
+            <w:r>
+              <w:rPr>
+                <w:b w:val="0"/>
+                <w:color w:val="1A1A1A"/>
+                <w:sz w:val="21"/>
+              </w:rPr>
+              <w:t>50</w:t>
+            </w:r>
+          </w:p>
+        </w:tc>
+        <w:tc>
+          <w:tcPr>
+            <w:tcW w:type="dxa" w:w="2160"/>
+            <w:vAlign w:val="center"/>
+            <w:tcBorders>
+              <w:top w:val="single" w:sz="6" w:color="B0B7C3"/>
+              <w:left w:val="single" w:sz="6" w:color="B0B7C3"/>
+              <w:bottom w:val="single" w:sz="6" w:color="B0B7C3"/>
+              <w:right w:val="single" w:sz="6" w:color="B0B7C3"/>
+            </w:tcBorders>
+          </w:tcPr>
+          <w:p>
+            <w:pPr>
+              <w:spacing w:before="0" w:after="0"/>
+              <w:jc w:val="right"/>
+            </w:pPr>
+            <w:r/>
+            <w:r>
+              <w:rPr>
+                <w:b w:val="0"/>
+                <w:color w:val="1A1A1A"/>
+                <w:sz w:val="21"/>
+              </w:rPr>
+              <w:t>31,201</w:t>
+            </w:r>
+          </w:p>
+        </w:tc>
+      </w:tr>
+      <w:tr>
+        <w:trPr>
+          <w:trHeight w:val="360" w:hRule="atLeast"/>
+        </w:trPr>
+        <w:tc>
+          <w:tcPr>
+            <w:tcW w:type="dxa" w:w="1440"/>
+            <w:vAlign w:val="center"/>
+            <w:tcBorders>
+              <w:top w:val="single" w:sz="6" w:color="B0B7C3"/>
+              <w:left w:val="single" w:sz="6" w:color="B0B7C3"/>
+              <w:bottom w:val="single" w:sz="6" w:color="B0B7C3"/>
+              <w:right w:val="single" w:sz="6" w:color="B0B7C3"/>
+            </w:tcBorders>
+            <w:shd w:fill="F6F7FA" w:val="clear"/>
+          </w:tcPr>
+          <w:p>
+            <w:pPr>
+              <w:spacing w:before="0" w:after="0"/>
+              <w:jc w:val="left"/>
+            </w:pPr>
+            <w:r/>
+            <w:r>
+              <w:rPr>
+                <w:b w:val="0"/>
+                <w:color w:val="1A1A1A"/>
+                <w:sz w:val="21"/>
+              </w:rPr>
+              <w:t>04</w:t>
+            </w:r>
+          </w:p>
+        </w:tc>
+        <w:tc>
+          <w:tcPr>
+            <w:tcW w:type="dxa" w:w="4608"/>
+            <w:vAlign w:val="center"/>
+            <w:tcBorders>
+              <w:top w:val="single" w:sz="6" w:color="B0B7C3"/>
+              <w:left w:val="single" w:sz="6" w:color="B0B7C3"/>
+              <w:bottom w:val="single" w:sz="6" w:color="B0B7C3"/>
+              <w:right w:val="single" w:sz="6" w:color="B0B7C3"/>
+            </w:tcBorders>
+            <w:shd w:fill="F6F7FA" w:val="clear"/>
+          </w:tcPr>
+          <w:p>
+            <w:pPr>
+              <w:spacing w:before="0" w:after="0"/>
+              <w:jc w:val="left"/>
+            </w:pPr>
+            <w:r/>
+            <w:r>
+              <w:rPr>
+                <w:b w:val="0"/>
+                <w:color w:val="1A1A1A"/>
+                <w:sz w:val="21"/>
+              </w:rPr>
+              <w:t>Railroad</w:t>
+            </w:r>
+          </w:p>
+        </w:tc>
+        <w:tc>
+          <w:tcPr>
+            <w:tcW w:type="dxa" w:w="1728"/>
+            <w:vAlign w:val="center"/>
+            <w:tcBorders>
+              <w:top w:val="single" w:sz="6" w:color="B0B7C3"/>
+              <w:left w:val="single" w:sz="6" w:color="B0B7C3"/>
+              <w:bottom w:val="single" w:sz="6" w:color="B0B7C3"/>
+              <w:right w:val="single" w:sz="6" w:color="B0B7C3"/>
+            </w:tcBorders>
+            <w:shd w:fill="F6F7FA" w:val="clear"/>
+          </w:tcPr>
+          <w:p>
+            <w:pPr>
+              <w:spacing w:before="0" w:after="0"/>
+              <w:jc w:val="right"/>
+            </w:pPr>
+            <w:r/>
+            <w:r>
+              <w:rPr>
+                <w:b w:val="0"/>
+                <w:color w:val="1A1A1A"/>
+                <w:sz w:val="21"/>
+              </w:rPr>
+              <w:t>726</w:t>
+            </w:r>
+          </w:p>
+        </w:tc>
+        <w:tc>
+          <w:tcPr>
+            <w:tcW w:type="dxa" w:w="1872"/>
+            <w:vAlign w:val="center"/>
+            <w:tcBorders>
+              <w:top w:val="single" w:sz="6" w:color="B0B7C3"/>
+              <w:left w:val="single" w:sz="6" w:color="B0B7C3"/>
+              <w:bottom w:val="single" w:sz="6" w:color="B0B7C3"/>
+              <w:right w:val="single" w:sz="6" w:color="B0B7C3"/>
+            </w:tcBorders>
+            <w:shd w:fill="F6F7FA" w:val="clear"/>
+          </w:tcPr>
+          <w:p>
+            <w:pPr>
+              <w:spacing w:before="0" w:after="0"/>
+              <w:jc w:val="right"/>
+            </w:pPr>
+            <w:r/>
+            <w:r>
+              <w:rPr>
+                <w:b w:val="0"/>
+                <w:color w:val="1A1A1A"/>
+                <w:sz w:val="21"/>
+              </w:rPr>
+              <w:t>705</w:t>
+            </w:r>
+          </w:p>
+        </w:tc>
+        <w:tc>
+          <w:tcPr>
+            <w:tcW w:type="dxa" w:w="2016"/>
+            <w:vAlign w:val="center"/>
+            <w:tcBorders>
+              <w:top w:val="single" w:sz="6" w:color="B0B7C3"/>
+              <w:left w:val="single" w:sz="6" w:color="B0B7C3"/>
+              <w:bottom w:val="single" w:sz="6" w:color="B0B7C3"/>
+              <w:right w:val="single" w:sz="6" w:color="B0B7C3"/>
+            </w:tcBorders>
+            <w:shd w:fill="F6F7FA" w:val="clear"/>
+          </w:tcPr>
+          <w:p>
+            <w:pPr>
+              <w:spacing w:before="0" w:after="0"/>
+              <w:jc w:val="right"/>
+            </w:pPr>
+            <w:r/>
+            <w:r>
+              <w:rPr>
+                <w:b w:val="0"/>
+                <w:color w:val="1A1A1A"/>
+                <w:sz w:val="21"/>
+              </w:rPr>
+              <w:t>21</w:t>
+            </w:r>
+          </w:p>
+        </w:tc>
+        <w:tc>
+          <w:tcPr>
+            <w:tcW w:type="dxa" w:w="2160"/>
+            <w:vAlign w:val="center"/>
+            <w:tcBorders>
+              <w:top w:val="single" w:sz="6" w:color="B0B7C3"/>
+              <w:left w:val="single" w:sz="6" w:color="B0B7C3"/>
+              <w:bottom w:val="single" w:sz="6" w:color="B0B7C3"/>
+              <w:right w:val="single" w:sz="6" w:color="B0B7C3"/>
+            </w:tcBorders>
+            <w:shd w:fill="F6F7FA" w:val="clear"/>
+          </w:tcPr>
+          <w:p>
+            <w:pPr>
+              <w:spacing w:before="0" w:after="0"/>
+              <w:jc w:val="right"/>
+            </w:pPr>
+            <w:r/>
+            <w:r>
+              <w:rPr>
+                <w:b w:val="0"/>
+                <w:color w:val="1A1A1A"/>
+                <w:sz w:val="21"/>
+              </w:rPr>
+              <w:t>13,394</w:t>
+            </w:r>
+          </w:p>
+        </w:tc>
+      </w:tr>
+      <w:tr>
+        <w:trPr>
+          <w:trHeight w:val="360" w:hRule="atLeast"/>
+        </w:trPr>
+        <w:tc>
+          <w:tcPr>
+            <w:tcW w:type="dxa" w:w="1440"/>
+            <w:vAlign w:val="center"/>
+            <w:tcBorders>
+              <w:top w:val="single" w:sz="6" w:color="B0B7C3"/>
+              <w:left w:val="single" w:sz="6" w:color="B0B7C3"/>
+              <w:bottom w:val="single" w:sz="6" w:color="B0B7C3"/>
+              <w:right w:val="single" w:sz="6" w:color="B0B7C3"/>
+            </w:tcBorders>
+            <w:shd w:fill="E6ECF4" w:val="clear"/>
+          </w:tcPr>
+          <w:p>
+            <w:pPr>
+              <w:spacing w:before="0" w:after="0"/>
+              <w:jc w:val="left"/>
+            </w:pPr>
+            <w:r/>
+            <w:r>
+              <w:rPr>
+                <w:b/>
+                <w:color w:val="1A1A1A"/>
+                <w:sz w:val="21"/>
+              </w:rPr>
+              <w:t>—</w:t>
+            </w:r>
+          </w:p>
+        </w:tc>
+        <w:tc>
+          <w:tcPr>
+            <w:tcW w:type="dxa" w:w="4608"/>
+            <w:vAlign w:val="center"/>
+            <w:tcBorders>
+              <w:top w:val="single" w:sz="6" w:color="B0B7C3"/>
+              <w:left w:val="single" w:sz="6" w:color="B0B7C3"/>
+              <w:bottom w:val="single" w:sz="6" w:color="B0B7C3"/>
+              <w:right w:val="single" w:sz="6" w:color="B0B7C3"/>
+            </w:tcBorders>
+            <w:shd w:fill="E6ECF4" w:val="clear"/>
+          </w:tcPr>
+          <w:p>
+            <w:pPr>
+              <w:spacing w:before="0" w:after="0"/>
+              <w:jc w:val="left"/>
+            </w:pPr>
+            <w:r/>
+            <w:r>
+              <w:rPr>
+                <w:b/>
+                <w:color w:val="1A1A1A"/>
+                <w:sz w:val="21"/>
+              </w:rPr>
+              <w:t>Not-excluded subtotal</w:t>
+            </w:r>
+          </w:p>
+        </w:tc>
+        <w:tc>
+          <w:tcPr>
+            <w:tcW w:type="dxa" w:w="1728"/>
+            <w:vAlign w:val="center"/>
+            <w:tcBorders>
+              <w:top w:val="single" w:sz="6" w:color="B0B7C3"/>
+              <w:left w:val="single" w:sz="6" w:color="B0B7C3"/>
+              <w:bottom w:val="single" w:sz="6" w:color="B0B7C3"/>
+              <w:right w:val="single" w:sz="6" w:color="B0B7C3"/>
+            </w:tcBorders>
+            <w:shd w:fill="E6ECF4" w:val="clear"/>
           </w:tcPr>
           <w:p>
             <w:pPr>
@@ -2660,14 +4133,98 @@
                 <w:color w:val="1A1A1A"/>
                 <w:sz w:val="21"/>
               </w:rPr>
-              <w:t>42,130</w:t>
+              <w:t>504,765</w:t>
+            </w:r>
+          </w:p>
+        </w:tc>
+        <w:tc>
+          <w:tcPr>
+            <w:tcW w:type="dxa" w:w="1872"/>
+            <w:vAlign w:val="center"/>
+            <w:tcBorders>
+              <w:top w:val="single" w:sz="6" w:color="B0B7C3"/>
+              <w:left w:val="single" w:sz="6" w:color="B0B7C3"/>
+              <w:bottom w:val="single" w:sz="6" w:color="B0B7C3"/>
+              <w:right w:val="single" w:sz="6" w:color="B0B7C3"/>
+            </w:tcBorders>
+            <w:shd w:fill="E6ECF4" w:val="clear"/>
+          </w:tcPr>
+          <w:p>
+            <w:pPr>
+              <w:spacing w:before="0" w:after="0"/>
+              <w:jc w:val="right"/>
+            </w:pPr>
+            <w:r/>
+            <w:r>
+              <w:rPr>
+                <w:b/>
+                <w:color w:val="1A1A1A"/>
+                <w:sz w:val="21"/>
+              </w:rPr>
+              <w:t>493,734</w:t>
+            </w:r>
+          </w:p>
+        </w:tc>
+        <w:tc>
+          <w:tcPr>
+            <w:tcW w:type="dxa" w:w="2016"/>
+            <w:vAlign w:val="center"/>
+            <w:tcBorders>
+              <w:top w:val="single" w:sz="6" w:color="B0B7C3"/>
+              <w:left w:val="single" w:sz="6" w:color="B0B7C3"/>
+              <w:bottom w:val="single" w:sz="6" w:color="B0B7C3"/>
+              <w:right w:val="single" w:sz="6" w:color="B0B7C3"/>
+            </w:tcBorders>
+            <w:shd w:fill="E6ECF4" w:val="clear"/>
+          </w:tcPr>
+          <w:p>
+            <w:pPr>
+              <w:spacing w:before="0" w:after="0"/>
+              <w:jc w:val="right"/>
+            </w:pPr>
+            <w:r/>
+            <w:r>
+              <w:rPr>
+                <w:b/>
+                <w:color w:val="1A1A1A"/>
+                <w:sz w:val="21"/>
+              </w:rPr>
+              <w:t>11,031</w:t>
+            </w:r>
+          </w:p>
+        </w:tc>
+        <w:tc>
+          <w:tcPr>
+            <w:tcW w:type="dxa" w:w="2160"/>
+            <w:vAlign w:val="center"/>
+            <w:tcBorders>
+              <w:top w:val="single" w:sz="6" w:color="B0B7C3"/>
+              <w:left w:val="single" w:sz="6" w:color="B0B7C3"/>
+              <w:bottom w:val="single" w:sz="6" w:color="B0B7C3"/>
+              <w:right w:val="single" w:sz="6" w:color="B0B7C3"/>
+            </w:tcBorders>
+            <w:shd w:fill="E6ECF4" w:val="clear"/>
+          </w:tcPr>
+          <w:p>
+            <w:pPr>
+              <w:spacing w:before="0" w:after="0"/>
+              <w:jc w:val="right"/>
+            </w:pPr>
+            <w:r/>
+            <w:r>
+              <w:rPr>
+                <w:b/>
+                <w:color w:val="1A1A1A"/>
+                <w:sz w:val="21"/>
+              </w:rPr>
+              <w:t>16,020,865</w:t>
             </w:r>
           </w:p>
         </w:tc>
       </w:tr>
       <w:tr>
         <w:trPr>
-          <w:trHeight w:val="400" w:hRule="atLeast"/>
+          <w:trHeight w:val="360" w:hRule="atLeast"/>
         </w:trPr>
         <w:tc>
           <w:tcPr>
@@ -2679,7 +4236,7 @@
               <w:bottom w:val="single" w:sz="6" w:color="B0B7C3"/>
               <w:right w:val="single" w:sz="6" w:color="B0B7C3"/>
             </w:tcBorders>
-            <w:shd w:fill="FDF3D3" w:val="clear"/>
+            <w:shd w:fill="E6ECF4" w:val="clear"/>
           </w:tcPr>
           <w:p>
             <w:pPr>
@@ -2689,7 +4246,7 @@
             <w:r/>
             <w:r>
               <w:rPr>
-                <w:b w:val="0"/>
+                <w:b/>
                 <w:color w:val="1A1A1A"/>
                 <w:sz w:val="21"/>
               </w:rPr>
@@ -2699,7 +4256,7 @@
         </w:tc>
         <w:tc>
           <w:tcPr>
-            <w:tcW w:type="dxa" w:w="4320"/>
+            <w:tcW w:type="dxa" w:w="4608"/>
             <w:vAlign w:val="center"/>
             <w:tcBorders>
               <w:top w:val="single" w:sz="6" w:color="B0B7C3"/>
@@ -2707,7 +4264,7 @@
               <w:bottom w:val="single" w:sz="6" w:color="B0B7C3"/>
               <w:right w:val="single" w:sz="6" w:color="B0B7C3"/>
             </w:tcBorders>
-            <w:shd w:fill="FDF3D3" w:val="clear"/>
+            <w:shd w:fill="E6ECF4" w:val="clear"/>
           </w:tcPr>
           <w:p>
             <w:pPr>
@@ -2727,7 +4284,7 @@
         </w:tc>
         <w:tc>
           <w:tcPr>
-            <w:tcW w:type="dxa" w:w="1872"/>
+            <w:tcW w:type="dxa" w:w="1728"/>
             <w:vAlign w:val="center"/>
             <w:tcBorders>
               <w:top w:val="single" w:sz="6" w:color="B0B7C3"/>
@@ -2735,7 +4292,7 @@
               <w:bottom w:val="single" w:sz="6" w:color="B0B7C3"/>
               <w:right w:val="single" w:sz="6" w:color="B0B7C3"/>
             </w:tcBorders>
-            <w:shd w:fill="FDF3D3" w:val="clear"/>
+            <w:shd w:fill="E6ECF4" w:val="clear"/>
           </w:tcPr>
           <w:p>
             <w:pPr>
@@ -2749,7 +4306,35 @@
                 <w:color w:val="1A1A1A"/>
                 <w:sz w:val="21"/>
               </w:rPr>
-              <w:t>28,453</w:t>
+              <w:t>554,765</w:t>
+            </w:r>
+          </w:p>
+        </w:tc>
+        <w:tc>
+          <w:tcPr>
+            <w:tcW w:type="dxa" w:w="1872"/>
+            <w:vAlign w:val="center"/>
+            <w:tcBorders>
+              <w:top w:val="single" w:sz="6" w:color="B0B7C3"/>
+              <w:left w:val="single" w:sz="6" w:color="B0B7C3"/>
+              <w:bottom w:val="single" w:sz="6" w:color="B0B7C3"/>
+              <w:right w:val="single" w:sz="6" w:color="B0B7C3"/>
+            </w:tcBorders>
+            <w:shd w:fill="E6ECF4" w:val="clear"/>
+          </w:tcPr>
+          <w:p>
+            <w:pPr>
+              <w:spacing w:before="0" w:after="0"/>
+              <w:jc w:val="right"/>
+            </w:pPr>
+            <w:r/>
+            <w:r>
+              <w:rPr>
+                <w:b/>
+                <w:color w:val="1A1A1A"/>
+                <w:sz w:val="21"/>
+              </w:rPr>
+              <w:t>542,391</w:t>
             </w:r>
           </w:p>
         </w:tc>
@@ -2763,7 +4348,7 @@
               <w:bottom w:val="single" w:sz="6" w:color="B0B7C3"/>
               <w:right w:val="single" w:sz="6" w:color="B0B7C3"/>
             </w:tcBorders>
-            <w:shd w:fill="FDF3D3" w:val="clear"/>
+            <w:shd w:fill="E6ECF4" w:val="clear"/>
           </w:tcPr>
           <w:p>
             <w:pPr>
@@ -2777,13 +4362,13 @@
                 <w:color w:val="1A1A1A"/>
                 <w:sz w:val="21"/>
               </w:rPr>
-              <w:t>27,338</w:t>
+              <w:t>12,374</w:t>
             </w:r>
           </w:p>
         </w:tc>
         <w:tc>
           <w:tcPr>
-            <w:tcW w:type="dxa" w:w="2016"/>
+            <w:tcW w:type="dxa" w:w="2160"/>
             <w:vAlign w:val="center"/>
             <w:tcBorders>
               <w:top w:val="single" w:sz="6" w:color="B0B7C3"/>
@@ -2791,7 +4376,7 @@
               <w:bottom w:val="single" w:sz="6" w:color="B0B7C3"/>
               <w:right w:val="single" w:sz="6" w:color="B0B7C3"/>
             </w:tcBorders>
-            <w:shd w:fill="FDF3D3" w:val="clear"/>
+            <w:shd w:fill="E6ECF4" w:val="clear"/>
           </w:tcPr>
           <w:p>
             <w:pPr>
@@ -2805,35 +4390,7 @@
                 <w:color w:val="1A1A1A"/>
                 <w:sz w:val="21"/>
               </w:rPr>
-              <w:t>1,115</w:t>
-            </w:r>
-          </w:p>
-        </w:tc>
-        <w:tc>
-          <w:tcPr>
-            <w:tcW w:type="dxa" w:w="2304"/>
-            <w:vAlign w:val="center"/>
-            <w:tcBorders>
-              <w:top w:val="single" w:sz="6" w:color="B0B7C3"/>
-              <w:left w:val="single" w:sz="6" w:color="B0B7C3"/>
-              <w:bottom w:val="single" w:sz="6" w:color="B0B7C3"/>
-              <w:right w:val="single" w:sz="6" w:color="B0B7C3"/>
-            </w:tcBorders>
-            <w:shd w:fill="FDF3D3" w:val="clear"/>
-          </w:tcPr>
-          <w:p>
-            <w:pPr>
-              <w:spacing w:before="0" w:after="0"/>
-              <w:jc w:val="right"/>
-            </w:pPr>
-            <w:r/>
-            <w:r>
-              <w:rPr>
-                <w:b/>
-                <w:color w:val="1A1A1A"/>
-                <w:sz w:val="21"/>
-              </w:rPr>
-              <w:t>620,527</w:t>
+              <w:t>17,028,786</w:t>
             </w:r>
           </w:p>
         </w:tc>
@@ -2841,7 +4398,7 @@
     </w:tbl>
     <w:sectPr>
       <w:pgSz w:w="15840" w:h="12240" w:orient="landscape"/>
-      <w:pgMar w:top="864" w:right="1080" w:bottom="864" w:left="1080" w:header="720" w:footer="720" w:gutter="0"/>
+      <w:pgMar w:top="792" w:right="1080" w:bottom="792" w:left="1080" w:header="720" w:footer="720" w:gutter="0"/>
       <w:cols w:space="720"/>
       <w:docGrid w:linePitch="360"/>
     </w:sectPr>

</xml_diff>

<commit_message>
Fix Table 1 excluded row and restore 25+ column in Table 2
Table 1: renamed columns from Eligible CMFs / Eligible Orders to
plain CMFs / Orders so the excluded row reads consistently. Renamed
"50+ (stays out)" to "Above 50 (excluded)". Total orders (1,752,777)
now shows in the Orders column instead of being hidden in Marginal.

Table 2: restored the three-bucket contact-count split (<10, 10–25,
25+) that was collapsed to just Eligible/Ineligible. Every row and
subtotal now shows all three CMF buckets plus total orders.

https://claude.ai/code/session_01PM89wz7vnfvW2NRaFUoooy
</commit_message>
<xml_diff>
--- a/Updating_SLV_Rules.docx
+++ b/Updating_SLV_Rules.docx
@@ -123,7 +123,7 @@
                 <w:color w:val="FFFFFF"/>
                 <w:sz w:val="21"/>
               </w:rPr>
-              <w:t>Eligible CMFs</w:t>
+              <w:t>CMFs</w:t>
             </w:r>
           </w:p>
         </w:tc>
@@ -151,7 +151,7 @@
                 <w:color w:val="FFFFFF"/>
                 <w:sz w:val="21"/>
               </w:rPr>
-              <w:t>% CMFs</w:t>
+              <w:t>% of CMFs</w:t>
             </w:r>
           </w:p>
         </w:tc>
@@ -179,7 +179,7 @@
                 <w:color w:val="FFFFFF"/>
                 <w:sz w:val="21"/>
               </w:rPr>
-              <w:t>Eligible Orders (cumulative)</w:t>
+              <w:t>Orders</w:t>
             </w:r>
           </w:p>
         </w:tc>
@@ -375,7 +375,7 @@
                 <w:color w:val="1A1A1A"/>
                 <w:sz w:val="21"/>
               </w:rPr>
-              <w:t>baseline</w:t>
+              <w:t>—</w:t>
             </w:r>
           </w:p>
         </w:tc>
@@ -1288,7 +1288,7 @@
                 <w:color w:val="1A1A1A"/>
                 <w:sz w:val="21"/>
               </w:rPr>
-              <w:t>50+ (stays out)</w:t>
+              <w:t>Above 50 (excluded)</w:t>
             </w:r>
           </w:p>
         </w:tc>
@@ -1372,7 +1372,7 @@
                 <w:color w:val="1A1A1A"/>
                 <w:sz w:val="21"/>
               </w:rPr>
-              <w:t>—</w:t>
+              <w:t>1,752,777</w:t>
             </w:r>
           </w:p>
         </w:tc>
@@ -1400,7 +1400,7 @@
                 <w:color w:val="1A1A1A"/>
                 <w:sz w:val="21"/>
               </w:rPr>
-              <w:t>1,752,777</w:t>
+              <w:t>—</w:t>
             </w:r>
           </w:p>
         </w:tc>
@@ -1455,7 +1455,7 @@
         <w:rPr>
           <w:sz w:val="22"/>
         </w:rPr>
-        <w:t>Every list code, split by whether its shipping locations already meet the contact-count rule (fewer than 10) or do not (10 or more). The highlighted rows are the list codes excluded from Shipping Location View.</w:t>
+        <w:t>Every list code, split by active-contact range (fewer than 10, 10–25, or 25 or more). The highlighted rows are the list codes excluded from Shipping Location View.</w:t>
       </w:r>
     </w:p>
     <w:tbl>
@@ -1465,12 +1465,13 @@
         <w:tblLook w:firstColumn="1" w:firstRow="1" w:lastColumn="0" w:lastRow="0" w:noHBand="0" w:noVBand="1" w:val="04A0"/>
       </w:tblPr>
       <w:tblGrid>
+        <w:gridCol w:w="1296"/>
+        <w:gridCol w:w="3888"/>
+        <w:gridCol w:w="1512"/>
         <w:gridCol w:w="1440"/>
-        <w:gridCol w:w="4608"/>
-        <w:gridCol w:w="1728"/>
-        <w:gridCol w:w="1872"/>
-        <w:gridCol w:w="2016"/>
-        <w:gridCol w:w="2160"/>
+        <w:gridCol w:w="1512"/>
+        <w:gridCol w:w="1440"/>
+        <w:gridCol w:w="1944"/>
       </w:tblGrid>
       <w:tr>
         <w:trPr>
@@ -1478,7 +1479,7 @@
         </w:trPr>
         <w:tc>
           <w:tcPr>
-            <w:tcW w:type="dxa" w:w="1440"/>
+            <w:tcW w:type="dxa" w:w="1296"/>
             <w:vAlign w:val="center"/>
             <w:tcBorders>
               <w:top w:val="single" w:sz="6" w:color="B0B7C3"/>
@@ -1506,7 +1507,7 @@
         </w:tc>
         <w:tc>
           <w:tcPr>
-            <w:tcW w:type="dxa" w:w="4608"/>
+            <w:tcW w:type="dxa" w:w="3888"/>
             <w:vAlign w:val="center"/>
             <w:tcBorders>
               <w:top w:val="single" w:sz="6" w:color="B0B7C3"/>
@@ -1534,7 +1535,7 @@
         </w:tc>
         <w:tc>
           <w:tcPr>
-            <w:tcW w:type="dxa" w:w="1728"/>
+            <w:tcW w:type="dxa" w:w="1512"/>
             <w:vAlign w:val="center"/>
             <w:tcBorders>
               <w:top w:val="single" w:sz="6" w:color="B0B7C3"/>
@@ -1562,7 +1563,7 @@
         </w:tc>
         <w:tc>
           <w:tcPr>
-            <w:tcW w:type="dxa" w:w="1872"/>
+            <w:tcW w:type="dxa" w:w="1440"/>
             <w:vAlign w:val="center"/>
             <w:tcBorders>
               <w:top w:val="single" w:sz="6" w:color="B0B7C3"/>
@@ -1584,13 +1585,13 @@
                 <w:color w:val="FFFFFF"/>
                 <w:sz w:val="21"/>
               </w:rPr>
-              <w:t>Eligible (&lt;10)</w:t>
+              <w:t>CMFs &lt;10</w:t>
             </w:r>
           </w:p>
         </w:tc>
         <w:tc>
           <w:tcPr>
-            <w:tcW w:type="dxa" w:w="2016"/>
+            <w:tcW w:type="dxa" w:w="1512"/>
             <w:vAlign w:val="center"/>
             <w:tcBorders>
               <w:top w:val="single" w:sz="6" w:color="B0B7C3"/>
@@ -1612,13 +1613,41 @@
                 <w:color w:val="FFFFFF"/>
                 <w:sz w:val="21"/>
               </w:rPr>
-              <w:t>Ineligible (10+)</w:t>
+              <w:t>CMFs 10–25</w:t>
             </w:r>
           </w:p>
         </w:tc>
         <w:tc>
           <w:tcPr>
-            <w:tcW w:type="dxa" w:w="2160"/>
+            <w:tcW w:type="dxa" w:w="1440"/>
+            <w:vAlign w:val="center"/>
+            <w:tcBorders>
+              <w:top w:val="single" w:sz="6" w:color="B0B7C3"/>
+              <w:left w:val="single" w:sz="6" w:color="B0B7C3"/>
+              <w:bottom w:val="single" w:sz="6" w:color="B0B7C3"/>
+              <w:right w:val="single" w:sz="6" w:color="B0B7C3"/>
+            </w:tcBorders>
+            <w:shd w:fill="2F4A7C" w:val="clear"/>
+          </w:tcPr>
+          <w:p>
+            <w:pPr>
+              <w:spacing w:before="0" w:after="0"/>
+              <w:jc w:val="right"/>
+            </w:pPr>
+            <w:r/>
+            <w:r>
+              <w:rPr>
+                <w:b/>
+                <w:color w:val="FFFFFF"/>
+                <w:sz w:val="21"/>
+              </w:rPr>
+              <w:t>CMFs 25+</w:t>
+            </w:r>
+          </w:p>
+        </w:tc>
+        <w:tc>
+          <w:tcPr>
+            <w:tcW w:type="dxa" w:w="1944"/>
             <w:vAlign w:val="center"/>
             <w:tcBorders>
               <w:top w:val="single" w:sz="6" w:color="B0B7C3"/>
@@ -1651,7 +1680,7 @@
         </w:trPr>
         <w:tc>
           <w:tcPr>
-            <w:tcW w:type="dxa" w:w="1440"/>
+            <w:tcW w:type="dxa" w:w="1296"/>
             <w:vAlign w:val="center"/>
             <w:tcBorders>
               <w:top w:val="single" w:sz="6" w:color="B0B7C3"/>
@@ -1679,7 +1708,7 @@
         </w:tc>
         <w:tc>
           <w:tcPr>
-            <w:tcW w:type="dxa" w:w="4608"/>
+            <w:tcW w:type="dxa" w:w="3888"/>
             <w:vAlign w:val="center"/>
             <w:tcBorders>
               <w:top w:val="single" w:sz="6" w:color="B0B7C3"/>
@@ -1707,7 +1736,7 @@
         </w:tc>
         <w:tc>
           <w:tcPr>
-            <w:tcW w:type="dxa" w:w="1728"/>
+            <w:tcW w:type="dxa" w:w="1512"/>
             <w:vAlign w:val="center"/>
             <w:tcBorders>
               <w:top w:val="single" w:sz="6" w:color="B0B7C3"/>
@@ -1735,7 +1764,7 @@
         </w:tc>
         <w:tc>
           <w:tcPr>
-            <w:tcW w:type="dxa" w:w="1872"/>
+            <w:tcW w:type="dxa" w:w="1440"/>
             <w:vAlign w:val="center"/>
             <w:tcBorders>
               <w:top w:val="single" w:sz="6" w:color="B0B7C3"/>
@@ -1763,7 +1792,7 @@
         </w:tc>
         <w:tc>
           <w:tcPr>
-            <w:tcW w:type="dxa" w:w="2016"/>
+            <w:tcW w:type="dxa" w:w="1512"/>
             <w:vAlign w:val="center"/>
             <w:tcBorders>
               <w:top w:val="single" w:sz="6" w:color="B0B7C3"/>
@@ -1785,13 +1814,41 @@
                 <w:color w:val="1A1A1A"/>
                 <w:sz w:val="21"/>
               </w:rPr>
-              <w:t>108</w:t>
+              <w:t>87</w:t>
             </w:r>
           </w:p>
         </w:tc>
         <w:tc>
           <w:tcPr>
-            <w:tcW w:type="dxa" w:w="2160"/>
+            <w:tcW w:type="dxa" w:w="1440"/>
+            <w:vAlign w:val="center"/>
+            <w:tcBorders>
+              <w:top w:val="single" w:sz="6" w:color="B0B7C3"/>
+              <w:left w:val="single" w:sz="6" w:color="B0B7C3"/>
+              <w:bottom w:val="single" w:sz="6" w:color="B0B7C3"/>
+              <w:right w:val="single" w:sz="6" w:color="B0B7C3"/>
+            </w:tcBorders>
+            <w:shd w:fill="FDF3D3" w:val="clear"/>
+          </w:tcPr>
+          <w:p>
+            <w:pPr>
+              <w:spacing w:before="0" w:after="0"/>
+              <w:jc w:val="right"/>
+            </w:pPr>
+            <w:r/>
+            <w:r>
+              <w:rPr>
+                <w:b w:val="0"/>
+                <w:color w:val="1A1A1A"/>
+                <w:sz w:val="21"/>
+              </w:rPr>
+              <w:t>21</w:t>
+            </w:r>
+          </w:p>
+        </w:tc>
+        <w:tc>
+          <w:tcPr>
+            <w:tcW w:type="dxa" w:w="1944"/>
             <w:vAlign w:val="center"/>
             <w:tcBorders>
               <w:top w:val="single" w:sz="6" w:color="B0B7C3"/>
@@ -1824,7 +1881,7 @@
         </w:trPr>
         <w:tc>
           <w:tcPr>
-            <w:tcW w:type="dxa" w:w="1440"/>
+            <w:tcW w:type="dxa" w:w="1296"/>
             <w:vAlign w:val="center"/>
             <w:tcBorders>
               <w:top w:val="single" w:sz="6" w:color="B0B7C3"/>
@@ -1852,7 +1909,7 @@
         </w:tc>
         <w:tc>
           <w:tcPr>
-            <w:tcW w:type="dxa" w:w="4608"/>
+            <w:tcW w:type="dxa" w:w="3888"/>
             <w:vAlign w:val="center"/>
             <w:tcBorders>
               <w:top w:val="single" w:sz="6" w:color="B0B7C3"/>
@@ -1880,7 +1937,7 @@
         </w:tc>
         <w:tc>
           <w:tcPr>
-            <w:tcW w:type="dxa" w:w="1728"/>
+            <w:tcW w:type="dxa" w:w="1512"/>
             <w:vAlign w:val="center"/>
             <w:tcBorders>
               <w:top w:val="single" w:sz="6" w:color="B0B7C3"/>
@@ -1908,7 +1965,7 @@
         </w:tc>
         <w:tc>
           <w:tcPr>
-            <w:tcW w:type="dxa" w:w="1872"/>
+            <w:tcW w:type="dxa" w:w="1440"/>
             <w:vAlign w:val="center"/>
             <w:tcBorders>
               <w:top w:val="single" w:sz="6" w:color="B0B7C3"/>
@@ -1936,7 +1993,7 @@
         </w:tc>
         <w:tc>
           <w:tcPr>
-            <w:tcW w:type="dxa" w:w="2016"/>
+            <w:tcW w:type="dxa" w:w="1512"/>
             <w:vAlign w:val="center"/>
             <w:tcBorders>
               <w:top w:val="single" w:sz="6" w:color="B0B7C3"/>
@@ -1964,7 +2021,35 @@
         </w:tc>
         <w:tc>
           <w:tcPr>
-            <w:tcW w:type="dxa" w:w="2160"/>
+            <w:tcW w:type="dxa" w:w="1440"/>
+            <w:vAlign w:val="center"/>
+            <w:tcBorders>
+              <w:top w:val="single" w:sz="6" w:color="B0B7C3"/>
+              <w:left w:val="single" w:sz="6" w:color="B0B7C3"/>
+              <w:bottom w:val="single" w:sz="6" w:color="B0B7C3"/>
+              <w:right w:val="single" w:sz="6" w:color="B0B7C3"/>
+            </w:tcBorders>
+            <w:shd w:fill="FDF3D3" w:val="clear"/>
+          </w:tcPr>
+          <w:p>
+            <w:pPr>
+              <w:spacing w:before="0" w:after="0"/>
+              <w:jc w:val="right"/>
+            </w:pPr>
+            <w:r/>
+            <w:r>
+              <w:rPr>
+                <w:b w:val="0"/>
+                <w:color w:val="1A1A1A"/>
+                <w:sz w:val="21"/>
+              </w:rPr>
+              <w:t>0</w:t>
+            </w:r>
+          </w:p>
+        </w:tc>
+        <w:tc>
+          <w:tcPr>
+            <w:tcW w:type="dxa" w:w="1944"/>
             <w:vAlign w:val="center"/>
             <w:tcBorders>
               <w:top w:val="single" w:sz="6" w:color="B0B7C3"/>
@@ -1997,7 +2082,7 @@
         </w:trPr>
         <w:tc>
           <w:tcPr>
-            <w:tcW w:type="dxa" w:w="1440"/>
+            <w:tcW w:type="dxa" w:w="1296"/>
             <w:vAlign w:val="center"/>
             <w:tcBorders>
               <w:top w:val="single" w:sz="6" w:color="B0B7C3"/>
@@ -2025,7 +2110,7 @@
         </w:tc>
         <w:tc>
           <w:tcPr>
-            <w:tcW w:type="dxa" w:w="4608"/>
+            <w:tcW w:type="dxa" w:w="3888"/>
             <w:vAlign w:val="center"/>
             <w:tcBorders>
               <w:top w:val="single" w:sz="6" w:color="B0B7C3"/>
@@ -2053,7 +2138,7 @@
         </w:tc>
         <w:tc>
           <w:tcPr>
-            <w:tcW w:type="dxa" w:w="1728"/>
+            <w:tcW w:type="dxa" w:w="1512"/>
             <w:vAlign w:val="center"/>
             <w:tcBorders>
               <w:top w:val="single" w:sz="6" w:color="B0B7C3"/>
@@ -2081,7 +2166,7 @@
         </w:tc>
         <w:tc>
           <w:tcPr>
-            <w:tcW w:type="dxa" w:w="1872"/>
+            <w:tcW w:type="dxa" w:w="1440"/>
             <w:vAlign w:val="center"/>
             <w:tcBorders>
               <w:top w:val="single" w:sz="6" w:color="B0B7C3"/>
@@ -2109,7 +2194,7 @@
         </w:tc>
         <w:tc>
           <w:tcPr>
-            <w:tcW w:type="dxa" w:w="2016"/>
+            <w:tcW w:type="dxa" w:w="1512"/>
             <w:vAlign w:val="center"/>
             <w:tcBorders>
               <w:top w:val="single" w:sz="6" w:color="B0B7C3"/>
@@ -2131,13 +2216,41 @@
                 <w:color w:val="1A1A1A"/>
                 <w:sz w:val="21"/>
               </w:rPr>
-              <w:t>516</w:t>
+              <w:t>382</w:t>
             </w:r>
           </w:p>
         </w:tc>
         <w:tc>
           <w:tcPr>
-            <w:tcW w:type="dxa" w:w="2160"/>
+            <w:tcW w:type="dxa" w:w="1440"/>
+            <w:vAlign w:val="center"/>
+            <w:tcBorders>
+              <w:top w:val="single" w:sz="6" w:color="B0B7C3"/>
+              <w:left w:val="single" w:sz="6" w:color="B0B7C3"/>
+              <w:bottom w:val="single" w:sz="6" w:color="B0B7C3"/>
+              <w:right w:val="single" w:sz="6" w:color="B0B7C3"/>
+            </w:tcBorders>
+            <w:shd w:fill="FDF3D3" w:val="clear"/>
+          </w:tcPr>
+          <w:p>
+            <w:pPr>
+              <w:spacing w:before="0" w:after="0"/>
+              <w:jc w:val="right"/>
+            </w:pPr>
+            <w:r/>
+            <w:r>
+              <w:rPr>
+                <w:b w:val="0"/>
+                <w:color w:val="1A1A1A"/>
+                <w:sz w:val="21"/>
+              </w:rPr>
+              <w:t>134</w:t>
+            </w:r>
+          </w:p>
+        </w:tc>
+        <w:tc>
+          <w:tcPr>
+            <w:tcW w:type="dxa" w:w="1944"/>
             <w:vAlign w:val="center"/>
             <w:tcBorders>
               <w:top w:val="single" w:sz="6" w:color="B0B7C3"/>
@@ -2170,7 +2283,7 @@
         </w:trPr>
         <w:tc>
           <w:tcPr>
-            <w:tcW w:type="dxa" w:w="1440"/>
+            <w:tcW w:type="dxa" w:w="1296"/>
             <w:vAlign w:val="center"/>
             <w:tcBorders>
               <w:top w:val="single" w:sz="6" w:color="B0B7C3"/>
@@ -2198,7 +2311,7 @@
         </w:tc>
         <w:tc>
           <w:tcPr>
-            <w:tcW w:type="dxa" w:w="4608"/>
+            <w:tcW w:type="dxa" w:w="3888"/>
             <w:vAlign w:val="center"/>
             <w:tcBorders>
               <w:top w:val="single" w:sz="6" w:color="B0B7C3"/>
@@ -2226,7 +2339,7 @@
         </w:tc>
         <w:tc>
           <w:tcPr>
-            <w:tcW w:type="dxa" w:w="1728"/>
+            <w:tcW w:type="dxa" w:w="1512"/>
             <w:vAlign w:val="center"/>
             <w:tcBorders>
               <w:top w:val="single" w:sz="6" w:color="B0B7C3"/>
@@ -2254,7 +2367,7 @@
         </w:tc>
         <w:tc>
           <w:tcPr>
-            <w:tcW w:type="dxa" w:w="1872"/>
+            <w:tcW w:type="dxa" w:w="1440"/>
             <w:vAlign w:val="center"/>
             <w:tcBorders>
               <w:top w:val="single" w:sz="6" w:color="B0B7C3"/>
@@ -2282,7 +2395,7 @@
         </w:tc>
         <w:tc>
           <w:tcPr>
-            <w:tcW w:type="dxa" w:w="2016"/>
+            <w:tcW w:type="dxa" w:w="1512"/>
             <w:vAlign w:val="center"/>
             <w:tcBorders>
               <w:top w:val="single" w:sz="6" w:color="B0B7C3"/>
@@ -2304,13 +2417,41 @@
                 <w:color w:val="1A1A1A"/>
                 <w:sz w:val="21"/>
               </w:rPr>
-              <w:t>222</w:t>
+              <w:t>176</w:t>
             </w:r>
           </w:p>
         </w:tc>
         <w:tc>
           <w:tcPr>
-            <w:tcW w:type="dxa" w:w="2160"/>
+            <w:tcW w:type="dxa" w:w="1440"/>
+            <w:vAlign w:val="center"/>
+            <w:tcBorders>
+              <w:top w:val="single" w:sz="6" w:color="B0B7C3"/>
+              <w:left w:val="single" w:sz="6" w:color="B0B7C3"/>
+              <w:bottom w:val="single" w:sz="6" w:color="B0B7C3"/>
+              <w:right w:val="single" w:sz="6" w:color="B0B7C3"/>
+            </w:tcBorders>
+            <w:shd w:fill="FDF3D3" w:val="clear"/>
+          </w:tcPr>
+          <w:p>
+            <w:pPr>
+              <w:spacing w:before="0" w:after="0"/>
+              <w:jc w:val="right"/>
+            </w:pPr>
+            <w:r/>
+            <w:r>
+              <w:rPr>
+                <w:b w:val="0"/>
+                <w:color w:val="1A1A1A"/>
+                <w:sz w:val="21"/>
+              </w:rPr>
+              <w:t>46</w:t>
+            </w:r>
+          </w:p>
+        </w:tc>
+        <w:tc>
+          <w:tcPr>
+            <w:tcW w:type="dxa" w:w="1944"/>
             <w:vAlign w:val="center"/>
             <w:tcBorders>
               <w:top w:val="single" w:sz="6" w:color="B0B7C3"/>
@@ -2343,7 +2484,7 @@
         </w:trPr>
         <w:tc>
           <w:tcPr>
-            <w:tcW w:type="dxa" w:w="1440"/>
+            <w:tcW w:type="dxa" w:w="1296"/>
             <w:vAlign w:val="center"/>
             <w:tcBorders>
               <w:top w:val="single" w:sz="6" w:color="B0B7C3"/>
@@ -2371,7 +2512,7 @@
         </w:tc>
         <w:tc>
           <w:tcPr>
-            <w:tcW w:type="dxa" w:w="4608"/>
+            <w:tcW w:type="dxa" w:w="3888"/>
             <w:vAlign w:val="center"/>
             <w:tcBorders>
               <w:top w:val="single" w:sz="6" w:color="B0B7C3"/>
@@ -2399,7 +2540,7 @@
         </w:tc>
         <w:tc>
           <w:tcPr>
-            <w:tcW w:type="dxa" w:w="1728"/>
+            <w:tcW w:type="dxa" w:w="1512"/>
             <w:vAlign w:val="center"/>
             <w:tcBorders>
               <w:top w:val="single" w:sz="6" w:color="B0B7C3"/>
@@ -2427,7 +2568,7 @@
         </w:tc>
         <w:tc>
           <w:tcPr>
-            <w:tcW w:type="dxa" w:w="1872"/>
+            <w:tcW w:type="dxa" w:w="1440"/>
             <w:vAlign w:val="center"/>
             <w:tcBorders>
               <w:top w:val="single" w:sz="6" w:color="B0B7C3"/>
@@ -2455,7 +2596,7 @@
         </w:tc>
         <w:tc>
           <w:tcPr>
-            <w:tcW w:type="dxa" w:w="2016"/>
+            <w:tcW w:type="dxa" w:w="1512"/>
             <w:vAlign w:val="center"/>
             <w:tcBorders>
               <w:top w:val="single" w:sz="6" w:color="B0B7C3"/>
@@ -2477,13 +2618,41 @@
                 <w:color w:val="1A1A1A"/>
                 <w:sz w:val="21"/>
               </w:rPr>
-              <w:t>263</w:t>
+              <w:t>171</w:t>
             </w:r>
           </w:p>
         </w:tc>
         <w:tc>
           <w:tcPr>
-            <w:tcW w:type="dxa" w:w="2160"/>
+            <w:tcW w:type="dxa" w:w="1440"/>
+            <w:vAlign w:val="center"/>
+            <w:tcBorders>
+              <w:top w:val="single" w:sz="6" w:color="B0B7C3"/>
+              <w:left w:val="single" w:sz="6" w:color="B0B7C3"/>
+              <w:bottom w:val="single" w:sz="6" w:color="B0B7C3"/>
+              <w:right w:val="single" w:sz="6" w:color="B0B7C3"/>
+            </w:tcBorders>
+            <w:shd w:fill="FDF3D3" w:val="clear"/>
+          </w:tcPr>
+          <w:p>
+            <w:pPr>
+              <w:spacing w:before="0" w:after="0"/>
+              <w:jc w:val="right"/>
+            </w:pPr>
+            <w:r/>
+            <w:r>
+              <w:rPr>
+                <w:b w:val="0"/>
+                <w:color w:val="1A1A1A"/>
+                <w:sz w:val="21"/>
+              </w:rPr>
+              <w:t>92</w:t>
+            </w:r>
+          </w:p>
+        </w:tc>
+        <w:tc>
+          <w:tcPr>
+            <w:tcW w:type="dxa" w:w="1944"/>
             <w:vAlign w:val="center"/>
             <w:tcBorders>
               <w:top w:val="single" w:sz="6" w:color="B0B7C3"/>
@@ -2516,7 +2685,7 @@
         </w:trPr>
         <w:tc>
           <w:tcPr>
-            <w:tcW w:type="dxa" w:w="1440"/>
+            <w:tcW w:type="dxa" w:w="1296"/>
             <w:vAlign w:val="center"/>
             <w:tcBorders>
               <w:top w:val="single" w:sz="6" w:color="B0B7C3"/>
@@ -2544,7 +2713,7 @@
         </w:tc>
         <w:tc>
           <w:tcPr>
-            <w:tcW w:type="dxa" w:w="4608"/>
+            <w:tcW w:type="dxa" w:w="3888"/>
             <w:vAlign w:val="center"/>
             <w:tcBorders>
               <w:top w:val="single" w:sz="6" w:color="B0B7C3"/>
@@ -2572,7 +2741,7 @@
         </w:tc>
         <w:tc>
           <w:tcPr>
-            <w:tcW w:type="dxa" w:w="1728"/>
+            <w:tcW w:type="dxa" w:w="1512"/>
             <w:vAlign w:val="center"/>
             <w:tcBorders>
               <w:top w:val="single" w:sz="6" w:color="B0B7C3"/>
@@ -2600,7 +2769,7 @@
         </w:tc>
         <w:tc>
           <w:tcPr>
-            <w:tcW w:type="dxa" w:w="1872"/>
+            <w:tcW w:type="dxa" w:w="1440"/>
             <w:vAlign w:val="center"/>
             <w:tcBorders>
               <w:top w:val="single" w:sz="6" w:color="B0B7C3"/>
@@ -2628,7 +2797,35 @@
         </w:tc>
         <w:tc>
           <w:tcPr>
-            <w:tcW w:type="dxa" w:w="2016"/>
+            <w:tcW w:type="dxa" w:w="1512"/>
+            <w:vAlign w:val="center"/>
+            <w:tcBorders>
+              <w:top w:val="single" w:sz="6" w:color="B0B7C3"/>
+              <w:left w:val="single" w:sz="6" w:color="B0B7C3"/>
+              <w:bottom w:val="single" w:sz="6" w:color="B0B7C3"/>
+              <w:right w:val="single" w:sz="6" w:color="B0B7C3"/>
+            </w:tcBorders>
+            <w:shd w:fill="FDF3D3" w:val="clear"/>
+          </w:tcPr>
+          <w:p>
+            <w:pPr>
+              <w:spacing w:before="0" w:after="0"/>
+              <w:jc w:val="right"/>
+            </w:pPr>
+            <w:r/>
+            <w:r>
+              <w:rPr>
+                <w:b w:val="0"/>
+                <w:color w:val="1A1A1A"/>
+                <w:sz w:val="21"/>
+              </w:rPr>
+              <w:t>0</w:t>
+            </w:r>
+          </w:p>
+        </w:tc>
+        <w:tc>
+          <w:tcPr>
+            <w:tcW w:type="dxa" w:w="1440"/>
             <w:vAlign w:val="center"/>
             <w:tcBorders>
               <w:top w:val="single" w:sz="6" w:color="B0B7C3"/>
@@ -2656,7 +2853,7 @@
         </w:tc>
         <w:tc>
           <w:tcPr>
-            <w:tcW w:type="dxa" w:w="2160"/>
+            <w:tcW w:type="dxa" w:w="1944"/>
             <w:vAlign w:val="center"/>
             <w:tcBorders>
               <w:top w:val="single" w:sz="6" w:color="B0B7C3"/>
@@ -2689,7 +2886,7 @@
         </w:trPr>
         <w:tc>
           <w:tcPr>
-            <w:tcW w:type="dxa" w:w="1440"/>
+            <w:tcW w:type="dxa" w:w="1296"/>
             <w:vAlign w:val="center"/>
             <w:tcBorders>
               <w:top w:val="single" w:sz="6" w:color="B0B7C3"/>
@@ -2717,7 +2914,7 @@
         </w:tc>
         <w:tc>
           <w:tcPr>
-            <w:tcW w:type="dxa" w:w="4608"/>
+            <w:tcW w:type="dxa" w:w="3888"/>
             <w:vAlign w:val="center"/>
             <w:tcBorders>
               <w:top w:val="single" w:sz="6" w:color="B0B7C3"/>
@@ -2745,7 +2942,7 @@
         </w:tc>
         <w:tc>
           <w:tcPr>
-            <w:tcW w:type="dxa" w:w="1728"/>
+            <w:tcW w:type="dxa" w:w="1512"/>
             <w:vAlign w:val="center"/>
             <w:tcBorders>
               <w:top w:val="single" w:sz="6" w:color="B0B7C3"/>
@@ -2773,7 +2970,7 @@
         </w:tc>
         <w:tc>
           <w:tcPr>
-            <w:tcW w:type="dxa" w:w="1872"/>
+            <w:tcW w:type="dxa" w:w="1440"/>
             <w:vAlign w:val="center"/>
             <w:tcBorders>
               <w:top w:val="single" w:sz="6" w:color="B0B7C3"/>
@@ -2801,7 +2998,7 @@
         </w:tc>
         <w:tc>
           <w:tcPr>
-            <w:tcW w:type="dxa" w:w="2016"/>
+            <w:tcW w:type="dxa" w:w="1512"/>
             <w:vAlign w:val="center"/>
             <w:tcBorders>
               <w:top w:val="single" w:sz="6" w:color="B0B7C3"/>
@@ -2823,13 +3020,41 @@
                 <w:color w:val="1A1A1A"/>
                 <w:sz w:val="21"/>
               </w:rPr>
-              <w:t>228</w:t>
+              <w:t>211</w:t>
             </w:r>
           </w:p>
         </w:tc>
         <w:tc>
           <w:tcPr>
-            <w:tcW w:type="dxa" w:w="2160"/>
+            <w:tcW w:type="dxa" w:w="1440"/>
+            <w:vAlign w:val="center"/>
+            <w:tcBorders>
+              <w:top w:val="single" w:sz="6" w:color="B0B7C3"/>
+              <w:left w:val="single" w:sz="6" w:color="B0B7C3"/>
+              <w:bottom w:val="single" w:sz="6" w:color="B0B7C3"/>
+              <w:right w:val="single" w:sz="6" w:color="B0B7C3"/>
+            </w:tcBorders>
+            <w:shd w:fill="FDF3D3" w:val="clear"/>
+          </w:tcPr>
+          <w:p>
+            <w:pPr>
+              <w:spacing w:before="0" w:after="0"/>
+              <w:jc w:val="right"/>
+            </w:pPr>
+            <w:r/>
+            <w:r>
+              <w:rPr>
+                <w:b w:val="0"/>
+                <w:color w:val="1A1A1A"/>
+                <w:sz w:val="21"/>
+              </w:rPr>
+              <w:t>17</w:t>
+            </w:r>
+          </w:p>
+        </w:tc>
+        <w:tc>
+          <w:tcPr>
+            <w:tcW w:type="dxa" w:w="1944"/>
             <w:vAlign w:val="center"/>
             <w:tcBorders>
               <w:top w:val="single" w:sz="6" w:color="B0B7C3"/>
@@ -2862,7 +3087,7 @@
         </w:trPr>
         <w:tc>
           <w:tcPr>
-            <w:tcW w:type="dxa" w:w="1440"/>
+            <w:tcW w:type="dxa" w:w="1296"/>
             <w:vAlign w:val="center"/>
             <w:tcBorders>
               <w:top w:val="single" w:sz="6" w:color="B0B7C3"/>
@@ -2890,7 +3115,7 @@
         </w:tc>
         <w:tc>
           <w:tcPr>
-            <w:tcW w:type="dxa" w:w="4608"/>
+            <w:tcW w:type="dxa" w:w="3888"/>
             <w:vAlign w:val="center"/>
             <w:tcBorders>
               <w:top w:val="single" w:sz="6" w:color="B0B7C3"/>
@@ -2918,7 +3143,7 @@
         </w:tc>
         <w:tc>
           <w:tcPr>
-            <w:tcW w:type="dxa" w:w="1728"/>
+            <w:tcW w:type="dxa" w:w="1512"/>
             <w:vAlign w:val="center"/>
             <w:tcBorders>
               <w:top w:val="single" w:sz="6" w:color="B0B7C3"/>
@@ -2946,7 +3171,7 @@
         </w:tc>
         <w:tc>
           <w:tcPr>
-            <w:tcW w:type="dxa" w:w="1872"/>
+            <w:tcW w:type="dxa" w:w="1440"/>
             <w:vAlign w:val="center"/>
             <w:tcBorders>
               <w:top w:val="single" w:sz="6" w:color="B0B7C3"/>
@@ -2974,7 +3199,7 @@
         </w:tc>
         <w:tc>
           <w:tcPr>
-            <w:tcW w:type="dxa" w:w="2016"/>
+            <w:tcW w:type="dxa" w:w="1512"/>
             <w:vAlign w:val="center"/>
             <w:tcBorders>
               <w:top w:val="single" w:sz="6" w:color="B0B7C3"/>
@@ -2996,13 +3221,41 @@
                 <w:color w:val="1A1A1A"/>
                 <w:sz w:val="21"/>
               </w:rPr>
-              <w:t>1,343</w:t>
+              <w:t>1,028</w:t>
             </w:r>
           </w:p>
         </w:tc>
         <w:tc>
           <w:tcPr>
-            <w:tcW w:type="dxa" w:w="2160"/>
+            <w:tcW w:type="dxa" w:w="1440"/>
+            <w:vAlign w:val="center"/>
+            <w:tcBorders>
+              <w:top w:val="single" w:sz="6" w:color="B0B7C3"/>
+              <w:left w:val="single" w:sz="6" w:color="B0B7C3"/>
+              <w:bottom w:val="single" w:sz="6" w:color="B0B7C3"/>
+              <w:right w:val="single" w:sz="6" w:color="B0B7C3"/>
+            </w:tcBorders>
+            <w:shd w:fill="FDF3D3" w:val="clear"/>
+          </w:tcPr>
+          <w:p>
+            <w:pPr>
+              <w:spacing w:before="0" w:after="0"/>
+              <w:jc w:val="right"/>
+            </w:pPr>
+            <w:r/>
+            <w:r>
+              <w:rPr>
+                <w:b/>
+                <w:color w:val="1A1A1A"/>
+                <w:sz w:val="21"/>
+              </w:rPr>
+              <w:t>315</w:t>
+            </w:r>
+          </w:p>
+        </w:tc>
+        <w:tc>
+          <w:tcPr>
+            <w:tcW w:type="dxa" w:w="1944"/>
             <w:vAlign w:val="center"/>
             <w:tcBorders>
               <w:top w:val="single" w:sz="6" w:color="B0B7C3"/>
@@ -3035,7 +3288,7 @@
         </w:trPr>
         <w:tc>
           <w:tcPr>
-            <w:tcW w:type="dxa" w:w="1440"/>
+            <w:tcW w:type="dxa" w:w="1296"/>
             <w:vAlign w:val="center"/>
             <w:tcBorders>
               <w:top w:val="single" w:sz="6" w:color="B0B7C3"/>
@@ -3062,7 +3315,7 @@
         </w:tc>
         <w:tc>
           <w:tcPr>
-            <w:tcW w:type="dxa" w:w="4608"/>
+            <w:tcW w:type="dxa" w:w="3888"/>
             <w:vAlign w:val="center"/>
             <w:tcBorders>
               <w:top w:val="single" w:sz="6" w:color="B0B7C3"/>
@@ -3089,7 +3342,7 @@
         </w:tc>
         <w:tc>
           <w:tcPr>
-            <w:tcW w:type="dxa" w:w="1728"/>
+            <w:tcW w:type="dxa" w:w="1512"/>
             <w:vAlign w:val="center"/>
             <w:tcBorders>
               <w:top w:val="single" w:sz="6" w:color="B0B7C3"/>
@@ -3116,7 +3369,7 @@
         </w:tc>
         <w:tc>
           <w:tcPr>
-            <w:tcW w:type="dxa" w:w="1872"/>
+            <w:tcW w:type="dxa" w:w="1440"/>
             <w:vAlign w:val="center"/>
             <w:tcBorders>
               <w:top w:val="single" w:sz="6" w:color="B0B7C3"/>
@@ -3143,7 +3396,7 @@
         </w:tc>
         <w:tc>
           <w:tcPr>
-            <w:tcW w:type="dxa" w:w="2016"/>
+            <w:tcW w:type="dxa" w:w="1512"/>
             <w:vAlign w:val="center"/>
             <w:tcBorders>
               <w:top w:val="single" w:sz="6" w:color="B0B7C3"/>
@@ -3164,13 +3417,40 @@
                 <w:color w:val="1A1A1A"/>
                 <w:sz w:val="21"/>
               </w:rPr>
-              <w:t>9,699</w:t>
+              <w:t>7,883</w:t>
             </w:r>
           </w:p>
         </w:tc>
         <w:tc>
           <w:tcPr>
-            <w:tcW w:type="dxa" w:w="2160"/>
+            <w:tcW w:type="dxa" w:w="1440"/>
+            <w:vAlign w:val="center"/>
+            <w:tcBorders>
+              <w:top w:val="single" w:sz="6" w:color="B0B7C3"/>
+              <w:left w:val="single" w:sz="6" w:color="B0B7C3"/>
+              <w:bottom w:val="single" w:sz="6" w:color="B0B7C3"/>
+              <w:right w:val="single" w:sz="6" w:color="B0B7C3"/>
+            </w:tcBorders>
+          </w:tcPr>
+          <w:p>
+            <w:pPr>
+              <w:spacing w:before="0" w:after="0"/>
+              <w:jc w:val="right"/>
+            </w:pPr>
+            <w:r/>
+            <w:r>
+              <w:rPr>
+                <w:b w:val="0"/>
+                <w:color w:val="1A1A1A"/>
+                <w:sz w:val="21"/>
+              </w:rPr>
+              <w:t>1,816</w:t>
+            </w:r>
+          </w:p>
+        </w:tc>
+        <w:tc>
+          <w:tcPr>
+            <w:tcW w:type="dxa" w:w="1944"/>
             <w:vAlign w:val="center"/>
             <w:tcBorders>
               <w:top w:val="single" w:sz="6" w:color="B0B7C3"/>
@@ -3202,7 +3482,7 @@
         </w:trPr>
         <w:tc>
           <w:tcPr>
-            <w:tcW w:type="dxa" w:w="1440"/>
+            <w:tcW w:type="dxa" w:w="1296"/>
             <w:vAlign w:val="center"/>
             <w:tcBorders>
               <w:top w:val="single" w:sz="6" w:color="B0B7C3"/>
@@ -3230,7 +3510,7 @@
         </w:tc>
         <w:tc>
           <w:tcPr>
-            <w:tcW w:type="dxa" w:w="4608"/>
+            <w:tcW w:type="dxa" w:w="3888"/>
             <w:vAlign w:val="center"/>
             <w:tcBorders>
               <w:top w:val="single" w:sz="6" w:color="B0B7C3"/>
@@ -3258,7 +3538,7 @@
         </w:tc>
         <w:tc>
           <w:tcPr>
-            <w:tcW w:type="dxa" w:w="1728"/>
+            <w:tcW w:type="dxa" w:w="1512"/>
             <w:vAlign w:val="center"/>
             <w:tcBorders>
               <w:top w:val="single" w:sz="6" w:color="B0B7C3"/>
@@ -3286,7 +3566,7 @@
         </w:tc>
         <w:tc>
           <w:tcPr>
-            <w:tcW w:type="dxa" w:w="1872"/>
+            <w:tcW w:type="dxa" w:w="1440"/>
             <w:vAlign w:val="center"/>
             <w:tcBorders>
               <w:top w:val="single" w:sz="6" w:color="B0B7C3"/>
@@ -3314,7 +3594,7 @@
         </w:tc>
         <w:tc>
           <w:tcPr>
-            <w:tcW w:type="dxa" w:w="2016"/>
+            <w:tcW w:type="dxa" w:w="1512"/>
             <w:vAlign w:val="center"/>
             <w:tcBorders>
               <w:top w:val="single" w:sz="6" w:color="B0B7C3"/>
@@ -3336,13 +3616,41 @@
                 <w:color w:val="1A1A1A"/>
                 <w:sz w:val="21"/>
               </w:rPr>
-              <w:t>25</w:t>
+              <w:t>10</w:t>
             </w:r>
           </w:p>
         </w:tc>
         <w:tc>
           <w:tcPr>
-            <w:tcW w:type="dxa" w:w="2160"/>
+            <w:tcW w:type="dxa" w:w="1440"/>
+            <w:vAlign w:val="center"/>
+            <w:tcBorders>
+              <w:top w:val="single" w:sz="6" w:color="B0B7C3"/>
+              <w:left w:val="single" w:sz="6" w:color="B0B7C3"/>
+              <w:bottom w:val="single" w:sz="6" w:color="B0B7C3"/>
+              <w:right w:val="single" w:sz="6" w:color="B0B7C3"/>
+            </w:tcBorders>
+            <w:shd w:fill="F6F7FA" w:val="clear"/>
+          </w:tcPr>
+          <w:p>
+            <w:pPr>
+              <w:spacing w:before="0" w:after="0"/>
+              <w:jc w:val="right"/>
+            </w:pPr>
+            <w:r/>
+            <w:r>
+              <w:rPr>
+                <w:b w:val="0"/>
+                <w:color w:val="1A1A1A"/>
+                <w:sz w:val="21"/>
+              </w:rPr>
+              <w:t>15</w:t>
+            </w:r>
+          </w:p>
+        </w:tc>
+        <w:tc>
+          <w:tcPr>
+            <w:tcW w:type="dxa" w:w="1944"/>
             <w:vAlign w:val="center"/>
             <w:tcBorders>
               <w:top w:val="single" w:sz="6" w:color="B0B7C3"/>
@@ -3375,7 +3683,7 @@
         </w:trPr>
         <w:tc>
           <w:tcPr>
-            <w:tcW w:type="dxa" w:w="1440"/>
+            <w:tcW w:type="dxa" w:w="1296"/>
             <w:vAlign w:val="center"/>
             <w:tcBorders>
               <w:top w:val="single" w:sz="6" w:color="B0B7C3"/>
@@ -3402,7 +3710,7 @@
         </w:tc>
         <w:tc>
           <w:tcPr>
-            <w:tcW w:type="dxa" w:w="4608"/>
+            <w:tcW w:type="dxa" w:w="3888"/>
             <w:vAlign w:val="center"/>
             <w:tcBorders>
               <w:top w:val="single" w:sz="6" w:color="B0B7C3"/>
@@ -3429,7 +3737,7 @@
         </w:tc>
         <w:tc>
           <w:tcPr>
-            <w:tcW w:type="dxa" w:w="1728"/>
+            <w:tcW w:type="dxa" w:w="1512"/>
             <w:vAlign w:val="center"/>
             <w:tcBorders>
               <w:top w:val="single" w:sz="6" w:color="B0B7C3"/>
@@ -3456,7 +3764,7 @@
         </w:tc>
         <w:tc>
           <w:tcPr>
-            <w:tcW w:type="dxa" w:w="1872"/>
+            <w:tcW w:type="dxa" w:w="1440"/>
             <w:vAlign w:val="center"/>
             <w:tcBorders>
               <w:top w:val="single" w:sz="6" w:color="B0B7C3"/>
@@ -3483,7 +3791,7 @@
         </w:tc>
         <w:tc>
           <w:tcPr>
-            <w:tcW w:type="dxa" w:w="2016"/>
+            <w:tcW w:type="dxa" w:w="1512"/>
             <w:vAlign w:val="center"/>
             <w:tcBorders>
               <w:top w:val="single" w:sz="6" w:color="B0B7C3"/>
@@ -3504,13 +3812,40 @@
                 <w:color w:val="1A1A1A"/>
                 <w:sz w:val="21"/>
               </w:rPr>
-              <w:t>1,057</w:t>
+              <w:t>908</w:t>
             </w:r>
           </w:p>
         </w:tc>
         <w:tc>
           <w:tcPr>
-            <w:tcW w:type="dxa" w:w="2160"/>
+            <w:tcW w:type="dxa" w:w="1440"/>
+            <w:vAlign w:val="center"/>
+            <w:tcBorders>
+              <w:top w:val="single" w:sz="6" w:color="B0B7C3"/>
+              <w:left w:val="single" w:sz="6" w:color="B0B7C3"/>
+              <w:bottom w:val="single" w:sz="6" w:color="B0B7C3"/>
+              <w:right w:val="single" w:sz="6" w:color="B0B7C3"/>
+            </w:tcBorders>
+          </w:tcPr>
+          <w:p>
+            <w:pPr>
+              <w:spacing w:before="0" w:after="0"/>
+              <w:jc w:val="right"/>
+            </w:pPr>
+            <w:r/>
+            <w:r>
+              <w:rPr>
+                <w:b w:val="0"/>
+                <w:color w:val="1A1A1A"/>
+                <w:sz w:val="21"/>
+              </w:rPr>
+              <w:t>149</w:t>
+            </w:r>
+          </w:p>
+        </w:tc>
+        <w:tc>
+          <w:tcPr>
+            <w:tcW w:type="dxa" w:w="1944"/>
             <w:vAlign w:val="center"/>
             <w:tcBorders>
               <w:top w:val="single" w:sz="6" w:color="B0B7C3"/>
@@ -3542,7 +3877,7 @@
         </w:trPr>
         <w:tc>
           <w:tcPr>
-            <w:tcW w:type="dxa" w:w="1440"/>
+            <w:tcW w:type="dxa" w:w="1296"/>
             <w:vAlign w:val="center"/>
             <w:tcBorders>
               <w:top w:val="single" w:sz="6" w:color="B0B7C3"/>
@@ -3570,7 +3905,7 @@
         </w:tc>
         <w:tc>
           <w:tcPr>
-            <w:tcW w:type="dxa" w:w="4608"/>
+            <w:tcW w:type="dxa" w:w="3888"/>
             <w:vAlign w:val="center"/>
             <w:tcBorders>
               <w:top w:val="single" w:sz="6" w:color="B0B7C3"/>
@@ -3598,7 +3933,7 @@
         </w:tc>
         <w:tc>
           <w:tcPr>
-            <w:tcW w:type="dxa" w:w="1728"/>
+            <w:tcW w:type="dxa" w:w="1512"/>
             <w:vAlign w:val="center"/>
             <w:tcBorders>
               <w:top w:val="single" w:sz="6" w:color="B0B7C3"/>
@@ -3626,7 +3961,7 @@
         </w:tc>
         <w:tc>
           <w:tcPr>
-            <w:tcW w:type="dxa" w:w="1872"/>
+            <w:tcW w:type="dxa" w:w="1440"/>
             <w:vAlign w:val="center"/>
             <w:tcBorders>
               <w:top w:val="single" w:sz="6" w:color="B0B7C3"/>
@@ -3654,7 +3989,7 @@
         </w:tc>
         <w:tc>
           <w:tcPr>
-            <w:tcW w:type="dxa" w:w="2016"/>
+            <w:tcW w:type="dxa" w:w="1512"/>
             <w:vAlign w:val="center"/>
             <w:tcBorders>
               <w:top w:val="single" w:sz="6" w:color="B0B7C3"/>
@@ -3676,13 +4011,41 @@
                 <w:color w:val="1A1A1A"/>
                 <w:sz w:val="21"/>
               </w:rPr>
-              <w:t>179</w:t>
+              <w:t>158</w:t>
             </w:r>
           </w:p>
         </w:tc>
         <w:tc>
           <w:tcPr>
-            <w:tcW w:type="dxa" w:w="2160"/>
+            <w:tcW w:type="dxa" w:w="1440"/>
+            <w:vAlign w:val="center"/>
+            <w:tcBorders>
+              <w:top w:val="single" w:sz="6" w:color="B0B7C3"/>
+              <w:left w:val="single" w:sz="6" w:color="B0B7C3"/>
+              <w:bottom w:val="single" w:sz="6" w:color="B0B7C3"/>
+              <w:right w:val="single" w:sz="6" w:color="B0B7C3"/>
+            </w:tcBorders>
+            <w:shd w:fill="F6F7FA" w:val="clear"/>
+          </w:tcPr>
+          <w:p>
+            <w:pPr>
+              <w:spacing w:before="0" w:after="0"/>
+              <w:jc w:val="right"/>
+            </w:pPr>
+            <w:r/>
+            <w:r>
+              <w:rPr>
+                <w:b w:val="0"/>
+                <w:color w:val="1A1A1A"/>
+                <w:sz w:val="21"/>
+              </w:rPr>
+              <w:t>21</w:t>
+            </w:r>
+          </w:p>
+        </w:tc>
+        <w:tc>
+          <w:tcPr>
+            <w:tcW w:type="dxa" w:w="1944"/>
             <w:vAlign w:val="center"/>
             <w:tcBorders>
               <w:top w:val="single" w:sz="6" w:color="B0B7C3"/>
@@ -3715,7 +4078,7 @@
         </w:trPr>
         <w:tc>
           <w:tcPr>
-            <w:tcW w:type="dxa" w:w="1440"/>
+            <w:tcW w:type="dxa" w:w="1296"/>
             <w:vAlign w:val="center"/>
             <w:tcBorders>
               <w:top w:val="single" w:sz="6" w:color="B0B7C3"/>
@@ -3742,7 +4105,7 @@
         </w:tc>
         <w:tc>
           <w:tcPr>
-            <w:tcW w:type="dxa" w:w="4608"/>
+            <w:tcW w:type="dxa" w:w="3888"/>
             <w:vAlign w:val="center"/>
             <w:tcBorders>
               <w:top w:val="single" w:sz="6" w:color="B0B7C3"/>
@@ -3769,7 +4132,7 @@
         </w:tc>
         <w:tc>
           <w:tcPr>
-            <w:tcW w:type="dxa" w:w="1728"/>
+            <w:tcW w:type="dxa" w:w="1512"/>
             <w:vAlign w:val="center"/>
             <w:tcBorders>
               <w:top w:val="single" w:sz="6" w:color="B0B7C3"/>
@@ -3796,7 +4159,7 @@
         </w:tc>
         <w:tc>
           <w:tcPr>
-            <w:tcW w:type="dxa" w:w="1872"/>
+            <w:tcW w:type="dxa" w:w="1440"/>
             <w:vAlign w:val="center"/>
             <w:tcBorders>
               <w:top w:val="single" w:sz="6" w:color="B0B7C3"/>
@@ -3823,7 +4186,7 @@
         </w:tc>
         <w:tc>
           <w:tcPr>
-            <w:tcW w:type="dxa" w:w="2016"/>
+            <w:tcW w:type="dxa" w:w="1512"/>
             <w:vAlign w:val="center"/>
             <w:tcBorders>
               <w:top w:val="single" w:sz="6" w:color="B0B7C3"/>
@@ -3844,13 +4207,40 @@
                 <w:color w:val="1A1A1A"/>
                 <w:sz w:val="21"/>
               </w:rPr>
-              <w:t>50</w:t>
+              <w:t>45</w:t>
             </w:r>
           </w:p>
         </w:tc>
         <w:tc>
           <w:tcPr>
-            <w:tcW w:type="dxa" w:w="2160"/>
+            <w:tcW w:type="dxa" w:w="1440"/>
+            <w:vAlign w:val="center"/>
+            <w:tcBorders>
+              <w:top w:val="single" w:sz="6" w:color="B0B7C3"/>
+              <w:left w:val="single" w:sz="6" w:color="B0B7C3"/>
+              <w:bottom w:val="single" w:sz="6" w:color="B0B7C3"/>
+              <w:right w:val="single" w:sz="6" w:color="B0B7C3"/>
+            </w:tcBorders>
+          </w:tcPr>
+          <w:p>
+            <w:pPr>
+              <w:spacing w:before="0" w:after="0"/>
+              <w:jc w:val="right"/>
+            </w:pPr>
+            <w:r/>
+            <w:r>
+              <w:rPr>
+                <w:b w:val="0"/>
+                <w:color w:val="1A1A1A"/>
+                <w:sz w:val="21"/>
+              </w:rPr>
+              <w:t>5</w:t>
+            </w:r>
+          </w:p>
+        </w:tc>
+        <w:tc>
+          <w:tcPr>
+            <w:tcW w:type="dxa" w:w="1944"/>
             <w:vAlign w:val="center"/>
             <w:tcBorders>
               <w:top w:val="single" w:sz="6" w:color="B0B7C3"/>
@@ -3882,7 +4272,7 @@
         </w:trPr>
         <w:tc>
           <w:tcPr>
-            <w:tcW w:type="dxa" w:w="1440"/>
+            <w:tcW w:type="dxa" w:w="1296"/>
             <w:vAlign w:val="center"/>
             <w:tcBorders>
               <w:top w:val="single" w:sz="6" w:color="B0B7C3"/>
@@ -3910,7 +4300,7 @@
         </w:tc>
         <w:tc>
           <w:tcPr>
-            <w:tcW w:type="dxa" w:w="4608"/>
+            <w:tcW w:type="dxa" w:w="3888"/>
             <w:vAlign w:val="center"/>
             <w:tcBorders>
               <w:top w:val="single" w:sz="6" w:color="B0B7C3"/>
@@ -3938,7 +4328,7 @@
         </w:tc>
         <w:tc>
           <w:tcPr>
-            <w:tcW w:type="dxa" w:w="1728"/>
+            <w:tcW w:type="dxa" w:w="1512"/>
             <w:vAlign w:val="center"/>
             <w:tcBorders>
               <w:top w:val="single" w:sz="6" w:color="B0B7C3"/>
@@ -3966,7 +4356,7 @@
         </w:tc>
         <w:tc>
           <w:tcPr>
-            <w:tcW w:type="dxa" w:w="1872"/>
+            <w:tcW w:type="dxa" w:w="1440"/>
             <w:vAlign w:val="center"/>
             <w:tcBorders>
               <w:top w:val="single" w:sz="6" w:color="B0B7C3"/>
@@ -3994,7 +4384,7 @@
         </w:tc>
         <w:tc>
           <w:tcPr>
-            <w:tcW w:type="dxa" w:w="2016"/>
+            <w:tcW w:type="dxa" w:w="1512"/>
             <w:vAlign w:val="center"/>
             <w:tcBorders>
               <w:top w:val="single" w:sz="6" w:color="B0B7C3"/>
@@ -4016,13 +4406,41 @@
                 <w:color w:val="1A1A1A"/>
                 <w:sz w:val="21"/>
               </w:rPr>
-              <w:t>21</w:t>
+              <w:t>16</w:t>
             </w:r>
           </w:p>
         </w:tc>
         <w:tc>
           <w:tcPr>
-            <w:tcW w:type="dxa" w:w="2160"/>
+            <w:tcW w:type="dxa" w:w="1440"/>
+            <w:vAlign w:val="center"/>
+            <w:tcBorders>
+              <w:top w:val="single" w:sz="6" w:color="B0B7C3"/>
+              <w:left w:val="single" w:sz="6" w:color="B0B7C3"/>
+              <w:bottom w:val="single" w:sz="6" w:color="B0B7C3"/>
+              <w:right w:val="single" w:sz="6" w:color="B0B7C3"/>
+            </w:tcBorders>
+            <w:shd w:fill="F6F7FA" w:val="clear"/>
+          </w:tcPr>
+          <w:p>
+            <w:pPr>
+              <w:spacing w:before="0" w:after="0"/>
+              <w:jc w:val="right"/>
+            </w:pPr>
+            <w:r/>
+            <w:r>
+              <w:rPr>
+                <w:b w:val="0"/>
+                <w:color w:val="1A1A1A"/>
+                <w:sz w:val="21"/>
+              </w:rPr>
+              <w:t>5</w:t>
+            </w:r>
+          </w:p>
+        </w:tc>
+        <w:tc>
+          <w:tcPr>
+            <w:tcW w:type="dxa" w:w="1944"/>
             <w:vAlign w:val="center"/>
             <w:tcBorders>
               <w:top w:val="single" w:sz="6" w:color="B0B7C3"/>
@@ -4055,7 +4473,7 @@
         </w:trPr>
         <w:tc>
           <w:tcPr>
-            <w:tcW w:type="dxa" w:w="1440"/>
+            <w:tcW w:type="dxa" w:w="1296"/>
             <w:vAlign w:val="center"/>
             <w:tcBorders>
               <w:top w:val="single" w:sz="6" w:color="B0B7C3"/>
@@ -4083,7 +4501,7 @@
         </w:tc>
         <w:tc>
           <w:tcPr>
-            <w:tcW w:type="dxa" w:w="4608"/>
+            <w:tcW w:type="dxa" w:w="3888"/>
             <w:vAlign w:val="center"/>
             <w:tcBorders>
               <w:top w:val="single" w:sz="6" w:color="B0B7C3"/>
@@ -4111,7 +4529,7 @@
         </w:tc>
         <w:tc>
           <w:tcPr>
-            <w:tcW w:type="dxa" w:w="1728"/>
+            <w:tcW w:type="dxa" w:w="1512"/>
             <w:vAlign w:val="center"/>
             <w:tcBorders>
               <w:top w:val="single" w:sz="6" w:color="B0B7C3"/>
@@ -4139,7 +4557,7 @@
         </w:tc>
         <w:tc>
           <w:tcPr>
-            <w:tcW w:type="dxa" w:w="1872"/>
+            <w:tcW w:type="dxa" w:w="1440"/>
             <w:vAlign w:val="center"/>
             <w:tcBorders>
               <w:top w:val="single" w:sz="6" w:color="B0B7C3"/>
@@ -4167,7 +4585,7 @@
         </w:tc>
         <w:tc>
           <w:tcPr>
-            <w:tcW w:type="dxa" w:w="2016"/>
+            <w:tcW w:type="dxa" w:w="1512"/>
             <w:vAlign w:val="center"/>
             <w:tcBorders>
               <w:top w:val="single" w:sz="6" w:color="B0B7C3"/>
@@ -4189,13 +4607,41 @@
                 <w:color w:val="1A1A1A"/>
                 <w:sz w:val="21"/>
               </w:rPr>
-              <w:t>11,031</w:t>
+              <w:t>9,020</w:t>
             </w:r>
           </w:p>
         </w:tc>
         <w:tc>
           <w:tcPr>
-            <w:tcW w:type="dxa" w:w="2160"/>
+            <w:tcW w:type="dxa" w:w="1440"/>
+            <w:vAlign w:val="center"/>
+            <w:tcBorders>
+              <w:top w:val="single" w:sz="6" w:color="B0B7C3"/>
+              <w:left w:val="single" w:sz="6" w:color="B0B7C3"/>
+              <w:bottom w:val="single" w:sz="6" w:color="B0B7C3"/>
+              <w:right w:val="single" w:sz="6" w:color="B0B7C3"/>
+            </w:tcBorders>
+            <w:shd w:fill="E6ECF4" w:val="clear"/>
+          </w:tcPr>
+          <w:p>
+            <w:pPr>
+              <w:spacing w:before="0" w:after="0"/>
+              <w:jc w:val="right"/>
+            </w:pPr>
+            <w:r/>
+            <w:r>
+              <w:rPr>
+                <w:b/>
+                <w:color w:val="1A1A1A"/>
+                <w:sz w:val="21"/>
+              </w:rPr>
+              <w:t>2,011</w:t>
+            </w:r>
+          </w:p>
+        </w:tc>
+        <w:tc>
+          <w:tcPr>
+            <w:tcW w:type="dxa" w:w="1944"/>
             <w:vAlign w:val="center"/>
             <w:tcBorders>
               <w:top w:val="single" w:sz="6" w:color="B0B7C3"/>
@@ -4228,7 +4674,7 @@
         </w:trPr>
         <w:tc>
           <w:tcPr>
-            <w:tcW w:type="dxa" w:w="1440"/>
+            <w:tcW w:type="dxa" w:w="1296"/>
             <w:vAlign w:val="center"/>
             <w:tcBorders>
               <w:top w:val="single" w:sz="6" w:color="B0B7C3"/>
@@ -4256,7 +4702,7 @@
         </w:tc>
         <w:tc>
           <w:tcPr>
-            <w:tcW w:type="dxa" w:w="4608"/>
+            <w:tcW w:type="dxa" w:w="3888"/>
             <w:vAlign w:val="center"/>
             <w:tcBorders>
               <w:top w:val="single" w:sz="6" w:color="B0B7C3"/>
@@ -4284,7 +4730,7 @@
         </w:tc>
         <w:tc>
           <w:tcPr>
-            <w:tcW w:type="dxa" w:w="1728"/>
+            <w:tcW w:type="dxa" w:w="1512"/>
             <w:vAlign w:val="center"/>
             <w:tcBorders>
               <w:top w:val="single" w:sz="6" w:color="B0B7C3"/>
@@ -4312,7 +4758,7 @@
         </w:tc>
         <w:tc>
           <w:tcPr>
-            <w:tcW w:type="dxa" w:w="1872"/>
+            <w:tcW w:type="dxa" w:w="1440"/>
             <w:vAlign w:val="center"/>
             <w:tcBorders>
               <w:top w:val="single" w:sz="6" w:color="B0B7C3"/>
@@ -4340,7 +4786,7 @@
         </w:tc>
         <w:tc>
           <w:tcPr>
-            <w:tcW w:type="dxa" w:w="2016"/>
+            <w:tcW w:type="dxa" w:w="1512"/>
             <w:vAlign w:val="center"/>
             <w:tcBorders>
               <w:top w:val="single" w:sz="6" w:color="B0B7C3"/>
@@ -4362,13 +4808,41 @@
                 <w:color w:val="1A1A1A"/>
                 <w:sz w:val="21"/>
               </w:rPr>
-              <w:t>12,374</w:t>
+              <w:t>10,048</w:t>
             </w:r>
           </w:p>
         </w:tc>
         <w:tc>
           <w:tcPr>
-            <w:tcW w:type="dxa" w:w="2160"/>
+            <w:tcW w:type="dxa" w:w="1440"/>
+            <w:vAlign w:val="center"/>
+            <w:tcBorders>
+              <w:top w:val="single" w:sz="6" w:color="B0B7C3"/>
+              <w:left w:val="single" w:sz="6" w:color="B0B7C3"/>
+              <w:bottom w:val="single" w:sz="6" w:color="B0B7C3"/>
+              <w:right w:val="single" w:sz="6" w:color="B0B7C3"/>
+            </w:tcBorders>
+            <w:shd w:fill="E6ECF4" w:val="clear"/>
+          </w:tcPr>
+          <w:p>
+            <w:pPr>
+              <w:spacing w:before="0" w:after="0"/>
+              <w:jc w:val="right"/>
+            </w:pPr>
+            <w:r/>
+            <w:r>
+              <w:rPr>
+                <w:b/>
+                <w:color w:val="1A1A1A"/>
+                <w:sz w:val="21"/>
+              </w:rPr>
+              <w:t>2,326</w:t>
+            </w:r>
+          </w:p>
+        </w:tc>
+        <w:tc>
+          <w:tcPr>
+            <w:tcW w:type="dxa" w:w="1944"/>
             <w:vAlign w:val="center"/>
             <w:tcBorders>
               <w:top w:val="single" w:sz="6" w:color="B0B7C3"/>

</xml_diff>

<commit_message>
Reorder intro sentences, fix Section 1 lede, center table text
Intro rewritten in the requested order:
1. Reordering-benefits opener.
2. 2017 introduction + rules not revisited.
3. Company-leader closer about extending the benefit to more
   customers.

Section 1 lede: dropped the confusing "what would remain excluded
even at 50 contacts" — anything >= 10 is already excluded so calling
out 50 was misleading.

All table text (headers, labels, numbers) now center-aligned.

https://claude.ai/code/session_01PM89wz7vnfvW2NRaFUoooy
</commit_message>
<xml_diff>
--- a/Updating_SLV_Rules.docx
+++ b/Updating_SLV_Rules.docx
@@ -26,7 +26,7 @@
         <w:rPr>
           <w:sz w:val="22"/>
         </w:rPr>
-        <w:t>We introduced Shipping Location View in 2017 to let coworkers at the same shipping location see one another’s order history. The eligibility rules have not been revisited since. Given the reordering benefits we see from customers with shared order history and purple links, we recommend revisiting the combination of rules to open shared view to more customers.</w:t>
+        <w:t>Customers with shared order history and purple links reorder more. We introduced Shipping Location View in 2017 to bring this experience to coworkers at the same shipping location, and the eligibility rules have not been revisited since. This is an opportunity to extend the benefit to more of our customers.</w:t>
       </w:r>
     </w:p>
     <w:p>
@@ -50,7 +50,7 @@
         <w:rPr>
           <w:sz w:val="22"/>
         </w:rPr>
-        <w:t>The current rule excludes any shipping location with 10 or more active ordering contacts. The table shows how many additional shipping locations and orders each higher threshold would include, and what would remain excluded even at 50 contacts.</w:t>
+        <w:t>The current rule excludes any shipping location with 10 or more active ordering contacts. The table below shows how many shipping locations and orders would qualify at each higher threshold.</w:t>
       </w:r>
     </w:p>
     <w:tbl>
@@ -86,7 +86,7 @@
           <w:p>
             <w:pPr>
               <w:spacing w:before="0" w:after="0"/>
-              <w:jc w:val="left"/>
+              <w:jc w:val="center"/>
             </w:pPr>
             <w:r/>
             <w:r>
@@ -114,7 +114,7 @@
           <w:p>
             <w:pPr>
               <w:spacing w:before="0" w:after="0"/>
-              <w:jc w:val="right"/>
+              <w:jc w:val="center"/>
             </w:pPr>
             <w:r/>
             <w:r>
@@ -142,7 +142,7 @@
           <w:p>
             <w:pPr>
               <w:spacing w:before="0" w:after="0"/>
-              <w:jc w:val="right"/>
+              <w:jc w:val="center"/>
             </w:pPr>
             <w:r/>
             <w:r>
@@ -170,7 +170,7 @@
           <w:p>
             <w:pPr>
               <w:spacing w:before="0" w:after="0"/>
-              <w:jc w:val="right"/>
+              <w:jc w:val="center"/>
             </w:pPr>
             <w:r/>
             <w:r>
@@ -198,7 +198,7 @@
           <w:p>
             <w:pPr>
               <w:spacing w:before="0" w:after="0"/>
-              <w:jc w:val="right"/>
+              <w:jc w:val="center"/>
             </w:pPr>
             <w:r/>
             <w:r>
@@ -226,7 +226,7 @@
           <w:p>
             <w:pPr>
               <w:spacing w:before="0" w:after="0"/>
-              <w:jc w:val="right"/>
+              <w:jc w:val="center"/>
             </w:pPr>
             <w:r/>
             <w:r>
@@ -258,7 +258,7 @@
           <w:p>
             <w:pPr>
               <w:spacing w:before="0" w:after="0"/>
-              <w:jc w:val="left"/>
+              <w:jc w:val="center"/>
             </w:pPr>
             <w:r/>
             <w:r>
@@ -285,7 +285,7 @@
           <w:p>
             <w:pPr>
               <w:spacing w:before="0" w:after="0"/>
-              <w:jc w:val="right"/>
+              <w:jc w:val="center"/>
             </w:pPr>
             <w:r/>
             <w:r>
@@ -312,7 +312,7 @@
           <w:p>
             <w:pPr>
               <w:spacing w:before="0" w:after="0"/>
-              <w:jc w:val="right"/>
+              <w:jc w:val="center"/>
             </w:pPr>
             <w:r/>
             <w:r>
@@ -339,7 +339,7 @@
           <w:p>
             <w:pPr>
               <w:spacing w:before="0" w:after="0"/>
-              <w:jc w:val="right"/>
+              <w:jc w:val="center"/>
             </w:pPr>
             <w:r/>
             <w:r>
@@ -366,7 +366,7 @@
           <w:p>
             <w:pPr>
               <w:spacing w:before="0" w:after="0"/>
-              <w:jc w:val="right"/>
+              <w:jc w:val="center"/>
             </w:pPr>
             <w:r/>
             <w:r>
@@ -393,7 +393,7 @@
           <w:p>
             <w:pPr>
               <w:spacing w:before="0" w:after="0"/>
-              <w:jc w:val="right"/>
+              <w:jc w:val="center"/>
             </w:pPr>
             <w:r/>
             <w:r>
@@ -426,7 +426,7 @@
           <w:p>
             <w:pPr>
               <w:spacing w:before="0" w:after="0"/>
-              <w:jc w:val="left"/>
+              <w:jc w:val="center"/>
             </w:pPr>
             <w:r/>
             <w:r>
@@ -454,7 +454,7 @@
           <w:p>
             <w:pPr>
               <w:spacing w:before="0" w:after="0"/>
-              <w:jc w:val="right"/>
+              <w:jc w:val="center"/>
             </w:pPr>
             <w:r/>
             <w:r>
@@ -482,7 +482,7 @@
           <w:p>
             <w:pPr>
               <w:spacing w:before="0" w:after="0"/>
-              <w:jc w:val="right"/>
+              <w:jc w:val="center"/>
             </w:pPr>
             <w:r/>
             <w:r>
@@ -510,7 +510,7 @@
           <w:p>
             <w:pPr>
               <w:spacing w:before="0" w:after="0"/>
-              <w:jc w:val="right"/>
+              <w:jc w:val="center"/>
             </w:pPr>
             <w:r/>
             <w:r>
@@ -538,7 +538,7 @@
           <w:p>
             <w:pPr>
               <w:spacing w:before="0" w:after="0"/>
-              <w:jc w:val="right"/>
+              <w:jc w:val="center"/>
             </w:pPr>
             <w:r/>
             <w:r>
@@ -566,7 +566,7 @@
           <w:p>
             <w:pPr>
               <w:spacing w:before="0" w:after="0"/>
-              <w:jc w:val="right"/>
+              <w:jc w:val="center"/>
             </w:pPr>
             <w:r/>
             <w:r>
@@ -598,7 +598,7 @@
           <w:p>
             <w:pPr>
               <w:spacing w:before="0" w:after="0"/>
-              <w:jc w:val="left"/>
+              <w:jc w:val="center"/>
             </w:pPr>
             <w:r/>
             <w:r>
@@ -625,7 +625,7 @@
           <w:p>
             <w:pPr>
               <w:spacing w:before="0" w:after="0"/>
-              <w:jc w:val="right"/>
+              <w:jc w:val="center"/>
             </w:pPr>
             <w:r/>
             <w:r>
@@ -652,7 +652,7 @@
           <w:p>
             <w:pPr>
               <w:spacing w:before="0" w:after="0"/>
-              <w:jc w:val="right"/>
+              <w:jc w:val="center"/>
             </w:pPr>
             <w:r/>
             <w:r>
@@ -679,7 +679,7 @@
           <w:p>
             <w:pPr>
               <w:spacing w:before="0" w:after="0"/>
-              <w:jc w:val="right"/>
+              <w:jc w:val="center"/>
             </w:pPr>
             <w:r/>
             <w:r>
@@ -706,7 +706,7 @@
           <w:p>
             <w:pPr>
               <w:spacing w:before="0" w:after="0"/>
-              <w:jc w:val="right"/>
+              <w:jc w:val="center"/>
             </w:pPr>
             <w:r/>
             <w:r>
@@ -733,7 +733,7 @@
           <w:p>
             <w:pPr>
               <w:spacing w:before="0" w:after="0"/>
-              <w:jc w:val="right"/>
+              <w:jc w:val="center"/>
             </w:pPr>
             <w:r/>
             <w:r>
@@ -766,7 +766,7 @@
           <w:p>
             <w:pPr>
               <w:spacing w:before="0" w:after="0"/>
-              <w:jc w:val="left"/>
+              <w:jc w:val="center"/>
             </w:pPr>
             <w:r/>
             <w:r>
@@ -794,7 +794,7 @@
           <w:p>
             <w:pPr>
               <w:spacing w:before="0" w:after="0"/>
-              <w:jc w:val="right"/>
+              <w:jc w:val="center"/>
             </w:pPr>
             <w:r/>
             <w:r>
@@ -822,7 +822,7 @@
           <w:p>
             <w:pPr>
               <w:spacing w:before="0" w:after="0"/>
-              <w:jc w:val="right"/>
+              <w:jc w:val="center"/>
             </w:pPr>
             <w:r/>
             <w:r>
@@ -850,7 +850,7 @@
           <w:p>
             <w:pPr>
               <w:spacing w:before="0" w:after="0"/>
-              <w:jc w:val="right"/>
+              <w:jc w:val="center"/>
             </w:pPr>
             <w:r/>
             <w:r>
@@ -878,7 +878,7 @@
           <w:p>
             <w:pPr>
               <w:spacing w:before="0" w:after="0"/>
-              <w:jc w:val="right"/>
+              <w:jc w:val="center"/>
             </w:pPr>
             <w:r/>
             <w:r>
@@ -906,7 +906,7 @@
           <w:p>
             <w:pPr>
               <w:spacing w:before="0" w:after="0"/>
-              <w:jc w:val="right"/>
+              <w:jc w:val="center"/>
             </w:pPr>
             <w:r/>
             <w:r>
@@ -938,7 +938,7 @@
           <w:p>
             <w:pPr>
               <w:spacing w:before="0" w:after="0"/>
-              <w:jc w:val="left"/>
+              <w:jc w:val="center"/>
             </w:pPr>
             <w:r/>
             <w:r>
@@ -965,7 +965,7 @@
           <w:p>
             <w:pPr>
               <w:spacing w:before="0" w:after="0"/>
-              <w:jc w:val="right"/>
+              <w:jc w:val="center"/>
             </w:pPr>
             <w:r/>
             <w:r>
@@ -992,7 +992,7 @@
           <w:p>
             <w:pPr>
               <w:spacing w:before="0" w:after="0"/>
-              <w:jc w:val="right"/>
+              <w:jc w:val="center"/>
             </w:pPr>
             <w:r/>
             <w:r>
@@ -1019,7 +1019,7 @@
           <w:p>
             <w:pPr>
               <w:spacing w:before="0" w:after="0"/>
-              <w:jc w:val="right"/>
+              <w:jc w:val="center"/>
             </w:pPr>
             <w:r/>
             <w:r>
@@ -1046,7 +1046,7 @@
           <w:p>
             <w:pPr>
               <w:spacing w:before="0" w:after="0"/>
-              <w:jc w:val="right"/>
+              <w:jc w:val="center"/>
             </w:pPr>
             <w:r/>
             <w:r>
@@ -1073,7 +1073,7 @@
           <w:p>
             <w:pPr>
               <w:spacing w:before="0" w:after="0"/>
-              <w:jc w:val="right"/>
+              <w:jc w:val="center"/>
             </w:pPr>
             <w:r/>
             <w:r>
@@ -1106,7 +1106,7 @@
           <w:p>
             <w:pPr>
               <w:spacing w:before="0" w:after="0"/>
-              <w:jc w:val="left"/>
+              <w:jc w:val="center"/>
             </w:pPr>
             <w:r/>
             <w:r>
@@ -1134,7 +1134,7 @@
           <w:p>
             <w:pPr>
               <w:spacing w:before="0" w:after="0"/>
-              <w:jc w:val="right"/>
+              <w:jc w:val="center"/>
             </w:pPr>
             <w:r/>
             <w:r>
@@ -1162,7 +1162,7 @@
           <w:p>
             <w:pPr>
               <w:spacing w:before="0" w:after="0"/>
-              <w:jc w:val="right"/>
+              <w:jc w:val="center"/>
             </w:pPr>
             <w:r/>
             <w:r>
@@ -1190,7 +1190,7 @@
           <w:p>
             <w:pPr>
               <w:spacing w:before="0" w:after="0"/>
-              <w:jc w:val="right"/>
+              <w:jc w:val="center"/>
             </w:pPr>
             <w:r/>
             <w:r>
@@ -1218,7 +1218,7 @@
           <w:p>
             <w:pPr>
               <w:spacing w:before="0" w:after="0"/>
-              <w:jc w:val="right"/>
+              <w:jc w:val="center"/>
             </w:pPr>
             <w:r/>
             <w:r>
@@ -1246,7 +1246,7 @@
           <w:p>
             <w:pPr>
               <w:spacing w:before="0" w:after="0"/>
-              <w:jc w:val="right"/>
+              <w:jc w:val="center"/>
             </w:pPr>
             <w:r/>
             <w:r>
@@ -1279,7 +1279,7 @@
           <w:p>
             <w:pPr>
               <w:spacing w:before="0" w:after="0"/>
-              <w:jc w:val="left"/>
+              <w:jc w:val="center"/>
             </w:pPr>
             <w:r/>
             <w:r>
@@ -1307,7 +1307,7 @@
           <w:p>
             <w:pPr>
               <w:spacing w:before="0" w:after="0"/>
-              <w:jc w:val="right"/>
+              <w:jc w:val="center"/>
             </w:pPr>
             <w:r/>
             <w:r>
@@ -1335,7 +1335,7 @@
           <w:p>
             <w:pPr>
               <w:spacing w:before="0" w:after="0"/>
-              <w:jc w:val="right"/>
+              <w:jc w:val="center"/>
             </w:pPr>
             <w:r/>
             <w:r>
@@ -1363,7 +1363,7 @@
           <w:p>
             <w:pPr>
               <w:spacing w:before="0" w:after="0"/>
-              <w:jc w:val="right"/>
+              <w:jc w:val="center"/>
             </w:pPr>
             <w:r/>
             <w:r>
@@ -1391,7 +1391,7 @@
           <w:p>
             <w:pPr>
               <w:spacing w:before="0" w:after="0"/>
-              <w:jc w:val="right"/>
+              <w:jc w:val="center"/>
             </w:pPr>
             <w:r/>
             <w:r>
@@ -1419,7 +1419,7 @@
           <w:p>
             <w:pPr>
               <w:spacing w:before="0" w:after="0"/>
-              <w:jc w:val="right"/>
+              <w:jc w:val="center"/>
             </w:pPr>
             <w:r/>
             <w:r>
@@ -1492,7 +1492,7 @@
           <w:p>
             <w:pPr>
               <w:spacing w:before="0" w:after="0"/>
-              <w:jc w:val="left"/>
+              <w:jc w:val="center"/>
             </w:pPr>
             <w:r/>
             <w:r>
@@ -1520,7 +1520,7 @@
           <w:p>
             <w:pPr>
               <w:spacing w:before="0" w:after="0"/>
-              <w:jc w:val="left"/>
+              <w:jc w:val="center"/>
             </w:pPr>
             <w:r/>
             <w:r>
@@ -1548,7 +1548,7 @@
           <w:p>
             <w:pPr>
               <w:spacing w:before="0" w:after="0"/>
-              <w:jc w:val="right"/>
+              <w:jc w:val="center"/>
             </w:pPr>
             <w:r/>
             <w:r>
@@ -1576,7 +1576,7 @@
           <w:p>
             <w:pPr>
               <w:spacing w:before="0" w:after="0"/>
-              <w:jc w:val="right"/>
+              <w:jc w:val="center"/>
             </w:pPr>
             <w:r/>
             <w:r>
@@ -1604,7 +1604,7 @@
           <w:p>
             <w:pPr>
               <w:spacing w:before="0" w:after="0"/>
-              <w:jc w:val="right"/>
+              <w:jc w:val="center"/>
             </w:pPr>
             <w:r/>
             <w:r>
@@ -1632,7 +1632,7 @@
           <w:p>
             <w:pPr>
               <w:spacing w:before="0" w:after="0"/>
-              <w:jc w:val="right"/>
+              <w:jc w:val="center"/>
             </w:pPr>
             <w:r/>
             <w:r>
@@ -1660,7 +1660,7 @@
           <w:p>
             <w:pPr>
               <w:spacing w:before="0" w:after="0"/>
-              <w:jc w:val="right"/>
+              <w:jc w:val="center"/>
             </w:pPr>
             <w:r/>
             <w:r>
@@ -1693,7 +1693,7 @@
           <w:p>
             <w:pPr>
               <w:spacing w:before="0" w:after="0"/>
-              <w:jc w:val="left"/>
+              <w:jc w:val="center"/>
             </w:pPr>
             <w:r/>
             <w:r>
@@ -1721,7 +1721,7 @@
           <w:p>
             <w:pPr>
               <w:spacing w:before="0" w:after="0"/>
-              <w:jc w:val="left"/>
+              <w:jc w:val="center"/>
             </w:pPr>
             <w:r/>
             <w:r>
@@ -1749,7 +1749,7 @@
           <w:p>
             <w:pPr>
               <w:spacing w:before="0" w:after="0"/>
-              <w:jc w:val="right"/>
+              <w:jc w:val="center"/>
             </w:pPr>
             <w:r/>
             <w:r>
@@ -1777,7 +1777,7 @@
           <w:p>
             <w:pPr>
               <w:spacing w:before="0" w:after="0"/>
-              <w:jc w:val="right"/>
+              <w:jc w:val="center"/>
             </w:pPr>
             <w:r/>
             <w:r>
@@ -1805,7 +1805,7 @@
           <w:p>
             <w:pPr>
               <w:spacing w:before="0" w:after="0"/>
-              <w:jc w:val="right"/>
+              <w:jc w:val="center"/>
             </w:pPr>
             <w:r/>
             <w:r>
@@ -1833,7 +1833,7 @@
           <w:p>
             <w:pPr>
               <w:spacing w:before="0" w:after="0"/>
-              <w:jc w:val="right"/>
+              <w:jc w:val="center"/>
             </w:pPr>
             <w:r/>
             <w:r>
@@ -1861,7 +1861,7 @@
           <w:p>
             <w:pPr>
               <w:spacing w:before="0" w:after="0"/>
-              <w:jc w:val="right"/>
+              <w:jc w:val="center"/>
             </w:pPr>
             <w:r/>
             <w:r>
@@ -1894,7 +1894,7 @@
           <w:p>
             <w:pPr>
               <w:spacing w:before="0" w:after="0"/>
-              <w:jc w:val="left"/>
+              <w:jc w:val="center"/>
             </w:pPr>
             <w:r/>
             <w:r>
@@ -1922,7 +1922,7 @@
           <w:p>
             <w:pPr>
               <w:spacing w:before="0" w:after="0"/>
-              <w:jc w:val="left"/>
+              <w:jc w:val="center"/>
             </w:pPr>
             <w:r/>
             <w:r>
@@ -1950,7 +1950,7 @@
           <w:p>
             <w:pPr>
               <w:spacing w:before="0" w:after="0"/>
-              <w:jc w:val="right"/>
+              <w:jc w:val="center"/>
             </w:pPr>
             <w:r/>
             <w:r>
@@ -1978,7 +1978,7 @@
           <w:p>
             <w:pPr>
               <w:spacing w:before="0" w:after="0"/>
-              <w:jc w:val="right"/>
+              <w:jc w:val="center"/>
             </w:pPr>
             <w:r/>
             <w:r>
@@ -2006,7 +2006,7 @@
           <w:p>
             <w:pPr>
               <w:spacing w:before="0" w:after="0"/>
-              <w:jc w:val="right"/>
+              <w:jc w:val="center"/>
             </w:pPr>
             <w:r/>
             <w:r>
@@ -2034,7 +2034,7 @@
           <w:p>
             <w:pPr>
               <w:spacing w:before="0" w:after="0"/>
-              <w:jc w:val="right"/>
+              <w:jc w:val="center"/>
             </w:pPr>
             <w:r/>
             <w:r>
@@ -2062,7 +2062,7 @@
           <w:p>
             <w:pPr>
               <w:spacing w:before="0" w:after="0"/>
-              <w:jc w:val="right"/>
+              <w:jc w:val="center"/>
             </w:pPr>
             <w:r/>
             <w:r>
@@ -2095,7 +2095,7 @@
           <w:p>
             <w:pPr>
               <w:spacing w:before="0" w:after="0"/>
-              <w:jc w:val="left"/>
+              <w:jc w:val="center"/>
             </w:pPr>
             <w:r/>
             <w:r>
@@ -2123,7 +2123,7 @@
           <w:p>
             <w:pPr>
               <w:spacing w:before="0" w:after="0"/>
-              <w:jc w:val="left"/>
+              <w:jc w:val="center"/>
             </w:pPr>
             <w:r/>
             <w:r>
@@ -2151,7 +2151,7 @@
           <w:p>
             <w:pPr>
               <w:spacing w:before="0" w:after="0"/>
-              <w:jc w:val="right"/>
+              <w:jc w:val="center"/>
             </w:pPr>
             <w:r/>
             <w:r>
@@ -2179,7 +2179,7 @@
           <w:p>
             <w:pPr>
               <w:spacing w:before="0" w:after="0"/>
-              <w:jc w:val="right"/>
+              <w:jc w:val="center"/>
             </w:pPr>
             <w:r/>
             <w:r>
@@ -2207,7 +2207,7 @@
           <w:p>
             <w:pPr>
               <w:spacing w:before="0" w:after="0"/>
-              <w:jc w:val="right"/>
+              <w:jc w:val="center"/>
             </w:pPr>
             <w:r/>
             <w:r>
@@ -2235,7 +2235,7 @@
           <w:p>
             <w:pPr>
               <w:spacing w:before="0" w:after="0"/>
-              <w:jc w:val="right"/>
+              <w:jc w:val="center"/>
             </w:pPr>
             <w:r/>
             <w:r>
@@ -2263,7 +2263,7 @@
           <w:p>
             <w:pPr>
               <w:spacing w:before="0" w:after="0"/>
-              <w:jc w:val="right"/>
+              <w:jc w:val="center"/>
             </w:pPr>
             <w:r/>
             <w:r>
@@ -2296,7 +2296,7 @@
           <w:p>
             <w:pPr>
               <w:spacing w:before="0" w:after="0"/>
-              <w:jc w:val="left"/>
+              <w:jc w:val="center"/>
             </w:pPr>
             <w:r/>
             <w:r>
@@ -2324,7 +2324,7 @@
           <w:p>
             <w:pPr>
               <w:spacing w:before="0" w:after="0"/>
-              <w:jc w:val="left"/>
+              <w:jc w:val="center"/>
             </w:pPr>
             <w:r/>
             <w:r>
@@ -2352,7 +2352,7 @@
           <w:p>
             <w:pPr>
               <w:spacing w:before="0" w:after="0"/>
-              <w:jc w:val="right"/>
+              <w:jc w:val="center"/>
             </w:pPr>
             <w:r/>
             <w:r>
@@ -2380,7 +2380,7 @@
           <w:p>
             <w:pPr>
               <w:spacing w:before="0" w:after="0"/>
-              <w:jc w:val="right"/>
+              <w:jc w:val="center"/>
             </w:pPr>
             <w:r/>
             <w:r>
@@ -2408,7 +2408,7 @@
           <w:p>
             <w:pPr>
               <w:spacing w:before="0" w:after="0"/>
-              <w:jc w:val="right"/>
+              <w:jc w:val="center"/>
             </w:pPr>
             <w:r/>
             <w:r>
@@ -2436,7 +2436,7 @@
           <w:p>
             <w:pPr>
               <w:spacing w:before="0" w:after="0"/>
-              <w:jc w:val="right"/>
+              <w:jc w:val="center"/>
             </w:pPr>
             <w:r/>
             <w:r>
@@ -2464,7 +2464,7 @@
           <w:p>
             <w:pPr>
               <w:spacing w:before="0" w:after="0"/>
-              <w:jc w:val="right"/>
+              <w:jc w:val="center"/>
             </w:pPr>
             <w:r/>
             <w:r>
@@ -2497,7 +2497,7 @@
           <w:p>
             <w:pPr>
               <w:spacing w:before="0" w:after="0"/>
-              <w:jc w:val="left"/>
+              <w:jc w:val="center"/>
             </w:pPr>
             <w:r/>
             <w:r>
@@ -2525,7 +2525,7 @@
           <w:p>
             <w:pPr>
               <w:spacing w:before="0" w:after="0"/>
-              <w:jc w:val="left"/>
+              <w:jc w:val="center"/>
             </w:pPr>
             <w:r/>
             <w:r>
@@ -2553,7 +2553,7 @@
           <w:p>
             <w:pPr>
               <w:spacing w:before="0" w:after="0"/>
-              <w:jc w:val="right"/>
+              <w:jc w:val="center"/>
             </w:pPr>
             <w:r/>
             <w:r>
@@ -2581,7 +2581,7 @@
           <w:p>
             <w:pPr>
               <w:spacing w:before="0" w:after="0"/>
-              <w:jc w:val="right"/>
+              <w:jc w:val="center"/>
             </w:pPr>
             <w:r/>
             <w:r>
@@ -2609,7 +2609,7 @@
           <w:p>
             <w:pPr>
               <w:spacing w:before="0" w:after="0"/>
-              <w:jc w:val="right"/>
+              <w:jc w:val="center"/>
             </w:pPr>
             <w:r/>
             <w:r>
@@ -2637,7 +2637,7 @@
           <w:p>
             <w:pPr>
               <w:spacing w:before="0" w:after="0"/>
-              <w:jc w:val="right"/>
+              <w:jc w:val="center"/>
             </w:pPr>
             <w:r/>
             <w:r>
@@ -2665,7 +2665,7 @@
           <w:p>
             <w:pPr>
               <w:spacing w:before="0" w:after="0"/>
-              <w:jc w:val="right"/>
+              <w:jc w:val="center"/>
             </w:pPr>
             <w:r/>
             <w:r>
@@ -2698,7 +2698,7 @@
           <w:p>
             <w:pPr>
               <w:spacing w:before="0" w:after="0"/>
-              <w:jc w:val="left"/>
+              <w:jc w:val="center"/>
             </w:pPr>
             <w:r/>
             <w:r>
@@ -2726,7 +2726,7 @@
           <w:p>
             <w:pPr>
               <w:spacing w:before="0" w:after="0"/>
-              <w:jc w:val="left"/>
+              <w:jc w:val="center"/>
             </w:pPr>
             <w:r/>
             <w:r>
@@ -2754,7 +2754,7 @@
           <w:p>
             <w:pPr>
               <w:spacing w:before="0" w:after="0"/>
-              <w:jc w:val="right"/>
+              <w:jc w:val="center"/>
             </w:pPr>
             <w:r/>
             <w:r>
@@ -2782,7 +2782,7 @@
           <w:p>
             <w:pPr>
               <w:spacing w:before="0" w:after="0"/>
-              <w:jc w:val="right"/>
+              <w:jc w:val="center"/>
             </w:pPr>
             <w:r/>
             <w:r>
@@ -2810,7 +2810,7 @@
           <w:p>
             <w:pPr>
               <w:spacing w:before="0" w:after="0"/>
-              <w:jc w:val="right"/>
+              <w:jc w:val="center"/>
             </w:pPr>
             <w:r/>
             <w:r>
@@ -2838,7 +2838,7 @@
           <w:p>
             <w:pPr>
               <w:spacing w:before="0" w:after="0"/>
-              <w:jc w:val="right"/>
+              <w:jc w:val="center"/>
             </w:pPr>
             <w:r/>
             <w:r>
@@ -2866,7 +2866,7 @@
           <w:p>
             <w:pPr>
               <w:spacing w:before="0" w:after="0"/>
-              <w:jc w:val="right"/>
+              <w:jc w:val="center"/>
             </w:pPr>
             <w:r/>
             <w:r>
@@ -2899,7 +2899,7 @@
           <w:p>
             <w:pPr>
               <w:spacing w:before="0" w:after="0"/>
-              <w:jc w:val="left"/>
+              <w:jc w:val="center"/>
             </w:pPr>
             <w:r/>
             <w:r>
@@ -2927,7 +2927,7 @@
           <w:p>
             <w:pPr>
               <w:spacing w:before="0" w:after="0"/>
-              <w:jc w:val="left"/>
+              <w:jc w:val="center"/>
             </w:pPr>
             <w:r/>
             <w:r>
@@ -2955,7 +2955,7 @@
           <w:p>
             <w:pPr>
               <w:spacing w:before="0" w:after="0"/>
-              <w:jc w:val="right"/>
+              <w:jc w:val="center"/>
             </w:pPr>
             <w:r/>
             <w:r>
@@ -2983,7 +2983,7 @@
           <w:p>
             <w:pPr>
               <w:spacing w:before="0" w:after="0"/>
-              <w:jc w:val="right"/>
+              <w:jc w:val="center"/>
             </w:pPr>
             <w:r/>
             <w:r>
@@ -3011,7 +3011,7 @@
           <w:p>
             <w:pPr>
               <w:spacing w:before="0" w:after="0"/>
-              <w:jc w:val="right"/>
+              <w:jc w:val="center"/>
             </w:pPr>
             <w:r/>
             <w:r>
@@ -3039,7 +3039,7 @@
           <w:p>
             <w:pPr>
               <w:spacing w:before="0" w:after="0"/>
-              <w:jc w:val="right"/>
+              <w:jc w:val="center"/>
             </w:pPr>
             <w:r/>
             <w:r>
@@ -3067,7 +3067,7 @@
           <w:p>
             <w:pPr>
               <w:spacing w:before="0" w:after="0"/>
-              <w:jc w:val="right"/>
+              <w:jc w:val="center"/>
             </w:pPr>
             <w:r/>
             <w:r>
@@ -3100,7 +3100,7 @@
           <w:p>
             <w:pPr>
               <w:spacing w:before="0" w:after="0"/>
-              <w:jc w:val="left"/>
+              <w:jc w:val="center"/>
             </w:pPr>
             <w:r/>
             <w:r>
@@ -3128,7 +3128,7 @@
           <w:p>
             <w:pPr>
               <w:spacing w:before="0" w:after="0"/>
-              <w:jc w:val="left"/>
+              <w:jc w:val="center"/>
             </w:pPr>
             <w:r/>
             <w:r>
@@ -3156,7 +3156,7 @@
           <w:p>
             <w:pPr>
               <w:spacing w:before="0" w:after="0"/>
-              <w:jc w:val="right"/>
+              <w:jc w:val="center"/>
             </w:pPr>
             <w:r/>
             <w:r>
@@ -3184,7 +3184,7 @@
           <w:p>
             <w:pPr>
               <w:spacing w:before="0" w:after="0"/>
-              <w:jc w:val="right"/>
+              <w:jc w:val="center"/>
             </w:pPr>
             <w:r/>
             <w:r>
@@ -3212,7 +3212,7 @@
           <w:p>
             <w:pPr>
               <w:spacing w:before="0" w:after="0"/>
-              <w:jc w:val="right"/>
+              <w:jc w:val="center"/>
             </w:pPr>
             <w:r/>
             <w:r>
@@ -3240,7 +3240,7 @@
           <w:p>
             <w:pPr>
               <w:spacing w:before="0" w:after="0"/>
-              <w:jc w:val="right"/>
+              <w:jc w:val="center"/>
             </w:pPr>
             <w:r/>
             <w:r>
@@ -3268,7 +3268,7 @@
           <w:p>
             <w:pPr>
               <w:spacing w:before="0" w:after="0"/>
-              <w:jc w:val="right"/>
+              <w:jc w:val="center"/>
             </w:pPr>
             <w:r/>
             <w:r>
@@ -3300,7 +3300,7 @@
           <w:p>
             <w:pPr>
               <w:spacing w:before="0" w:after="0"/>
-              <w:jc w:val="left"/>
+              <w:jc w:val="center"/>
             </w:pPr>
             <w:r/>
             <w:r>
@@ -3327,7 +3327,7 @@
           <w:p>
             <w:pPr>
               <w:spacing w:before="0" w:after="0"/>
-              <w:jc w:val="left"/>
+              <w:jc w:val="center"/>
             </w:pPr>
             <w:r/>
             <w:r>
@@ -3354,7 +3354,7 @@
           <w:p>
             <w:pPr>
               <w:spacing w:before="0" w:after="0"/>
-              <w:jc w:val="right"/>
+              <w:jc w:val="center"/>
             </w:pPr>
             <w:r/>
             <w:r>
@@ -3381,7 +3381,7 @@
           <w:p>
             <w:pPr>
               <w:spacing w:before="0" w:after="0"/>
-              <w:jc w:val="right"/>
+              <w:jc w:val="center"/>
             </w:pPr>
             <w:r/>
             <w:r>
@@ -3408,7 +3408,7 @@
           <w:p>
             <w:pPr>
               <w:spacing w:before="0" w:after="0"/>
-              <w:jc w:val="right"/>
+              <w:jc w:val="center"/>
             </w:pPr>
             <w:r/>
             <w:r>
@@ -3435,7 +3435,7 @@
           <w:p>
             <w:pPr>
               <w:spacing w:before="0" w:after="0"/>
-              <w:jc w:val="right"/>
+              <w:jc w:val="center"/>
             </w:pPr>
             <w:r/>
             <w:r>
@@ -3462,7 +3462,7 @@
           <w:p>
             <w:pPr>
               <w:spacing w:before="0" w:after="0"/>
-              <w:jc w:val="right"/>
+              <w:jc w:val="center"/>
             </w:pPr>
             <w:r/>
             <w:r>
@@ -3495,7 +3495,7 @@
           <w:p>
             <w:pPr>
               <w:spacing w:before="0" w:after="0"/>
-              <w:jc w:val="left"/>
+              <w:jc w:val="center"/>
             </w:pPr>
             <w:r/>
             <w:r>
@@ -3523,7 +3523,7 @@
           <w:p>
             <w:pPr>
               <w:spacing w:before="0" w:after="0"/>
-              <w:jc w:val="left"/>
+              <w:jc w:val="center"/>
             </w:pPr>
             <w:r/>
             <w:r>
@@ -3551,7 +3551,7 @@
           <w:p>
             <w:pPr>
               <w:spacing w:before="0" w:after="0"/>
-              <w:jc w:val="right"/>
+              <w:jc w:val="center"/>
             </w:pPr>
             <w:r/>
             <w:r>
@@ -3579,7 +3579,7 @@
           <w:p>
             <w:pPr>
               <w:spacing w:before="0" w:after="0"/>
-              <w:jc w:val="right"/>
+              <w:jc w:val="center"/>
             </w:pPr>
             <w:r/>
             <w:r>
@@ -3607,7 +3607,7 @@
           <w:p>
             <w:pPr>
               <w:spacing w:before="0" w:after="0"/>
-              <w:jc w:val="right"/>
+              <w:jc w:val="center"/>
             </w:pPr>
             <w:r/>
             <w:r>
@@ -3635,7 +3635,7 @@
           <w:p>
             <w:pPr>
               <w:spacing w:before="0" w:after="0"/>
-              <w:jc w:val="right"/>
+              <w:jc w:val="center"/>
             </w:pPr>
             <w:r/>
             <w:r>
@@ -3663,7 +3663,7 @@
           <w:p>
             <w:pPr>
               <w:spacing w:before="0" w:after="0"/>
-              <w:jc w:val="right"/>
+              <w:jc w:val="center"/>
             </w:pPr>
             <w:r/>
             <w:r>
@@ -3695,7 +3695,7 @@
           <w:p>
             <w:pPr>
               <w:spacing w:before="0" w:after="0"/>
-              <w:jc w:val="left"/>
+              <w:jc w:val="center"/>
             </w:pPr>
             <w:r/>
             <w:r>
@@ -3722,7 +3722,7 @@
           <w:p>
             <w:pPr>
               <w:spacing w:before="0" w:after="0"/>
-              <w:jc w:val="left"/>
+              <w:jc w:val="center"/>
             </w:pPr>
             <w:r/>
             <w:r>
@@ -3749,7 +3749,7 @@
           <w:p>
             <w:pPr>
               <w:spacing w:before="0" w:after="0"/>
-              <w:jc w:val="right"/>
+              <w:jc w:val="center"/>
             </w:pPr>
             <w:r/>
             <w:r>
@@ -3776,7 +3776,7 @@
           <w:p>
             <w:pPr>
               <w:spacing w:before="0" w:after="0"/>
-              <w:jc w:val="right"/>
+              <w:jc w:val="center"/>
             </w:pPr>
             <w:r/>
             <w:r>
@@ -3803,7 +3803,7 @@
           <w:p>
             <w:pPr>
               <w:spacing w:before="0" w:after="0"/>
-              <w:jc w:val="right"/>
+              <w:jc w:val="center"/>
             </w:pPr>
             <w:r/>
             <w:r>
@@ -3830,7 +3830,7 @@
           <w:p>
             <w:pPr>
               <w:spacing w:before="0" w:after="0"/>
-              <w:jc w:val="right"/>
+              <w:jc w:val="center"/>
             </w:pPr>
             <w:r/>
             <w:r>
@@ -3857,7 +3857,7 @@
           <w:p>
             <w:pPr>
               <w:spacing w:before="0" w:after="0"/>
-              <w:jc w:val="right"/>
+              <w:jc w:val="center"/>
             </w:pPr>
             <w:r/>
             <w:r>
@@ -3890,7 +3890,7 @@
           <w:p>
             <w:pPr>
               <w:spacing w:before="0" w:after="0"/>
-              <w:jc w:val="left"/>
+              <w:jc w:val="center"/>
             </w:pPr>
             <w:r/>
             <w:r>
@@ -3918,7 +3918,7 @@
           <w:p>
             <w:pPr>
               <w:spacing w:before="0" w:after="0"/>
-              <w:jc w:val="left"/>
+              <w:jc w:val="center"/>
             </w:pPr>
             <w:r/>
             <w:r>
@@ -3946,7 +3946,7 @@
           <w:p>
             <w:pPr>
               <w:spacing w:before="0" w:after="0"/>
-              <w:jc w:val="right"/>
+              <w:jc w:val="center"/>
             </w:pPr>
             <w:r/>
             <w:r>
@@ -3974,7 +3974,7 @@
           <w:p>
             <w:pPr>
               <w:spacing w:before="0" w:after="0"/>
-              <w:jc w:val="right"/>
+              <w:jc w:val="center"/>
             </w:pPr>
             <w:r/>
             <w:r>
@@ -4002,7 +4002,7 @@
           <w:p>
             <w:pPr>
               <w:spacing w:before="0" w:after="0"/>
-              <w:jc w:val="right"/>
+              <w:jc w:val="center"/>
             </w:pPr>
             <w:r/>
             <w:r>
@@ -4030,7 +4030,7 @@
           <w:p>
             <w:pPr>
               <w:spacing w:before="0" w:after="0"/>
-              <w:jc w:val="right"/>
+              <w:jc w:val="center"/>
             </w:pPr>
             <w:r/>
             <w:r>
@@ -4058,7 +4058,7 @@
           <w:p>
             <w:pPr>
               <w:spacing w:before="0" w:after="0"/>
-              <w:jc w:val="right"/>
+              <w:jc w:val="center"/>
             </w:pPr>
             <w:r/>
             <w:r>
@@ -4090,7 +4090,7 @@
           <w:p>
             <w:pPr>
               <w:spacing w:before="0" w:after="0"/>
-              <w:jc w:val="left"/>
+              <w:jc w:val="center"/>
             </w:pPr>
             <w:r/>
             <w:r>
@@ -4117,7 +4117,7 @@
           <w:p>
             <w:pPr>
               <w:spacing w:before="0" w:after="0"/>
-              <w:jc w:val="left"/>
+              <w:jc w:val="center"/>
             </w:pPr>
             <w:r/>
             <w:r>
@@ -4144,7 +4144,7 @@
           <w:p>
             <w:pPr>
               <w:spacing w:before="0" w:after="0"/>
-              <w:jc w:val="right"/>
+              <w:jc w:val="center"/>
             </w:pPr>
             <w:r/>
             <w:r>
@@ -4171,7 +4171,7 @@
           <w:p>
             <w:pPr>
               <w:spacing w:before="0" w:after="0"/>
-              <w:jc w:val="right"/>
+              <w:jc w:val="center"/>
             </w:pPr>
             <w:r/>
             <w:r>
@@ -4198,7 +4198,7 @@
           <w:p>
             <w:pPr>
               <w:spacing w:before="0" w:after="0"/>
-              <w:jc w:val="right"/>
+              <w:jc w:val="center"/>
             </w:pPr>
             <w:r/>
             <w:r>
@@ -4225,7 +4225,7 @@
           <w:p>
             <w:pPr>
               <w:spacing w:before="0" w:after="0"/>
-              <w:jc w:val="right"/>
+              <w:jc w:val="center"/>
             </w:pPr>
             <w:r/>
             <w:r>
@@ -4252,7 +4252,7 @@
           <w:p>
             <w:pPr>
               <w:spacing w:before="0" w:after="0"/>
-              <w:jc w:val="right"/>
+              <w:jc w:val="center"/>
             </w:pPr>
             <w:r/>
             <w:r>
@@ -4285,7 +4285,7 @@
           <w:p>
             <w:pPr>
               <w:spacing w:before="0" w:after="0"/>
-              <w:jc w:val="left"/>
+              <w:jc w:val="center"/>
             </w:pPr>
             <w:r/>
             <w:r>
@@ -4313,7 +4313,7 @@
           <w:p>
             <w:pPr>
               <w:spacing w:before="0" w:after="0"/>
-              <w:jc w:val="left"/>
+              <w:jc w:val="center"/>
             </w:pPr>
             <w:r/>
             <w:r>
@@ -4341,7 +4341,7 @@
           <w:p>
             <w:pPr>
               <w:spacing w:before="0" w:after="0"/>
-              <w:jc w:val="right"/>
+              <w:jc w:val="center"/>
             </w:pPr>
             <w:r/>
             <w:r>
@@ -4369,7 +4369,7 @@
           <w:p>
             <w:pPr>
               <w:spacing w:before="0" w:after="0"/>
-              <w:jc w:val="right"/>
+              <w:jc w:val="center"/>
             </w:pPr>
             <w:r/>
             <w:r>
@@ -4397,7 +4397,7 @@
           <w:p>
             <w:pPr>
               <w:spacing w:before="0" w:after="0"/>
-              <w:jc w:val="right"/>
+              <w:jc w:val="center"/>
             </w:pPr>
             <w:r/>
             <w:r>
@@ -4425,7 +4425,7 @@
           <w:p>
             <w:pPr>
               <w:spacing w:before="0" w:after="0"/>
-              <w:jc w:val="right"/>
+              <w:jc w:val="center"/>
             </w:pPr>
             <w:r/>
             <w:r>
@@ -4453,7 +4453,7 @@
           <w:p>
             <w:pPr>
               <w:spacing w:before="0" w:after="0"/>
-              <w:jc w:val="right"/>
+              <w:jc w:val="center"/>
             </w:pPr>
             <w:r/>
             <w:r>
@@ -4486,7 +4486,7 @@
           <w:p>
             <w:pPr>
               <w:spacing w:before="0" w:after="0"/>
-              <w:jc w:val="left"/>
+              <w:jc w:val="center"/>
             </w:pPr>
             <w:r/>
             <w:r>
@@ -4514,7 +4514,7 @@
           <w:p>
             <w:pPr>
               <w:spacing w:before="0" w:after="0"/>
-              <w:jc w:val="left"/>
+              <w:jc w:val="center"/>
             </w:pPr>
             <w:r/>
             <w:r>
@@ -4542,7 +4542,7 @@
           <w:p>
             <w:pPr>
               <w:spacing w:before="0" w:after="0"/>
-              <w:jc w:val="right"/>
+              <w:jc w:val="center"/>
             </w:pPr>
             <w:r/>
             <w:r>
@@ -4570,7 +4570,7 @@
           <w:p>
             <w:pPr>
               <w:spacing w:before="0" w:after="0"/>
-              <w:jc w:val="right"/>
+              <w:jc w:val="center"/>
             </w:pPr>
             <w:r/>
             <w:r>
@@ -4598,7 +4598,7 @@
           <w:p>
             <w:pPr>
               <w:spacing w:before="0" w:after="0"/>
-              <w:jc w:val="right"/>
+              <w:jc w:val="center"/>
             </w:pPr>
             <w:r/>
             <w:r>
@@ -4626,7 +4626,7 @@
           <w:p>
             <w:pPr>
               <w:spacing w:before="0" w:after="0"/>
-              <w:jc w:val="right"/>
+              <w:jc w:val="center"/>
             </w:pPr>
             <w:r/>
             <w:r>
@@ -4654,7 +4654,7 @@
           <w:p>
             <w:pPr>
               <w:spacing w:before="0" w:after="0"/>
-              <w:jc w:val="right"/>
+              <w:jc w:val="center"/>
             </w:pPr>
             <w:r/>
             <w:r>
@@ -4687,7 +4687,7 @@
           <w:p>
             <w:pPr>
               <w:spacing w:before="0" w:after="0"/>
-              <w:jc w:val="left"/>
+              <w:jc w:val="center"/>
             </w:pPr>
             <w:r/>
             <w:r>
@@ -4715,7 +4715,7 @@
           <w:p>
             <w:pPr>
               <w:spacing w:before="0" w:after="0"/>
-              <w:jc w:val="left"/>
+              <w:jc w:val="center"/>
             </w:pPr>
             <w:r/>
             <w:r>
@@ -4743,7 +4743,7 @@
           <w:p>
             <w:pPr>
               <w:spacing w:before="0" w:after="0"/>
-              <w:jc w:val="right"/>
+              <w:jc w:val="center"/>
             </w:pPr>
             <w:r/>
             <w:r>
@@ -4771,7 +4771,7 @@
           <w:p>
             <w:pPr>
               <w:spacing w:before="0" w:after="0"/>
-              <w:jc w:val="right"/>
+              <w:jc w:val="center"/>
             </w:pPr>
             <w:r/>
             <w:r>
@@ -4799,7 +4799,7 @@
           <w:p>
             <w:pPr>
               <w:spacing w:before="0" w:after="0"/>
-              <w:jc w:val="right"/>
+              <w:jc w:val="center"/>
             </w:pPr>
             <w:r/>
             <w:r>
@@ -4827,7 +4827,7 @@
           <w:p>
             <w:pPr>
               <w:spacing w:before="0" w:after="0"/>
-              <w:jc w:val="right"/>
+              <w:jc w:val="center"/>
             </w:pPr>
             <w:r/>
             <w:r>
@@ -4855,7 +4855,7 @@
           <w:p>
             <w:pPr>
               <w:spacing w:before="0" w:after="0"/>
-              <w:jc w:val="right"/>
+              <w:jc w:val="center"/>
             </w:pPr>
             <w:r/>
             <w:r>

</xml_diff>

<commit_message>
Add SLV Eligibility reference PDF as first page of Word doc
Renders the SHARE ACTIVITY / SLV Eligibility PDF to a 200-DPI PNG and
embeds it as page 1 of the Word document at 9.5" wide (fits the
landscape page). A page break then leads into the "Updating SLV
Rules" analysis pages that follow.

https://claude.ai/code/session_01PM89wz7vnfvW2NRaFUoooy
</commit_message>
<xml_diff>
--- a/Updating_SLV_Rules.docx
+++ b/Updating_SLV_Rules.docx
@@ -2,6 +2,51 @@
 <file path=word/document.xml><?xml version="1.0" encoding="utf-8"?>
 <w:document xmlns:wpc="http://schemas.microsoft.com/office/word/2010/wordprocessingCanvas" xmlns:mo="http://schemas.microsoft.com/office/mac/office/2008/main" xmlns:mc="http://schemas.openxmlformats.org/markup-compatibility/2006" xmlns:mv="urn:schemas-microsoft-com:mac:vml" xmlns:o="urn:schemas-microsoft-com:office:office" xmlns:r="http://schemas.openxmlformats.org/officeDocument/2006/relationships" xmlns:m="http://schemas.openxmlformats.org/officeDocument/2006/math" xmlns:v="urn:schemas-microsoft-com:vml" xmlns:wp14="http://schemas.microsoft.com/office/word/2010/wordprocessingDrawing" xmlns:wp="http://schemas.openxmlformats.org/drawingml/2006/wordprocessingDrawing" xmlns:w10="urn:schemas-microsoft-com:office:word" xmlns:w="http://schemas.openxmlformats.org/wordprocessingml/2006/main" xmlns:w14="http://schemas.microsoft.com/office/word/2010/wordml" xmlns:wpg="http://schemas.microsoft.com/office/word/2010/wordprocessingGroup" xmlns:wpi="http://schemas.microsoft.com/office/word/2010/wordprocessingInk" xmlns:wne="http://schemas.microsoft.com/office/word/2006/wordml" xmlns:wps="http://schemas.microsoft.com/office/word/2010/wordprocessingShape" mc:Ignorable="w14 wp14">
   <w:body>
+    <w:p>
+      <w:pPr>
+        <w:spacing w:before="0" w:after="0"/>
+        <w:jc w:val="center"/>
+      </w:pPr>
+      <w:r>
+        <w:drawing>
+          <wp:inline xmlns:a="http://schemas.openxmlformats.org/drawingml/2006/main" xmlns:pic="http://schemas.openxmlformats.org/drawingml/2006/picture">
+            <wp:extent cx="8686800" cy="6712527"/>
+            <wp:docPr id="1" name="Picture 1"/>
+            <wp:cNvGraphicFramePr>
+              <a:graphicFrameLocks noChangeAspect="1"/>
+            </wp:cNvGraphicFramePr>
+            <a:graphic>
+              <a:graphicData uri="http://schemas.openxmlformats.org/drawingml/2006/picture">
+                <pic:pic>
+                  <pic:nvPicPr>
+                    <pic:cNvPr id="0" name="slv_eligibility_page1.png"/>
+                    <pic:cNvPicPr/>
+                  </pic:nvPicPr>
+                  <pic:blipFill>
+                    <a:blip r:embed="rId9"/>
+                    <a:stretch>
+                      <a:fillRect/>
+                    </a:stretch>
+                  </pic:blipFill>
+                  <pic:spPr>
+                    <a:xfrm>
+                      <a:off x="0" y="0"/>
+                      <a:ext cx="8686800" cy="6712527"/>
+                    </a:xfrm>
+                    <a:prstGeom prst="rect"/>
+                  </pic:spPr>
+                </pic:pic>
+              </a:graphicData>
+            </a:graphic>
+          </wp:inline>
+        </w:drawing>
+      </w:r>
+    </w:p>
+    <w:p>
+      <w:r>
+        <w:br w:type="page"/>
+      </w:r>
+    </w:p>
     <w:p>
       <w:pPr>
         <w:spacing w:after="240"/>

</xml_diff>

<commit_message>
Treat Above 50 as another threshold row, not a highlighted excluded row
Removed the cream highlight and "(excluded)" tag. Row now shows full
cumulative values (545,030 CMFs, 16,985,084 orders, 100%) with
+1,752,777 as its marginal — same visual treatment as every other
threshold row.

Also rewrote the intro to lead with the 2017 introduction, the
observed reordering benefits since, the fact that rules haven't been
revisited, and close with the leader-voice sentence about revisiting
the combination of rules as a starting point.

https://claude.ai/code/session_01PM89wz7vnfvW2NRaFUoooy
</commit_message>
<xml_diff>
--- a/Updating_SLV_Rules.docx
+++ b/Updating_SLV_Rules.docx
@@ -71,7 +71,7 @@
         <w:rPr>
           <w:sz w:val="22"/>
         </w:rPr>
-        <w:t>Customers with shared order history and purple links reorder more. We introduced Shipping Location View in 2017 to bring this experience to coworkers at the same shipping location, and the eligibility rules have not been revisited since. This is an opportunity to extend the benefit to more of our customers.</w:t>
+        <w:t>We introduced Shipping Location View in 2017 to let coworkers at the same shipping location see one another’s order history. Since then, we have seen the reordering benefits from customers with shared order history and purple links. The eligibility rules have not been revisited. This is an opportunity to revisit the combination of rules as a starting point to extend the benefit to more of our customers.</w:t>
       </w:r>
     </w:p>
     <w:p>
@@ -1319,7 +1319,6 @@
               <w:bottom w:val="single" w:sz="6" w:color="B0B7C3"/>
               <w:right w:val="single" w:sz="6" w:color="B0B7C3"/>
             </w:tcBorders>
-            <w:shd w:fill="FDF3D3" w:val="clear"/>
           </w:tcPr>
           <w:p>
             <w:pPr>
@@ -1329,11 +1328,11 @@
             <w:r/>
             <w:r>
               <w:rPr>
-                <w:b/>
+                <w:b w:val="0"/>
                 <w:color w:val="1A1A1A"/>
                 <w:sz w:val="21"/>
               </w:rPr>
-              <w:t>Above 50 (excluded)</w:t>
+              <w:t>Above 50</w:t>
             </w:r>
           </w:p>
         </w:tc>
@@ -1347,7 +1346,6 @@
               <w:bottom w:val="single" w:sz="6" w:color="B0B7C3"/>
               <w:right w:val="single" w:sz="6" w:color="B0B7C3"/>
             </w:tcBorders>
-            <w:shd w:fill="FDF3D3" w:val="clear"/>
           </w:tcPr>
           <w:p>
             <w:pPr>
@@ -1361,7 +1359,7 @@
                 <w:color w:val="1A1A1A"/>
                 <w:sz w:val="21"/>
               </w:rPr>
-              <w:t>751</w:t>
+              <w:t>545,030</w:t>
             </w:r>
           </w:p>
         </w:tc>
@@ -1375,7 +1373,6 @@
               <w:bottom w:val="single" w:sz="6" w:color="B0B7C3"/>
               <w:right w:val="single" w:sz="6" w:color="B0B7C3"/>
             </w:tcBorders>
-            <w:shd w:fill="FDF3D3" w:val="clear"/>
           </w:tcPr>
           <w:p>
             <w:pPr>
@@ -1389,7 +1386,7 @@
                 <w:color w:val="1A1A1A"/>
                 <w:sz w:val="21"/>
               </w:rPr>
-              <w:t>0.1%</w:t>
+              <w:t>100.0%</w:t>
             </w:r>
           </w:p>
         </w:tc>
@@ -1403,7 +1400,6 @@
               <w:bottom w:val="single" w:sz="6" w:color="B0B7C3"/>
               <w:right w:val="single" w:sz="6" w:color="B0B7C3"/>
             </w:tcBorders>
-            <w:shd w:fill="FDF3D3" w:val="clear"/>
           </w:tcPr>
           <w:p>
             <w:pPr>
@@ -1417,7 +1413,7 @@
                 <w:color w:val="1A1A1A"/>
                 <w:sz w:val="21"/>
               </w:rPr>
-              <w:t>1,752,777</w:t>
+              <w:t>16,985,084</w:t>
             </w:r>
           </w:p>
         </w:tc>
@@ -1431,7 +1427,6 @@
               <w:bottom w:val="single" w:sz="6" w:color="B0B7C3"/>
               <w:right w:val="single" w:sz="6" w:color="B0B7C3"/>
             </w:tcBorders>
-            <w:shd w:fill="FDF3D3" w:val="clear"/>
           </w:tcPr>
           <w:p>
             <w:pPr>
@@ -1445,7 +1440,7 @@
                 <w:color w:val="1A1A1A"/>
                 <w:sz w:val="21"/>
               </w:rPr>
-              <w:t>—</w:t>
+              <w:t>+1,752,777</w:t>
             </w:r>
           </w:p>
         </w:tc>
@@ -1459,7 +1454,6 @@
               <w:bottom w:val="single" w:sz="6" w:color="B0B7C3"/>
               <w:right w:val="single" w:sz="6" w:color="B0B7C3"/>
             </w:tcBorders>
-            <w:shd w:fill="FDF3D3" w:val="clear"/>
           </w:tcPr>
           <w:p>
             <w:pPr>
@@ -1473,7 +1467,7 @@
                 <w:color w:val="1A1A1A"/>
                 <w:sz w:val="21"/>
               </w:rPr>
-              <w:t>10.3%</w:t>
+              <w:t>100.0%</w:t>
             </w:r>
           </w:p>
         </w:tc>

</xml_diff>

<commit_message>
Match Table 1 and Table 2 totals; add outer border; tighter margins
- Rewrote Table 1's Above 50 row to use our universe (554,765 CMFs,
  17,028,786 orders) so it matches Table 2's grand total. Percentages
  across Table 1 recomputed against this universe.
- Added a light-black outer border on both tables.
- Reduced page margins to 0.5" all around so the tables have more
  room on the landscape page.

https://claude.ai/code/session_01PM89wz7vnfvW2NRaFUoooy
</commit_message>
<xml_diff>
--- a/Updating_SLV_Rules.docx
+++ b/Updating_SLV_Rules.docx
@@ -103,6 +103,12 @@
         <w:tblW w:type="auto" w:w="0"/>
         <w:jc w:val="left"/>
         <w:tblLook w:firstColumn="1" w:firstRow="1" w:lastColumn="0" w:lastRow="0" w:noHBand="0" w:noVBand="1" w:val="04A0"/>
+        <w:tblBorders>
+          <w:top w:val="single" w:sz="12" w:color="4A4A4A"/>
+          <w:left w:val="single" w:sz="12" w:color="4A4A4A"/>
+          <w:bottom w:val="single" w:sz="12" w:color="4A4A4A"/>
+          <w:right w:val="single" w:sz="12" w:color="4A4A4A"/>
+        </w:tblBorders>
       </w:tblPr>
       <w:tblGrid>
         <w:gridCol w:w="2160"/>
@@ -366,7 +372,7 @@
                 <w:color w:val="1A1A1A"/>
                 <w:sz w:val="21"/>
               </w:rPr>
-              <w:t>97.7%</w:t>
+              <w:t>96.0%</w:t>
             </w:r>
           </w:p>
         </w:tc>
@@ -447,7 +453,7 @@
                 <w:color w:val="1A1A1A"/>
                 <w:sz w:val="21"/>
               </w:rPr>
-              <w:t>74.8%</w:t>
+              <w:t>74.6%</w:t>
             </w:r>
           </w:p>
         </w:tc>
@@ -536,7 +542,7 @@
                 <w:color w:val="1A1A1A"/>
                 <w:sz w:val="21"/>
               </w:rPr>
-              <w:t>98.4%</w:t>
+              <w:t>96.6%</w:t>
             </w:r>
           </w:p>
         </w:tc>
@@ -620,7 +626,7 @@
                 <w:color w:val="1A1A1A"/>
                 <w:sz w:val="21"/>
               </w:rPr>
-              <w:t>77.8%</w:t>
+              <w:t>77.6%</w:t>
             </w:r>
           </w:p>
         </w:tc>
@@ -706,7 +712,7 @@
                 <w:color w:val="1A1A1A"/>
                 <w:sz w:val="21"/>
               </w:rPr>
-              <w:t>98.9%</w:t>
+              <w:t>97.1%</w:t>
             </w:r>
           </w:p>
         </w:tc>
@@ -787,7 +793,7 @@
                 <w:color w:val="1A1A1A"/>
                 <w:sz w:val="21"/>
               </w:rPr>
-              <w:t>80.8%</w:t>
+              <w:t>80.6%</w:t>
             </w:r>
           </w:p>
         </w:tc>
@@ -876,7 +882,7 @@
                 <w:color w:val="1A1A1A"/>
                 <w:sz w:val="21"/>
               </w:rPr>
-              <w:t>99.3%</w:t>
+              <w:t>97.6%</w:t>
             </w:r>
           </w:p>
         </w:tc>
@@ -960,7 +966,7 @@
                 <w:color w:val="1A1A1A"/>
                 <w:sz w:val="21"/>
               </w:rPr>
-              <w:t>83.8%</w:t>
+              <w:t>83.6%</w:t>
             </w:r>
           </w:p>
         </w:tc>
@@ -1046,7 +1052,7 @@
                 <w:color w:val="1A1A1A"/>
                 <w:sz w:val="21"/>
               </w:rPr>
-              <w:t>99.5%</w:t>
+              <w:t>97.8%</w:t>
             </w:r>
           </w:p>
         </w:tc>
@@ -1127,7 +1133,7 @@
                 <w:color w:val="1A1A1A"/>
                 <w:sz w:val="21"/>
               </w:rPr>
-              <w:t>85.7%</w:t>
+              <w:t>85.5%</w:t>
             </w:r>
           </w:p>
         </w:tc>
@@ -1216,7 +1222,7 @@
                 <w:color w:val="1A1A1A"/>
                 <w:sz w:val="21"/>
               </w:rPr>
-              <w:t>99.9%</w:t>
+              <w:t>98.1%</w:t>
             </w:r>
           </w:p>
         </w:tc>
@@ -1300,7 +1306,7 @@
                 <w:color w:val="1A1A1A"/>
                 <w:sz w:val="21"/>
               </w:rPr>
-              <w:t>89.7%</w:t>
+              <w:t>89.5%</w:t>
             </w:r>
           </w:p>
         </w:tc>
@@ -1359,7 +1365,7 @@
                 <w:color w:val="1A1A1A"/>
                 <w:sz w:val="21"/>
               </w:rPr>
-              <w:t>545,030</w:t>
+              <w:t>554,765</w:t>
             </w:r>
           </w:p>
         </w:tc>
@@ -1413,7 +1419,7 @@
                 <w:color w:val="1A1A1A"/>
                 <w:sz w:val="21"/>
               </w:rPr>
-              <w:t>16,985,084</w:t>
+              <w:t>17,028,786</w:t>
             </w:r>
           </w:p>
         </w:tc>
@@ -1440,7 +1446,7 @@
                 <w:color w:val="1A1A1A"/>
                 <w:sz w:val="21"/>
               </w:rPr>
-              <w:t>+1,752,777</w:t>
+              <w:t>+1,796,479</w:t>
             </w:r>
           </w:p>
         </w:tc>
@@ -1502,6 +1508,12 @@
         <w:tblW w:type="auto" w:w="0"/>
         <w:jc w:val="left"/>
         <w:tblLook w:firstColumn="1" w:firstRow="1" w:lastColumn="0" w:lastRow="0" w:noHBand="0" w:noVBand="1" w:val="04A0"/>
+        <w:tblBorders>
+          <w:top w:val="single" w:sz="12" w:color="4A4A4A"/>
+          <w:left w:val="single" w:sz="12" w:color="4A4A4A"/>
+          <w:bottom w:val="single" w:sz="12" w:color="4A4A4A"/>
+          <w:right w:val="single" w:sz="12" w:color="4A4A4A"/>
+        </w:tblBorders>
       </w:tblPr>
       <w:tblGrid>
         <w:gridCol w:w="1296"/>
@@ -4911,7 +4923,7 @@
     </w:tbl>
     <w:sectPr>
       <w:pgSz w:w="15840" w:h="12240" w:orient="landscape"/>
-      <w:pgMar w:top="792" w:right="1080" w:bottom="792" w:left="1080" w:header="720" w:footer="720" w:gutter="0"/>
+      <w:pgMar w:top="720" w:right="720" w:bottom="720" w:left="720" w:header="720" w:footer="720" w:gutter="0"/>
       <w:cols w:space="720"/>
       <w:docGrid w:linePitch="360"/>
     </w:sectPr>

</xml_diff>

<commit_message>
Split Section 2 into excluded/not-excluded tables with a small gap
Replaced the empty spacer row between the excluded and not-excluded
blocks with two separate tables and a small paragraph gap. Same
column widths so the two tables line up visually; only the top table
carries the header row.

https://claude.ai/code/session_01PM89wz7vnfvW2NRaFUoooy
</commit_message>
<xml_diff>
--- a/Updating_SLV_Rules.docx
+++ b/Updating_SLV_Rules.docx
@@ -3333,6 +3333,33 @@
           </w:p>
         </w:tc>
       </w:tr>
+    </w:tbl>
+    <w:p>
+      <w:pPr>
+        <w:spacing w:before="80" w:after="80"/>
+      </w:pPr>
+    </w:p>
+    <w:tbl>
+      <w:tblPr>
+        <w:tblW w:type="auto" w:w="0"/>
+        <w:jc w:val="left"/>
+        <w:tblLook w:firstColumn="1" w:firstRow="1" w:lastColumn="0" w:lastRow="0" w:noHBand="0" w:noVBand="1" w:val="04A0"/>
+        <w:tblBorders>
+          <w:top w:val="single" w:sz="12" w:color="4A4A4A"/>
+          <w:left w:val="single" w:sz="12" w:color="4A4A4A"/>
+          <w:bottom w:val="single" w:sz="12" w:color="4A4A4A"/>
+          <w:right w:val="single" w:sz="12" w:color="4A4A4A"/>
+        </w:tblBorders>
+      </w:tblPr>
+      <w:tblGrid>
+        <w:gridCol w:w="1296"/>
+        <w:gridCol w:w="3888"/>
+        <w:gridCol w:w="1512"/>
+        <w:gridCol w:w="1440"/>
+        <w:gridCol w:w="1512"/>
+        <w:gridCol w:w="1440"/>
+        <w:gridCol w:w="1944"/>
+      </w:tblGrid>
       <w:tr>
         <w:trPr>
           <w:trHeight w:val="360" w:hRule="atLeast"/>
@@ -3347,6 +3374,7 @@
               <w:bottom w:val="single" w:sz="6" w:color="B0B7C3"/>
               <w:right w:val="single" w:sz="6" w:color="B0B7C3"/>
             </w:tcBorders>
+            <w:shd w:fill="F6F7FA" w:val="clear"/>
           </w:tcPr>
           <w:p>
             <w:pPr>
@@ -3374,6 +3402,7 @@
               <w:bottom w:val="single" w:sz="6" w:color="B0B7C3"/>
               <w:right w:val="single" w:sz="6" w:color="B0B7C3"/>
             </w:tcBorders>
+            <w:shd w:fill="F6F7FA" w:val="clear"/>
           </w:tcPr>
           <w:p>
             <w:pPr>
@@ -3401,6 +3430,7 @@
               <w:bottom w:val="single" w:sz="6" w:color="B0B7C3"/>
               <w:right w:val="single" w:sz="6" w:color="B0B7C3"/>
             </w:tcBorders>
+            <w:shd w:fill="F6F7FA" w:val="clear"/>
           </w:tcPr>
           <w:p>
             <w:pPr>
@@ -3428,6 +3458,7 @@
               <w:bottom w:val="single" w:sz="6" w:color="B0B7C3"/>
               <w:right w:val="single" w:sz="6" w:color="B0B7C3"/>
             </w:tcBorders>
+            <w:shd w:fill="F6F7FA" w:val="clear"/>
           </w:tcPr>
           <w:p>
             <w:pPr>
@@ -3455,6 +3486,7 @@
               <w:bottom w:val="single" w:sz="6" w:color="B0B7C3"/>
               <w:right w:val="single" w:sz="6" w:color="B0B7C3"/>
             </w:tcBorders>
+            <w:shd w:fill="F6F7FA" w:val="clear"/>
           </w:tcPr>
           <w:p>
             <w:pPr>
@@ -3482,6 +3514,7 @@
               <w:bottom w:val="single" w:sz="6" w:color="B0B7C3"/>
               <w:right w:val="single" w:sz="6" w:color="B0B7C3"/>
             </w:tcBorders>
+            <w:shd w:fill="F6F7FA" w:val="clear"/>
           </w:tcPr>
           <w:p>
             <w:pPr>
@@ -3509,6 +3542,7 @@
               <w:bottom w:val="single" w:sz="6" w:color="B0B7C3"/>
               <w:right w:val="single" w:sz="6" w:color="B0B7C3"/>
             </w:tcBorders>
+            <w:shd w:fill="F6F7FA" w:val="clear"/>
           </w:tcPr>
           <w:p>
             <w:pPr>
@@ -3541,7 +3575,6 @@
               <w:bottom w:val="single" w:sz="6" w:color="B0B7C3"/>
               <w:right w:val="single" w:sz="6" w:color="B0B7C3"/>
             </w:tcBorders>
-            <w:shd w:fill="F6F7FA" w:val="clear"/>
           </w:tcPr>
           <w:p>
             <w:pPr>
@@ -3569,7 +3602,6 @@
               <w:bottom w:val="single" w:sz="6" w:color="B0B7C3"/>
               <w:right w:val="single" w:sz="6" w:color="B0B7C3"/>
             </w:tcBorders>
-            <w:shd w:fill="F6F7FA" w:val="clear"/>
           </w:tcPr>
           <w:p>
             <w:pPr>
@@ -3597,7 +3629,6 @@
               <w:bottom w:val="single" w:sz="6" w:color="B0B7C3"/>
               <w:right w:val="single" w:sz="6" w:color="B0B7C3"/>
             </w:tcBorders>
-            <w:shd w:fill="F6F7FA" w:val="clear"/>
           </w:tcPr>
           <w:p>
             <w:pPr>
@@ -3625,7 +3656,6 @@
               <w:bottom w:val="single" w:sz="6" w:color="B0B7C3"/>
               <w:right w:val="single" w:sz="6" w:color="B0B7C3"/>
             </w:tcBorders>
-            <w:shd w:fill="F6F7FA" w:val="clear"/>
           </w:tcPr>
           <w:p>
             <w:pPr>
@@ -3653,7 +3683,6 @@
               <w:bottom w:val="single" w:sz="6" w:color="B0B7C3"/>
               <w:right w:val="single" w:sz="6" w:color="B0B7C3"/>
             </w:tcBorders>
-            <w:shd w:fill="F6F7FA" w:val="clear"/>
           </w:tcPr>
           <w:p>
             <w:pPr>
@@ -3681,7 +3710,6 @@
               <w:bottom w:val="single" w:sz="6" w:color="B0B7C3"/>
               <w:right w:val="single" w:sz="6" w:color="B0B7C3"/>
             </w:tcBorders>
-            <w:shd w:fill="F6F7FA" w:val="clear"/>
           </w:tcPr>
           <w:p>
             <w:pPr>
@@ -3709,7 +3737,6 @@
               <w:bottom w:val="single" w:sz="6" w:color="B0B7C3"/>
               <w:right w:val="single" w:sz="6" w:color="B0B7C3"/>
             </w:tcBorders>
-            <w:shd w:fill="F6F7FA" w:val="clear"/>
           </w:tcPr>
           <w:p>
             <w:pPr>
@@ -3742,6 +3769,7 @@
               <w:bottom w:val="single" w:sz="6" w:color="B0B7C3"/>
               <w:right w:val="single" w:sz="6" w:color="B0B7C3"/>
             </w:tcBorders>
+            <w:shd w:fill="F6F7FA" w:val="clear"/>
           </w:tcPr>
           <w:p>
             <w:pPr>
@@ -3769,6 +3797,7 @@
               <w:bottom w:val="single" w:sz="6" w:color="B0B7C3"/>
               <w:right w:val="single" w:sz="6" w:color="B0B7C3"/>
             </w:tcBorders>
+            <w:shd w:fill="F6F7FA" w:val="clear"/>
           </w:tcPr>
           <w:p>
             <w:pPr>
@@ -3796,6 +3825,7 @@
               <w:bottom w:val="single" w:sz="6" w:color="B0B7C3"/>
               <w:right w:val="single" w:sz="6" w:color="B0B7C3"/>
             </w:tcBorders>
+            <w:shd w:fill="F6F7FA" w:val="clear"/>
           </w:tcPr>
           <w:p>
             <w:pPr>
@@ -3823,6 +3853,7 @@
               <w:bottom w:val="single" w:sz="6" w:color="B0B7C3"/>
               <w:right w:val="single" w:sz="6" w:color="B0B7C3"/>
             </w:tcBorders>
+            <w:shd w:fill="F6F7FA" w:val="clear"/>
           </w:tcPr>
           <w:p>
             <w:pPr>
@@ -3850,6 +3881,7 @@
               <w:bottom w:val="single" w:sz="6" w:color="B0B7C3"/>
               <w:right w:val="single" w:sz="6" w:color="B0B7C3"/>
             </w:tcBorders>
+            <w:shd w:fill="F6F7FA" w:val="clear"/>
           </w:tcPr>
           <w:p>
             <w:pPr>
@@ -3877,6 +3909,7 @@
               <w:bottom w:val="single" w:sz="6" w:color="B0B7C3"/>
               <w:right w:val="single" w:sz="6" w:color="B0B7C3"/>
             </w:tcBorders>
+            <w:shd w:fill="F6F7FA" w:val="clear"/>
           </w:tcPr>
           <w:p>
             <w:pPr>
@@ -3904,6 +3937,7 @@
               <w:bottom w:val="single" w:sz="6" w:color="B0B7C3"/>
               <w:right w:val="single" w:sz="6" w:color="B0B7C3"/>
             </w:tcBorders>
+            <w:shd w:fill="F6F7FA" w:val="clear"/>
           </w:tcPr>
           <w:p>
             <w:pPr>
@@ -3936,7 +3970,6 @@
               <w:bottom w:val="single" w:sz="6" w:color="B0B7C3"/>
               <w:right w:val="single" w:sz="6" w:color="B0B7C3"/>
             </w:tcBorders>
-            <w:shd w:fill="F6F7FA" w:val="clear"/>
           </w:tcPr>
           <w:p>
             <w:pPr>
@@ -3964,7 +3997,6 @@
               <w:bottom w:val="single" w:sz="6" w:color="B0B7C3"/>
               <w:right w:val="single" w:sz="6" w:color="B0B7C3"/>
             </w:tcBorders>
-            <w:shd w:fill="F6F7FA" w:val="clear"/>
           </w:tcPr>
           <w:p>
             <w:pPr>
@@ -3992,7 +4024,6 @@
               <w:bottom w:val="single" w:sz="6" w:color="B0B7C3"/>
               <w:right w:val="single" w:sz="6" w:color="B0B7C3"/>
             </w:tcBorders>
-            <w:shd w:fill="F6F7FA" w:val="clear"/>
           </w:tcPr>
           <w:p>
             <w:pPr>
@@ -4020,7 +4051,6 @@
               <w:bottom w:val="single" w:sz="6" w:color="B0B7C3"/>
               <w:right w:val="single" w:sz="6" w:color="B0B7C3"/>
             </w:tcBorders>
-            <w:shd w:fill="F6F7FA" w:val="clear"/>
           </w:tcPr>
           <w:p>
             <w:pPr>
@@ -4048,7 +4078,6 @@
               <w:bottom w:val="single" w:sz="6" w:color="B0B7C3"/>
               <w:right w:val="single" w:sz="6" w:color="B0B7C3"/>
             </w:tcBorders>
-            <w:shd w:fill="F6F7FA" w:val="clear"/>
           </w:tcPr>
           <w:p>
             <w:pPr>
@@ -4076,7 +4105,6 @@
               <w:bottom w:val="single" w:sz="6" w:color="B0B7C3"/>
               <w:right w:val="single" w:sz="6" w:color="B0B7C3"/>
             </w:tcBorders>
-            <w:shd w:fill="F6F7FA" w:val="clear"/>
           </w:tcPr>
           <w:p>
             <w:pPr>
@@ -4104,7 +4132,6 @@
               <w:bottom w:val="single" w:sz="6" w:color="B0B7C3"/>
               <w:right w:val="single" w:sz="6" w:color="B0B7C3"/>
             </w:tcBorders>
-            <w:shd w:fill="F6F7FA" w:val="clear"/>
           </w:tcPr>
           <w:p>
             <w:pPr>
@@ -4137,6 +4164,7 @@
               <w:bottom w:val="single" w:sz="6" w:color="B0B7C3"/>
               <w:right w:val="single" w:sz="6" w:color="B0B7C3"/>
             </w:tcBorders>
+            <w:shd w:fill="F6F7FA" w:val="clear"/>
           </w:tcPr>
           <w:p>
             <w:pPr>
@@ -4164,6 +4192,7 @@
               <w:bottom w:val="single" w:sz="6" w:color="B0B7C3"/>
               <w:right w:val="single" w:sz="6" w:color="B0B7C3"/>
             </w:tcBorders>
+            <w:shd w:fill="F6F7FA" w:val="clear"/>
           </w:tcPr>
           <w:p>
             <w:pPr>
@@ -4191,6 +4220,7 @@
               <w:bottom w:val="single" w:sz="6" w:color="B0B7C3"/>
               <w:right w:val="single" w:sz="6" w:color="B0B7C3"/>
             </w:tcBorders>
+            <w:shd w:fill="F6F7FA" w:val="clear"/>
           </w:tcPr>
           <w:p>
             <w:pPr>
@@ -4218,6 +4248,7 @@
               <w:bottom w:val="single" w:sz="6" w:color="B0B7C3"/>
               <w:right w:val="single" w:sz="6" w:color="B0B7C3"/>
             </w:tcBorders>
+            <w:shd w:fill="F6F7FA" w:val="clear"/>
           </w:tcPr>
           <w:p>
             <w:pPr>
@@ -4245,6 +4276,7 @@
               <w:bottom w:val="single" w:sz="6" w:color="B0B7C3"/>
               <w:right w:val="single" w:sz="6" w:color="B0B7C3"/>
             </w:tcBorders>
+            <w:shd w:fill="F6F7FA" w:val="clear"/>
           </w:tcPr>
           <w:p>
             <w:pPr>
@@ -4259,205 +4291,6 @@
                 <w:sz w:val="21"/>
               </w:rPr>
               <w:t>45</w:t>
-            </w:r>
-          </w:p>
-        </w:tc>
-        <w:tc>
-          <w:tcPr>
-            <w:tcW w:type="dxa" w:w="1440"/>
-            <w:vAlign w:val="center"/>
-            <w:tcBorders>
-              <w:top w:val="single" w:sz="6" w:color="B0B7C3"/>
-              <w:left w:val="single" w:sz="6" w:color="B0B7C3"/>
-              <w:bottom w:val="single" w:sz="6" w:color="B0B7C3"/>
-              <w:right w:val="single" w:sz="6" w:color="B0B7C3"/>
-            </w:tcBorders>
-          </w:tcPr>
-          <w:p>
-            <w:pPr>
-              <w:spacing w:before="0" w:after="0"/>
-              <w:jc w:val="center"/>
-            </w:pPr>
-            <w:r/>
-            <w:r>
-              <w:rPr>
-                <w:b w:val="0"/>
-                <w:color w:val="1A1A1A"/>
-                <w:sz w:val="21"/>
-              </w:rPr>
-              <w:t>5</w:t>
-            </w:r>
-          </w:p>
-        </w:tc>
-        <w:tc>
-          <w:tcPr>
-            <w:tcW w:type="dxa" w:w="1944"/>
-            <w:vAlign w:val="center"/>
-            <w:tcBorders>
-              <w:top w:val="single" w:sz="6" w:color="B0B7C3"/>
-              <w:left w:val="single" w:sz="6" w:color="B0B7C3"/>
-              <w:bottom w:val="single" w:sz="6" w:color="B0B7C3"/>
-              <w:right w:val="single" w:sz="6" w:color="B0B7C3"/>
-            </w:tcBorders>
-          </w:tcPr>
-          <w:p>
-            <w:pPr>
-              <w:spacing w:before="0" w:after="0"/>
-              <w:jc w:val="center"/>
-            </w:pPr>
-            <w:r/>
-            <w:r>
-              <w:rPr>
-                <w:b w:val="0"/>
-                <w:color w:val="1A1A1A"/>
-                <w:sz w:val="21"/>
-              </w:rPr>
-              <w:t>31,201</w:t>
-            </w:r>
-          </w:p>
-        </w:tc>
-      </w:tr>
-      <w:tr>
-        <w:trPr>
-          <w:trHeight w:val="360" w:hRule="atLeast"/>
-        </w:trPr>
-        <w:tc>
-          <w:tcPr>
-            <w:tcW w:type="dxa" w:w="1296"/>
-            <w:vAlign w:val="center"/>
-            <w:tcBorders>
-              <w:top w:val="single" w:sz="6" w:color="B0B7C3"/>
-              <w:left w:val="single" w:sz="6" w:color="B0B7C3"/>
-              <w:bottom w:val="single" w:sz="6" w:color="B0B7C3"/>
-              <w:right w:val="single" w:sz="6" w:color="B0B7C3"/>
-            </w:tcBorders>
-            <w:shd w:fill="F6F7FA" w:val="clear"/>
-          </w:tcPr>
-          <w:p>
-            <w:pPr>
-              <w:spacing w:before="0" w:after="0"/>
-              <w:jc w:val="center"/>
-            </w:pPr>
-            <w:r/>
-            <w:r>
-              <w:rPr>
-                <w:b w:val="0"/>
-                <w:color w:val="1A1A1A"/>
-                <w:sz w:val="21"/>
-              </w:rPr>
-              <w:t>04</w:t>
-            </w:r>
-          </w:p>
-        </w:tc>
-        <w:tc>
-          <w:tcPr>
-            <w:tcW w:type="dxa" w:w="3888"/>
-            <w:vAlign w:val="center"/>
-            <w:tcBorders>
-              <w:top w:val="single" w:sz="6" w:color="B0B7C3"/>
-              <w:left w:val="single" w:sz="6" w:color="B0B7C3"/>
-              <w:bottom w:val="single" w:sz="6" w:color="B0B7C3"/>
-              <w:right w:val="single" w:sz="6" w:color="B0B7C3"/>
-            </w:tcBorders>
-            <w:shd w:fill="F6F7FA" w:val="clear"/>
-          </w:tcPr>
-          <w:p>
-            <w:pPr>
-              <w:spacing w:before="0" w:after="0"/>
-              <w:jc w:val="center"/>
-            </w:pPr>
-            <w:r/>
-            <w:r>
-              <w:rPr>
-                <w:b w:val="0"/>
-                <w:color w:val="1A1A1A"/>
-                <w:sz w:val="21"/>
-              </w:rPr>
-              <w:t>Railroad</w:t>
-            </w:r>
-          </w:p>
-        </w:tc>
-        <w:tc>
-          <w:tcPr>
-            <w:tcW w:type="dxa" w:w="1512"/>
-            <w:vAlign w:val="center"/>
-            <w:tcBorders>
-              <w:top w:val="single" w:sz="6" w:color="B0B7C3"/>
-              <w:left w:val="single" w:sz="6" w:color="B0B7C3"/>
-              <w:bottom w:val="single" w:sz="6" w:color="B0B7C3"/>
-              <w:right w:val="single" w:sz="6" w:color="B0B7C3"/>
-            </w:tcBorders>
-            <w:shd w:fill="F6F7FA" w:val="clear"/>
-          </w:tcPr>
-          <w:p>
-            <w:pPr>
-              <w:spacing w:before="0" w:after="0"/>
-              <w:jc w:val="center"/>
-            </w:pPr>
-            <w:r/>
-            <w:r>
-              <w:rPr>
-                <w:b w:val="0"/>
-                <w:color w:val="1A1A1A"/>
-                <w:sz w:val="21"/>
-              </w:rPr>
-              <w:t>726</w:t>
-            </w:r>
-          </w:p>
-        </w:tc>
-        <w:tc>
-          <w:tcPr>
-            <w:tcW w:type="dxa" w:w="1440"/>
-            <w:vAlign w:val="center"/>
-            <w:tcBorders>
-              <w:top w:val="single" w:sz="6" w:color="B0B7C3"/>
-              <w:left w:val="single" w:sz="6" w:color="B0B7C3"/>
-              <w:bottom w:val="single" w:sz="6" w:color="B0B7C3"/>
-              <w:right w:val="single" w:sz="6" w:color="B0B7C3"/>
-            </w:tcBorders>
-            <w:shd w:fill="F6F7FA" w:val="clear"/>
-          </w:tcPr>
-          <w:p>
-            <w:pPr>
-              <w:spacing w:before="0" w:after="0"/>
-              <w:jc w:val="center"/>
-            </w:pPr>
-            <w:r/>
-            <w:r>
-              <w:rPr>
-                <w:b w:val="0"/>
-                <w:color w:val="1A1A1A"/>
-                <w:sz w:val="21"/>
-              </w:rPr>
-              <w:t>705</w:t>
-            </w:r>
-          </w:p>
-        </w:tc>
-        <w:tc>
-          <w:tcPr>
-            <w:tcW w:type="dxa" w:w="1512"/>
-            <w:vAlign w:val="center"/>
-            <w:tcBorders>
-              <w:top w:val="single" w:sz="6" w:color="B0B7C3"/>
-              <w:left w:val="single" w:sz="6" w:color="B0B7C3"/>
-              <w:bottom w:val="single" w:sz="6" w:color="B0B7C3"/>
-              <w:right w:val="single" w:sz="6" w:color="B0B7C3"/>
-            </w:tcBorders>
-            <w:shd w:fill="F6F7FA" w:val="clear"/>
-          </w:tcPr>
-          <w:p>
-            <w:pPr>
-              <w:spacing w:before="0" w:after="0"/>
-              <w:jc w:val="center"/>
-            </w:pPr>
-            <w:r/>
-            <w:r>
-              <w:rPr>
-                <w:b w:val="0"/>
-                <w:color w:val="1A1A1A"/>
-                <w:sz w:val="21"/>
-              </w:rPr>
-              <w:t>16</w:t>
             </w:r>
           </w:p>
         </w:tc>
@@ -4500,6 +4333,200 @@
               <w:right w:val="single" w:sz="6" w:color="B0B7C3"/>
             </w:tcBorders>
             <w:shd w:fill="F6F7FA" w:val="clear"/>
+          </w:tcPr>
+          <w:p>
+            <w:pPr>
+              <w:spacing w:before="0" w:after="0"/>
+              <w:jc w:val="center"/>
+            </w:pPr>
+            <w:r/>
+            <w:r>
+              <w:rPr>
+                <w:b w:val="0"/>
+                <w:color w:val="1A1A1A"/>
+                <w:sz w:val="21"/>
+              </w:rPr>
+              <w:t>31,201</w:t>
+            </w:r>
+          </w:p>
+        </w:tc>
+      </w:tr>
+      <w:tr>
+        <w:trPr>
+          <w:trHeight w:val="360" w:hRule="atLeast"/>
+        </w:trPr>
+        <w:tc>
+          <w:tcPr>
+            <w:tcW w:type="dxa" w:w="1296"/>
+            <w:vAlign w:val="center"/>
+            <w:tcBorders>
+              <w:top w:val="single" w:sz="6" w:color="B0B7C3"/>
+              <w:left w:val="single" w:sz="6" w:color="B0B7C3"/>
+              <w:bottom w:val="single" w:sz="6" w:color="B0B7C3"/>
+              <w:right w:val="single" w:sz="6" w:color="B0B7C3"/>
+            </w:tcBorders>
+          </w:tcPr>
+          <w:p>
+            <w:pPr>
+              <w:spacing w:before="0" w:after="0"/>
+              <w:jc w:val="center"/>
+            </w:pPr>
+            <w:r/>
+            <w:r>
+              <w:rPr>
+                <w:b w:val="0"/>
+                <w:color w:val="1A1A1A"/>
+                <w:sz w:val="21"/>
+              </w:rPr>
+              <w:t>04</w:t>
+            </w:r>
+          </w:p>
+        </w:tc>
+        <w:tc>
+          <w:tcPr>
+            <w:tcW w:type="dxa" w:w="3888"/>
+            <w:vAlign w:val="center"/>
+            <w:tcBorders>
+              <w:top w:val="single" w:sz="6" w:color="B0B7C3"/>
+              <w:left w:val="single" w:sz="6" w:color="B0B7C3"/>
+              <w:bottom w:val="single" w:sz="6" w:color="B0B7C3"/>
+              <w:right w:val="single" w:sz="6" w:color="B0B7C3"/>
+            </w:tcBorders>
+          </w:tcPr>
+          <w:p>
+            <w:pPr>
+              <w:spacing w:before="0" w:after="0"/>
+              <w:jc w:val="center"/>
+            </w:pPr>
+            <w:r/>
+            <w:r>
+              <w:rPr>
+                <w:b w:val="0"/>
+                <w:color w:val="1A1A1A"/>
+                <w:sz w:val="21"/>
+              </w:rPr>
+              <w:t>Railroad</w:t>
+            </w:r>
+          </w:p>
+        </w:tc>
+        <w:tc>
+          <w:tcPr>
+            <w:tcW w:type="dxa" w:w="1512"/>
+            <w:vAlign w:val="center"/>
+            <w:tcBorders>
+              <w:top w:val="single" w:sz="6" w:color="B0B7C3"/>
+              <w:left w:val="single" w:sz="6" w:color="B0B7C3"/>
+              <w:bottom w:val="single" w:sz="6" w:color="B0B7C3"/>
+              <w:right w:val="single" w:sz="6" w:color="B0B7C3"/>
+            </w:tcBorders>
+          </w:tcPr>
+          <w:p>
+            <w:pPr>
+              <w:spacing w:before="0" w:after="0"/>
+              <w:jc w:val="center"/>
+            </w:pPr>
+            <w:r/>
+            <w:r>
+              <w:rPr>
+                <w:b w:val="0"/>
+                <w:color w:val="1A1A1A"/>
+                <w:sz w:val="21"/>
+              </w:rPr>
+              <w:t>726</w:t>
+            </w:r>
+          </w:p>
+        </w:tc>
+        <w:tc>
+          <w:tcPr>
+            <w:tcW w:type="dxa" w:w="1440"/>
+            <w:vAlign w:val="center"/>
+            <w:tcBorders>
+              <w:top w:val="single" w:sz="6" w:color="B0B7C3"/>
+              <w:left w:val="single" w:sz="6" w:color="B0B7C3"/>
+              <w:bottom w:val="single" w:sz="6" w:color="B0B7C3"/>
+              <w:right w:val="single" w:sz="6" w:color="B0B7C3"/>
+            </w:tcBorders>
+          </w:tcPr>
+          <w:p>
+            <w:pPr>
+              <w:spacing w:before="0" w:after="0"/>
+              <w:jc w:val="center"/>
+            </w:pPr>
+            <w:r/>
+            <w:r>
+              <w:rPr>
+                <w:b w:val="0"/>
+                <w:color w:val="1A1A1A"/>
+                <w:sz w:val="21"/>
+              </w:rPr>
+              <w:t>705</w:t>
+            </w:r>
+          </w:p>
+        </w:tc>
+        <w:tc>
+          <w:tcPr>
+            <w:tcW w:type="dxa" w:w="1512"/>
+            <w:vAlign w:val="center"/>
+            <w:tcBorders>
+              <w:top w:val="single" w:sz="6" w:color="B0B7C3"/>
+              <w:left w:val="single" w:sz="6" w:color="B0B7C3"/>
+              <w:bottom w:val="single" w:sz="6" w:color="B0B7C3"/>
+              <w:right w:val="single" w:sz="6" w:color="B0B7C3"/>
+            </w:tcBorders>
+          </w:tcPr>
+          <w:p>
+            <w:pPr>
+              <w:spacing w:before="0" w:after="0"/>
+              <w:jc w:val="center"/>
+            </w:pPr>
+            <w:r/>
+            <w:r>
+              <w:rPr>
+                <w:b w:val="0"/>
+                <w:color w:val="1A1A1A"/>
+                <w:sz w:val="21"/>
+              </w:rPr>
+              <w:t>16</w:t>
+            </w:r>
+          </w:p>
+        </w:tc>
+        <w:tc>
+          <w:tcPr>
+            <w:tcW w:type="dxa" w:w="1440"/>
+            <w:vAlign w:val="center"/>
+            <w:tcBorders>
+              <w:top w:val="single" w:sz="6" w:color="B0B7C3"/>
+              <w:left w:val="single" w:sz="6" w:color="B0B7C3"/>
+              <w:bottom w:val="single" w:sz="6" w:color="B0B7C3"/>
+              <w:right w:val="single" w:sz="6" w:color="B0B7C3"/>
+            </w:tcBorders>
+          </w:tcPr>
+          <w:p>
+            <w:pPr>
+              <w:spacing w:before="0" w:after="0"/>
+              <w:jc w:val="center"/>
+            </w:pPr>
+            <w:r/>
+            <w:r>
+              <w:rPr>
+                <w:b w:val="0"/>
+                <w:color w:val="1A1A1A"/>
+                <w:sz w:val="21"/>
+              </w:rPr>
+              <w:t>5</w:t>
+            </w:r>
+          </w:p>
+        </w:tc>
+        <w:tc>
+          <w:tcPr>
+            <w:tcW w:type="dxa" w:w="1944"/>
+            <w:vAlign w:val="center"/>
+            <w:tcBorders>
+              <w:top w:val="single" w:sz="6" w:color="B0B7C3"/>
+              <w:left w:val="single" w:sz="6" w:color="B0B7C3"/>
+              <w:bottom w:val="single" w:sz="6" w:color="B0B7C3"/>
+              <w:right w:val="single" w:sz="6" w:color="B0B7C3"/>
+            </w:tcBorders>
           </w:tcPr>
           <w:p>
             <w:pPr>

</xml_diff>